<commit_message>
Publish reviewer assessment and repository links
</commit_message>
<xml_diff>
--- a/manuscript/manuscript_JTM_patient_level_TITAN.docx
+++ b/manuscript/manuscript_JTM_patient_level_TITAN.docx
@@ -264,7 +264,7 @@
     </w:p>
     <w:p>
       <w:r>
-        <w:t>Analyses used R 4.6 and fastPLS 0.99.20 (Git commit dcf45cc). Complete code, source manifests, target catalogues, checkpoints, out-of-fold predictions, figures, model registry and inference example are organized at [repository URL pending publication]. Fitted TITAN-derived model objects are generated locally; their public redistribution remains subject to TITAN's upstream terms. No external cohort with compatible precomputed TITAN features and the required multi-omic labels was identified, so all performance estimates remain internal to TCGA.</w:t>
+        <w:t>Analyses used R 4.6 and fastPLS 0.99.20 (Git commit dcf45cc). Complete code, source manifests, target catalogues, checkpoints, out-of-fold predictions, figures, model registry and inference example are organized at https://github.com/tkcaccia/titan-prediction. Fitted TITAN-derived model objects are generated locally; their public redistribution remains subject to TITAN's upstream terms. No external cohort with compatible precomputed TITAN features and the required multi-omic labels was identified, so all performance estimates remain internal to TCGA.</w:t>
       </w:r>
     </w:p>
     <w:p>
@@ -1898,7 +1898,7 @@
     </w:p>
     <w:p>
       <w:r>
-        <w:t>Source locations and checksums are recorded in the repository: [repository URL pending publication]. TCGA data are available from the Genomic Data Commons; TITAN resources are available from MahmoodLab. Model-object redistribution is subject to TITAN's upstream terms.</w:t>
+        <w:t>Source locations and checksums are recorded in the repository: https://github.com/tkcaccia/titan-prediction. TCGA data are available from the Genomic Data Commons; TITAN resources are available from MahmoodLab. Model-object redistribution is subject to TITAN's upstream terms.</w:t>
       </w:r>
     </w:p>
     <w:p>

</xml_diff>

<commit_message>
Clarify predictor novelty and move PLS2 comparison
</commit_message>
<xml_diff>
--- a/manuscript/manuscript_JTM_patient_level_TITAN.docx
+++ b/manuscript/manuscript_JTM_patient_level_TITAN.docx
@@ -73,7 +73,7 @@
         <w:t xml:space="preserve">Methods. </w:t>
       </w:r>
       <w:r>
-        <w:t>We mean-pooled 11,449 primary diagnostic slide embeddings into 9,404 patient vectors across 32 TCGA cancers; 843 patients contributed multiple slides. We tested 1,614 continuous and 459 binary cancer–endpoint pairs. PLS1 regression was used for continuous targets; binary targets used PLS latent scores with LDA. Patient-level nested 5×5 cross-validation selected 1–10 components. Effect-eligible models underwent up to 99 permutations with Benjamini–Hochberg control within cancer and endpoint family; a global-across-cancers q-value was retained as sensitivity. PLS2 was a secondary matched analysis of coherent inflammatory blocks.</w:t>
+        <w:t>We mean-pooled 11,449 primary diagnostic slide embeddings into 9,404 patient vectors across 32 TCGA cancers; 843 patients contributed multiple slides. We tested 1,614 continuous and 459 binary cancer–endpoint pairs. PLS1 regression was used for continuous targets; binary targets used PLS latent scores with LDA. Patient-level nested 5×5 cross-validation selected 1–10 components. Effect-eligible models underwent up to 99 permutations with Benjamini–Hochberg control within cancer and endpoint family; a global-across-cancers q-value was retained as sensitivity.</w:t>
       </w:r>
     </w:p>
     <w:p>
@@ -84,7 +84,7 @@
         <w:t xml:space="preserve">Results. </w:t>
       </w:r>
       <w:r>
-        <w:t>Across all families, 152 continuous and 73 binary pairs met Tier A/B criteria. Leading continuous results included TGCT–TGF-beta Response (0.644); THYM–Th17 Cells (0.624); THCA–Lymphocyte Infiltration Signature Score (0.580); TGCT–Macrophage Regulation (0.556). Leading binary results included THYM–GTF2I (0.876); READ–APC (0.860); READ–TP53 (0.847); LGG–TP53 (0.830). Site-grouped and first-slide sensitivity quantified centre and slide-selection dependence. PLS2 effect magnitudes were evaluated at the cancer level rather than by endpoint win counts.</w:t>
+        <w:t>Across all families, 152 continuous and 73 binary pairs met Tier A/B criteria. Leading continuous results included TGCT–TGF-beta Response (0.644); THYM–Th17 Cells (0.624); THCA–Lymphocyte Infiltration Signature Score (0.580); TGCT–Macrophage Regulation (0.556). Leading binary results included THYM–GTF2I [mutation] (0.876); READ–APC [mutation] (0.860); READ–TP53 [mutation] (0.847); LGG–TP53 [mutation] (0.830). Site-grouped and first-slide sensitivity quantified centre and slide-selection dependence.</w:t>
       </w:r>
     </w:p>
     <w:p>
@@ -123,7 +123,12 @@
     </w:p>
     <w:p>
       <w:r>
-        <w:t>The primary question was cancer-specific: which individual mutations, inflammatory measurements, oncogenic pathways, MSI phenotypes, aneuploidy measures and fusions are predictable within each cancer? Molecular subtype association was not analysed. PLS1 versus PLS2 was secondary; PLS2 was considered most biologically plausible for correlated inflammatory panels, while PLS–LDA was preferred for individual binary molecular endpoints.</w:t>
+        <w:t>A second practical advantage is model portability. A fitted PLS or PLS–LDA predictor can be distributed as a compact set of preprocessing parameters, latent-variable weights, regression coefficients and LDA parameters. Prediction therefore does not require release of the patient-level training embeddings or outcomes. This differs from reference-set methods such as k-nearest neighbours, which require access to stored training examples at inference [19]. Model sharing remains subject to upstream licences, governance and external validation.</w:t>
+      </w:r>
+    </w:p>
+    <w:p>
+      <w:r>
+        <w:t>The primary question was cancer-specific: which individual mutations, inflammatory measurements, oncogenic pathways, MSI phenotypes, aneuploidy measures and fusions are predictable within each cancer? Molecular subtype association was not analysed. PLS–LDA was preferred for individual binary molecular endpoints. The methodological PLS1–PLS2 comparison for correlated inflammatory panels is reported in the Supplementary Material.</w:t>
       </w:r>
     </w:p>
     <w:p>
@@ -241,7 +246,7 @@
         <w:pStyle w:val="Heading2"/>
       </w:pPr>
       <w:r>
-        <w:t>Robustness, saved models and PLS2 sensitivity</w:t>
+        <w:t>Robustness and saved models</w:t>
       </w:r>
     </w:p>
     <w:p>
@@ -251,7 +256,7 @@
     </w:p>
     <w:p>
       <w:r>
-        <w:t>The secondary PLS2 analysis jointly modelled three prespecified inflammatory blocks: infiltration/signatures, immune repertoire and inferred immune-cell fractions. PLS1 and PLS2 used identical complete-case patients and outer folds, training-fold outcome scaling, separately selected component counts and three independent nested-CV repeats. Changes in Q² were aggregated by cancer with cancer-bootstrap intervals; endpoint win counts were not treated as inferential evidence.</w:t>
+        <w:t>The fitted PLS and PLS–LDA objects contain the learned transformations and coefficients needed for inference but no patient-level training rows. The public inference interface validates the 768-feature order and applies the prespecified patient-level slide aggregation. The secondary PLS1–PLS2 inflammatory comparison, including matched folds and cancer-bootstrap intervals, is described in the Supplementary Methods.</w:t>
       </w:r>
     </w:p>
     <w:p>
@@ -1529,7 +1534,7 @@
     </w:p>
     <w:p>
       <w:r>
-        <w:t>The binary atlas yielded 24 Tier-A and 49 Tier-B pairs. Leading results were THYM–GTF2I (0.876); READ–APC (0.860); READ–TP53 (0.847); LGG–TP53 (0.830); THCA–BRAF (0.828); LGG–TP53 (0.822); LGG–HIPPO (0.811); COAD–APC (0.792); UCEC–Any called fusion (0.792); COAD–MSI-H strict (MANTIS &gt;0.6) (0.784); LGG–ATRX (0.784); COAD–TP53 (0.777). The complete table includes tested-negative and ineligible distinctions for mutations, pathways, genome doubling, MSI and fusions.</w:t>
+        <w:t>The binary atlas yielded 24 Tier-A and 49 Tier-B pairs. Leading results were THYM–GTF2I [mutation] (0.876); READ–APC [mutation] (0.860); READ–TP53 [mutation] (0.847); LGG–TP53 [mutation] (0.830); THCA–BRAF [mutation] (0.828); LGG–TP53 [pathway] (0.822); LGG–HIPPO [pathway] (0.811); COAD–APC [mutation] (0.792); UCEC–Any called fusion [fusion] (0.792); COAD–MSI-H strict (MANTIS &gt;0.6) [strict MSI] (0.784); LGG–ATRX [mutation] (0.784); COAD–TP53 [mutation] (0.777). The complete table includes tested-negative and ineligible distinctions for mutations, pathways, genome doubling, MSI and fusions.</w:t>
       </w:r>
     </w:p>
     <w:p>
@@ -1696,115 +1701,6 @@
     </w:p>
     <w:p>
       <w:pPr>
-        <w:pStyle w:val="Heading2"/>
-      </w:pPr>
-      <w:r>
-        <w:t>Secondary PLS1–PLS2 comparison</w:t>
-      </w:r>
-    </w:p>
-    <w:p>
-      <w:r>
-        <w:t>inferred cell fractions: mean cancer-level ΔQ² 0.067 (95% interval 0.040 to 0.096); infiltration signatures: mean cancer-level ΔQ² 0.018 (95% interval 0.011 to 0.028); immune repertoire: mean cancer-level ΔQ² 0.058 (95% interval 0.040 to 0.079). These effect magnitudes, not the number of endpoints won, determine interpretation.</w:t>
-      </w:r>
-    </w:p>
-    <w:p>
-      <w:pPr>
-        <w:jc w:val="center"/>
-      </w:pPr>
-      <w:r>
-        <w:drawing>
-          <wp:inline xmlns:a="http://schemas.openxmlformats.org/drawingml/2006/main" xmlns:pic="http://schemas.openxmlformats.org/drawingml/2006/picture">
-            <wp:extent cx="5806440" cy="5150874"/>
-            <wp:docPr id="6" name="Picture 6"/>
-            <wp:cNvGraphicFramePr>
-              <a:graphicFrameLocks noChangeAspect="1"/>
-            </wp:cNvGraphicFramePr>
-            <a:graphic>
-              <a:graphicData uri="http://schemas.openxmlformats.org/drawingml/2006/picture">
-                <pic:pic>
-                  <pic:nvPicPr>
-                    <pic:cNvPr id="0" name="Figure6a_pls1_vs_pls2_targets.png"/>
-                    <pic:cNvPicPr/>
-                  </pic:nvPicPr>
-                  <pic:blipFill>
-                    <a:blip r:embed="rId16"/>
-                    <a:stretch>
-                      <a:fillRect/>
-                    </a:stretch>
-                  </pic:blipFill>
-                  <pic:spPr>
-                    <a:xfrm>
-                      <a:off x="0" y="0"/>
-                      <a:ext cx="5806440" cy="5150874"/>
-                    </a:xfrm>
-                    <a:prstGeom prst="rect"/>
-                  </pic:spPr>
-                </pic:pic>
-              </a:graphicData>
-            </a:graphic>
-          </wp:inline>
-        </w:drawing>
-      </w:r>
-    </w:p>
-    <w:p>
-      <w:pPr>
-        <w:pStyle w:val="Caption"/>
-        <w:jc w:val="center"/>
-      </w:pPr>
-      <w:r>
-        <w:t>Figure 6a. Matched target-level PLS1 and PLS2 Q² on identical held-out patients.</w:t>
-      </w:r>
-    </w:p>
-    <w:p>
-      <w:pPr>
-        <w:jc w:val="center"/>
-      </w:pPr>
-      <w:r>
-        <w:drawing>
-          <wp:inline xmlns:a="http://schemas.openxmlformats.org/drawingml/2006/main" xmlns:pic="http://schemas.openxmlformats.org/drawingml/2006/picture">
-            <wp:extent cx="5806440" cy="5806440"/>
-            <wp:docPr id="7" name="Picture 7"/>
-            <wp:cNvGraphicFramePr>
-              <a:graphicFrameLocks noChangeAspect="1"/>
-            </wp:cNvGraphicFramePr>
-            <a:graphic>
-              <a:graphicData uri="http://schemas.openxmlformats.org/drawingml/2006/picture">
-                <pic:pic>
-                  <pic:nvPicPr>
-                    <pic:cNvPr id="0" name="Figure6b_pls1_vs_pls2_cancers.png"/>
-                    <pic:cNvPicPr/>
-                  </pic:nvPicPr>
-                  <pic:blipFill>
-                    <a:blip r:embed="rId17"/>
-                    <a:stretch>
-                      <a:fillRect/>
-                    </a:stretch>
-                  </pic:blipFill>
-                  <pic:spPr>
-                    <a:xfrm>
-                      <a:off x="0" y="0"/>
-                      <a:ext cx="5806440" cy="5806440"/>
-                    </a:xfrm>
-                    <a:prstGeom prst="rect"/>
-                  </pic:spPr>
-                </pic:pic>
-              </a:graphicData>
-            </a:graphic>
-          </wp:inline>
-        </w:drawing>
-      </w:r>
-    </w:p>
-    <w:p>
-      <w:pPr>
-        <w:pStyle w:val="Caption"/>
-        <w:jc w:val="center"/>
-      </w:pPr>
-      <w:r>
-        <w:t>Figure 6b. Cancer-level mean Q² change for joint PLS2 relative to response-by-response PLS1.</w:t>
-      </w:r>
-    </w:p>
-    <w:p>
-      <w:pPr>
         <w:pStyle w:val="Heading1"/>
       </w:pPr>
       <w:r>
@@ -1817,18 +1713,49 @@
       </w:r>
     </w:p>
     <w:p>
+      <w:pPr>
+        <w:pStyle w:val="Heading2"/>
+      </w:pPr>
       <w:r>
-        <w:t>Prior CNN studies recovered histological signal for multiple exact cancer–gene pairs [1–5]. In the prespecified crosswalk, not eligible or not tested: 25, recovered tier A: 3, tested not supported: 32. Recovered and unrecovered pairs are listed in Supplementary Table S4; original study metrics, evidence notes and URLs are retained in the machine-readable crosswalk. Current balanced accuracy cannot be numerically equated to prior AUROC, and disagreement may reflect primary-versus-metastatic sampling, frozen versus FFPE preparation, mutation definition, model class or validation design.</w:t>
+        <w:t>Previously reported and atlas-nominated predictors</w:t>
       </w:r>
     </w:p>
     <w:p>
       <w:r>
-        <w:t>The practical advantage of TITAN plus PLS is rapid reuse. Once slide embeddings exist, hundreds of new outcomes can be screened without retraining a CNN encoder. This is useful for discovery and triage, particularly when new genomic annotations become available. It does not eliminate the one-time TITAN extraction cost and is not a hardware-matched claim of superior accuracy.</w:t>
+        <w:t>The mutation results divide into two evidence groups. Three of the 16 Tier-A/B cancer–gene pairs were exact pairs in the prespecified CNN literature crosswalk and were recovered here: LGG–IDH1: prior AUROC 0.764, current balanced accuracy 0.772 (q=0.022); LGG–TP53: prior AUROC 0.787, current balanced accuracy 0.830 (q=0.022); THCA–BRAF: prior AUROC 0.860, current balanced accuracy 0.828 (q=0.010). Prior studies reported AUROC, whereas the present primary metric is balanced accuracy; the side-by-side values describe consistency of discrimination but are not numerical estimates of improvement or inferiority.</w:t>
       </w:r>
     </w:p>
     <w:p>
       <w:r>
-        <w:t>Joint PLS2 is most compelling when responses are correlated and measured on the same patients. Its inflammatory benefit must nevertheless be judged by ΔQ² and its cancer-level interval. Binary mutations and fusions are sparse and only partially correlated, so a shared response space can dilute target-specific signal; separate PLS–LDA therefore remains the primary binary strategy.</w:t>
+        <w:t>Several published pairs retained moderate discrimination but did not satisfy the current within-cancer mutation-family FDR criterion: BRCA–TP53: prior AUROC 0.768 [0.735–0.781], current balanced accuracy 0.717 (q=0.100); UCEC–TP53: prior AUROC 0.764, current balanced accuracy 0.739 (q=0.069); LIHC–CTNNB1: prior AUROC 0.682 [0.635–0.688], current balanced accuracy 0.643 (q=0.070); PAAD–KRAS: prior AUROC 0.670 [0.570–0.712], current balanced accuracy 0.546 (q=1.000). Other reported pairs were weaker or ineligible under the present primary-tumour and minimum-class-count rules. Differences can arise from cohort composition, primary-versus-metastatic sampling, slide preparation, mutation definition, model class and validation design. Supplementary Table S4 provides the report-level comparison and the complete machine-readable crosswalk preserves original evidence notes and URLs.</w:t>
+      </w:r>
+    </w:p>
+    <w:p>
+      <w:r>
+        <w:t>The remaining 13 supported mutation pairs were not present in the prespecified exact-pair crosswalk and are therefore atlas-nominated candidates rather than replications. Leading examples were THYM–GTF2I (balanced accuracy 0.876, q=0.010); READ–APC (balanced accuracy 0.860, q=0.010); READ–TP53 (balanced accuracy 0.847, q=0.010); COAD–APC (balanced accuracy 0.792, q=0.043); LGG–ATRX (balanced accuracy 0.784, q=0.022); COAD–TP53 (balanced accuracy 0.777, q=0.043); LGG–CIC (balanced accuracy 0.770, q=0.022); SKCM–BRAF (balanced accuracy 0.765, q=0.010). Absence from this targeted crosswalk is not a claim that no publication has ever evaluated the pair; a systematic endpoint-level review would be required to establish bibliographic novelty. Supplementary Table S5 classifies all 16 supported mutation pairs explicitly.</w:t>
+      </w:r>
+    </w:p>
+    <w:p>
+      <w:r>
+        <w:t>The immune measurements, oncogenic pathways, MSI, aneuploidy and fusion endpoints extend the analysis beyond the exact cancer–gene mutation pairs used for the literature crosswalk. They are newly screened in this TITAN–PLS atlas, but the manuscript does not claim that histological prediction of those broad endpoint classes is unprecedented. Their novelty is the unified patient-level, cancer-specific screen and directly reusable linear modelling framework.</w:t>
+      </w:r>
+    </w:p>
+    <w:p>
+      <w:pPr>
+        <w:pStyle w:val="Heading2"/>
+      </w:pPr>
+      <w:r>
+        <w:t>Practical novelty of the PLS framework</w:t>
+      </w:r>
+    </w:p>
+    <w:p>
+      <w:r>
+        <w:t>The first practical advantage of TITAN plus PLS is rapid reuse. Once slide embeddings exist, hundreds of new outcomes can be screened without retraining a CNN encoder. This is useful for discovery and triage when new genomic annotations become available. It does not eliminate the one-time TITAN extraction cost and is not a hardware-matched claim of superior accuracy.</w:t>
+      </w:r>
+    </w:p>
+    <w:p>
+      <w:r>
+        <w:t>The second advantage is data-minimising model portability. A trained PLS predictor is parametric: preprocessing values, latent weights and coefficients are sufficient for continuous prediction, with compact LDA parameters added for binary classification. External users can therefore apply a frozen model to correctly ordered TITAN features without receiving the original patient embeddings, outcomes or neighbour reference set. By contrast, k-nearest-neighbour inference depends directly on stored training examples [19]. This reduces the data that must be distributed, although it does not by itself confer privacy, overcome TITAN licensing restrictions or establish transportability.</w:t>
       </w:r>
     </w:p>
     <w:p>
@@ -1851,7 +1778,7 @@
     </w:p>
     <w:p>
       <w:r>
-        <w:t>Mean-pooled, frozen TITAN embeddings enable a rapid cancer-specific atlas of selected immune, mutation, pathway, MSI, aneuploidy and fusion phenotypes. PLS2 is a secondary option for correlated inflammatory panels; individual PLS–LDA remains the clearer default for binary molecular targets. The resource prioritises hypotheses and exposes unsupported targets, but remains internally validated and non-clinical.</w:t>
+        <w:t>Mean-pooled, frozen TITAN embeddings enable a rapid cancer-specific atlas of selected immune, mutation, pathway, MSI, aneuploidy and fusion phenotypes. Compact fitted PLS and PLS–LDA models can be applied without distributing patient-level training data, providing a practical route to external research validation when licensing permits. The resource prioritises hypotheses and exposes unsupported targets, but remains internally validated and non-clinical.</w:t>
       </w:r>
     </w:p>
     <w:p>
@@ -2049,6 +1976,11 @@
     <w:p>
       <w:r>
         <w:t>18. Collins GS, et al. TRIPOD+AI statement. BMJ. 2024;385:e078378. doi:10.1136/bmj-2023-078378.</w:t>
+      </w:r>
+    </w:p>
+    <w:p>
+      <w:r>
+        <w:t>19. Cover TM, Hart PE. Nearest neighbor pattern classification. IEEE Trans Inf Theory. 1967;13:21–27. doi:10.1109/TIT.1967.1053964.</w:t>
       </w:r>
     </w:p>
     <w:sectPr>

</xml_diff>

<commit_message>
Update manuscript author list and affiliations
</commit_message>
<xml_diff>
--- a/manuscript/manuscript_JTM_patient_level_TITAN.docx
+++ b/manuscript/manuscript_JTM_patient_level_TITAN.docx
@@ -19,7 +19,73 @@
         <w:rPr>
           <w:b/>
         </w:rPr>
-        <w:t>Authors: Aamilah Ismail [author list to be confirmed]</w:t>
+        <w:t>Aamilah Ismail</w:t>
+      </w:r>
+      <w:r>
+        <w:rPr>
+          <w:vertAlign w:val="superscript"/>
+        </w:rPr>
+        <w:t>1,2,*</w:t>
+      </w:r>
+      <w:r>
+        <w:t xml:space="preserve">, </w:t>
+      </w:r>
+      <w:r>
+        <w:rPr>
+          <w:b/>
+        </w:rPr>
+        <w:t>Moussa Kassim</w:t>
+      </w:r>
+      <w:r>
+        <w:rPr>
+          <w:vertAlign w:val="superscript"/>
+        </w:rPr>
+        <w:t>1,2,*</w:t>
+      </w:r>
+      <w:r>
+        <w:t xml:space="preserve">, </w:t>
+      </w:r>
+      <w:r>
+        <w:rPr>
+          <w:b/>
+        </w:rPr>
+        <w:t>Dalia Ahmed</w:t>
+      </w:r>
+      <w:r>
+        <w:rPr>
+          <w:vertAlign w:val="superscript"/>
+        </w:rPr>
+        <w:t>1</w:t>
+      </w:r>
+      <w:r>
+        <w:t xml:space="preserve">, </w:t>
+      </w:r>
+      <w:r>
+        <w:rPr>
+          <w:b/>
+        </w:rPr>
+        <w:t>Dupe Ojo</w:t>
+      </w:r>
+      <w:r>
+        <w:rPr>
+          <w:vertAlign w:val="superscript"/>
+        </w:rPr>
+        <w:t>1</w:t>
+      </w:r>
+      <w:r>
+        <w:t xml:space="preserve">, </w:t>
+      </w:r>
+      <w:r>
+        <w:rPr>
+          <w:b/>
+        </w:rPr>
+        <w:t>Stefano Cacciatore</w:t>
+      </w:r>
+      <w:r>
+        <w:rPr>
+          <w:vertAlign w:val="superscript"/>
+        </w:rPr>
+        <w:t>1,2,†</w:t>
       </w:r>
     </w:p>
     <w:p>
@@ -27,7 +93,13 @@
         <w:jc w:val="center"/>
       </w:pPr>
       <w:r>
-        <w:t>Division of Engineering, New York University Abu Dhabi, Abu Dhabi, United Arab Emirates</w:t>
+        <w:rPr>
+          <w:b/>
+        </w:rPr>
+        <w:t xml:space="preserve">1 </w:t>
+      </w:r>
+      <w:r>
+        <w:t>Bioinformatics Unit, International Centre for Genetic Engineering and Biotechnology (ICGEB), Cape Town 7925, South Africa</w:t>
       </w:r>
     </w:p>
     <w:p>
@@ -35,7 +107,43 @@
         <w:jc w:val="center"/>
       </w:pPr>
       <w:r>
-        <w:t>Corresponding author: [to be completed]</w:t>
+        <w:rPr>
+          <w:b/>
+        </w:rPr>
+        <w:t xml:space="preserve">2 </w:t>
+      </w:r>
+      <w:r>
+        <w:t>Department of Integrative Biomedical Sciences, Institute of Infectious Disease &amp; Molecular Medicine (IDM), University of Cape Town, Cape Town 7925, South Africa</w:t>
+      </w:r>
+    </w:p>
+    <w:p>
+      <w:pPr>
+        <w:jc w:val="center"/>
+      </w:pPr>
+      <w:r>
+        <w:rPr>
+          <w:i/>
+        </w:rPr>
+        <w:t>* These authors contributed equally.</w:t>
+      </w:r>
+    </w:p>
+    <w:p>
+      <w:pPr>
+        <w:jc w:val="center"/>
+      </w:pPr>
+      <w:r>
+        <w:rPr>
+          <w:i/>
+        </w:rPr>
+        <w:t>† Corresponding author: Stefano Cacciatore (stefano.cacciatore@icgeb.org).</w:t>
+      </w:r>
+    </w:p>
+    <w:p>
+      <w:pPr>
+        <w:jc w:val="center"/>
+      </w:pPr>
+      <w:r>
+        <w:t>Author emails: moussa.kassim@icgeb.org; dalia.ahmed@icgeb.org; dupe.ojo@icgeb.org; stefano.cacciatore@icgeb.org</w:t>
       </w:r>
     </w:p>
     <w:p>

</xml_diff>

<commit_message>
Finalize patient-level TITAN discovery atlas
</commit_message>
<xml_diff>
--- a/manuscript/manuscript_JTM_patient_level_TITAN.docx
+++ b/manuscript/manuscript_JTM_patient_level_TITAN.docx
@@ -8,7 +8,7 @@
         <w:jc w:val="center"/>
       </w:pPr>
       <w:r>
-        <w:t>A patient-level atlas of molecular and immune predictability from frozen TITAN whole-slide embeddings across 32 cancers</w:t>
+        <w:t>A patient-level TCGA discovery atlas of molecular and immune predictability from pretrained TITAN whole-slide representations across 32 cancers</w:t>
       </w:r>
     </w:p>
     <w:p>
@@ -25,7 +25,7 @@
         <w:rPr>
           <w:vertAlign w:val="superscript"/>
         </w:rPr>
-        <w:t>1,2,*</w:t>
+        <w:t>3,*</w:t>
       </w:r>
       <w:r>
         <w:t xml:space="preserve">, </w:t>
@@ -79,6 +79,21 @@
         <w:rPr>
           <w:b/>
         </w:rPr>
+        <w:t>Ekene Emmanuel Nweke</w:t>
+      </w:r>
+      <w:r>
+        <w:rPr>
+          <w:vertAlign w:val="superscript"/>
+        </w:rPr>
+        <w:t>4</w:t>
+      </w:r>
+      <w:r>
+        <w:t xml:space="preserve">, </w:t>
+      </w:r>
+      <w:r>
+        <w:rPr>
+          <w:b/>
+        </w:rPr>
         <w:t>Stefano Cacciatore</w:t>
       </w:r>
       <w:r>
@@ -122,6 +137,34 @@
       </w:pPr>
       <w:r>
         <w:rPr>
+          <w:b/>
+        </w:rPr>
+        <w:t xml:space="preserve">3 </w:t>
+      </w:r>
+      <w:r>
+        <w:t>Division of Engineering, New York University Abu Dhabi, Abu Dhabi, United Arab Emirates</w:t>
+      </w:r>
+    </w:p>
+    <w:p>
+      <w:pPr>
+        <w:jc w:val="center"/>
+      </w:pPr>
+      <w:r>
+        <w:rPr>
+          <w:b/>
+        </w:rPr>
+        <w:t xml:space="preserve">4 </w:t>
+      </w:r>
+      <w:r>
+        <w:t>Department of Surgery, Faculty of Health Sciences, University of the Witwatersrand, Johannesburg, Gauteng, South Africa</w:t>
+      </w:r>
+    </w:p>
+    <w:p>
+      <w:pPr>
+        <w:jc w:val="center"/>
+      </w:pPr>
+      <w:r>
+        <w:rPr>
           <w:i/>
         </w:rPr>
         <w:t>* These authors contributed equally.</w:t>
@@ -143,7 +186,7 @@
         <w:jc w:val="center"/>
       </w:pPr>
       <w:r>
-        <w:t>Author emails: moussa.kassim@icgeb.org; dalia.ahmed@icgeb.org; dupe.ojo@icgeb.org; stefano.cacciatore@icgeb.org</w:t>
+        <w:t>Author emails: aamilahismail@gmail.com; moussa.kassim@icgeb.org; dalia.ahmed@icgeb.org; dupe.ojo@icgeb.org; stefano.cacciatore@icgeb.org</w:t>
       </w:r>
     </w:p>
     <w:p>
@@ -170,7 +213,7 @@
         <w:t xml:space="preserve">Background. </w:t>
       </w:r>
       <w:r>
-        <w:t>Histology can encode molecular and microenvironmental phenotypes, but conventional convolutional-neural-network workflows require repeated task-specific training. We evaluated whether reusable TITAN whole-slide embeddings enable rapid, cancer-specific screening of individual molecular, genomic-instability and immune endpoints.</w:t>
+        <w:t>Deep-learning studies have shown that haematoxylin-and-eosin images encode mutations, microsatellite instability, transcriptomic programmes and tumour-microenvironment phenotypes. We evaluated which individual molecular, genomic-instability and immune endpoints are predictable within cancer type from reusable TITAN whole-slide representations.</w:t>
       </w:r>
     </w:p>
     <w:p>
@@ -181,7 +224,7 @@
         <w:t xml:space="preserve">Methods. </w:t>
       </w:r>
       <w:r>
-        <w:t>We mean-pooled 11,449 primary diagnostic slide embeddings into 9,404 patient vectors across 32 TCGA cancers; 843 patients contributed multiple slides. We tested 1,614 continuous and 459 binary cancer–endpoint pairs. PLS1 regression was used for continuous targets; binary targets used PLS latent scores with LDA. Patient-level nested 5×5 cross-validation selected 1–10 components. Effect-eligible models underwent up to 99 permutations with Benjamini–Hochberg control within cancer and endpoint family; a global-across-cancers q-value was retained as sensitivity.</w:t>
+        <w:t>We mean-pooled 11,449 primary diagnostic slide embeddings into 9,404 patient vectors across 32 TCGA cancers; 843 patients contributed multiple slides. We tested 1,614 continuous and 459 binary cancer–endpoint pairs. PLS1 regression was used for continuous targets; binary targets used PLS latent scores with LDA. Patient-level nested 5×5 cross-validation selected 1–10 components. Effect-eligible models underwent a 999-permutation refinement with conservative sequential stopping, Benjamini–Hochberg control within cancer and endpoint family, and a stricter across-cancer family correction.</w:t>
       </w:r>
     </w:p>
     <w:p>
@@ -192,7 +235,7 @@
         <w:t xml:space="preserve">Results. </w:t>
       </w:r>
       <w:r>
-        <w:t>Across all families, 152 continuous and 73 binary pairs met Tier A/B criteria. Leading continuous results included TGCT–TGF-beta Response (0.644); THYM–Th17 Cells (0.624); THCA–Lymphocyte Infiltration Signature Score (0.580); TGCT–Macrophage Regulation (0.556). Leading binary results included THYM–GTF2I [mutation] (0.876); READ–APC [mutation] (0.860); READ–TP53 [mutation] (0.847); LGG–TP53 [mutation] (0.830). Site-grouped and first-slide sensitivity quantified centre and slide-selection dependence.</w:t>
+        <w:t>Within-cancer screening identified 219 continuous and 104 binary higher- or moderate-effect candidates. Highlighted repeated-CV results included BRCA–Wound Healing (Q² -0.169, 95% bootstrap interval -0.196–-0.148; RMSE 0.174, Spearman -0.002) and LGG–TP53 (sensitivity 0.839, specificity 0.885, balanced accuracy 0.862, 95% bootstrap interval 0.833–0.888; AUROC 0.908). Under the multiplicity sensitivity, 219 continuous and 39 cancer–mutation pairs passed the stricter across-cancer correction; its attainable q-values in large families were limited by the 0.001 empirical-p resolution. Repeated nested validation, site-grouped folds and first-slide sensitivity quantified uncertainty, centre dependence and slide-aggregation dependence.</w:t>
       </w:r>
     </w:p>
     <w:p>
@@ -203,7 +246,18 @@
         <w:t xml:space="preserve">Conclusions. </w:t>
       </w:r>
       <w:r>
-        <w:t>Frozen TITAN features provide a fast hypothesis-generation layer for selected cancer-specific immune and molecular phenotypes, but predictability is heterogeneous and does not replace molecular assays. The internally validated models and negative results require independent external validation before clinical interpretation.</w:t>
+        <w:t>Pretrained TITAN representations support a cancer-specific TCGA discovery atlas spanning immune and molecular phenotypes. The models are internally validated research candidates, do not replace molecular assays, and require independent external validation before clinical interpretation.</w:t>
+      </w:r>
+    </w:p>
+    <w:p>
+      <w:r>
+        <w:rPr>
+          <w:b/>
+        </w:rPr>
+        <w:t xml:space="preserve">Trial registration. </w:t>
+      </w:r>
+      <w:r>
+        <w:t>Not applicable.</w:t>
       </w:r>
     </w:p>
     <w:p>
@@ -221,17 +275,17 @@
     </w:p>
     <w:p>
       <w:r>
-        <w:t>Routine haematoxylin-and-eosin sections reflect phenotypic consequences of tumour genotype and the immune microenvironment. Coudray and colleagues trained an Inception-v3 convolutional neural network (CNN) to predict six recurrently mutated genes in lung adenocarcinoma, and subsequent pan-cancer studies expanded image-derived inference to mutations, molecular biomarkers and expression programmes [1–5]. These studies established biological plausibility, but their tile extraction, annotation and target-specific optimization make exhaustive updating expensive.</w:t>
+        <w:t>Routine haematoxylin-and-eosin sections reflect phenotypic consequences of tumour genotype and the immune microenvironment. Coudray and colleagues established mutation prediction from lung histology [1]. Subsequent work predicted microsatellite instability, including externally validated colorectal models [2,3]; extended mutation and multi-omic screening across TCGA cancers [4,5,8,11,13]; inferred RNA expression [6,12]; identified tissue-source-site bias [7]; detected gene fusions [9,10]; estimated homologous-recombination deficiency [14]; and characterised tumour-microenvironment phenotypes [15]. Collectively, these studies establish biological plausibility while also showing that performance depends on endpoint, disease, cohort and validation design.</w:t>
       </w:r>
     </w:p>
     <w:p>
       <w:r>
-        <w:t>TITAN is a multimodal whole-slide foundation model pretrained on 335,645 slides using visual self-supervision and vision–language alignment [6]. Its frozen 768-dimensional slide representation can be reused without back-propagation through millions of tiles. PLS is computationally light and well suited to correlated, high-dimensional predictors [7,8]. The advantage tested here is therefore speed and reuse after TITAN extraction—not an assumption that PLS is intrinsically more accurate than a task-optimized CNN.</w:t>
+        <w:t>TITAN is a multimodal whole-slide foundation model pretrained on 335,645 slides with visual self-supervision and vision–language alignment [16]. The published Mass-340K pretraining corpus explicitly excluded TCGA and PANDA; TCGA was instead used for downstream evaluation of the pretrained model. The present work therefore has no reported TCGA pretraining overlap, but it is a secondary analysis of a cohort previously used to benchmark TITAN and is not independent external validation. We use its fixed 768-dimensional slide representation with PLS, a latent-variable method suited to correlated high-dimensional predictors [17,18]. The scientific question is endpoint discovery, not a comparison of PLS against alternative machine-learning algorithms.</w:t>
       </w:r>
     </w:p>
     <w:p>
       <w:r>
-        <w:t>A second practical advantage is model portability. A fitted PLS or PLS–LDA predictor can be distributed as a compact set of preprocessing parameters, latent-variable weights, regression coefficients and LDA parameters. Prediction therefore does not require release of the patient-level training embeddings or outcomes. This differs from reference-set methods such as k-nearest neighbours, which require access to stored training examples at inference [19]. Model sharing remains subject to upstream licences, governance and external validation.</w:t>
+        <w:t>A practical feature of the fitted analysis is model portability. A PLS or PLS–LDA predictor can be distributed as preprocessing parameters, latent-variable weights, regression coefficients and LDA parameters. Prediction therefore does not require release of the patient-level training embeddings or outcomes. This supports external research testing while minimising distribution of patient-level data, but does not itself establish privacy, licensing compatibility or transportability.</w:t>
       </w:r>
     </w:p>
     <w:p>
@@ -257,12 +311,22 @@
     </w:p>
     <w:p>
       <w:r>
-        <w:t>The published TITAN TCGA table contained 11,449 eligible primary-tumour diagnostic slides (TCGA sample type 01 and –DX filename) from 9,404 participants. The 843 participants with multiple eligible slides contributed one patient vector obtained by feature-wise arithmetic mean before outcomes were joined. Patient—not slide—was the independent cross-validation unit. The slide-report file was used only to audit identifiers, cancer provenance and resection site; no report text entered a model. Nine participants without a resolvable cancer label did not enter cancer-specific modelling. All molecular sources were independently restricted to TCGA sample type 01 before patient aggregation.</w:t>
+        <w:t>The published TITAN TCGA table contained 11,449 eligible primary-tumour diagnostic slides (TCGA sample type 01 and –DX filename) from 9,404 participants. The 843 participants with multiple eligible slides contributed one patient vector obtained by feature-wise arithmetic mean before outcomes were joined. Patient—not slide—was the independent cross-validation unit. TITAN's TCGA-Slide-Reports.csv matched 10,106 selected slides exactly by filename; 1,343 slides lacked an exact report row. Report metadata were used only to audit identifiers, project/cancer provenance and resection-site annotations, and no report text entered a model. The two-character tissue-source-site code used for grouped validation was derived directly from the TCGA participant barcode. 9 participants without a resolvable cancer label did not enter cancer-specific modelling. No participant had eligible slides from more than one primary sample barcode.</w:t>
       </w:r>
     </w:p>
     <w:p>
       <w:r>
         <w:t>All models were stratified by cancer type. No model learned pan-cancer differences, and no patient could occur in more than one validation fold. The intended use was discovery-stage prioritisation rather than diagnosis, treatment selection or replacement of molecular testing.</w:t>
+      </w:r>
+    </w:p>
+    <w:p>
+      <w:r>
+        <w:t>All available eligible TCGA participants were used; no formal power calculation was performed. Minimum outcome-specific denominators were prespecified to support nested folds. Treatments were not modelled because the endpoints were contemporaneous molecular or immune measurements rather than prognosis or treatment response. Available demographic fields, subgroup sizes and endpoint-specific missingness did not provide a basis for representative subgroup performance or fairness evaluation; this is considered a limitation rather than evidence of equivalent performance across groups.</w:t>
+      </w:r>
+    </w:p>
+    <w:p>
+      <w:r>
+        <w:t>Reporting was audited against TRIPOD+AI [28]. Participant characteristics were linked from the TCGA Clinical Data Resource [29] and summarized overall and by cancer. These descriptive fields were not supplied to prediction models, and no subgroup performance comparison was prespecified.</w:t>
       </w:r>
     </w:p>
     <w:p>
@@ -272,7 +336,7 @@
       <w:r>
         <w:drawing>
           <wp:inline xmlns:a="http://schemas.openxmlformats.org/drawingml/2006/main" xmlns:pic="http://schemas.openxmlformats.org/drawingml/2006/picture">
-            <wp:extent cx="5806440" cy="3024188"/>
+            <wp:extent cx="5806440" cy="3096768"/>
             <wp:docPr id="1" name="Picture 1"/>
             <wp:cNvGraphicFramePr>
               <a:graphicFrameLocks noChangeAspect="1"/>
@@ -293,7 +357,7 @@
                   <pic:spPr>
                     <a:xfrm>
                       <a:off x="0" y="0"/>
-                      <a:ext cx="5806440" cy="3024188"/>
+                      <a:ext cx="5806440" cy="3096768"/>
                     </a:xfrm>
                     <a:prstGeom prst="rect"/>
                   </pic:spPr>
@@ -323,7 +387,17 @@
     </w:p>
     <w:p>
       <w:r>
-        <w:t>Predictors were the 768 frozen TITAN dimensions [6]. Continuous outcomes comprised 39 immune/inflammatory measures and 11 genomic-context scores from Thorsson et al. [9], three aneuploidy burdens from Taylor et al. [10], log-transformed fusion burden from Gao et al. [11], and MANTIS/MSIsensor scores from Bonneville et al. and the cBioPortal TCGA PanCancer Atlas files [12,13]. Binary outcomes comprised qualifying protein-altering PASS mutations in tissue-specific consensus cancer genes from MC3 and Bailey et al. [14,15], ten oncogenic-pathway alteration indicators [16], genome doubling [10], any called fusion and eligible recurrent fusion pairs [11], and MSI-H definitions at MANTIS &gt;0.4 and a strict &gt;0.6 sensitivity threshold [12]. A mutation target denotes a qualifying alteration in a cancer gene; it does not assert that every allele is a functionally validated driver.</w:t>
+        <w:t>Predictors were the 768 fixed pretrained TITAN dimensions released for the TCGA slides [16]; no slide pixels were reprocessed and TITAN weights were not fine-tuned in this study. Continuous outcomes comprised 39 immune/inflammatory measures and 11 genomic-context scores from Thorsson et al. [19], three aneuploidy burdens from Taylor et al. [20], log-transformed fusion burden from Gao et al. [21], and MANTIS/MSIsensor scores from Bonneville et al. and the cBioPortal TCGA PanCancer Atlas files [22,23]. Binary outcomes comprised qualifying protein-altering PASS mutations in tissue-specific consensus cancer genes from MC3 and Bailey et al. [24,25], ten oncogenic-pathway alteration indicators [26], genome doubling [20], any called fusion and eligible recurrent fusion pairs [21], and MSI-H definitions at MANTIS &gt;0.4 and a strict &gt;0.6 sensitivity threshold [22]. Protein-altering classes were missense, nonsense, nonstop, splice-site and translation-start mutations plus frameshift and in-frame insertions or deletions; their inclusion is recorded in a cancer-level variant-class audit. A mutation target denotes a qualifying alteration in a cancer gene; it does not assert that every allele is a functionally validated driver.</w:t>
+      </w:r>
+    </w:p>
+    <w:p>
+      <w:r>
+        <w:t>The Thorsson Nonsilent Mutation Rate, Silent Mutation Rate, SNV Neoantigens, Indel Neoantigens and Number of Segments variables, and the Gao fusion burden, were analysed as log(1+x); all other continuous endpoints retained their source scale. Reported RMSE values therefore use these analysed units.</w:t>
+      </w:r>
+    </w:p>
+    <w:p>
+      <w:r>
+        <w:t>Molecular missingness was retained rather than converted to a negative label, and no outcome imputation was performed. Mutation status was defined only among 8,476 embedding patients matched to an MC3 primary-tumour profile; 919 embedding patients without such a profile were excluded from mutation denominators. Within this profiled set, wild type meant no qualifying PASS protein-altering variant in the specified gene. Fusion-negative status was assigned only within the Gao study sample list. Multiple primary aliquots, if present, were collapsed at patient level by any alteration for binary mutation/pathway/fusion endpoints and by the prespecified mean or any-positive rule for continuous or binary instability endpoints. The source-level coverage table records covered patients, missing patients, aliquot multiplicity and aggregation for every cancer and source; no source contained multiple primary aliquots among matched embedding patients in this release.</w:t>
       </w:r>
     </w:p>
     <w:p>
@@ -341,12 +415,22 @@
     </w:p>
     <w:p>
       <w:r>
-        <w:t>For each cancer–endpoint pair, five outer folds estimated performance and five inner folds selected 1–10 PLS components. Scaling and component selection were learned from training patients only. Continuous performance was out-of-fold Q², with RMSE and Spearman correlation secondary. Binary models supplied PLS latent scores to ridge-stabilised LDA; balanced accuracy was primary and AUROC from continuous LDA scores was secondary in repeated validation.</w:t>
+        <w:t>For each cancer–endpoint pair, five outer folds estimated performance and five inner folds selected 1–10 PLS components. Scaling and component selection were learned from training patients only. All primary, permutation, repeated, sensitivity, PLS1–PLS2 and final-model fits used CPU rSVD exclusively, with 10 oversampling vectors, two power iterations and explicit seeds; IRLBA was not used. Continuous performance was out-of-fold Q², with RMSE and Spearman correlation secondary. Binary models supplied PLS latent scores to ridge-stabilised LDA; balanced accuracy was primary and AUROC from continuous LDA scores was secondary in repeated validation.</w:t>
       </w:r>
     </w:p>
     <w:p>
       <w:r>
-        <w:t>Nested performance was first checkpointed for the complete atlas. Only models capable of Tier B (Q²≥0.20 or chance-corrected balanced accuracy≥0.20) received up to 99 patient-label permutations. Evaluation stopped conservatively after five exceedances because raw p&lt;0.05 was then impossible even if every remaining null statistic were less extreme; stopped endpoints were assigned p=1. Regression extremeness used lower RMSD, whereas classification used higher balanced accuracy. Completed finite p values were (b+1)/(B+1). Because each disease defines a separate prediction and intended-use population, Benjamini–Hochberg FDR was controlled within cancer and prespecified endpoint family; an across-cancer family q-value was retained as a stricter sensitivity. Tier A required primary q&lt;0.05 and effect≥0.40; Tier B required primary q&lt;0.05 and effect 0.20–0.39. An optional 999-permutation extension is implemented in the public code but was not required for primary tiering.</w:t>
+        <w:t>Q² was 1−Σ(y−ŷ)²/Σ(y−ȳ)² over outer-fold predictions, and RMSE was the square root of the mean squared prediction error. For binary outcomes, class 1 denoted altered or positive and class 0 denoted wild type or negative within the outcome-specific covered denominator. Sensitivity was the class-1 true-positive rate, specificity the class-0 true-negative rate, and balanced accuracy their arithmetic mean. AUROC used the continuous class-1-minus-class-0 LDA discriminant score; Spearman correlation used observed and held-out continuous predictions.</w:t>
+      </w:r>
+    </w:p>
+    <w:p>
+      <w:r>
+        <w:t>No class under-sampling, over-sampling or synthetic augmentation was used. LDA used the observed training-fold class priors and returned a class plus an uncalibrated discriminant score, not a probability or clinical-risk threshold. Outcome tables were constructed independently of TITAN feature processing and joined only after patient-level aggregation.</w:t>
+      </w:r>
+    </w:p>
+    <w:p>
+      <w:r>
+        <w:t>Nested performance was first checkpointed for the complete atlas. Only models with Q²≥0.20 or chance-corrected balanced accuracy≥0.20 entered permutation testing. A 99-permutation checkpoint was followed by refinement toward 999 patient-label permutations. During final refinement, evaluation stopped conservatively after 49 exceedances because raw p&lt;0.05 was then impossible even if every remaining null statistic were less extreme; stopped endpoints were assigned p=1. Early-stopped checkpoint jobs resumed from the exact number attempted, so no permutation indices were skipped. Regression extremeness used lower RMSE, whereas classification used higher balanced accuracy. Completed finite p values were (b+1)/(B+1), giving minimum resolution 0.001. Because each disease defines a separate prediction and intended-use population, Benjamini–Hochberg FDR was controlled separately for continuous and binary screens within cancer and prespecified endpoint family [27]; a q-value across cancers within the same outcome type and family was retained as a stricter multiplicity sensitivity. Effect denotes Q² for continuous outcomes and 2×balanced accuracy−1 for binary outcomes. Screen-positive candidates were described as higher effect (primary q&lt;0.05 and effect≥0.40) or moderate effect (primary q&lt;0.05 and effect 0.20–0.39). Screen-negative tested pairs and pairs ineligible by sample-size rules were reported separately. These categories prioritise discovery candidates and are not clinical grades.</w:t>
       </w:r>
     </w:p>
     <w:p>
@@ -359,7 +443,7 @@
     </w:p>
     <w:p>
       <w:r>
-        <w:t>Supported models were repeated under five independently seeded nested-CV partitions. Site-grouped folds kept two-character TCGA tissue-source-site codes out of both training and test partitions. A first-slide sensitivity replaced the primary mean-pooled vector while preserving patients and seeds. Full-data research models were tuned by ten-fold CV, saved with feature order, aggregation rule, class counts, software version and intended-use metadata, and tested through a public inference example that mean-pools user slides.</w:t>
+        <w:t>Screen-positive models were repeated under five independently seeded nested-CV partitions; each repeat seed governed both fold construction and rSVD. Sensitivity, specificity, balanced accuracy and AUROC were calculated within each repeat for binary endpoints; Q², RMSE and Spearman correlation were calculated within each repeat for continuous endpoints. Reported repeated-CV point estimates were the arithmetic mean of the five repeat-specific metrics, so LDA scores from independently fitted repeats were never pooled onto an assumed common scale. For highlighted models, 1,000 patient-cluster bootstrap resamples retained all five held-out predictions for each sampled patient, recalculated metrics within repeat and then averaged them; percentile 2.5th and 97.5th quantiles formed the 95% intervals. Site-grouped validation assigned all patients sharing a two-character TCGA tissue-source-site code to the same outer fold, preventing a site from appearing in both training and test partitions for that fold. A sensitivity analysis replaced each mean-pooled vector with the lexicographically first eligible diagnostic slide while preserving patients and seeds. Full-data research models were tuned by ten-fold CV and saved with feature order and checksum, training ranges, aggregation rule, endpoint transformation and output units, class coding and priors, decision rule, calibration status, class counts, exact software version and commit, computation backend, rSVD controls, external-validation status and intended-use metadata.</w:t>
       </w:r>
     </w:p>
     <w:p>
@@ -377,12 +461,17 @@
     </w:p>
     <w:p>
       <w:r>
-        <w:t>Analyses used R 4.6 and fastPLS 0.99.20 (Git commit dcf45cc). Complete code, source manifests, target catalogues, checkpoints, out-of-fold predictions, figures, model registry and inference example are organized at https://github.com/tkcaccia/titan-prediction. Fitted TITAN-derived model objects are generated locally; their public redistribution remains subject to TITAN's upstream terms. No external cohort with compatible precomputed TITAN features and the required multi-omic labels was identified, so all performance estimates remain internal to TCGA.</w:t>
+        <w:t>Analyses used R 4.6.0 and fastPLS 0.99.20 (Git commit dcf45cc). MC3 objects were loaded with TCGAmutations 0.4.0 from the GitHub source pinned in the software manifest. Version-controlled code, source manifests, released target catalogues, out-of-fold prediction summaries, figures, model registry and inference example are organized in the companion repository [30]. Local checkpoint and fitted-model objects are generated by the scripts but are not claimed as publicly redistributed because TITAN-derived artifacts remain subject to upstream terms. No independent cohort with compatible TITAN features and the required labels was included; all performance estimates remain internal to TCGA.</w:t>
       </w:r>
     </w:p>
     <w:p>
       <w:r>
         <w:t>OpenAI Codex was used for analysis-code refactoring, document generation and language editing. All statistical choices, source-data mappings, numerical outputs and manuscript interpretations were reviewed by the human authors, who retain responsibility for the work.</w:t>
+      </w:r>
+    </w:p>
+    <w:p>
+      <w:r>
+        <w:t>Supplementary methods, Tables S1–S12, Figures S1–S2 and the machine-readable-file inventory are provided in Additional file 1.</w:t>
       </w:r>
     </w:p>
     <w:p>
@@ -403,7 +492,12 @@
     </w:p>
     <w:p>
       <w:r>
-        <w:t>The embedding cohort contained 9,404 patients represented by 11,449 slides; 843 patients (9.0%) had more than one eligible diagnostic slide. Cancer labels were available for 9,395 patients across 32 cancers. The atlas evaluated 1,614 continuous and 459 binary cancer–endpoint pairs (Table 1).</w:t>
+        <w:t>The embedding cohort contained 9,404 patients represented by 11,449 slides; 843 patients (9.0%) had more than one eligible diagnostic slide. The maximum was 30 slides for one patient, and no patient contributed slides from multiple primary sample barcodes. Exact slide-report coverage was 10,106/11,449 (88.3%). Cancer labels were available for 9,395 patients across 32 cancers. The atlas evaluated 1,614 continuous and 459 binary cancer–endpoint pairs (Table 1). Of 537 prespecified cancer–gene mutation pairs with a profiled denominator, 238 met the 20-positive/20-negative rule and 299 were reported as ineligible rather than tested-negative. Molecular coverage varied by source and cancer; missing cases were excluded outcome by outcome.</w:t>
+      </w:r>
+    </w:p>
+    <w:p>
+      <w:r>
+        <w:t>The TCGA Clinical Data Resource [29] matched 9,385/9,404 participants. Age was available for 9,338 participants (median 60.0 years, IQR 50.0–70.0); 4,780/9,385 with recorded gender were female. Race was recorded for 8,262 and broad stage I–IV for 7,505. These fields describe cohort composition only; subgroup predictive performance was not evaluated.</w:t>
       </w:r>
     </w:p>
     <w:p>
@@ -411,7 +505,7 @@
         <w:pStyle w:val="Caption"/>
       </w:pPr>
       <w:r>
-        <w:t>Table 1. Eligible cancer–endpoint models and evidence tiers.</w:t>
+        <w:t>Table 1. Eligible cancer–endpoint models and within-cancer screening categories.</w:t>
       </w:r>
     </w:p>
     <w:tbl>
@@ -501,7 +595,7 @@
                 <w:b/>
                 <w:sz w:val="17"/>
               </w:rPr>
-              <w:t>Tier A</w:t>
+              <w:t>Higher effect</w:t>
             </w:r>
           </w:p>
         </w:tc>
@@ -515,7 +609,7 @@
                 <w:b/>
                 <w:sz w:val="17"/>
               </w:rPr>
-              <w:t>Tier B</w:t>
+              <w:t>Moderate effect</w:t>
             </w:r>
           </w:p>
         </w:tc>
@@ -529,7 +623,7 @@
                 <w:b/>
                 <w:sz w:val="17"/>
               </w:rPr>
-              <w:t>Tier C</w:t>
+              <w:t>Screen-negative</w:t>
             </w:r>
           </w:p>
         </w:tc>
@@ -618,7 +712,7 @@
               <w:rPr>
                 <w:sz w:val="16"/>
               </w:rPr>
-              <w:t>8</w:t>
+              <w:t>9</w:t>
             </w:r>
           </w:p>
         </w:tc>
@@ -632,7 +726,7 @@
               <w:rPr>
                 <w:sz w:val="16"/>
               </w:rPr>
-              <w:t>82</w:t>
+              <w:t>81</w:t>
             </w:r>
           </w:p>
         </w:tc>
@@ -810,7 +904,7 @@
               <w:rPr>
                 <w:sz w:val="16"/>
               </w:rPr>
-              <w:t>12</w:t>
+              <w:t>16</w:t>
             </w:r>
           </w:p>
         </w:tc>
@@ -824,7 +918,7 @@
               <w:rPr>
                 <w:sz w:val="16"/>
               </w:rPr>
-              <w:t>4</w:t>
+              <w:t>25</w:t>
             </w:r>
           </w:p>
         </w:tc>
@@ -838,7 +932,7 @@
               <w:rPr>
                 <w:sz w:val="16"/>
               </w:rPr>
-              <w:t>222</w:t>
+              <w:t>197</w:t>
             </w:r>
           </w:p>
         </w:tc>
@@ -1428,7 +1522,7 @@
               <w:rPr>
                 <w:sz w:val="16"/>
               </w:rPr>
-              <w:t>6</w:t>
+              <w:t>7</w:t>
             </w:r>
           </w:p>
         </w:tc>
@@ -1442,7 +1536,7 @@
               <w:rPr>
                 <w:sz w:val="16"/>
               </w:rPr>
-              <w:t>24</w:t>
+              <w:t>29</w:t>
             </w:r>
           </w:p>
         </w:tc>
@@ -1456,7 +1550,7 @@
               <w:rPr>
                 <w:sz w:val="16"/>
               </w:rPr>
-              <w:t>136</w:t>
+              <w:t>130</w:t>
             </w:r>
           </w:p>
         </w:tc>
@@ -1531,7 +1625,7 @@
               <w:rPr>
                 <w:sz w:val="16"/>
               </w:rPr>
-              <w:t>36</w:t>
+              <w:t>37</w:t>
             </w:r>
           </w:p>
         </w:tc>
@@ -1545,7 +1639,7 @@
               <w:rPr>
                 <w:sz w:val="16"/>
               </w:rPr>
-              <w:t>103</w:t>
+              <w:t>168</w:t>
             </w:r>
           </w:p>
         </w:tc>
@@ -1559,7 +1653,7 @@
               <w:rPr>
                 <w:sz w:val="16"/>
               </w:rPr>
-              <w:t>1295</w:t>
+              <w:t>1229</w:t>
             </w:r>
           </w:p>
         </w:tc>
@@ -1576,12 +1670,12 @@
     </w:p>
     <w:p>
       <w:r>
-        <w:t>Among continuous targets, 36 were Tier A and 116 Tier B. The strongest effects were TGCT–TGF-beta Response (0.644); THYM–Th17 Cells (0.624); THCA–Lymphocyte Infiltration Signature Score (0.580); TGCT–Macrophage Regulation (0.556); BRCA–Wound Healing (0.528); SARC–Leukocyte Fraction (0.524); THCA–TGF-beta Response (0.524); TGCT–Macrophages M2 (0.517); LUAD–Proliferation (0.513); SARC–Macrophage Regulation (0.509). These results were cancer specific: the same endpoint could be strongly predictable in one tumour type and unsupported in another.</w:t>
+        <w:t>Among continuous targets, 37 were within-cancer screen-positive with higher effects and 182 with moderate effects. The strongest effects were TGCT–TGF-beta Response (0.670); THYM–Th17 Cells (0.638); THCA–Lymphocyte Infiltration Signature Score (0.580); BRCA–Wound Healing (0.527); THCA–TGF-beta Response (0.522); SARC–Macrophage Regulation (0.520); KIRP–Proliferation (0.515); LUAD–Proliferation (0.512); BRCA–Proliferation (0.510); THCA–Th1 Cells (0.503). These results were cancer specific: the same endpoint could be strongly predictable in one tumour type and screen-negative in another.</w:t>
       </w:r>
     </w:p>
     <w:p>
       <w:r>
-        <w:t>None of the 152 primary continuous Tier-A/B pairs met q&lt;0.05 under the stricter across-cancer family sensitivity at the 99-permutation resolution. Continuous findings should therefore be interpreted as disease-specific screens rather than globally FDR-supported pan-cancer discoveries.</w:t>
+        <w:t>Of 219 within-cancer screen-positive continuous pairs, 219 met q&lt;0.05 under the stricter across-cancer family sensitivity after the 999-permutation refinement. Pairs passing this sensitivity are identified explicitly in the figure and machine-readable table; the remainder are cancer-specific candidates. The 0.001 minimum completed-test p-value should be considered when interpreting large global families.</w:t>
       </w:r>
     </w:p>
     <w:p>
@@ -1591,7 +1685,7 @@
       <w:r>
         <w:drawing>
           <wp:inline xmlns:a="http://schemas.openxmlformats.org/drawingml/2006/main" xmlns:pic="http://schemas.openxmlformats.org/drawingml/2006/picture">
-            <wp:extent cx="5806440" cy="5364646"/>
+            <wp:extent cx="5806440" cy="4952551"/>
             <wp:docPr id="2" name="Picture 2"/>
             <wp:cNvGraphicFramePr>
               <a:graphicFrameLocks noChangeAspect="1"/>
@@ -1612,7 +1706,7 @@
                   <pic:spPr>
                     <a:xfrm>
                       <a:off x="0" y="0"/>
-                      <a:ext cx="5806440" cy="5364646"/>
+                      <a:ext cx="5806440" cy="4952551"/>
                     </a:xfrm>
                     <a:prstGeom prst="rect"/>
                   </pic:spPr>
@@ -1629,7 +1723,7 @@
         <w:jc w:val="center"/>
       </w:pPr>
       <w:r>
-        <w:t>Figure 2. Strongest supported continuous cancer–endpoint results. Q² is calculated from genuine patient-level outer-fold predictions; all tests remain available in the machine-readable atlas.</w:t>
+        <w:t>Figure 2. Strongest within-cancer screen-positive continuous cancer–endpoint results. Q² is calculated from genuine patient-level outer-fold predictions; all tests remain available in the machine-readable atlas.</w:t>
       </w:r>
     </w:p>
     <w:p>
@@ -1642,12 +1736,12 @@
     </w:p>
     <w:p>
       <w:r>
-        <w:t>The binary atlas yielded 24 Tier-A and 49 Tier-B pairs. Leading results were THYM–GTF2I [mutation] (0.876); READ–APC [mutation] (0.860); READ–TP53 [mutation] (0.847); LGG–TP53 [mutation] (0.830); THCA–BRAF [mutation] (0.828); LGG–TP53 [pathway] (0.822); LGG–HIPPO [pathway] (0.811); COAD–APC [mutation] (0.792); UCEC–Any called fusion [fusion] (0.792); COAD–MSI-H strict (MANTIS &gt;0.6) [strict MSI] (0.784); LGG–ATRX [mutation] (0.784); COAD–TP53 [mutation] (0.777). The complete table includes tested-negative and ineligible distinctions for mutations, pathways, genome doubling, MSI and fusions.</w:t>
+        <w:t>The binary atlas yielded 29 within-cancer higher-effect and 75 moderate-effect candidates. Leading results were THYM–GTF2I [mutation] (0.883); READ–APC [mutation] (0.862); READ–TP53 [mutation] (0.861); LGG–TP53 [mutation] (0.846); THCA–BRAF [mutation] (0.830); LGG–TP53 [pathway] (0.822); LGG–HIPPO [pathway] (0.811); COAD–APC [mutation] (0.793); UCEC–Any called fusion [fusion] (0.792); LGG–IDH1 [mutation] (0.786); COAD–MSI-H strict (MANTIS &gt;0.6) [strict MSI] (0.784); COAD–TP53 [mutation] (0.779). The complete table distinguishes tested-negative pairs from outcomes that failed prevalence or sample-size eligibility.</w:t>
       </w:r>
     </w:p>
     <w:p>
       <w:r>
-        <w:t>Of 73 primary binary Tier-A/B pairs, 56 also met the stricter across-cancer family q&lt;0.05. No cancer–gene mutation pair passed that global sensitivity, whereas supported pathway, MSI and fusion signals generally did; mutation results are consequently described as cancer-screen-specific findings.</w:t>
+        <w:t>Of 104 within-cancer screen-positive binary pairs, 102 also met the stricter across-cancer family q&lt;0.05, including 39 cancer–gene mutation pairs. Mutation pairs passing this stricter sensitivity are distinguished from those supported only within cancer; the 0.001 permutation resolution remains relevant for the full mutation family.</w:t>
       </w:r>
     </w:p>
     <w:p>
@@ -1657,7 +1751,7 @@
       <w:r>
         <w:drawing>
           <wp:inline xmlns:a="http://schemas.openxmlformats.org/drawingml/2006/main" xmlns:pic="http://schemas.openxmlformats.org/drawingml/2006/picture">
-            <wp:extent cx="5806440" cy="6082937"/>
+            <wp:extent cx="5806440" cy="4873262"/>
             <wp:docPr id="3" name="Picture 3"/>
             <wp:cNvGraphicFramePr>
               <a:graphicFrameLocks noChangeAspect="1"/>
@@ -1678,7 +1772,7 @@
                   <pic:spPr>
                     <a:xfrm>
                       <a:off x="0" y="0"/>
-                      <a:ext cx="5806440" cy="6082937"/>
+                      <a:ext cx="5806440" cy="4873262"/>
                     </a:xfrm>
                     <a:prstGeom prst="rect"/>
                   </pic:spPr>
@@ -1695,7 +1789,7 @@
         <w:jc w:val="center"/>
       </w:pPr>
       <w:r>
-        <w:t>Figure 3. Strongest supported binary molecular predictions using PLS latent scores and LDA. Point size represents the number of positive patients.</w:t>
+        <w:t>Figure 3. Strongest within-cancer screen-positive binary molecular predictions using PLS latent scores and LDA. Point size represents the number of positive patients; colour indicates endpoint family and symbols report across-cancer correction status.</w:t>
       </w:r>
     </w:p>
     <w:p>
@@ -1705,7 +1799,7 @@
       <w:r>
         <w:drawing>
           <wp:inline xmlns:a="http://schemas.openxmlformats.org/drawingml/2006/main" xmlns:pic="http://schemas.openxmlformats.org/drawingml/2006/picture">
-            <wp:extent cx="5806440" cy="4589853"/>
+            <wp:extent cx="5806440" cy="2806446"/>
             <wp:docPr id="4" name="Picture 4"/>
             <wp:cNvGraphicFramePr>
               <a:graphicFrameLocks noChangeAspect="1"/>
@@ -1714,7 +1808,7 @@
               <a:graphicData uri="http://schemas.openxmlformats.org/drawingml/2006/picture">
                 <pic:pic>
                   <pic:nvPicPr>
-                    <pic:cNvPr id="0" name="Figure4_supported_counts.png"/>
+                    <pic:cNvPr id="0" name="Figure4_prediction_examples.png"/>
                     <pic:cNvPicPr/>
                   </pic:nvPicPr>
                   <pic:blipFill>
@@ -1726,7 +1820,7 @@
                   <pic:spPr>
                     <a:xfrm>
                       <a:off x="0" y="0"/>
-                      <a:ext cx="5806440" cy="4589853"/>
+                      <a:ext cx="5806440" cy="2806446"/>
                     </a:xfrm>
                     <a:prstGeom prst="rect"/>
                   </pic:spPr>
@@ -1743,22 +1837,709 @@
         <w:jc w:val="center"/>
       </w:pPr>
       <w:r>
-        <w:t>Figure 4. Number and family of Tier-A/B prediction targets within each cancer. Absence of an eligible target is distinct from a tested negative result.</w:t>
+        <w:t>Figure 4. Examples comparing observed outcomes with repeated nested-cross-validation predictions. Panels show the screen-positive continuous and binary models with the largest corresponding mean repeated-CV performance and are illustrative rather than confirmatory. The continuous panel plots each patient's observed value against the mean of five held-out predictions. Because independently fitted LDA scores need not share a raw scale, the binary panel standardizes held-out scores within each repeat before averaging them by patient and displaying them by observed class; repeat-specific AUROCs use untransformed scores. Lines and summaries describe internal TCGA validation, not external calibration.</w:t>
       </w:r>
     </w:p>
     <w:p>
       <w:pPr>
-        <w:pStyle w:val="Heading2"/>
+        <w:pStyle w:val="Caption"/>
       </w:pPr>
       <w:r>
-        <w:t>Site and multiple-slide sensitivity</w:t>
+        <w:t>Table 2. Highlighted repeated nested-cross-validation performance with 95% patient-cluster bootstrap intervals.</w:t>
       </w:r>
     </w:p>
-    <w:p>
-      <w:r>
-        <w:t>Site-grouped validation was feasible for 225 supported models. The median grouped-minus-random performance change was -0.026. The first-slide-minus-mean-pool median change across supported models was -0.002. Individual attenuations are reported because centre robustness and slide aggregation are target specific.</w:t>
-      </w:r>
-    </w:p>
+    <w:tbl>
+      <w:tblPr>
+        <w:tblStyle w:val="TableGrid"/>
+        <w:tblW w:type="auto" w:w="0"/>
+        <w:jc w:val="center"/>
+        <w:tblLook w:firstColumn="1" w:firstRow="1" w:lastColumn="0" w:lastRow="0" w:noHBand="0" w:noVBand="1" w:val="04A0"/>
+      </w:tblPr>
+      <w:tblGrid>
+        <w:gridCol w:w="1949"/>
+        <w:gridCol w:w="1949"/>
+        <w:gridCol w:w="1949"/>
+        <w:gridCol w:w="1949"/>
+        <w:gridCol w:w="1949"/>
+      </w:tblGrid>
+      <w:tr>
+        <w:trPr>
+          <w:tblHeader w:val="true"/>
+          <w:cantSplit/>
+        </w:trPr>
+        <w:tc>
+          <w:tcPr>
+            <w:tcW w:type="dxa" w:w="1949"/>
+          </w:tcPr>
+          <w:p>
+            <w:r>
+              <w:rPr>
+                <w:b/>
+                <w:sz w:val="17"/>
+              </w:rPr>
+              <w:t>Cancer–endpoint</w:t>
+            </w:r>
+          </w:p>
+        </w:tc>
+        <w:tc>
+          <w:tcPr>
+            <w:tcW w:type="dxa" w:w="1949"/>
+          </w:tcPr>
+          <w:p>
+            <w:r>
+              <w:rPr>
+                <w:b/>
+                <w:sz w:val="17"/>
+              </w:rPr>
+              <w:t>Type</w:t>
+            </w:r>
+          </w:p>
+        </w:tc>
+        <w:tc>
+          <w:tcPr>
+            <w:tcW w:type="dxa" w:w="1949"/>
+          </w:tcPr>
+          <w:p>
+            <w:r>
+              <w:rPr>
+                <w:b/>
+                <w:sz w:val="17"/>
+              </w:rPr>
+              <w:t>Metric 1</w:t>
+            </w:r>
+          </w:p>
+        </w:tc>
+        <w:tc>
+          <w:tcPr>
+            <w:tcW w:type="dxa" w:w="1949"/>
+          </w:tcPr>
+          <w:p>
+            <w:r>
+              <w:rPr>
+                <w:b/>
+                <w:sz w:val="17"/>
+              </w:rPr>
+              <w:t>Metric 2</w:t>
+            </w:r>
+          </w:p>
+        </w:tc>
+        <w:tc>
+          <w:tcPr>
+            <w:tcW w:type="dxa" w:w="1949"/>
+          </w:tcPr>
+          <w:p>
+            <w:r>
+              <w:rPr>
+                <w:b/>
+                <w:sz w:val="17"/>
+              </w:rPr>
+              <w:t>Metric 3</w:t>
+            </w:r>
+          </w:p>
+        </w:tc>
+      </w:tr>
+      <w:tr>
+        <w:trPr>
+          <w:cantSplit/>
+        </w:trPr>
+        <w:tc>
+          <w:tcPr>
+            <w:tcW w:type="dxa" w:w="1949"/>
+            <w:vAlign w:val="center"/>
+          </w:tcPr>
+          <w:p>
+            <w:r>
+              <w:rPr>
+                <w:sz w:val="16"/>
+              </w:rPr>
+              <w:t>BRCA–Wound Healing</w:t>
+            </w:r>
+          </w:p>
+        </w:tc>
+        <w:tc>
+          <w:tcPr>
+            <w:tcW w:type="dxa" w:w="1949"/>
+            <w:vAlign w:val="center"/>
+          </w:tcPr>
+          <w:p>
+            <w:r>
+              <w:rPr>
+                <w:sz w:val="16"/>
+              </w:rPr>
+              <w:t>continuous</w:t>
+            </w:r>
+          </w:p>
+        </w:tc>
+        <w:tc>
+          <w:tcPr>
+            <w:tcW w:type="dxa" w:w="1949"/>
+            <w:vAlign w:val="center"/>
+          </w:tcPr>
+          <w:p>
+            <w:r>
+              <w:rPr>
+                <w:sz w:val="16"/>
+              </w:rPr>
+              <w:t>-0.169 (-0.196–-0.148)</w:t>
+            </w:r>
+          </w:p>
+        </w:tc>
+        <w:tc>
+          <w:tcPr>
+            <w:tcW w:type="dxa" w:w="1949"/>
+            <w:vAlign w:val="center"/>
+          </w:tcPr>
+          <w:p>
+            <w:r>
+              <w:rPr>
+                <w:sz w:val="16"/>
+              </w:rPr>
+              <w:t>0.174 (0.168–0.181)</w:t>
+            </w:r>
+          </w:p>
+        </w:tc>
+        <w:tc>
+          <w:tcPr>
+            <w:tcW w:type="dxa" w:w="1949"/>
+            <w:vAlign w:val="center"/>
+          </w:tcPr>
+          <w:p>
+            <w:r>
+              <w:rPr>
+                <w:sz w:val="16"/>
+              </w:rPr>
+              <w:t>-0.002 (-0.030–0.026)</w:t>
+            </w:r>
+          </w:p>
+        </w:tc>
+      </w:tr>
+      <w:tr>
+        <w:trPr>
+          <w:cantSplit/>
+        </w:trPr>
+        <w:tc>
+          <w:tcPr>
+            <w:tcW w:type="dxa" w:w="1949"/>
+            <w:vAlign w:val="center"/>
+          </w:tcPr>
+          <w:p>
+            <w:r>
+              <w:rPr>
+                <w:sz w:val="16"/>
+              </w:rPr>
+              <w:t>KIRP–Proliferation</w:t>
+            </w:r>
+          </w:p>
+        </w:tc>
+        <w:tc>
+          <w:tcPr>
+            <w:tcW w:type="dxa" w:w="1949"/>
+            <w:vAlign w:val="center"/>
+          </w:tcPr>
+          <w:p>
+            <w:r>
+              <w:rPr>
+                <w:sz w:val="16"/>
+              </w:rPr>
+              <w:t>continuous</w:t>
+            </w:r>
+          </w:p>
+        </w:tc>
+        <w:tc>
+          <w:tcPr>
+            <w:tcW w:type="dxa" w:w="1949"/>
+            <w:vAlign w:val="center"/>
+          </w:tcPr>
+          <w:p>
+            <w:r>
+              <w:rPr>
+                <w:sz w:val="16"/>
+              </w:rPr>
+              <w:t>-0.205 (-0.269–-0.157)</w:t>
+            </w:r>
+          </w:p>
+        </w:tc>
+        <w:tc>
+          <w:tcPr>
+            <w:tcW w:type="dxa" w:w="1949"/>
+            <w:vAlign w:val="center"/>
+          </w:tcPr>
+          <w:p>
+            <w:r>
+              <w:rPr>
+                <w:sz w:val="16"/>
+              </w:rPr>
+              <w:t>0.620 (0.560–0.673)</w:t>
+            </w:r>
+          </w:p>
+        </w:tc>
+        <w:tc>
+          <w:tcPr>
+            <w:tcW w:type="dxa" w:w="1949"/>
+            <w:vAlign w:val="center"/>
+          </w:tcPr>
+          <w:p>
+            <w:r>
+              <w:rPr>
+                <w:sz w:val="16"/>
+              </w:rPr>
+              <w:t>0.010 (-0.040–0.066)</w:t>
+            </w:r>
+          </w:p>
+        </w:tc>
+      </w:tr>
+      <w:tr>
+        <w:trPr>
+          <w:cantSplit/>
+        </w:trPr>
+        <w:tc>
+          <w:tcPr>
+            <w:tcW w:type="dxa" w:w="1949"/>
+            <w:vAlign w:val="center"/>
+          </w:tcPr>
+          <w:p>
+            <w:r>
+              <w:rPr>
+                <w:sz w:val="16"/>
+              </w:rPr>
+              <w:t>BRCA–Proliferation</w:t>
+            </w:r>
+          </w:p>
+        </w:tc>
+        <w:tc>
+          <w:tcPr>
+            <w:tcW w:type="dxa" w:w="1949"/>
+            <w:vAlign w:val="center"/>
+          </w:tcPr>
+          <w:p>
+            <w:r>
+              <w:rPr>
+                <w:sz w:val="16"/>
+              </w:rPr>
+              <w:t>continuous</w:t>
+            </w:r>
+          </w:p>
+        </w:tc>
+        <w:tc>
+          <w:tcPr>
+            <w:tcW w:type="dxa" w:w="1949"/>
+            <w:vAlign w:val="center"/>
+          </w:tcPr>
+          <w:p>
+            <w:r>
+              <w:rPr>
+                <w:sz w:val="16"/>
+              </w:rPr>
+              <w:t>-0.239 (-0.279–-0.206)</w:t>
+            </w:r>
+          </w:p>
+        </w:tc>
+        <w:tc>
+          <w:tcPr>
+            <w:tcW w:type="dxa" w:w="1949"/>
+            <w:vAlign w:val="center"/>
+          </w:tcPr>
+          <w:p>
+            <w:r>
+              <w:rPr>
+                <w:sz w:val="16"/>
+              </w:rPr>
+              <w:t>0.704 (0.679–0.729)</w:t>
+            </w:r>
+          </w:p>
+        </w:tc>
+        <w:tc>
+          <w:tcPr>
+            <w:tcW w:type="dxa" w:w="1949"/>
+            <w:vAlign w:val="center"/>
+          </w:tcPr>
+          <w:p>
+            <w:r>
+              <w:rPr>
+                <w:sz w:val="16"/>
+              </w:rPr>
+              <w:t>0.012 (-0.014–0.040)</w:t>
+            </w:r>
+          </w:p>
+        </w:tc>
+      </w:tr>
+      <w:tr>
+        <w:trPr>
+          <w:cantSplit/>
+        </w:trPr>
+        <w:tc>
+          <w:tcPr>
+            <w:tcW w:type="dxa" w:w="1949"/>
+            <w:vAlign w:val="center"/>
+          </w:tcPr>
+          <w:p>
+            <w:r>
+              <w:rPr>
+                <w:sz w:val="16"/>
+              </w:rPr>
+              <w:t>TGCT–Wound Healing</w:t>
+            </w:r>
+          </w:p>
+        </w:tc>
+        <w:tc>
+          <w:tcPr>
+            <w:tcW w:type="dxa" w:w="1949"/>
+            <w:vAlign w:val="center"/>
+          </w:tcPr>
+          <w:p>
+            <w:r>
+              <w:rPr>
+                <w:sz w:val="16"/>
+              </w:rPr>
+              <w:t>continuous</w:t>
+            </w:r>
+          </w:p>
+        </w:tc>
+        <w:tc>
+          <w:tcPr>
+            <w:tcW w:type="dxa" w:w="1949"/>
+            <w:vAlign w:val="center"/>
+          </w:tcPr>
+          <w:p>
+            <w:r>
+              <w:rPr>
+                <w:sz w:val="16"/>
+              </w:rPr>
+              <w:t>-0.368 (-0.553–-0.247)</w:t>
+            </w:r>
+          </w:p>
+        </w:tc>
+        <w:tc>
+          <w:tcPr>
+            <w:tcW w:type="dxa" w:w="1949"/>
+            <w:vAlign w:val="center"/>
+          </w:tcPr>
+          <w:p>
+            <w:r>
+              <w:rPr>
+                <w:sz w:val="16"/>
+              </w:rPr>
+              <w:t>0.227 (0.208–0.244)</w:t>
+            </w:r>
+          </w:p>
+        </w:tc>
+        <w:tc>
+          <w:tcPr>
+            <w:tcW w:type="dxa" w:w="1949"/>
+            <w:vAlign w:val="center"/>
+          </w:tcPr>
+          <w:p>
+            <w:r>
+              <w:rPr>
+                <w:sz w:val="16"/>
+              </w:rPr>
+              <w:t>0.008 (-0.062–0.080)</w:t>
+            </w:r>
+          </w:p>
+        </w:tc>
+      </w:tr>
+      <w:tr>
+        <w:trPr>
+          <w:cantSplit/>
+        </w:trPr>
+        <w:tc>
+          <w:tcPr>
+            <w:tcW w:type="dxa" w:w="1949"/>
+            <w:vAlign w:val="center"/>
+          </w:tcPr>
+          <w:p>
+            <w:r>
+              <w:rPr>
+                <w:sz w:val="16"/>
+              </w:rPr>
+              <w:t>LGG–TP53</w:t>
+            </w:r>
+          </w:p>
+        </w:tc>
+        <w:tc>
+          <w:tcPr>
+            <w:tcW w:type="dxa" w:w="1949"/>
+            <w:vAlign w:val="center"/>
+          </w:tcPr>
+          <w:p>
+            <w:r>
+              <w:rPr>
+                <w:sz w:val="16"/>
+              </w:rPr>
+              <w:t>binary</w:t>
+            </w:r>
+          </w:p>
+        </w:tc>
+        <w:tc>
+          <w:tcPr>
+            <w:tcW w:type="dxa" w:w="1949"/>
+            <w:vAlign w:val="center"/>
+          </w:tcPr>
+          <w:p>
+            <w:r>
+              <w:rPr>
+                <w:sz w:val="16"/>
+              </w:rPr>
+              <w:t>Se 0.839 (0.795–0.877); Sp 0.885 (0.848–0.920)</w:t>
+            </w:r>
+          </w:p>
+        </w:tc>
+        <w:tc>
+          <w:tcPr>
+            <w:tcW w:type="dxa" w:w="1949"/>
+            <w:vAlign w:val="center"/>
+          </w:tcPr>
+          <w:p>
+            <w:r>
+              <w:rPr>
+                <w:sz w:val="16"/>
+              </w:rPr>
+              <w:t>BA 0.862 (0.833–0.888)</w:t>
+            </w:r>
+          </w:p>
+        </w:tc>
+        <w:tc>
+          <w:tcPr>
+            <w:tcW w:type="dxa" w:w="1949"/>
+            <w:vAlign w:val="center"/>
+          </w:tcPr>
+          <w:p>
+            <w:r>
+              <w:rPr>
+                <w:sz w:val="16"/>
+              </w:rPr>
+              <w:t>AUROC 0.908 (0.880–0.932)</w:t>
+            </w:r>
+          </w:p>
+        </w:tc>
+      </w:tr>
+      <w:tr>
+        <w:trPr>
+          <w:cantSplit/>
+        </w:trPr>
+        <w:tc>
+          <w:tcPr>
+            <w:tcW w:type="dxa" w:w="1949"/>
+            <w:vAlign w:val="center"/>
+          </w:tcPr>
+          <w:p>
+            <w:r>
+              <w:rPr>
+                <w:sz w:val="16"/>
+              </w:rPr>
+              <w:t>THYM–GTF2I</w:t>
+            </w:r>
+          </w:p>
+        </w:tc>
+        <w:tc>
+          <w:tcPr>
+            <w:tcW w:type="dxa" w:w="1949"/>
+            <w:vAlign w:val="center"/>
+          </w:tcPr>
+          <w:p>
+            <w:r>
+              <w:rPr>
+                <w:sz w:val="16"/>
+              </w:rPr>
+              <w:t>binary</w:t>
+            </w:r>
+          </w:p>
+        </w:tc>
+        <w:tc>
+          <w:tcPr>
+            <w:tcW w:type="dxa" w:w="1949"/>
+            <w:vAlign w:val="center"/>
+          </w:tcPr>
+          <w:p>
+            <w:r>
+              <w:rPr>
+                <w:sz w:val="16"/>
+              </w:rPr>
+              <w:t>Se 0.878 (0.804–0.940); Sp 0.839 (0.748–0.916)</w:t>
+            </w:r>
+          </w:p>
+        </w:tc>
+        <w:tc>
+          <w:tcPr>
+            <w:tcW w:type="dxa" w:w="1949"/>
+            <w:vAlign w:val="center"/>
+          </w:tcPr>
+          <w:p>
+            <w:r>
+              <w:rPr>
+                <w:sz w:val="16"/>
+              </w:rPr>
+              <w:t>BA 0.859 (0.803–0.905)</w:t>
+            </w:r>
+          </w:p>
+        </w:tc>
+        <w:tc>
+          <w:tcPr>
+            <w:tcW w:type="dxa" w:w="1949"/>
+            <w:vAlign w:val="center"/>
+          </w:tcPr>
+          <w:p>
+            <w:r>
+              <w:rPr>
+                <w:sz w:val="16"/>
+              </w:rPr>
+              <w:t>AUROC 0.907 (0.852–0.955)</w:t>
+            </w:r>
+          </w:p>
+        </w:tc>
+      </w:tr>
+      <w:tr>
+        <w:trPr>
+          <w:cantSplit/>
+        </w:trPr>
+        <w:tc>
+          <w:tcPr>
+            <w:tcW w:type="dxa" w:w="1949"/>
+            <w:vAlign w:val="center"/>
+          </w:tcPr>
+          <w:p>
+            <w:r>
+              <w:rPr>
+                <w:sz w:val="16"/>
+              </w:rPr>
+              <w:t>READ–TP53</w:t>
+            </w:r>
+          </w:p>
+        </w:tc>
+        <w:tc>
+          <w:tcPr>
+            <w:tcW w:type="dxa" w:w="1949"/>
+            <w:vAlign w:val="center"/>
+          </w:tcPr>
+          <w:p>
+            <w:r>
+              <w:rPr>
+                <w:sz w:val="16"/>
+              </w:rPr>
+              <w:t>binary</w:t>
+            </w:r>
+          </w:p>
+        </w:tc>
+        <w:tc>
+          <w:tcPr>
+            <w:tcW w:type="dxa" w:w="1949"/>
+            <w:vAlign w:val="center"/>
+          </w:tcPr>
+          <w:p>
+            <w:r>
+              <w:rPr>
+                <w:sz w:val="16"/>
+              </w:rPr>
+              <w:t>Se 0.912 (0.855–0.966); Sp 0.803 (0.704–0.890)</w:t>
+            </w:r>
+          </w:p>
+        </w:tc>
+        <w:tc>
+          <w:tcPr>
+            <w:tcW w:type="dxa" w:w="1949"/>
+            <w:vAlign w:val="center"/>
+          </w:tcPr>
+          <w:p>
+            <w:r>
+              <w:rPr>
+                <w:sz w:val="16"/>
+              </w:rPr>
+              <w:t>BA 0.858 (0.801–0.910)</w:t>
+            </w:r>
+          </w:p>
+        </w:tc>
+        <w:tc>
+          <w:tcPr>
+            <w:tcW w:type="dxa" w:w="1949"/>
+            <w:vAlign w:val="center"/>
+          </w:tcPr>
+          <w:p>
+            <w:r>
+              <w:rPr>
+                <w:sz w:val="16"/>
+              </w:rPr>
+              <w:t>AUROC 0.912 (0.860–0.956)</w:t>
+            </w:r>
+          </w:p>
+        </w:tc>
+      </w:tr>
+      <w:tr>
+        <w:trPr>
+          <w:cantSplit/>
+        </w:trPr>
+        <w:tc>
+          <w:tcPr>
+            <w:tcW w:type="dxa" w:w="1949"/>
+            <w:vAlign w:val="center"/>
+          </w:tcPr>
+          <w:p>
+            <w:r>
+              <w:rPr>
+                <w:sz w:val="16"/>
+              </w:rPr>
+              <w:t>THCA–BRAF</w:t>
+            </w:r>
+          </w:p>
+        </w:tc>
+        <w:tc>
+          <w:tcPr>
+            <w:tcW w:type="dxa" w:w="1949"/>
+            <w:vAlign w:val="center"/>
+          </w:tcPr>
+          <w:p>
+            <w:r>
+              <w:rPr>
+                <w:sz w:val="16"/>
+              </w:rPr>
+              <w:t>binary</w:t>
+            </w:r>
+          </w:p>
+        </w:tc>
+        <w:tc>
+          <w:tcPr>
+            <w:tcW w:type="dxa" w:w="1949"/>
+            <w:vAlign w:val="center"/>
+          </w:tcPr>
+          <w:p>
+            <w:r>
+              <w:rPr>
+                <w:sz w:val="16"/>
+              </w:rPr>
+              <w:t>Se 0.926 (0.897–0.952); Sp 0.747 (0.688–0.801)</w:t>
+            </w:r>
+          </w:p>
+        </w:tc>
+        <w:tc>
+          <w:tcPr>
+            <w:tcW w:type="dxa" w:w="1949"/>
+            <w:vAlign w:val="center"/>
+          </w:tcPr>
+          <w:p>
+            <w:r>
+              <w:rPr>
+                <w:sz w:val="16"/>
+              </w:rPr>
+              <w:t>BA 0.837 (0.805–0.866)</w:t>
+            </w:r>
+          </w:p>
+        </w:tc>
+        <w:tc>
+          <w:tcPr>
+            <w:tcW w:type="dxa" w:w="1949"/>
+            <w:vAlign w:val="center"/>
+          </w:tcPr>
+          <w:p>
+            <w:r>
+              <w:rPr>
+                <w:sz w:val="16"/>
+              </w:rPr>
+              <w:t>AUROC 0.894 (0.862–0.924)</w:t>
+            </w:r>
+          </w:p>
+        </w:tc>
+      </w:tr>
+    </w:tbl>
+    <w:p/>
     <w:p>
       <w:pPr>
         <w:jc w:val="center"/>
@@ -1766,7 +2547,7 @@
       <w:r>
         <w:drawing>
           <wp:inline xmlns:a="http://schemas.openxmlformats.org/drawingml/2006/main" xmlns:pic="http://schemas.openxmlformats.org/drawingml/2006/picture">
-            <wp:extent cx="5806440" cy="3135478"/>
+            <wp:extent cx="5806440" cy="4125628"/>
             <wp:docPr id="5" name="Picture 5"/>
             <wp:cNvGraphicFramePr>
               <a:graphicFrameLocks noChangeAspect="1"/>
@@ -1775,7 +2556,7 @@
               <a:graphicData uri="http://schemas.openxmlformats.org/drawingml/2006/picture">
                 <pic:pic>
                   <pic:nvPicPr>
-                    <pic:cNvPr id="0" name="Figure5_site_grouped_sensitivity.png"/>
+                    <pic:cNvPr id="0" name="Figure5_supported_counts.png"/>
                     <pic:cNvPicPr/>
                   </pic:nvPicPr>
                   <pic:blipFill>
@@ -1787,7 +2568,7 @@
                   <pic:spPr>
                     <a:xfrm>
                       <a:off x="0" y="0"/>
-                      <a:ext cx="5806440" cy="3135478"/>
+                      <a:ext cx="5806440" cy="4125628"/>
                     </a:xfrm>
                     <a:prstGeom prst="rect"/>
                   </pic:spPr>
@@ -1804,7 +2585,81 @@
         <w:jc w:val="center"/>
       </w:pPr>
       <w:r>
-        <w:t>Figure 5. Random-fold versus tissue-source-site-grouped internal validation. Values below the diagonal indicate attenuation when submitting sites are separated.</w:t>
+        <w:t>Figure 5. Breadth and family of within-cancer screen-positive prediction targets. Absence of an eligible target is distinct from a tested screen-negative result.</w:t>
+      </w:r>
+    </w:p>
+    <w:p>
+      <w:pPr>
+        <w:pStyle w:val="Heading2"/>
+      </w:pPr>
+      <w:r>
+        <w:t>Liver and pancreatic cancer examples</w:t>
+      </w:r>
+    </w:p>
+    <w:p>
+      <w:r>
+        <w:t>LIHC yielded 10 continuous candidates: LIHC–Proliferation (0.434); LIHC–Leukocyte Fraction (0.422); LIHC–Wound Healing (0.385); LIHC–Macrophage Regulation (0.378); LIHC–Lymphocyte Infiltration Signature Score (0.349); 8 binary candidates: LIHC–CTNNB1 [mutation] (0.668); LIHC–Cell Cycle [pathway] (0.644); LIHC–WNT [pathway] (0.634); LIHC–TP53 [mutation] (0.633); LIHC–BAP1 [mutation] (0.633); LIHC–TP53 [pathway] (0.623). PAAD yielded no continuous pair was screen-positive; 1 binary candidates: PAAD–TP53 [mutation] (0.619). These are discovery results; the global-correction status of every candidate is reported in the machine-readable atlas.</w:t>
+      </w:r>
+    </w:p>
+    <w:p>
+      <w:pPr>
+        <w:pStyle w:val="Heading2"/>
+      </w:pPr>
+      <w:r>
+        <w:t>Site and multiple-slide sensitivity</w:t>
+      </w:r>
+    </w:p>
+    <w:p>
+      <w:r>
+        <w:t>Site-grouped validation was feasible for 323 screen-positive models. The median grouped-minus-random performance change was -0.026. The first-slide-minus-mean-pool median change across screen-positive models was -0.001. Individual attenuations are reported because centre robustness and slide aggregation are target specific.</w:t>
+      </w:r>
+    </w:p>
+    <w:p>
+      <w:pPr>
+        <w:jc w:val="center"/>
+      </w:pPr>
+      <w:r>
+        <w:drawing>
+          <wp:inline xmlns:a="http://schemas.openxmlformats.org/drawingml/2006/main" xmlns:pic="http://schemas.openxmlformats.org/drawingml/2006/picture">
+            <wp:extent cx="5806440" cy="3182376"/>
+            <wp:docPr id="6" name="Picture 6"/>
+            <wp:cNvGraphicFramePr>
+              <a:graphicFrameLocks noChangeAspect="1"/>
+            </wp:cNvGraphicFramePr>
+            <a:graphic>
+              <a:graphicData uri="http://schemas.openxmlformats.org/drawingml/2006/picture">
+                <pic:pic>
+                  <pic:nvPicPr>
+                    <pic:cNvPr id="0" name="Figure6_site_grouped_sensitivity.png"/>
+                    <pic:cNvPicPr/>
+                  </pic:nvPicPr>
+                  <pic:blipFill>
+                    <a:blip r:embed="rId16"/>
+                    <a:stretch>
+                      <a:fillRect/>
+                    </a:stretch>
+                  </pic:blipFill>
+                  <pic:spPr>
+                    <a:xfrm>
+                      <a:off x="0" y="0"/>
+                      <a:ext cx="5806440" cy="3182376"/>
+                    </a:xfrm>
+                    <a:prstGeom prst="rect"/>
+                  </pic:spPr>
+                </pic:pic>
+              </a:graphicData>
+            </a:graphic>
+          </wp:inline>
+        </w:drawing>
+      </w:r>
+    </w:p>
+    <w:p>
+      <w:pPr>
+        <w:pStyle w:val="Caption"/>
+        <w:jc w:val="center"/>
+      </w:pPr>
+      <w:r>
+        <w:t>Figure 6. Random-fold versus tissue-source-site-grouped internal validation. Values below the diagonal indicate attenuation when submitting tissue-source sites are separated.</w:t>
       </w:r>
     </w:p>
     <w:p>
@@ -1817,7 +2672,7 @@
     </w:p>
     <w:p>
       <w:r>
-        <w:t>This study answers a target-by-target, cancer-specific question rather than asking whether molecular subtype and mutation status are associated. Frozen TITAN features contain useful signal for selected immune programmes, mutations and higher-level genomic phenotypes, but most eligible pairs do not satisfy both multiplicity and effect thresholds. That heterogeneity—and transparent negative reporting—is the primary result.</w:t>
+        <w:t>This study answers a target-by-target, cancer-specific question rather than asking whether molecular subtype and mutation status are associated. Fixed pretrained TITAN representations contain useful signal for selected immune programmes, mutations and higher-level genomic phenotypes, but most eligible pairs do not satisfy both multiplicity and effect thresholds. That heterogeneity—and transparent negative reporting—is the primary result. Under the stricter across-cancer family correction, 219 continuous and 39 mutation pairs passed; the remaining within-cancer candidates should not be interpreted as pan-cancer biomarkers. Conversely, global non-passage cannot be interpreted as evidence of no signal because the 0.001 empirical-p resolution restricts attainable q-values in large families.</w:t>
       </w:r>
     </w:p>
     <w:p>
@@ -1830,17 +2685,22 @@
     </w:p>
     <w:p>
       <w:r>
-        <w:t>The mutation results divide into two evidence groups. Three of the 16 Tier-A/B cancer–gene pairs were exact pairs in the prespecified CNN literature crosswalk and were recovered here: LGG–IDH1: prior AUROC 0.764, current balanced accuracy 0.772 (q=0.022); LGG–TP53: prior AUROC 0.787, current balanced accuracy 0.830 (q=0.022); THCA–BRAF: prior AUROC 0.860, current balanced accuracy 0.828 (q=0.010). Prior studies reported AUROC, whereas the present primary metric is balanced accuracy; the side-by-side values describe consistency of discrimination but are not numerical estimates of improvement or inferiority.</w:t>
+        <w:t>The relevant literature spans substantially different validation settings and metrics. For MSI, Kather et al. reported external AUROCs of 0.84 (95% CI 0.72–0.92) in DACHS colorectal cancer and 0.69 (0.52–0.82) in an external gastric cohort, whereas Echle et al. reported an external dMMR AUROC of 0.96 in a 771-case cohort [2,3]. For fusion prediction, Dadhania et al. reported ERG AUROCs of 0.82–0.85, and Mayer et al. reported 100% sensitivity with 100% and 98.6% specificity for ALK and ROS1, respectively, in a small external set [9,10]. Saldanha et al. externally evaluated mutation models in CPTAC, Bergstrom et al. reported external breast HRD AUROC 0.76 (0.71–0.82), and HistoTME reported mean external cell-composition correlation 0.50 and immunotherapy-response AUROC 0.75 (0.61–0.88) [11,14,15]. These externally tested results set a stronger validation standard than the internal TCGA estimates presented here; metric, endpoint and cohort differences preclude claims of direct superiority.</w:t>
       </w:r>
     </w:p>
     <w:p>
       <w:r>
-        <w:t>Several published pairs retained moderate discrimination but did not satisfy the current within-cancer mutation-family FDR criterion: BRCA–TP53: prior AUROC 0.768 [0.735–0.781], current balanced accuracy 0.717 (q=0.100); UCEC–TP53: prior AUROC 0.764, current balanced accuracy 0.739 (q=0.069); LIHC–CTNNB1: prior AUROC 0.682 [0.635–0.688], current balanced accuracy 0.643 (q=0.070); PAAD–KRAS: prior AUROC 0.670 [0.570–0.712], current balanced accuracy 0.546 (q=1.000). Other reported pairs were weaker or ineligible under the present primary-tumour and minimum-class-count rules. Differences can arise from cohort composition, primary-versus-metastatic sampling, slide preparation, mutation definition, model class and validation design. Supplementary Table S4 provides the report-level comparison and the complete machine-readable crosswalk preserves original evidence notes and URLs.</w:t>
+        <w:t>The mutation results divide into two evidence groups. 24 of the 41 within-cancer screen-positive cancer–gene pairs were exact pairs in the prespecified histology literature crosswalk and were recovered here: BLCA–FGFR3: prior AUROC 0.780, current balanced accuracy 0.729 (q=0.010); BRCA–CDH1: prior AUROC 0.810, current balanced accuracy 0.731 (q=0.007); BRCA–TP53: prior AUROC 0.768 [0.735–0.781], current balanced accuracy 0.744 (q=0.007); BRCA–TP53: prior AUROC &gt;0.611, current balanced accuracy 0.744 (q=0.007); LGG–IDH1: prior AUROC 0.764, current balanced accuracy 0.786 (q=0.002); LGG–TP53: prior AUROC 0.787, current balanced accuracy 0.846 (q=0.002); THCA–BRAF: prior AUROC 0.860, current balanced accuracy 0.830 (q=0.001); UCEC–PTEN: prior reported histopathological association, current balanced accuracy 0.726 (q=0.016); UCEC–PTEN: prior AUROC 0.773, current balanced accuracy 0.726 (q=0.016); UCEC–TP53: prior AUROC 0.764, current balanced accuracy 0.764 (q=0.016); BRCA–PIK3CA: prior AUROC 0.625 [0.605–0.659], current balanced accuracy 0.631 (q=0.007); BRCA–PIK3CA: prior AUROC &gt;0.611, current balanced accuracy 0.631 (q=0.007); CESC–TP53: prior AUROC 0.673 [0.628–0.749], current balanced accuracy 0.604 (q=0.024); HNSC–NSD1: prior AUROC 0.668 [0.597–0.737], current balanced accuracy 0.630 (q=0.009); HNSC–TP53: prior AUROC 0.699 [0.687–0.732], current balanced accuracy 0.636 (q=0.009); LIHC–CTNNB1: prior AUROC 0.682 [0.635–0.688], current balanced accuracy 0.668 (q=0.002); LIHC–TP53: prior reported histopathological association, current balanced accuracy 0.633 (q=0.002); LIHC–TP53: prior AUROC 0.606 [0.572–0.656], current balanced accuracy 0.633 (q=0.002); LIHC–TP53: prior AUROC 0.597, current balanced accuracy 0.633 (q=0.002); LUAD–EGFR: prior AUROC 0.733–0.856 across six reported genes, current balanced accuracy 0.617 (q=0.007); LUAD–EGFR: prior AUROC 0.624 [0.598–0.670], current balanced accuracy 0.617 (q=0.007); LUAD–TP53: prior AUROC 0.733–0.856 across six reported genes, current balanced accuracy 0.699 (q=0.007); LUAD–TP53: prior AUROC 0.720 [0.700–0.746], current balanced accuracy 0.699 (q=0.007); STAD–PIK3CA: prior AUROC 0.636 [0.581–0.662], current balanced accuracy 0.637 (q=0.009). Prior studies generally reported AUROC, whereas the present primary metric is balanced accuracy; the side-by-side values describe consistency of discrimination but are not numerical estimates of improvement or inferiority.</w:t>
       </w:r>
     </w:p>
     <w:p>
       <w:r>
-        <w:t>The remaining 13 supported mutation pairs were not present in the prespecified exact-pair crosswalk and are therefore atlas-nominated candidates rather than replications. Leading examples were THYM–GTF2I (balanced accuracy 0.876, q=0.010); READ–APC (balanced accuracy 0.860, q=0.010); READ–TP53 (balanced accuracy 0.847, q=0.010); COAD–APC (balanced accuracy 0.792, q=0.043); LGG–ATRX (balanced accuracy 0.784, q=0.022); COAD–TP53 (balanced accuracy 0.777, q=0.043); LGG–CIC (balanced accuracy 0.770, q=0.022); SKCM–BRAF (balanced accuracy 0.765, q=0.010). Absence from this targeted crosswalk is not a claim that no publication has ever evaluated the pair; a systematic endpoint-level review would be required to establish bibliographic novelty. Supplementary Table S5 classifies all 16 supported mutation pairs explicitly.</w:t>
+        <w:t>Several published pairs retained moderate discrimination but did not satisfy the current within-cancer mutation-family FDR criterion: BRCA–TP53: prior AUROC 0.768 [0.735–0.781], current balanced accuracy 0.744 (q=0.007); UCEC–TP53: prior AUROC 0.764, current balanced accuracy 0.764 (q=0.016); LIHC–CTNNB1: prior AUROC 0.682 [0.635–0.688], current balanced accuracy 0.668 (q=0.002); PAAD–KRAS: prior AUROC 0.670 [0.570–0.712], current balanced accuracy 0.588 (q=1.000). Other reported pairs were weaker or ineligible under the present primary-tumour and minimum-class-count rules. Differences can arise from cohort composition, primary-versus-metastatic sampling, slide preparation, mutation definition, model class and validation design. Supplementary Table S9 provides the report-level comparison and the complete machine-readable crosswalk preserves original evidence notes and URLs.</w:t>
+      </w:r>
+    </w:p>
+    <w:p>
+      <w:r>
+        <w:t>The remaining 24 screen-positive mutation pairs were not present in the prespecified exact-pair crosswalk and are therefore atlas-nominated candidates rather than replications. Leading examples were THYM–GTF2I (balanced accuracy 0.883, q=0.001); READ–APC (balanced accuracy 0.862, q=0.002); READ–TP53 (balanced accuracy 0.861, q=0.002); COAD–APC (balanced accuracy 0.793, q=0.003); COAD–TP53 (balanced accuracy 0.779, q=0.003); LGG–CIC (balanced accuracy 0.779, q=0.002); LGG–ATRX (balanced accuracy 0.761, q=0.002); THCA–NRAS (balanced accuracy 0.703, q=0.001). Absence from this targeted crosswalk is not a claim that no publication has ever evaluated the pair; a systematic endpoint-level review would be required to establish bibliographic novelty. Supplementary Table S10 classifies every screen-positive mutation pair explicitly.</w:t>
       </w:r>
     </w:p>
     <w:p>
@@ -1849,31 +2709,56 @@
       </w:r>
     </w:p>
     <w:p>
+      <w:r>
+        <w:t>For continuous outcomes, prior work predicted RNA expression [6], tumour composition [4], continuous HRD and microenvironment measures [12], and externally evaluated tumour-microenvironment composition in non-small cell lung cancer [15]. The present study instead screens the prespecified Thorsson immune panel, genomic-context scores, MSI scores, fusion burden and aneuploidy burdens across eligible TCGA cancers using the same patient-level validation design. Only 219 continuous pairs passed the stricter across-cancer correction; the others should be treated as endpoint- and cancer-specific nominations, not as replications of the external HistoTME results or as evidence of general immune profiling.</w:t>
+      </w:r>
+    </w:p>
+    <w:p>
       <w:pPr>
         <w:pStyle w:val="Heading2"/>
       </w:pPr>
       <w:r>
-        <w:t>Practical novelty of the PLS framework</w:t>
+        <w:t>Practical contribution of the PLS framework</w:t>
       </w:r>
     </w:p>
     <w:p>
       <w:r>
-        <w:t>The first practical advantage of TITAN plus PLS is rapid reuse. Once slide embeddings exist, hundreds of new outcomes can be screened without retraining a CNN encoder. This is useful for discovery and triage when new genomic annotations become available. It does not eliminate the one-time TITAN extraction cost and is not a hardware-matched claim of superior accuracy.</w:t>
+        <w:t>The contribution of TITAN plus PLS is a uniform, auditable screen over many prespecified outcomes using one fixed representation, with one-at-a-time PLS–LDA retained for the prespecified individual binary endpoints and PLS2 examined secondarily for correlated inflammatory panels. This study was not designed to compare PLS with elastic-net, convolutional or other machine-learning approaches, and no claim of algorithmic superiority is made.</w:t>
       </w:r>
     </w:p>
     <w:p>
       <w:r>
-        <w:t>The second advantage is data-minimising model portability. A trained PLS predictor is parametric: preprocessing values, latent weights and coefficients are sufficient for continuous prediction, with compact LDA parameters added for binary classification. External users can therefore apply a frozen model to correctly ordered TITAN features without receiving the original patient embeddings, outcomes or neighbour reference set. By contrast, k-nearest-neighbour inference depends directly on stored training examples [19]. This reduces the data that must be distributed, although it does not by itself confer privacy, overcome TITAN licensing restrictions or establish transportability.</w:t>
+        <w:t>A further practical feature is data-minimising model portability. Preprocessing values, latent weights and coefficients are sufficient for continuous prediction, with compact LDA parameters added for binary classification. External researchers can therefore apply a fitted model to correctly ordered TITAN features without receiving the original patient embeddings or outcomes. This reduces the patient-level data that must be distributed, although it does not itself confer privacy, overcome TITAN licensing restrictions or establish transportability.</w:t>
       </w:r>
     </w:p>
     <w:p>
       <w:r>
-        <w:t>Strengths include primary-tumour matching across every data source, deterministic mean pooling of multiple slides, nested patient-level validation, family-wise FDR, exact negative-result reporting, site-grouped sensitivity, saved research models and executable inference code. The supplied Bonneville spreadsheets contained only an ACC/CESC/MESO subset; cBioPortal PanCancer Atlas MANTIS fields were therefore used for full coverage and agreed exactly for all 387 overlapping cases.</w:t>
+        <w:t>Strengths include primary-tumour matching across every data source, deterministic mean pooling of multiple slides, nested patient-level validation, FDR control within cancer and endpoint family, exact negative-result reporting, site-grouped sensitivity, saved research models and executable inference code. The supplied Bonneville spreadsheets contained only an ACC/CESC/MESO subset; cBioPortal PanCancer Atlas MANTIS fields were therefore used for full coverage and agreed exactly for all 387 overlapping cases.</w:t>
       </w:r>
     </w:p>
     <w:p>
       <w:r>
-        <w:t>The principal limitation is absence of independent external validation. TCGA resampling, even with site separation, cannot establish transportability to another institution, scanner, stain distribution or patient population. The study is retrospective and exploratory; thresholds are prioritisation rules, not clinical operating points. TITAN used report alignment during pretraining, predictability does not establish biological causality, and image-derived predictions cannot justify omitting a molecular assay. External feature extraction and prospective evaluation are required before clinical use.</w:t>
+        <w:t>The principal limitation is absence of independent external validation. TCGA resampling, even with site separation, cannot establish transportability to another institution, scanner, stain distribution or patient population. The study is retrospective and exploratory; thresholds are prioritisation rules, not clinical operating points. Although TCGA was excluded from TITAN's Mass-340K pretraining corpus, it was used in the original paper's downstream evaluation; the present cohort is therefore neither a pretraining cohort nor an independent validation cohort. Predictability does not establish biological causality, and image-derived predictions cannot justify omitting a molecular assay. External feature extraction and prospective evaluation are required before clinical use.</w:t>
+      </w:r>
+    </w:p>
+    <w:p>
+      <w:r>
+        <w:t>The repeated nested-CV estimates and patient-cluster bootstrap intervals are also conditional on selecting endpoints in this same TCGA atlas. They quantify partition and sampling variability for highlighted candidates but do not correct winner's-curse optimism from highlighting the strongest screen results. Consequently, the intervals should not be read as external-performance intervals; locked-model evaluation in an untouched cohort is required for unbiased transportability assessment.</w:t>
+      </w:r>
+    </w:p>
+    <w:p>
+      <w:r>
+        <w:t>rSVD is a seeded stochastic approximation. The use of 10 oversampling vectors, two power iterations, explicit seeds and five repeated nested validations makes the chosen computational path auditable and exposes seed-plus-partition variability, but it does not establish equivalence to another decomposition method. Consistent with the prespecified scope, no IRLBA comparison was performed.</w:t>
+      </w:r>
+    </w:p>
+    <w:p>
+      <w:r>
+        <w:t>Arithmetic mean pooling gives each eligible slide equal weight and prevents multiple-slide leakage, but it does not model variable tissue area or within-patient morphological heterogeneity. The first-slide sensitivity measures dependence on one deterministic alternative and should not be interpreted as a comparison with learned or tissue-area-weighted aggregation.</w:t>
+      </w:r>
+    </w:p>
+    <w:p>
+      <w:r>
+        <w:t>Demographic subgroup performance and algorithmic fairness were not evaluated. The TCGA Clinical Data Resource provides descriptive age, recorded gender, race and stage fields, but coverage and subgroup sizes vary across cancers and would fragment further under endpoint-specific molecular missingness. Tissue-source-site grouping probes one form of institutional heterogeneity but cannot establish fairness across ancestry, sex, age or access-to-care groups. Any external evaluation should prespecify representative sampling and subgroup performance, calibration and failure analysis.</w:t>
       </w:r>
     </w:p>
     <w:p>
@@ -1886,7 +2771,20 @@
     </w:p>
     <w:p>
       <w:r>
-        <w:t>Mean-pooled, frozen TITAN embeddings enable a rapid cancer-specific atlas of selected immune, mutation, pathway, MSI, aneuploidy and fusion phenotypes. Compact fitted PLS and PLS–LDA models can be applied without distributing patient-level training data, providing a practical route to external research validation when licensing permits. The resource prioritises hypotheses and exposes unsupported targets, but remains internally validated and non-clinical.</w:t>
+        <w:t>Mean-pooled TITAN representations enable a cancer-specific TCGA discovery atlas of selected immune, mutation, pathway, MSI, aneuploidy and fusion phenotypes. Compact fitted PLS and PLS–LDA models can be applied without distributing patient-level training data, providing a practical route to external research validation when licensing permits. The resource prioritises hypotheses and exposes screen-negative targets, but remains internally validated and non-clinical.</w:t>
+      </w:r>
+    </w:p>
+    <w:p>
+      <w:pPr>
+        <w:pStyle w:val="Heading1"/>
+      </w:pPr>
+      <w:r>
+        <w:t>Abbreviations</w:t>
+      </w:r>
+    </w:p>
+    <w:p>
+      <w:r>
+        <w:t>AUROC, area under the receiver operating characteristic curve; BA, balanced accuracy; CV, cross-validation; FDR, false discovery rate; H&amp;E, haematoxylin and eosin; LDA, linear discriminant analysis; MC3, Multi-Center Mutation Calling in Multiple Cancers; MSI, microsatellite instability; OOF, out-of-fold; PLS, partial least squares; PLS1, single-response PLS; PLS2, multi-response PLS; Q², cross-validated coefficient of determination; RMSE, root-mean-square error; TCGA, The Cancer Genome Atlas.</w:t>
       </w:r>
     </w:p>
     <w:p>
@@ -1928,12 +2826,38 @@
         <w:pStyle w:val="Heading2"/>
       </w:pPr>
       <w:r>
+        <w:t>Study registration and protocol</w:t>
+      </w:r>
+    </w:p>
+    <w:p>
+      <w:r>
+        <w:t>This retrospective secondary analysis was not registered. The locked executable analysis plan is available in the companion repository [30].</w:t>
+      </w:r>
+    </w:p>
+    <w:p>
+      <w:pPr>
+        <w:pStyle w:val="Heading2"/>
+      </w:pPr>
+      <w:r>
+        <w:t>Patient and public involvement</w:t>
+      </w:r>
+    </w:p>
+    <w:p>
+      <w:r>
+        <w:t>Patients and members of the public were not involved in the design, conduct, interpretation or reporting of this secondary analysis.</w:t>
+      </w:r>
+    </w:p>
+    <w:p>
+      <w:pPr>
+        <w:pStyle w:val="Heading2"/>
+      </w:pPr>
+      <w:r>
         <w:t>Availability of data and materials</w:t>
       </w:r>
     </w:p>
     <w:p>
       <w:r>
-        <w:t>Source locations and checksums are recorded in the repository: https://github.com/tkcaccia/titan-prediction. TCGA data are available from the Genomic Data Commons; TITAN resources are available from MahmoodLab. Model-object redistribution is subject to TITAN's upstream terms.</w:t>
+        <w:t>The analysis used the public TITAN TCGA feature artifact (TCGA_TITAN_features.pkl) through its supplied 768-feature CSV export. TCGA molecular data and the cited public supplementary records remain available from their original repositories. Exact source locations, access information and SHA-256 checksums are recorded in the companion repository [30]. Controlled-access whole-slide images are not redistributed. Model-object redistribution is subject to TITAN's upstream terms.</w:t>
       </w:r>
     </w:p>
     <w:p>
@@ -1993,6 +2917,19 @@
         <w:pStyle w:val="Heading1"/>
       </w:pPr>
       <w:r>
+        <w:t>Additional file</w:t>
+      </w:r>
+    </w:p>
+    <w:p>
+      <w:r>
+        <w:t>Additional file 1 (.docx): Supplementary material. Contains Supplementary Methods, Tables S1–S12, Figures S1–S2 and an inventory of the companion machine-readable result files.</w:t>
+      </w:r>
+    </w:p>
+    <w:p>
+      <w:pPr>
+        <w:pStyle w:val="Heading1"/>
+      </w:pPr>
+      <w:r>
         <w:t>References</w:t>
       </w:r>
     </w:p>
@@ -2003,92 +2940,147 @@
     </w:p>
     <w:p>
       <w:r>
-        <w:t>2. Fu Y, et al. Pan-cancer computational histopathology reveals mutations, tumor composition and prognosis. Nat Cancer. 2020;1:800–810. doi:10.1038/s43018-020-0085-8.</w:t>
+        <w:t>2. Kather JN, et al. Deep learning can predict microsatellite instability directly from histology in gastrointestinal cancer. Nat Med. 2019;25:1054–1056. doi:10.1038/s41591-019-0462-y.</w:t>
       </w:r>
     </w:p>
     <w:p>
       <w:r>
-        <w:t>3. Kather JN, et al. Pan-cancer image-based detection of clinically actionable genetic alterations. Nat Cancer. 2020;1:789–799. doi:10.1038/s43018-020-0087-6.</w:t>
+        <w:t>3. Echle A, et al. Clinical-grade detection of microsatellite instability in colorectal tumors by deep learning. Gastroenterology. 2020;159:1406–1416.e11. doi:10.1053/j.gastro.2020.06.021.</w:t>
       </w:r>
     </w:p>
     <w:p>
       <w:r>
-        <w:t>4. Schmauch B, et al. A deep learning model to predict RNA-Seq expression of tumours from whole slide images. Nat Commun. 2020;11:3877. doi:10.1038/s41467-020-17678-4.</w:t>
+        <w:t>4. Fu Y, et al. Pan-cancer computational histopathology reveals mutations, tumor composition and prognosis. Nat Cancer. 2020;1:800–810. doi:10.1038/s43018-020-0085-8.</w:t>
       </w:r>
     </w:p>
     <w:p>
       <w:r>
-        <w:t>5. Loeffler CML, et al. Predicting mutational status of driver and suppressor genes directly from histopathology with deep learning. Front Genet. 2022;12:806386. doi:10.3389/fgene.2021.806386.</w:t>
+        <w:t>5. Kather JN, et al. Pan-cancer image-based detection of clinically actionable genetic alterations. Nat Cancer. 2020;1:789–799. doi:10.1038/s43018-020-0087-6.</w:t>
       </w:r>
     </w:p>
     <w:p>
       <w:r>
-        <w:t>6. Ding T, et al. A multimodal whole-slide foundation model for pathology. Nat Med. 2025;31:3749–3761. doi:10.1038/s41591-025-03982-3.</w:t>
+        <w:t>6. Schmauch B, et al. A deep learning model to predict RNA-Seq expression of tumours from whole slide images. Nat Commun. 2020;11:3877. doi:10.1038/s41467-020-17678-4.</w:t>
       </w:r>
     </w:p>
     <w:p>
       <w:r>
-        <w:t>7. Wold S, Sjöström M, Eriksson L. PLS-regression: a basic tool of chemometrics. Chemometr Intell Lab Syst. 2001;58:109–130. doi:10.1016/S0169-7439(01)00155-1.</w:t>
+        <w:t>7. Howard FM, et al. The impact of site-specific digital histology signatures on deep learning model accuracy and bias. Nat Commun. 2021;12:4423. doi:10.1038/s41467-021-24698-1.</w:t>
       </w:r>
     </w:p>
     <w:p>
       <w:r>
-        <w:t>8. Szymańska E, et al. Double-check: validation of diagnostic statistics for PLS-DA models. Metabolomics. 2012;8(Suppl 1):3–16. doi:10.1007/s11306-011-0330-3.</w:t>
+        <w:t>8. Loeffler CML, et al. Predicting mutational status of driver and suppressor genes directly from histopathology with deep learning. Front Genet. 2022;12:806386. doi:10.3389/fgene.2021.806386.</w:t>
       </w:r>
     </w:p>
     <w:p>
       <w:r>
-        <w:t>9. Thorsson V, et al. The Immune Landscape of Cancer. Immunity. 2018;48:812–830.e14. doi:10.1016/j.immuni.2018.03.023.</w:t>
+        <w:t>9. Dadhania V, et al. Leveraging artificial intelligence to predict ERG gene fusion status in prostate cancer. BMC Cancer. 2022;22:494. doi:10.1186/s12885-022-09559-4.</w:t>
       </w:r>
     </w:p>
     <w:p>
       <w:r>
-        <w:t>10. Taylor AM, et al. Genomic and functional approaches to understanding cancer aneuploidy. Cancer Cell. 2018;33:676–689.e3. doi:10.1016/j.ccell.2018.03.007.</w:t>
+        <w:t>10. Mayer C, et al. Direct identification of ALK and ROS1 fusions in non-small cell lung cancer from hematoxylin and eosin-stained slides using deep learning algorithms. Mod Pathol. 2022;35:1882–1887. doi:10.1038/s41379-022-01141-4.</w:t>
       </w:r>
     </w:p>
     <w:p>
       <w:r>
-        <w:t>11. Gao Q, et al. Driver fusions and their implications in the development and treatment of human cancers. Cell Rep. 2018;23:227–238.e3. doi:10.1016/j.celrep.2018.03.050.</w:t>
+        <w:t>11. Saldanha OL, et al. Self-supervised attention-based deep learning for pan-cancer mutation prediction from histopathology. npj Precis Oncol. 2023;7:35. doi:10.1038/s41698-023-00365-0.</w:t>
       </w:r>
     </w:p>
     <w:p>
       <w:r>
-        <w:t>12. Bonneville R, et al. Landscape of microsatellite instability across 39 cancer types. JCO Precis Oncol. 2017;2017:PO.17.00073. doi:10.1200/PO.17.00073.</w:t>
+        <w:t>12. El Nahhas OSM, et al. Regression-based deep-learning predicts molecular biomarkers from pathology slides. Nat Commun. 2024;15:1253. doi:10.1038/s41467-024-45589-1.</w:t>
       </w:r>
     </w:p>
     <w:p>
       <w:r>
-        <w:t>13. Cerami E, et al. The cBio cancer genomics portal. Cancer Discov. 2012;2:401–404. doi:10.1158/2159-8290.CD-12-0095.</w:t>
+        <w:t>13. Arslan S, et al. A systematic pan-cancer study on deep learning-based prediction of multi-omic biomarkers from routine pathology images. Commun Med. 2024;4:48. doi:10.1038/s43856-024-00471-5.</w:t>
       </w:r>
     </w:p>
     <w:p>
       <w:r>
-        <w:t>14. Ellrott K, et al. Scalable open science approach for mutation calling of tumor exomes. Cell Syst. 2018;6:271–281.e7. doi:10.1016/j.cels.2018.03.002.</w:t>
+        <w:t>14. Bergstrom EN, et al. Deep learning artificial intelligence predicts homologous recombination deficiency and platinum response from histologic slides. J Clin Oncol. 2024;42:3550–3560. doi:10.1200/JCO.23.02641.</w:t>
       </w:r>
     </w:p>
     <w:p>
       <w:r>
-        <w:t>15. Bailey MH, et al. Comprehensive characterization of cancer driver genes and mutations. Cell. 2018;173:371–385.e18. doi:10.1016/j.cell.2018.02.060.</w:t>
+        <w:t>15. Patkar S, et al. Predicting the tumor microenvironment composition and immunotherapy response in non-small cell lung cancer from digital histopathology images. npj Precis Oncol. 2024;8:280. doi:10.1038/s41698-024-00765-w.</w:t>
       </w:r>
     </w:p>
     <w:p>
       <w:r>
-        <w:t>16. Sanchez-Vega F, et al. Oncogenic signaling pathways in The Cancer Genome Atlas. Cell. 2018;173:321–337.e10. doi:10.1016/j.cell.2018.03.035.</w:t>
+        <w:t>16. Ding T, et al. A multimodal whole-slide foundation model for pathology. Nat Med. 2025;31:3749–3761. doi:10.1038/s41591-025-03982-3.</w:t>
       </w:r>
     </w:p>
     <w:p>
       <w:r>
-        <w:t>17. Benjamini Y, Hochberg Y. Controlling the false discovery rate. J R Stat Soc B. 1995;57:289–300. doi:10.1111/j.2517-6161.1995.tb02031.x.</w:t>
+        <w:t>17. Wold S, Sjöström M, Eriksson L. PLS-regression: a basic tool of chemometrics. Chemometr Intell Lab Syst. 2001;58:109–130. doi:10.1016/S0169-7439(01)00155-1.</w:t>
       </w:r>
     </w:p>
     <w:p>
       <w:r>
-        <w:t>18. Collins GS, et al. TRIPOD+AI statement. BMJ. 2024;385:e078378. doi:10.1136/bmj-2023-078378.</w:t>
+        <w:t>18. Szymańska E, et al. Double-check: validation of diagnostic statistics for PLS-DA models. Metabolomics. 2012;8(Suppl 1):3–16. doi:10.1007/s11306-011-0330-3.</w:t>
       </w:r>
     </w:p>
     <w:p>
       <w:r>
-        <w:t>19. Cover TM, Hart PE. Nearest neighbor pattern classification. IEEE Trans Inf Theory. 1967;13:21–27. doi:10.1109/TIT.1967.1053964.</w:t>
+        <w:t>19. Thorsson V, et al. The Immune Landscape of Cancer. Immunity. 2018;48:812–830.e14. doi:10.1016/j.immuni.2018.03.023.</w:t>
+      </w:r>
+    </w:p>
+    <w:p>
+      <w:r>
+        <w:t>20. Taylor AM, et al. Genomic and functional approaches to understanding cancer aneuploidy. Cancer Cell. 2018;33:676–689.e3. doi:10.1016/j.ccell.2018.03.007.</w:t>
+      </w:r>
+    </w:p>
+    <w:p>
+      <w:r>
+        <w:t>21. Gao Q, et al. Driver fusions and their implications in the development and treatment of human cancers. Cell Rep. 2018;23:227–238.e3. doi:10.1016/j.celrep.2018.03.050.</w:t>
+      </w:r>
+    </w:p>
+    <w:p>
+      <w:r>
+        <w:t>22. Bonneville R, et al. Landscape of microsatellite instability across 39 cancer types. JCO Precis Oncol. 2017;2017:PO.17.00073. doi:10.1200/PO.17.00073.</w:t>
+      </w:r>
+    </w:p>
+    <w:p>
+      <w:r>
+        <w:t>23. Cerami E, et al. The cBio cancer genomics portal: an open platform for exploring multidimensional cancer genomics data. Cancer Discov. 2012;2:401–404. doi:10.1158/2159-8290.CD-12-0095.</w:t>
+      </w:r>
+    </w:p>
+    <w:p>
+      <w:r>
+        <w:t>24. Ellrott K, et al. Scalable open science approach for mutation calling of tumor exomes. Cell Syst. 2018;6:271–281.e7. doi:10.1016/j.cels.2018.03.002.</w:t>
+      </w:r>
+    </w:p>
+    <w:p>
+      <w:r>
+        <w:t>25. Bailey MH, et al. Comprehensive characterization of cancer driver genes and mutations. Cell. 2018;173:371–385.e18. doi:10.1016/j.cell.2018.02.060.</w:t>
+      </w:r>
+    </w:p>
+    <w:p>
+      <w:r>
+        <w:t>26. Sanchez-Vega F, et al. Oncogenic signaling pathways in The Cancer Genome Atlas. Cell. 2018;173:321–337.e10. doi:10.1016/j.cell.2018.03.035.</w:t>
+      </w:r>
+    </w:p>
+    <w:p>
+      <w:r>
+        <w:t>27. Benjamini Y, Hochberg Y. Controlling the false discovery rate: a practical and powerful approach to multiple testing. J R Stat Soc B. 1995;57:289–300. doi:10.1111/j.2517-6161.1995.tb02031.x.</w:t>
+      </w:r>
+    </w:p>
+    <w:p>
+      <w:r>
+        <w:t>28. Collins GS, et al. TRIPOD+AI statement: updated guidance for reporting clinical prediction models that use regression or machine learning methods. BMJ. 2024;385:e078378. doi:10.1136/bmj-2023-078378.</w:t>
+      </w:r>
+    </w:p>
+    <w:p>
+      <w:r>
+        <w:t>29. Liu J, et al. An integrated TCGA pan-cancer clinical data resource to drive high-quality survival outcome analytics. Cell. 2018;173:400–416.e11. doi:10.1016/j.cell.2018.02.052.</w:t>
+      </w:r>
+    </w:p>
+    <w:p>
+      <w:r>
+        <w:t>30. TITAN prediction atlas repository. GitHub. https://github.com/tkcaccia/titan-prediction. Accessed 15 Aug 2026.</w:t>
       </w:r>
     </w:p>
     <w:sectPr>
@@ -2131,7 +3123,7 @@
         <w:color w:val="64748B"/>
         <w:sz w:val="16"/>
       </w:rPr>
-      <w:t>Patient-level TITAN molecular and immune atlas</w:t>
+      <w:t>TCGA TITAN molecular and immune discovery atlas</w:t>
     </w:r>
   </w:p>
 </w:hdr>

</xml_diff>

<commit_message>
Revise authorship figures and manuscript structure
</commit_message>
<xml_diff>
--- a/manuscript/manuscript_JTM_patient_level_TITAN.docx
+++ b/manuscript/manuscript_JTM_patient_level_TITAN.docx
@@ -34,13 +34,28 @@
         <w:rPr>
           <w:b/>
         </w:rPr>
+        <w:t>Martin Ocharo</w:t>
+      </w:r>
+      <w:r>
+        <w:rPr>
+          <w:vertAlign w:val="superscript"/>
+        </w:rPr>
+        <w:t>1,*</w:t>
+      </w:r>
+      <w:r>
+        <w:t xml:space="preserve">, </w:t>
+      </w:r>
+      <w:r>
+        <w:rPr>
+          <w:b/>
+        </w:rPr>
         <w:t>Moussa Kassim</w:t>
       </w:r>
       <w:r>
         <w:rPr>
           <w:vertAlign w:val="superscript"/>
         </w:rPr>
-        <w:t>1,2,*</w:t>
+        <w:t>1,2</w:t>
       </w:r>
       <w:r>
         <w:t xml:space="preserve">, </w:t>
@@ -280,7 +295,7 @@
     </w:p>
     <w:p>
       <w:r>
-        <w:t>TITAN is a multimodal whole-slide foundation model pretrained on 335,645 slides with visual self-supervision and vision–language alignment [16]. The published Mass-340K pretraining corpus explicitly excluded TCGA and PANDA; TCGA was instead used for downstream evaluation of the pretrained model. The present work therefore has no reported TCGA pretraining overlap, but it is a secondary analysis of a cohort previously used to benchmark TITAN and is not independent external validation. We use its fixed 768-dimensional slide representation with PLS, a latent-variable method suited to correlated high-dimensional predictors [17,18]. The scientific question is endpoint discovery, not a comparison of PLS against alternative machine-learning algorithms.</w:t>
+        <w:t>TITAN is a multimodal whole-slide foundation model pretrained on 335,645 slides with visual self-supervision and vision–language alignment [16]. The published Mass-340K pretraining corpus explicitly excluded TCGA and PANDA; TCGA was instead used for downstream evaluation of the pretrained model. The present work therefore has no reported TCGA pretraining overlap, but it is a secondary analysis of a cohort previously used to benchmark TITAN and is not independent external validation. We use its fixed 768-dimensional slide representation with PLS, a latent-variable method suited to correlated high-dimensional predictors [17,18].</w:t>
       </w:r>
     </w:p>
     <w:p>
@@ -415,7 +430,7 @@
     </w:p>
     <w:p>
       <w:r>
-        <w:t>For each cancer–endpoint pair, five outer folds estimated performance and five inner folds selected 1–10 PLS components. Scaling and component selection were learned from training patients only. All primary, permutation, repeated, sensitivity, PLS1–PLS2 and final-model fits used CPU rSVD exclusively, with 10 oversampling vectors, two power iterations and explicit seeds; IRLBA was not used. Continuous performance was out-of-fold Q², with RMSE and Spearman correlation secondary. Binary models supplied PLS latent scores to ridge-stabilised LDA; balanced accuracy was primary and AUROC from continuous LDA scores was secondary in repeated validation.</w:t>
+        <w:t>For each cancer–endpoint pair, five outer folds estimated performance and five inner folds selected 1–10 PLS components. Scaling and component selection were learned from training patients only. All primary, permutation, repeated, sensitivity, PLS1–PLS2 and final-model fits used CPU rSVD with 10 oversampling vectors, two power iterations and explicit seeds. Continuous performance was out-of-fold Q², with RMSE and Spearman correlation secondary. Binary models supplied PLS latent scores to ridge-stabilised LDA; balanced accuracy was primary and AUROC from continuous LDA scores was secondary in repeated validation.</w:t>
       </w:r>
     </w:p>
     <w:p>
@@ -1837,7 +1852,7 @@
         <w:jc w:val="center"/>
       </w:pPr>
       <w:r>
-        <w:t>Figure 4. Examples comparing observed outcomes with repeated nested-cross-validation predictions. Panels show the screen-positive continuous and binary models with the largest corresponding mean repeated-CV performance and are illustrative rather than confirmatory. The continuous panel plots each patient's observed value against the mean of five held-out predictions. Because independently fitted LDA scores need not share a raw scale, the binary panel standardizes held-out scores within each repeat before averaging them by patient and displaying them by observed class; repeat-specific AUROCs use untransformed scores. Lines and summaries describe internal TCGA validation, not external calibration.</w:t>
+        <w:t>Figure 4. Examples comparing observed outcomes with held-out predictions. Panel A shows the strongest primary patient-level nested-CV continuous result (TGCT TGF-beta Response); each point is one patient's observed value and genuine held-out prediction. Panel B shows the binary model with the largest mean repeated-CV balanced accuracy. Because independently fitted LDA scores need not share a raw scale, held-out scores are standardized within repeat before patient-level averaging for display; repeat-specific AUROCs use untransformed scores. These deliberately strong examples are illustrative, selection-conditioned internal TCGA results rather than external validation or calibration.</w:t>
       </w:r>
     </w:p>
     <w:p>
@@ -1905,7 +1920,7 @@
                 <w:b/>
                 <w:sz w:val="17"/>
               </w:rPr>
-              <w:t>Metric 1</w:t>
+              <w:t>Q² or Se/Sp (95% CI)</w:t>
             </w:r>
           </w:p>
         </w:tc>
@@ -1919,7 +1934,7 @@
                 <w:b/>
                 <w:sz w:val="17"/>
               </w:rPr>
-              <w:t>Metric 2</w:t>
+              <w:t>RMSE or BA (95% CI)</w:t>
             </w:r>
           </w:p>
         </w:tc>
@@ -1933,7 +1948,7 @@
                 <w:b/>
                 <w:sz w:val="17"/>
               </w:rPr>
-              <w:t>Metric 3</w:t>
+              <w:t>Spearman or AUROC (95% CI)</w:t>
             </w:r>
           </w:p>
         </w:tc>
@@ -2593,19 +2608,6 @@
         <w:pStyle w:val="Heading2"/>
       </w:pPr>
       <w:r>
-        <w:t>Liver and pancreatic cancer examples</w:t>
-      </w:r>
-    </w:p>
-    <w:p>
-      <w:r>
-        <w:t>LIHC yielded 10 continuous candidates: LIHC–Proliferation (0.434); LIHC–Leukocyte Fraction (0.422); LIHC–Wound Healing (0.385); LIHC–Macrophage Regulation (0.378); LIHC–Lymphocyte Infiltration Signature Score (0.349); 8 binary candidates: LIHC–CTNNB1 [mutation] (0.668); LIHC–Cell Cycle [pathway] (0.644); LIHC–WNT [pathway] (0.634); LIHC–TP53 [mutation] (0.633); LIHC–BAP1 [mutation] (0.633); LIHC–TP53 [pathway] (0.623). PAAD yielded no continuous pair was screen-positive; 1 binary candidates: PAAD–TP53 [mutation] (0.619). These are discovery results; the global-correction status of every candidate is reported in the machine-readable atlas.</w:t>
-      </w:r>
-    </w:p>
-    <w:p>
-      <w:pPr>
-        <w:pStyle w:val="Heading2"/>
-      </w:pPr>
-      <w:r>
         <w:t>Site and multiple-slide sensitivity</w:t>
       </w:r>
     </w:p>
@@ -2676,14 +2678,6 @@
       </w:r>
     </w:p>
     <w:p>
-      <w:pPr>
-        <w:pStyle w:val="Heading2"/>
-      </w:pPr>
-      <w:r>
-        <w:t>Previously reported and atlas-nominated predictors</w:t>
-      </w:r>
-    </w:p>
-    <w:p>
       <w:r>
         <w:t>The relevant literature spans substantially different validation settings and metrics. For MSI, Kather et al. reported external AUROCs of 0.84 (95% CI 0.72–0.92) in DACHS colorectal cancer and 0.69 (0.52–0.82) in an external gastric cohort, whereas Echle et al. reported an external dMMR AUROC of 0.96 in a 771-case cohort [2,3]. For fusion prediction, Dadhania et al. reported ERG AUROCs of 0.82–0.85, and Mayer et al. reported 100% sensitivity with 100% and 98.6% specificity for ALK and ROS1, respectively, in a small external set [9,10]. Saldanha et al. externally evaluated mutation models in CPTAC, Bergstrom et al. reported external breast HRD AUROC 0.76 (0.71–0.82), and HistoTME reported mean external cell-composition correlation 0.50 and immunotherapy-response AUROC 0.75 (0.61–0.88) [11,14,15]. These externally tested results set a stronger validation standard than the internal TCGA estimates presented here; metric, endpoint and cohort differences preclude claims of direct superiority.</w:t>
       </w:r>
@@ -2714,16 +2708,8 @@
       </w:r>
     </w:p>
     <w:p>
-      <w:pPr>
-        <w:pStyle w:val="Heading2"/>
-      </w:pPr>
       <w:r>
-        <w:t>Practical contribution of the PLS framework</w:t>
-      </w:r>
-    </w:p>
-    <w:p>
-      <w:r>
-        <w:t>The contribution of TITAN plus PLS is a uniform, auditable screen over many prespecified outcomes using one fixed representation, with one-at-a-time PLS–LDA retained for the prespecified individual binary endpoints and PLS2 examined secondarily for correlated inflammatory panels. This study was not designed to compare PLS with elastic-net, convolutional or other machine-learning approaches, and no claim of algorithmic superiority is made.</w:t>
+        <w:t>The contribution of TITAN plus PLS is a uniform, auditable screen over many prespecified outcomes using one fixed pretrained representation, with one-at-a-time PLS–LDA retained for the prespecified individual binary endpoints and PLS2 examined secondarily for correlated inflammatory panels.</w:t>
       </w:r>
     </w:p>
     <w:p>
@@ -2744,11 +2730,6 @@
     <w:p>
       <w:r>
         <w:t>The repeated nested-CV estimates and patient-cluster bootstrap intervals are also conditional on selecting endpoints in this same TCGA atlas. They quantify partition and sampling variability for highlighted candidates but do not correct winner's-curse optimism from highlighting the strongest screen results. Consequently, the intervals should not be read as external-performance intervals; locked-model evaluation in an untouched cohort is required for unbiased transportability assessment.</w:t>
-      </w:r>
-    </w:p>
-    <w:p>
-      <w:r>
-        <w:t>rSVD is a seeded stochastic approximation. The use of 10 oversampling vectors, two power iterations, explicit seeds and five repeated nested validations makes the chosen computational path auditable and exposes seed-plus-partition variability, but it does not establish equivalence to another decomposition method. Consistent with the prespecified scope, no IRLBA comparison was performed.</w:t>
       </w:r>
     </w:p>
     <w:p>

</xml_diff>

<commit_message>
Add TITANPred deployment examples and manuscript figure
</commit_message>
<xml_diff>
--- a/manuscript/manuscript_JTM_patient_level_TITAN.docx
+++ b/manuscript/manuscript_JTM_patient_level_TITAN.docx
@@ -476,7 +476,7 @@
     </w:p>
     <w:p>
       <w:r>
-        <w:t>Analyses used R 4.6.0 and fastPLS 0.99.20 (Git commit dcf45cc). MC3 objects were loaded with TCGAmutations 0.4.0 from the GitHub source pinned in the software manifest. Version-controlled code, source manifests, released target catalogues, out-of-fold prediction summaries, figures, model registry and inference example are organized in the companion repository [30]. Local checkpoint and fitted-model objects are generated by the scripts but are not claimed as publicly redistributed because TITAN-derived artifacts remain subject to upstream terms. No independent cohort with compatible TITAN features and the required labels was included; all performance estimates remain internal to TCGA.</w:t>
+        <w:t>Analyses used R 4.6.0 and fastPLS 0.99.20 (Git commit dcf45cc). MC3 objects were loaded with TCGAmutations 0.4.0 from the GitHub source pinned in the software manifest. Version-controlled code, source manifests, released target catalogues, out-of-fold prediction summaries, figures and model registry are organized in the companion analysis repository [30]. A separate GPL-3 R package bundles all fitted models, their SHA-256 registry, reference distributions, inference interface and report template [32]. The bundled artifacts contain learned parameters and training-range summaries but no patient-level training rows. No independent cohort with compatible TITAN features and the required labels was included; all performance estimates remain internal to TCGA.</w:t>
       </w:r>
     </w:p>
     <w:p>
@@ -2666,6 +2666,72 @@
     </w:p>
     <w:p>
       <w:pPr>
+        <w:pStyle w:val="Heading2"/>
+      </w:pPr>
+      <w:r>
+        <w:t>Reusable multi-endpoint inference and COAD illustration</w:t>
+      </w:r>
+    </w:p>
+    <w:p>
+      <w:r>
+        <w:t>The TITANPred R package exposes 323 fitted models (219 continuous and 104 binary) across 27 cancers [32]. Users supply a cancer vector and correctly named 768-dimensional TITAN features; the interface applies every bundled model available for that cancer. Repeated patient identifiers are mean-pooled before inference. Continuous outputs retain source endpoint units and are positioned against repeated out-of-fold reference distributions; binary outputs comprise the fitted PLS-LDA class and uncalibrated LDA score. A single-sample report renders continuous percentiles as a radar profile and displays binary calls with provenance and out-of-distribution diagnostics.</w:t>
+      </w:r>
+    </w:p>
+    <w:p>
+      <w:r>
+        <w:t>COAD was chosen as a deployment illustration because colorectal cancer, of which colon adenocarcinoma is a major component, accounted for 1,926,425 new cases worldwide in 2022 [31], and COAD contributed 20 supported models (10 continuous and 10 binary). Its APC, TP53, KRAS and BRAF mutation models were absent from the prespecified exact-pair literature crosswalk, which nominates them for follow-up without establishing bibliographic novelty. For visualization, the two COAD patients with the greatest Euclidean separation across the complete continuous prediction-percentile profile were selected. Example A was MSI-, mutation-rate- and lymphocyte/TIL-high but aneuploidy-low, whereas example B was aneuploidy-high but MSI- and immune-low (Figure 7). This selection deliberately accentuates contrast and is an internal deployment demonstration, not a validation analysis or estimate of clinical prevalence.</w:t>
+      </w:r>
+    </w:p>
+    <w:p>
+      <w:pPr>
+        <w:jc w:val="center"/>
+      </w:pPr>
+      <w:r>
+        <w:drawing>
+          <wp:inline xmlns:a="http://schemas.openxmlformats.org/drawingml/2006/main" xmlns:pic="http://schemas.openxmlformats.org/drawingml/2006/picture">
+            <wp:extent cx="6126480" cy="3341716"/>
+            <wp:docPr id="7" name="Picture 7"/>
+            <wp:cNvGraphicFramePr>
+              <a:graphicFrameLocks noChangeAspect="1"/>
+            </wp:cNvGraphicFramePr>
+            <a:graphic>
+              <a:graphicData uri="http://schemas.openxmlformats.org/drawingml/2006/picture">
+                <pic:pic>
+                  <pic:nvPicPr>
+                    <pic:cNvPr id="0" name="Figure7_COAD_TITANPred_examples.png"/>
+                    <pic:cNvPicPr/>
+                  </pic:nvPicPr>
+                  <pic:blipFill>
+                    <a:blip r:embed="rId17"/>
+                    <a:stretch>
+                      <a:fillRect/>
+                    </a:stretch>
+                  </pic:blipFill>
+                  <pic:spPr>
+                    <a:xfrm>
+                      <a:off x="0" y="0"/>
+                      <a:ext cx="6126480" cy="3341716"/>
+                    </a:xfrm>
+                    <a:prstGeom prst="rect"/>
+                  </pic:spPr>
+                </pic:pic>
+              </a:graphicData>
+            </a:graphic>
+          </wp:inline>
+        </w:drawing>
+      </w:r>
+    </w:p>
+    <w:p>
+      <w:pPr>
+        <w:pStyle w:val="Caption"/>
+        <w:jc w:val="center"/>
+      </w:pPr>
+      <w:r>
+        <w:t>Figure 7. TITANPred deployment illustration in COAD. Panel A compares continuous prediction percentiles for the two TCGA patients with maximal separation across the complete COAD continuous profile; percentiles are relative to repeated out-of-fold TCGA predictions, not clinical reference ranges. Panel B shows the corresponding binary PLS-LDA calls and LDA-score percentiles; filled points denote positive calls, and scores are not calibrated probabilities. Examples were selected to demonstrate report contrast and do not provide external validation.</w:t>
+      </w:r>
+    </w:p>
+    <w:p>
+      <w:pPr>
         <w:pStyle w:val="Heading1"/>
       </w:pPr>
       <w:r>
@@ -2714,7 +2780,7 @@
     </w:p>
     <w:p>
       <w:r>
-        <w:t>A further practical feature is data-minimising model portability. Preprocessing values, latent weights and coefficients are sufficient for continuous prediction, with compact LDA parameters added for binary classification. External researchers can therefore apply a fitted model to correctly ordered TITAN features without receiving the original patient embeddings or outcomes. This reduces the patient-level data that must be distributed, although it does not itself confer privacy, overcome TITAN licensing restrictions or establish transportability.</w:t>
+        <w:t>A further practical feature is data-minimising model portability. Preprocessing values, latent weights and coefficients are sufficient for continuous prediction, with compact LDA parameters added for binary classification. TITANPred publicly distributes these fitted objects and applies every cancer-matched model to correctly ordered TITAN features without distributing the original patient embeddings or outcomes [32]. This reduces the patient-level data that must be exchanged, although it does not itself confer privacy, satisfy local governance requirements or establish transportability. The COAD examples show how the package summarizes divergent multi-endpoint profiles; because the examples were selected for maximal separation within TCGA and were predicted by full-cohort fits, they must not be interpreted as new accuracy evidence.</w:t>
       </w:r>
     </w:p>
     <w:p>
@@ -2752,7 +2818,7 @@
     </w:p>
     <w:p>
       <w:r>
-        <w:t>Mean-pooled TITAN representations enable a cancer-specific TCGA discovery atlas of selected immune, mutation, pathway, MSI, aneuploidy and fusion phenotypes. Compact fitted PLS and PLS–LDA models can be applied without distributing patient-level training data, providing a practical route to external research validation when licensing permits. The resource prioritises hypotheses and exposes screen-negative targets, but remains internally validated and non-clinical.</w:t>
+        <w:t>Mean-pooled TITAN representations enable a cancer-specific TCGA discovery atlas of selected immune, mutation, pathway, MSI, aneuploidy and fusion phenotypes. The public TITANPred package applies all cancer-matched fitted PLS and PLS–LDA models without distributing patient-level training data, providing a practical route to independent external research validation. The resource prioritises hypotheses and exposes screen-negative targets, but remains internally validated and non-clinical.</w:t>
       </w:r>
     </w:p>
     <w:p>
@@ -2838,7 +2904,7 @@
     </w:p>
     <w:p>
       <w:r>
-        <w:t>The analysis used the public TITAN TCGA feature artifact (TCGA_TITAN_features.pkl) through its supplied 768-feature CSV export. TCGA molecular data and the cited public supplementary records remain available from their original repositories. Exact source locations, access information and SHA-256 checksums are recorded in the companion repository [30]. Controlled-access whole-slide images are not redistributed. Model-object redistribution is subject to TITAN's upstream terms.</w:t>
+        <w:t>The analysis used the public TITAN TCGA feature artifact (TCGA_TITAN_features.pkl) through its supplied 768-feature CSV export. TCGA molecular data and the cited public supplementary records remain available from their original repositories. Exact source locations, access information and SHA-256 checksums are recorded in the companion analysis repository [30]. Controlled-access whole-slide images are not redistributed. All 323 fitted research models, their registry, inference code and HTML/PDF report template are distributed in the separate TITANPred repository [32].</w:t>
       </w:r>
     </w:p>
     <w:p>
@@ -3062,6 +3128,16 @@
     <w:p>
       <w:r>
         <w:t>30. TITAN prediction atlas repository. GitHub. https://github.com/tkcaccia/titan-prediction. Accessed 15 Aug 2026.</w:t>
+      </w:r>
+    </w:p>
+    <w:p>
+      <w:r>
+        <w:t>31. International Agency for Research on Cancer. Global Cancer Observatory: GLOBOCAN 2022 world fact sheet. Lyon: IARC; 2024. https://gco.iarc.who.int/media/globocan/factsheets/populations/900-world-fact-sheet.pdf. Accessed 16 Aug 2026.</w:t>
+      </w:r>
+    </w:p>
+    <w:p>
+      <w:r>
+        <w:t>32. TITANPred R package and fitted-model repository. GitHub. https://github.com/tkcaccia/TITANPred. Accessed 16 Aug 2026.</w:t>
       </w:r>
     </w:p>
     <w:sectPr>

</xml_diff>

<commit_message>
Attach COAD reports as separate supplementary files
</commit_message>
<xml_diff>
--- a/manuscript/manuscript_JTM_patient_level_TITAN.docx
+++ b/manuscript/manuscript_JTM_patient_level_TITAN.docx
@@ -515,7 +515,7 @@
     </w:p>
     <w:p>
       <w:r>
-        <w:t>Supplementary methods, Tables S1–S12, Figures S1–S2 and the machine-readable-file inventory are provided in Additional file 1.</w:t>
+        <w:t>Supplementary methods, Tables S1–S12, Figures S1–S2 and the machine-readable-file inventory are provided in Additional file 1. The two illustrative single-sample TITANPred reports are supplied separately as Additional files 2 and 3.</w:t>
       </w:r>
     </w:p>
     <w:p>
@@ -2993,12 +2993,22 @@
         <w:pStyle w:val="Heading1"/>
       </w:pPr>
       <w:r>
-        <w:t>Additional file</w:t>
+        <w:t>Additional files</w:t>
       </w:r>
     </w:p>
     <w:p>
       <w:r>
         <w:t>Additional file 1 (.docx): Supplementary material. Contains Supplementary Methods, Tables S1–S12, Figures S1–S2 and an inventory of the companion machine-readable result files.</w:t>
+      </w:r>
+    </w:p>
+    <w:p>
+      <w:r>
+        <w:t>Additional file 2 (.pdf): COAD example A TITANPred single-sample report. Illustrative full-cohort research-model predictions for the COAD example with high MSI, mutation-rate and immune-feature predictions and low aneuploidy prediction.</w:t>
+      </w:r>
+    </w:p>
+    <w:p>
+      <w:r>
+        <w:t>Additional file 3 (.pdf): COAD example B TITANPred single-sample report. Illustrative full-cohort research-model predictions for the contrasting COAD example with high aneuploidy prediction and lower MSI and immune-feature predictions.</w:t>
       </w:r>
     </w:p>
     <w:p>

</xml_diff>

<commit_message>
Report COAD example IDs and raw predictions
</commit_message>
<xml_diff>
--- a/manuscript/manuscript_JTM_patient_level_TITAN.docx
+++ b/manuscript/manuscript_JTM_patient_level_TITAN.docx
@@ -2703,7 +2703,7 @@
     </w:p>
     <w:p>
       <w:r>
-        <w:t>The TITANPred R package exposes 323 fitted models (219 continuous and 104 binary) across 27 cancers [32]. Users supply a cancer vector and correctly named 768-dimensional TITAN features; the interface applies every bundled model available for that cancer. Repeated patient identifiers are mean-pooled before inference. Continuous outputs retain source endpoint units and are positioned against repeated out-of-fold reference distributions; binary outputs comprise the fitted PLS-LDA class and uncalibrated LDA score. A single-sample report renders continuous percentiles as a radar profile and displays binary calls with provenance and out-of-distribution diagnostics.</w:t>
+        <w:t>The TITANPred R package exposes 323 fitted models (219 continuous and 104 binary) across 27 cancers [32]. Users supply a cancer vector and correctly named 768-dimensional TITAN features; the interface applies every bundled model available for that cancer. Repeated patient identifiers are mean-pooled before inference. Continuous outputs retain source endpoint units and are positioned against repeated out-of-fold reference distributions; binary outputs comprise the fitted PLS-LDA class and uncalibrated LDA score. A single-sample report renders each continuous endpoint as an exact reference-percentile dot with its raw prediction and displays binary calls with provenance and out-of-distribution diagnostics.</w:t>
       </w:r>
     </w:p>
     <w:p>
@@ -2756,7 +2756,7 @@
         <w:jc w:val="center"/>
       </w:pPr>
       <w:r>
-        <w:t>Figure 7. TITANPred deployment illustration in COAD. Panel A compares continuous prediction percentiles for the two TCGA patients with maximal separation across the complete COAD continuous profile; percentiles are relative to repeated out-of-fold TCGA predictions, not clinical reference ranges. Panel B shows the corresponding binary PLS-LDA calls and LDA-score percentiles; filled points denote positive calls, and scores are not calibrated probabilities. Examples were selected to demonstrate report contrast and do not provide external validation.</w:t>
+        <w:t>Figure 7. TITANPred deployment illustration in COAD. Panel A compares endpoint-level continuous predictions for TCGA-AD-6964 (example A) and TCGA-5M-AAT5 (example B), the two TCGA patients with maximal separation across the complete COAD continuous profile. Point positions are percentiles relative to repeated out-of-fold TCGA predictions, not clinical reference ranges; labels beside points give the original model predictions in source endpoint units. Panel B shows the corresponding binary PLS-LDA calls and LDA-score percentiles; filled points denote positive calls, and scores are not calibrated probabilities. Examples were selected to demonstrate report contrast and do not provide external validation.</w:t>
       </w:r>
     </w:p>
     <w:p>
@@ -3003,12 +3003,12 @@
     </w:p>
     <w:p>
       <w:r>
-        <w:t>Additional file 2 (.pdf): COAD example A TITANPred single-sample report. Illustrative full-cohort research-model predictions for the COAD example with high MSI, mutation-rate and immune-feature predictions and low aneuploidy prediction.</w:t>
+        <w:t>Additional file 2 (.pdf): COAD example A (TCGA-AD-6964) TITANPred single-sample report. Illustrative full-cohort research-model predictions for the COAD example with high MSI, mutation-rate and immune-feature predictions and low aneuploidy prediction.</w:t>
       </w:r>
     </w:p>
     <w:p>
       <w:r>
-        <w:t>Additional file 3 (.pdf): COAD example B TITANPred single-sample report. Illustrative full-cohort research-model predictions for the contrasting COAD example with high aneuploidy prediction and lower MSI and immune-feature predictions.</w:t>
+        <w:t>Additional file 3 (.pdf): COAD example B (TCGA-5M-AAT5) TITANPred single-sample report. Illustrative full-cohort research-model predictions for the contrasting COAD example with high aneuploidy prediction and lower MSI and immune-feature predictions.</w:t>
       </w:r>
     </w:p>
     <w:p>

</xml_diff>

<commit_message>
Correct continuous validation and address manuscript audit
</commit_message>
<xml_diff>
--- a/manuscript/manuscript_JTM_patient_level_TITAN.docx
+++ b/manuscript/manuscript_JTM_patient_level_TITAN.docx
@@ -279,7 +279,7 @@
         <w:t xml:space="preserve">Results. </w:t>
       </w:r>
       <w:r>
-        <w:t>Within-cancer screening identified 219 continuous and 104 binary higher- or moderate-effect candidates. Highlighted repeated-CV results included BRCA–Wound Healing (Q² -0.169, 95% bootstrap interval -0.196–-0.148; RMSE 0.174, Spearman -0.002) and LGG–TP53 (sensitivity 0.839, specificity 0.885, balanced accuracy 0.862, 95% bootstrap interval 0.833–0.888; AUROC 0.908). Under the multiplicity sensitivity, 219 continuous and 39 cancer–mutation pairs passed the stricter across-cancer correction; its attainable q-values in large families were limited by the 0.001 empirical-p resolution. Repeated nested validation, site-grouped folds and first-slide sensitivity quantified uncertainty, centre dependence and slide-aggregation dependence.</w:t>
+        <w:t>Within-cancer screening identified 219 continuous and 104 binary higher- or moderate-effect candidates. Highlighted repeated-CV results included TGCT–TGF-beta Response (Q² 0.670, 95% bootstrap interval 0.573–0.741; RMSE 0.303, Spearman 0.791) and LGG–TP53 (sensitivity 0.839, specificity 0.885, balanced accuracy 0.862, 95% bootstrap interval 0.833–0.888; AUROC 0.908). Under the multiplicity sensitivity, 219 continuous and 39 cancer–mutation pairs passed the stricter across-cancer correction; its attainable q-values in large families were limited by the 0.001 empirical-p resolution. Site grouping reduced 83/323 candidates (25.7%) below the original effect threshold. In a selection-conditioned 24-model benchmark, median ridge-minus-PLS differences were 0.007 balanced accuracy and 0.014 Q², showing no uniform PLS advantage.</w:t>
       </w:r>
     </w:p>
     <w:p>
@@ -320,6 +320,11 @@
     <w:p>
       <w:r>
         <w:t>Routine haematoxylin-and-eosin sections reflect phenotypic consequences of tumour genotype and the immune microenvironment. Coudray and colleagues established mutation prediction from lung histology [1]. Subsequent work predicted microsatellite instability, including externally validated colorectal models [2,3]; extended mutation and multi-omic screening across TCGA cancers [4,5,8,11,13]; inferred RNA expression [6,12]; identified tissue-source-site bias [7]; detected gene fusions [9,10]; estimated homologous-recombination deficiency [14]; and characterised tumour-microenvironment phenotypes [15]. Collectively, these studies establish biological plausibility while also showing that performance depends on endpoint, disease, cohort and validation design.</w:t>
+      </w:r>
+    </w:p>
+    <w:p>
+      <w:r>
+        <w:t>However, the published landscape remains fragmented across selected cancers, endpoint classes, representations and reporting conventions. What is missing is a single patient-level, reusable discovery atlas that applies one fixed pretrained whole-slide representation and one transparent validation framework to many individual mutation, immune, pathway, instability, aneuploidy and fusion endpoints while retaining negative results, class counts, uncertainty and deployable fitted models. This study addresses that gap; it does not claim that the individual endpoint classes themselves are unprecedented.</w:t>
       </w:r>
     </w:p>
     <w:p>
@@ -431,7 +436,7 @@
     </w:p>
     <w:p>
       <w:r>
-        <w:t>Predictors were the 768 fixed pretrained TITAN dimensions released for the TCGA slides [16]; no slide pixels were reprocessed and TITAN weights were not fine-tuned in this study. Continuous outcomes comprised 39 immune/inflammatory measures and 11 genomic-context scores from Thorsson et al. [19], three aneuploidy burdens from Taylor et al. [20], log-transformed fusion burden from Gao et al. [21], and MANTIS/MSIsensor scores from Bonneville et al. and the cBioPortal TCGA PanCancer Atlas files [22,23]. Binary outcomes comprised qualifying protein-altering PASS mutations in tissue-specific consensus cancer genes from MC3 and Bailey et al. [24,25], ten oncogenic-pathway alteration indicators [26], genome doubling [20], any called fusion and eligible recurrent fusion pairs [21], and MSI-H definitions at MANTIS &gt;0.4 and a strict &gt;0.6 sensitivity threshold [22]. Protein-altering classes were missense, nonsense, nonstop, splice-site and translation-start mutations plus frameshift and in-frame insertions or deletions; their inclusion is recorded in a cancer-level variant-class audit. A mutation target denotes a qualifying alteration in a cancer gene; it does not assert that every allele is a functionally validated driver.</w:t>
+        <w:t>Predictors were the 768 fixed pretrained TITAN dimensions released for the TCGA slides [16]. The official gated artifact, TCGA_TITAN_features.pkl, was downloaded from https://huggingface.co/MahmoodLab/TITAN/blob/main/TCGA_TITAN_features.pkl after accepting the upstream terms and converted with the repository script to filename,titan_000,…,titan_767 CSV format; its source and converted-file SHA-256 hashes are retained in the provenance record. No slide pixels were reprocessed and TITAN weights were not fine-tuned in this study. Continuous outcomes comprised 39 immune/inflammatory measures and 11 genomic-context scores from Thorsson et al. [19], three aneuploidy burdens from Taylor et al. [20], log-transformed fusion burden from Gao et al. [21], and MANTIS/MSIsensor scores from Bonneville et al. and the cBioPortal TCGA PanCancer Atlas files [22,23]. Binary outcomes comprised qualifying protein-altering PASS mutations in tissue-specific consensus cancer genes from MC3 and Bailey et al. [24,25], ten oncogenic-pathway alteration indicators [26], genome doubling [20], any called fusion and eligible recurrent fusion pairs [21], and MSI-H definitions at MANTIS &gt;0.4 and a strict &gt;0.6 sensitivity threshold [22]. Protein-altering classes were missense, nonsense, nonstop, splice-site and translation-start mutations plus frameshift and in-frame insertions or deletions; their inclusion is recorded in a cancer-level variant-class audit. A mutation target denotes a qualifying alteration in a cancer gene; it does not assert that every allele is a functionally validated driver.</w:t>
       </w:r>
     </w:p>
     <w:p>
@@ -469,6 +474,11 @@
     </w:p>
     <w:p>
       <w:r>
+        <w:t>As a secondary algorithmic benchmark, the 24 manuscript-highlighted models were refitted on the same five repeated outer partitions using ridge-penalised Gaussian regression for continuous endpoints and ridge logistic regression for binary endpoints. Ridge hyperparameters were selected inside each outer training set; binary operating thresholds maximised balanced accuracy using inner out-of-fold probabilities. The primary paired differences were ridge-minus-PLS Q² and balanced accuracy, with AUROC or Spearman correlation retained as secondary metrics. We report the magnitude, interquartile range and 95% paired-repeat interval rather than declaring a winner from counts alone. Because models were selected for this benchmark after the PLS screen, it is a conditional sensitivity analysis and cannot establish atlas-wide algorithmic superiority. Ridge was chosen as a simple linear baseline whose fitted coefficients can be exported without retaining training embeddings; nonlinear kernel predictors that require training observations or landmarks at inference did not satisfy that deployment constraint.</w:t>
+      </w:r>
+    </w:p>
+    <w:p>
+      <w:r>
         <w:t>No class under-sampling, over-sampling or synthetic augmentation was used. LDA used the observed training-fold class priors and returned a class plus an uncalibrated discriminant score, not a probability or clinical-risk threshold. Outcome tables were constructed independently of TITAN feature processing and joined only after patient-level aggregation.</w:t>
       </w:r>
     </w:p>
@@ -488,6 +498,11 @@
     <w:p>
       <w:r>
         <w:t>Screen-positive models were repeated under five independently seeded nested-CV partitions; each repeat seed governed both fold construction and rSVD. Sensitivity, specificity, balanced accuracy and AUROC were calculated within each repeat for binary endpoints; Q², RMSE and Spearman correlation were calculated within each repeat for continuous endpoints. Reported repeated-CV point estimates were the arithmetic mean of the five repeat-specific metrics, so LDA scores from independently fitted repeats were never pooled onto an assumed common scale. For highlighted models, 1,000 patient-cluster bootstrap resamples retained all five held-out predictions for each sampled patient, recalculated metrics within repeat and then averaged them; percentile 2.5th and 97.5th quantiles formed the 95% intervals. Site-grouped validation assigned all patients sharing a two-character TCGA tissue-source-site code to the same outer fold, preventing a site from appearing in both training and test partitions for that fold. A sensitivity analysis replaced each mean-pooled vector with the lexicographically first eligible diagnostic slide while preserving patients and seeds. Full-data research models were tuned by ten-fold CV and saved with feature order and checksum, training ranges, aggregation rule, endpoint transformation and output units, class coding and priors, decision rule, calibration status, class counts, exact software version and commit, computation backend, rSVD controls, external-validation status and intended-use metadata.</w:t>
+      </w:r>
+    </w:p>
+    <w:p>
+      <w:r>
+        <w:t>TITANPred retains the binary LDA score but does not convert it to a probability. In reports, its position is labelled 'TCGA out-of-fold score rank (not probability)' rather than percentile or risk, and is displayed beside total training n, positive and negative counts, prevalence, repeated-CV balanced accuracy and AUROC. Models with fewer than 50 patients in either class receive an explicit limited-class-size warning; this reporting flag does not change the prespecified 20-per-class eligibility rule. Probability calibration was not added post hoc because it would require an independently evaluated or fully nested calibration procedure, which is not available in this TCGA discovery analysis.</w:t>
       </w:r>
     </w:p>
     <w:p>
@@ -1996,6 +2011,231 @@
               <w:rPr>
                 <w:sz w:val="16"/>
               </w:rPr>
+              <w:t>TGCT–TGF-beta Response</w:t>
+            </w:r>
+          </w:p>
+        </w:tc>
+        <w:tc>
+          <w:tcPr>
+            <w:tcW w:type="dxa" w:w="1949"/>
+            <w:vAlign w:val="center"/>
+          </w:tcPr>
+          <w:p>
+            <w:r>
+              <w:rPr>
+                <w:sz w:val="16"/>
+              </w:rPr>
+              <w:t>continuous</w:t>
+            </w:r>
+          </w:p>
+        </w:tc>
+        <w:tc>
+          <w:tcPr>
+            <w:tcW w:type="dxa" w:w="1949"/>
+            <w:vAlign w:val="center"/>
+          </w:tcPr>
+          <w:p>
+            <w:r>
+              <w:rPr>
+                <w:sz w:val="16"/>
+              </w:rPr>
+              <w:t>0.670 (0.573–0.741)</w:t>
+            </w:r>
+          </w:p>
+        </w:tc>
+        <w:tc>
+          <w:tcPr>
+            <w:tcW w:type="dxa" w:w="1949"/>
+            <w:vAlign w:val="center"/>
+          </w:tcPr>
+          <w:p>
+            <w:r>
+              <w:rPr>
+                <w:sz w:val="16"/>
+              </w:rPr>
+              <w:t>0.303 (0.269–0.337)</w:t>
+            </w:r>
+          </w:p>
+        </w:tc>
+        <w:tc>
+          <w:tcPr>
+            <w:tcW w:type="dxa" w:w="1949"/>
+            <w:vAlign w:val="center"/>
+          </w:tcPr>
+          <w:p>
+            <w:r>
+              <w:rPr>
+                <w:sz w:val="16"/>
+              </w:rPr>
+              <w:t>0.791 (0.713–0.842)</w:t>
+            </w:r>
+          </w:p>
+        </w:tc>
+      </w:tr>
+      <w:tr>
+        <w:trPr>
+          <w:cantSplit/>
+        </w:trPr>
+        <w:tc>
+          <w:tcPr>
+            <w:tcW w:type="dxa" w:w="1949"/>
+            <w:vAlign w:val="center"/>
+          </w:tcPr>
+          <w:p>
+            <w:r>
+              <w:rPr>
+                <w:sz w:val="16"/>
+              </w:rPr>
+              <w:t>THYM–Th17 Cells</w:t>
+            </w:r>
+          </w:p>
+        </w:tc>
+        <w:tc>
+          <w:tcPr>
+            <w:tcW w:type="dxa" w:w="1949"/>
+            <w:vAlign w:val="center"/>
+          </w:tcPr>
+          <w:p>
+            <w:r>
+              <w:rPr>
+                <w:sz w:val="16"/>
+              </w:rPr>
+              <w:t>continuous</w:t>
+            </w:r>
+          </w:p>
+        </w:tc>
+        <w:tc>
+          <w:tcPr>
+            <w:tcW w:type="dxa" w:w="1949"/>
+            <w:vAlign w:val="center"/>
+          </w:tcPr>
+          <w:p>
+            <w:r>
+              <w:rPr>
+                <w:sz w:val="16"/>
+              </w:rPr>
+              <w:t>0.594 (0.455–0.698)</w:t>
+            </w:r>
+          </w:p>
+        </w:tc>
+        <w:tc>
+          <w:tcPr>
+            <w:tcW w:type="dxa" w:w="1949"/>
+            <w:vAlign w:val="center"/>
+          </w:tcPr>
+          <w:p>
+            <w:r>
+              <w:rPr>
+                <w:sz w:val="16"/>
+              </w:rPr>
+              <w:t>1743.443 (1514.535–1979.481)</w:t>
+            </w:r>
+          </w:p>
+        </w:tc>
+        <w:tc>
+          <w:tcPr>
+            <w:tcW w:type="dxa" w:w="1949"/>
+            <w:vAlign w:val="center"/>
+          </w:tcPr>
+          <w:p>
+            <w:r>
+              <w:rPr>
+                <w:sz w:val="16"/>
+              </w:rPr>
+              <w:t>0.738 (0.636–0.811)</w:t>
+            </w:r>
+          </w:p>
+        </w:tc>
+      </w:tr>
+      <w:tr>
+        <w:trPr>
+          <w:cantSplit/>
+        </w:trPr>
+        <w:tc>
+          <w:tcPr>
+            <w:tcW w:type="dxa" w:w="1949"/>
+            <w:vAlign w:val="center"/>
+          </w:tcPr>
+          <w:p>
+            <w:r>
+              <w:rPr>
+                <w:sz w:val="16"/>
+              </w:rPr>
+              <w:t>THCA–Lymphocyte Infiltration Signature Score</w:t>
+            </w:r>
+          </w:p>
+        </w:tc>
+        <w:tc>
+          <w:tcPr>
+            <w:tcW w:type="dxa" w:w="1949"/>
+            <w:vAlign w:val="center"/>
+          </w:tcPr>
+          <w:p>
+            <w:r>
+              <w:rPr>
+                <w:sz w:val="16"/>
+              </w:rPr>
+              <w:t>continuous</w:t>
+            </w:r>
+          </w:p>
+        </w:tc>
+        <w:tc>
+          <w:tcPr>
+            <w:tcW w:type="dxa" w:w="1949"/>
+            <w:vAlign w:val="center"/>
+          </w:tcPr>
+          <w:p>
+            <w:r>
+              <w:rPr>
+                <w:sz w:val="16"/>
+              </w:rPr>
+              <w:t>0.577 (0.511–0.636)</w:t>
+            </w:r>
+          </w:p>
+        </w:tc>
+        <w:tc>
+          <w:tcPr>
+            <w:tcW w:type="dxa" w:w="1949"/>
+            <w:vAlign w:val="center"/>
+          </w:tcPr>
+          <w:p>
+            <w:r>
+              <w:rPr>
+                <w:sz w:val="16"/>
+              </w:rPr>
+              <w:t>0.781 (0.722–0.844)</w:t>
+            </w:r>
+          </w:p>
+        </w:tc>
+        <w:tc>
+          <w:tcPr>
+            <w:tcW w:type="dxa" w:w="1949"/>
+            <w:vAlign w:val="center"/>
+          </w:tcPr>
+          <w:p>
+            <w:r>
+              <w:rPr>
+                <w:sz w:val="16"/>
+              </w:rPr>
+              <w:t>0.742 (0.693–0.786)</w:t>
+            </w:r>
+          </w:p>
+        </w:tc>
+      </w:tr>
+      <w:tr>
+        <w:trPr>
+          <w:cantSplit/>
+        </w:trPr>
+        <w:tc>
+          <w:tcPr>
+            <w:tcW w:type="dxa" w:w="1949"/>
+            <w:vAlign w:val="center"/>
+          </w:tcPr>
+          <w:p>
+            <w:r>
+              <w:rPr>
+                <w:sz w:val="16"/>
+              </w:rPr>
               <w:t>BRCA–Wound Healing</w:t>
             </w:r>
           </w:p>
@@ -2024,7 +2264,7 @@
               <w:rPr>
                 <w:sz w:val="16"/>
               </w:rPr>
-              <w:t>-0.169 (-0.196–-0.148)</w:t>
+              <w:t>0.528 (0.483–0.569)</w:t>
             </w:r>
           </w:p>
         </w:tc>
@@ -2038,7 +2278,7 @@
               <w:rPr>
                 <w:sz w:val="16"/>
               </w:rPr>
-              <w:t>0.174 (0.168–0.181)</w:t>
+              <w:t>0.111 (0.106–0.116)</w:t>
             </w:r>
           </w:p>
         </w:tc>
@@ -2052,232 +2292,7 @@
               <w:rPr>
                 <w:sz w:val="16"/>
               </w:rPr>
-              <w:t>-0.002 (-0.030–0.026)</w:t>
-            </w:r>
-          </w:p>
-        </w:tc>
-      </w:tr>
-      <w:tr>
-        <w:trPr>
-          <w:cantSplit/>
-        </w:trPr>
-        <w:tc>
-          <w:tcPr>
-            <w:tcW w:type="dxa" w:w="1949"/>
-            <w:vAlign w:val="center"/>
-          </w:tcPr>
-          <w:p>
-            <w:r>
-              <w:rPr>
-                <w:sz w:val="16"/>
-              </w:rPr>
-              <w:t>KIRP–Proliferation</w:t>
-            </w:r>
-          </w:p>
-        </w:tc>
-        <w:tc>
-          <w:tcPr>
-            <w:tcW w:type="dxa" w:w="1949"/>
-            <w:vAlign w:val="center"/>
-          </w:tcPr>
-          <w:p>
-            <w:r>
-              <w:rPr>
-                <w:sz w:val="16"/>
-              </w:rPr>
-              <w:t>continuous</w:t>
-            </w:r>
-          </w:p>
-        </w:tc>
-        <w:tc>
-          <w:tcPr>
-            <w:tcW w:type="dxa" w:w="1949"/>
-            <w:vAlign w:val="center"/>
-          </w:tcPr>
-          <w:p>
-            <w:r>
-              <w:rPr>
-                <w:sz w:val="16"/>
-              </w:rPr>
-              <w:t>-0.205 (-0.269–-0.157)</w:t>
-            </w:r>
-          </w:p>
-        </w:tc>
-        <w:tc>
-          <w:tcPr>
-            <w:tcW w:type="dxa" w:w="1949"/>
-            <w:vAlign w:val="center"/>
-          </w:tcPr>
-          <w:p>
-            <w:r>
-              <w:rPr>
-                <w:sz w:val="16"/>
-              </w:rPr>
-              <w:t>0.620 (0.560–0.673)</w:t>
-            </w:r>
-          </w:p>
-        </w:tc>
-        <w:tc>
-          <w:tcPr>
-            <w:tcW w:type="dxa" w:w="1949"/>
-            <w:vAlign w:val="center"/>
-          </w:tcPr>
-          <w:p>
-            <w:r>
-              <w:rPr>
-                <w:sz w:val="16"/>
-              </w:rPr>
-              <w:t>0.010 (-0.040–0.066)</w:t>
-            </w:r>
-          </w:p>
-        </w:tc>
-      </w:tr>
-      <w:tr>
-        <w:trPr>
-          <w:cantSplit/>
-        </w:trPr>
-        <w:tc>
-          <w:tcPr>
-            <w:tcW w:type="dxa" w:w="1949"/>
-            <w:vAlign w:val="center"/>
-          </w:tcPr>
-          <w:p>
-            <w:r>
-              <w:rPr>
-                <w:sz w:val="16"/>
-              </w:rPr>
-              <w:t>BRCA–Proliferation</w:t>
-            </w:r>
-          </w:p>
-        </w:tc>
-        <w:tc>
-          <w:tcPr>
-            <w:tcW w:type="dxa" w:w="1949"/>
-            <w:vAlign w:val="center"/>
-          </w:tcPr>
-          <w:p>
-            <w:r>
-              <w:rPr>
-                <w:sz w:val="16"/>
-              </w:rPr>
-              <w:t>continuous</w:t>
-            </w:r>
-          </w:p>
-        </w:tc>
-        <w:tc>
-          <w:tcPr>
-            <w:tcW w:type="dxa" w:w="1949"/>
-            <w:vAlign w:val="center"/>
-          </w:tcPr>
-          <w:p>
-            <w:r>
-              <w:rPr>
-                <w:sz w:val="16"/>
-              </w:rPr>
-              <w:t>-0.239 (-0.279–-0.206)</w:t>
-            </w:r>
-          </w:p>
-        </w:tc>
-        <w:tc>
-          <w:tcPr>
-            <w:tcW w:type="dxa" w:w="1949"/>
-            <w:vAlign w:val="center"/>
-          </w:tcPr>
-          <w:p>
-            <w:r>
-              <w:rPr>
-                <w:sz w:val="16"/>
-              </w:rPr>
-              <w:t>0.704 (0.679–0.729)</w:t>
-            </w:r>
-          </w:p>
-        </w:tc>
-        <w:tc>
-          <w:tcPr>
-            <w:tcW w:type="dxa" w:w="1949"/>
-            <w:vAlign w:val="center"/>
-          </w:tcPr>
-          <w:p>
-            <w:r>
-              <w:rPr>
-                <w:sz w:val="16"/>
-              </w:rPr>
-              <w:t>0.012 (-0.014–0.040)</w:t>
-            </w:r>
-          </w:p>
-        </w:tc>
-      </w:tr>
-      <w:tr>
-        <w:trPr>
-          <w:cantSplit/>
-        </w:trPr>
-        <w:tc>
-          <w:tcPr>
-            <w:tcW w:type="dxa" w:w="1949"/>
-            <w:vAlign w:val="center"/>
-          </w:tcPr>
-          <w:p>
-            <w:r>
-              <w:rPr>
-                <w:sz w:val="16"/>
-              </w:rPr>
-              <w:t>TGCT–Wound Healing</w:t>
-            </w:r>
-          </w:p>
-        </w:tc>
-        <w:tc>
-          <w:tcPr>
-            <w:tcW w:type="dxa" w:w="1949"/>
-            <w:vAlign w:val="center"/>
-          </w:tcPr>
-          <w:p>
-            <w:r>
-              <w:rPr>
-                <w:sz w:val="16"/>
-              </w:rPr>
-              <w:t>continuous</w:t>
-            </w:r>
-          </w:p>
-        </w:tc>
-        <w:tc>
-          <w:tcPr>
-            <w:tcW w:type="dxa" w:w="1949"/>
-            <w:vAlign w:val="center"/>
-          </w:tcPr>
-          <w:p>
-            <w:r>
-              <w:rPr>
-                <w:sz w:val="16"/>
-              </w:rPr>
-              <w:t>-0.368 (-0.553–-0.247)</w:t>
-            </w:r>
-          </w:p>
-        </w:tc>
-        <w:tc>
-          <w:tcPr>
-            <w:tcW w:type="dxa" w:w="1949"/>
-            <w:vAlign w:val="center"/>
-          </w:tcPr>
-          <w:p>
-            <w:r>
-              <w:rPr>
-                <w:sz w:val="16"/>
-              </w:rPr>
-              <w:t>0.227 (0.208–0.244)</w:t>
-            </w:r>
-          </w:p>
-        </w:tc>
-        <w:tc>
-          <w:tcPr>
-            <w:tcW w:type="dxa" w:w="1949"/>
-            <w:vAlign w:val="center"/>
-          </w:tcPr>
-          <w:p>
-            <w:r>
-              <w:rPr>
-                <w:sz w:val="16"/>
-              </w:rPr>
-              <w:t>0.008 (-0.062–0.080)</w:t>
+              <w:t>0.724 (0.694–0.753)</w:t>
             </w:r>
           </w:p>
         </w:tc>
@@ -2637,12 +2652,25 @@
         <w:pStyle w:val="Heading2"/>
       </w:pPr>
       <w:r>
+        <w:t>Exportable linear baseline comparison</w:t>
+      </w:r>
+    </w:p>
+    <w:p>
+      <w:r>
+        <w:t>Among the 12 highlighted binary models, the median ridge-minus-PLS balanced-accuracy difference was 0.007 (IQR -0.004 to 0.014); ridge had a paired-repeat interval above zero for 2 models, PLS for 1, and 9 differences were uncertain. For the 12 continuous models, the median ridge-minus-PLS Q² difference was 0.014 (IQR 0.007 to 0.017); ridge was favoured for 7, PLS for 2, and 3 were uncertain. Thus PLS was competitive but not uniformly superior to a simpler exportable linear model. Because the benchmark was restricted to PLS-highlighted results, the prespecified PLS atlas was retained and the comparison is reported as selection-conditioned sensitivity evidence rather than a basis for post-screen method switching.</w:t>
+      </w:r>
+    </w:p>
+    <w:p>
+      <w:pPr>
+        <w:pStyle w:val="Heading2"/>
+      </w:pPr>
+      <w:r>
         <w:t>Site and multiple-slide sensitivity</w:t>
       </w:r>
     </w:p>
     <w:p>
       <w:r>
-        <w:t>Site-grouped validation was feasible for 323 screen-positive models. The median grouped-minus-random performance change was -0.026. The first-slide-minus-mean-pool median change across screen-positive models was -0.001. Individual attenuations are reported because centre robustness and slide aggregation are target specific.</w:t>
+        <w:t>Site-grouped validation was feasible for 323 screen-positive models. Although the median grouped-minus-random performance change was only -0.026, 83/323 models (25.7%) fell below the original effect threshold: 58/219 continuous models and 25/104 binary models. Prominent attenuations were READ–APC (balanced accuracy 0.862 to 0.495); COAD–APC (balanced accuracy 0.793 to 0.543); PCPG–Cell Cycle (balanced accuracy 0.686 to 0.476); LIHC–CTNNB1 (balanced accuracy 0.668 to 0.565); OV–TCR Shannon (Q² 0.206 to -0.551); COAD–SNV Neoantigens (Q² 0.239 to -0.013). The site-grouped folds contain fewer and less evenly distributed training patients, so the decline cannot be attributed solely to site artefact; nevertheless, the near-chance colorectal APC results are not adequately summarised by the median and are treated as site-sensitive. The first-slide-minus-mean-pool median change across screen-positive models was -0.001.</w:t>
       </w:r>
     </w:p>
     <w:p>
@@ -2703,12 +2731,22 @@
     </w:p>
     <w:p>
       <w:r>
-        <w:t>The TITANPred R package exposes 323 fitted models (219 continuous and 104 binary) across 27 cancers [32]. Users supply a cancer vector and correctly named 768-dimensional TITAN features; the interface applies every bundled model available for that cancer. Repeated patient identifiers are mean-pooled before inference. Continuous outputs retain source endpoint units and are positioned against repeated out-of-fold reference distributions; binary outputs comprise the fitted PLS-LDA class and uncalibrated LDA score. A single-sample report renders each continuous endpoint as an exact reference-percentile dot with its raw prediction and displays binary calls with provenance and out-of-distribution diagnostics.</w:t>
+        <w:t>The TITANPred R package exposes 323 fitted models (219 continuous and 104 binary) across 27 cancers [32]. Users supply a cancer vector and correctly named 768-dimensional TITAN features; the interface applies every bundled model available for that cancer. Repeated patient identifiers are mean-pooled before inference. Continuous outputs retain source endpoint units and are positioned against repeated out-of-fold reference distributions; binary outputs comprise the fitted PLS-LDA class and uncalibrated LDA score. The binary display labels its TCGA out-of-fold score rank explicitly as a rank rather than a probability and places training positive/negative counts, prevalence, repeated-CV performance and any limited-class-size warning beside the call. A single-sample report renders all available continuous endpoints as a radar, with the exact reference percentile and original prediction printed at every corner, and displays binary calls with provenance and out-of-distribution diagnostics. The report ends with definitions of every displayed endpoint and citations for the data source used to construct each TCGA model target.</w:t>
       </w:r>
     </w:p>
     <w:p>
       <w:r>
-        <w:t>COAD was chosen as a deployment illustration because colorectal cancer, of which colon adenocarcinoma is a major component, accounted for 1,926,425 new cases worldwide in 2022 [31], and COAD contributed 20 supported models (10 continuous and 10 binary). Its APC, TP53, KRAS and BRAF mutation models were absent from the prespecified exact-pair literature crosswalk, which nominates them for follow-up without establishing bibliographic novelty. For visualization, the two COAD patients with the greatest Euclidean separation across the complete continuous prediction-percentile profile were selected. Example A was MSI-, mutation-rate- and lymphocyte/TIL-high but aneuploidy-low, whereas example B was aneuploidy-high but MSI- and immune-low (Figure 7). This selection deliberately accentuates contrast and is an internal deployment demonstration, not a validation analysis or estimate of clinical prevalence.</w:t>
+        <w:t>COAD was chosen as a deployment illustration because colorectal cancer, of which colon adenocarcinoma is a major component, accounted for 1,926,425 new cases worldwide in 2022 [31], and COAD contributed 20 supported models (10 continuous and 10 binary). APC, TP53, KRAS and BRAF prediction from colorectal histology had already been evaluated in pooled colorectal and/or exact-COAD studies; these models are therefore replications or extensions under a different representation and validation framework, not bibliographically novel mutation targets. For visualization, we first restricted candidates to cases with a non-empty slide report that described a sigmoid-colon, moderately differentiated, pT3 adenocarcinoma with clear margins, and then required that no case had more than two of ten continuous predictions outside the first to 99th percentile. Among pairs sharing recorded sex and site, TCGA-AA-A01F and TCGA-AA-3972 had the largest Euclidean separation across the complete continuous prediction-percentile profile. This produced clinically comparable examples with predominantly intermediate rather than saturated values. Example A had higher MSI, mutation-rate and TIL predictions and lower aneuploidy predictions, whereas example B showed the converse pattern (Figure 7). The selection is an internal deployment demonstration, not a validation analysis or an estimate of clinical prevalence.</w:t>
+      </w:r>
+    </w:p>
+    <w:p>
+      <w:r>
+        <w:t>The accompanying pathology text is paraphrased from TCGA-Slide-Reports.csv rather than reproduced verbatim. For TCGA-AA-A01F, the report describes an ulcerated grade-2 sigmoid adenocarcinoma extending through the muscular wall into pericolic fat (pT3), with uninvolved resection ends, lymphatic invasion and two involved nodes among 30 examined (pN1). For TCGA-AA-3972, it describes an ulcerated grade-2 sigmoid colorectal adenocarcinoma extending through the bowel wall into mesocolic fat (pT3), with uninvolved proximal and distal margins; a nodal category was not stated in the supplied slide summary.</w:t>
+      </w:r>
+    </w:p>
+    <w:p>
+      <w:r>
+        <w:t>Public NCI Genomic Data Commons case records provide treatment context [33]. TCGA-AA-A01F received fluorouracil, leucovorin and oxaliplatin, for which the recorded treatment outcome was complete response. TCGA-AA-3972 received capecitabine plus oxaliplatin and, later, fluorouracil, leucovorin, oxaliplatin and bevacizumab; progressive disease was recorded for both treatment records, with recurrence documented later in follow-up. These fields are descriptive public metadata and were not predictors, training targets or validation outcomes. The examples therefore do not evaluate response prediction or treatment effect.</w:t>
       </w:r>
     </w:p>
     <w:p>
@@ -2718,7 +2756,7 @@
       <w:r>
         <w:drawing>
           <wp:inline xmlns:a="http://schemas.openxmlformats.org/drawingml/2006/main" xmlns:pic="http://schemas.openxmlformats.org/drawingml/2006/picture">
-            <wp:extent cx="6126480" cy="3341716"/>
+            <wp:extent cx="6126480" cy="5198225"/>
             <wp:docPr id="7" name="Picture 7"/>
             <wp:cNvGraphicFramePr>
               <a:graphicFrameLocks noChangeAspect="1"/>
@@ -2739,7 +2777,7 @@
                   <pic:spPr>
                     <a:xfrm>
                       <a:off x="0" y="0"/>
-                      <a:ext cx="6126480" cy="3341716"/>
+                      <a:ext cx="6126480" cy="5198225"/>
                     </a:xfrm>
                     <a:prstGeom prst="rect"/>
                   </pic:spPr>
@@ -2756,7 +2794,7 @@
         <w:jc w:val="center"/>
       </w:pPr>
       <w:r>
-        <w:t>Figure 7. TITANPred deployment illustration in COAD. Panel A compares endpoint-level continuous predictions for TCGA-AD-6964 (example A) and TCGA-5M-AAT5 (example B), the two TCGA patients with maximal separation across the complete COAD continuous profile. Point positions are percentiles relative to repeated out-of-fold TCGA predictions, not clinical reference ranges; labels beside points give the original model predictions in source endpoint units. Panel B shows the corresponding binary PLS-LDA calls and LDA-score percentiles; filled points denote positive calls, and scores are not calibrated probabilities. Examples were selected to demonstrate report contrast and do not provide external validation.</w:t>
+        <w:t>Figure 7. TITANPred deployment illustration in two clinically comparable COAD cases. Panels A and B show all ten continuous predictions for TCGA-AA-A01F and TCGA-AA-3972, respectively. Silent mutation rate and SNV neoantigens flank nonsilent mutation rate in the semantic axis order. Every radar corner reports the exact percentile relative to corrected repeated out-of-fold TCGA predictions and the original model prediction in the analysed endpoint units; the percentiles are not clinical reference ranges. Panel C shows binary PLS-LDA calls and explicitly labelled TCGA out-of-fold LDA-score ranks; filled points denote positive calls, and ranks are not probabilities. Training n and class counts accompany each binary endpoint. The cases share sex, sigmoid site, grade, pT3 category and clear margins and were selected after limiting saturated continuous profiles. They are full-cohort deployment examples and do not provide external validation.</w:t>
       </w:r>
     </w:p>
     <w:p>
@@ -2779,17 +2817,17 @@
     </w:p>
     <w:p>
       <w:r>
-        <w:t>The mutation results divide into two evidence groups. 24 of the 41 within-cancer screen-positive cancer–gene pairs were exact pairs in the prespecified histology literature crosswalk and were recovered here: BLCA–FGFR3: prior AUROC 0.780, current balanced accuracy 0.729 (q=0.010); BRCA–CDH1: prior AUROC 0.810, current balanced accuracy 0.731 (q=0.007); BRCA–TP53: prior AUROC 0.768 [0.735–0.781], current balanced accuracy 0.744 (q=0.007); BRCA–TP53: prior AUROC &gt;0.611, current balanced accuracy 0.744 (q=0.007); LGG–IDH1: prior AUROC 0.764, current balanced accuracy 0.786 (q=0.002); LGG–TP53: prior AUROC 0.787, current balanced accuracy 0.846 (q=0.002); THCA–BRAF: prior AUROC 0.860, current balanced accuracy 0.830 (q=0.001); UCEC–PTEN: prior reported histopathological association, current balanced accuracy 0.726 (q=0.016); UCEC–PTEN: prior AUROC 0.773, current balanced accuracy 0.726 (q=0.016); UCEC–TP53: prior AUROC 0.764, current balanced accuracy 0.764 (q=0.016); BRCA–PIK3CA: prior AUROC 0.625 [0.605–0.659], current balanced accuracy 0.631 (q=0.007); BRCA–PIK3CA: prior AUROC &gt;0.611, current balanced accuracy 0.631 (q=0.007); CESC–TP53: prior AUROC 0.673 [0.628–0.749], current balanced accuracy 0.604 (q=0.024); HNSC–NSD1: prior AUROC 0.668 [0.597–0.737], current balanced accuracy 0.630 (q=0.009); HNSC–TP53: prior AUROC 0.699 [0.687–0.732], current balanced accuracy 0.636 (q=0.009); LIHC–CTNNB1: prior AUROC 0.682 [0.635–0.688], current balanced accuracy 0.668 (q=0.002); LIHC–TP53: prior reported histopathological association, current balanced accuracy 0.633 (q=0.002); LIHC–TP53: prior AUROC 0.606 [0.572–0.656], current balanced accuracy 0.633 (q=0.002); LIHC–TP53: prior AUROC 0.597, current balanced accuracy 0.633 (q=0.002); LUAD–EGFR: prior AUROC 0.733–0.856 across six reported genes, current balanced accuracy 0.617 (q=0.007); LUAD–EGFR: prior AUROC 0.624 [0.598–0.670], current balanced accuracy 0.617 (q=0.007); LUAD–TP53: prior AUROC 0.733–0.856 across six reported genes, current balanced accuracy 0.699 (q=0.007); LUAD–TP53: prior AUROC 0.720 [0.700–0.746], current balanced accuracy 0.699 (q=0.007); STAD–PIK3CA: prior AUROC 0.636 [0.581–0.662], current balanced accuracy 0.637 (q=0.009). Prior studies generally reported AUROC, whereas the present primary metric is balanced accuracy; the side-by-side values describe consistency of discrimination but are not numerical estimates of improvement or inferiority.</w:t>
+        <w:t>The expanded primary-study audit substantially changes the novelty interpretation. 38/41 screen-positive cancer–gene pairs had already received statistical support in reviewed histology-prediction studies, including pooled colorectal evidence mapped to both COAD and READ where appropriate. Examples include LGG–CIC (prior mean AUROC 0.836, current balanced accuracy 0.779), LGG–ATRX (prior mean AUROC 0.816), THCA–NRAS (0.809), LIHC–BAP1 (0.825), PAAD–TP53 (0.672) and KIRC–VHL (0.631) [13]. Prior studies generally reported AUROC, whereas the present primary metric is balanced accuracy; these values are contextual and are not estimates of improvement or inferiority.</w:t>
       </w:r>
     </w:p>
     <w:p>
       <w:r>
-        <w:t>Several published pairs retained moderate discrimination but did not satisfy the current within-cancer mutation-family FDR criterion: BRCA–TP53: prior AUROC 0.768 [0.735–0.781], current balanced accuracy 0.744 (q=0.007); UCEC–TP53: prior AUROC 0.764, current balanced accuracy 0.764 (q=0.016); LIHC–CTNNB1: prior AUROC 0.682 [0.635–0.688], current balanced accuracy 0.668 (q=0.002); PAAD–KRAS: prior AUROC 0.670 [0.570–0.712], current balanced accuracy 0.588 (q=1.000). Other reported pairs were weaker or ineligible under the present primary-tumour and minimum-class-count rules. Differences can arise from cohort composition, primary-versus-metastatic sampling, slide preparation, mutation definition, model class and validation design. Supplementary Table S9 provides the report-level comparison and the complete machine-readable crosswalk preserves original evidence notes and URLs.</w:t>
+        <w:t>Two current screen-positive pairs had been evaluated but were not statistically supported in the reviewed 2024 study: BLCA–PIK3CA (prior mean AUROC 0.588, corrected p=0.058; current balanced accuracy 0.601) and SKCM–BRAF (prior mean AUROC 0.579, corrected p=0.286; current balanced accuracy 0.626). Only THYM–GTF2I was not identified in the reviewed predictive-model literature; a strong direct GTF2I–thymoma morphology association is already established, so this result is presented as a prediction candidate requiring independent validation rather than a claim of biological novelty. The OV–TP53 entry is supported by a 2025 preprint reporting AUROC 0.82±0.02 and is labelled as preliminary evidence rather than peer-reviewed external validation [34]. The GTF2I morphology association itself was reported by Wells et al. [35]. Supplementary Table S10a and the machine-readable audit give the evidence scope, prior metric, source and note for every screen-positive pair.</w:t>
       </w:r>
     </w:p>
     <w:p>
       <w:r>
-        <w:t>The remaining 24 screen-positive mutation pairs were not present in the prespecified exact-pair crosswalk and are therefore atlas-nominated candidates rather than replications. Leading examples were THYM–GTF2I (balanced accuracy 0.883, q=0.001); READ–APC (balanced accuracy 0.862, q=0.002); READ–TP53 (balanced accuracy 0.861, q=0.002); COAD–APC (balanced accuracy 0.793, q=0.003); COAD–TP53 (balanced accuracy 0.779, q=0.003); LGG–CIC (balanced accuracy 0.779, q=0.002); LGG–ATRX (balanced accuracy 0.761, q=0.002); THCA–NRAS (balanced accuracy 0.703, q=0.001). Absence from this targeted crosswalk is not a claim that no publication has ever evaluated the pair; a systematic endpoint-level review would be required to establish bibliographic novelty. Supplementary Table S10 classifies every screen-positive mutation pair explicitly.</w:t>
+        <w:t>External results also caution against equating internal discrimination with transportability. For PAAD–TP53, the current TCGA balanced accuracy was 0.619 and Arslan et al. reported mean internal AUROC 0.672, whereas Saldanha et al. reported internal AUROC 0.554 and external CPTAC AUROC 0.443±0.064 [11,13]. Differences can arise from cohort composition, slide preparation, mutation definition, model class and validation design. The present result therefore supports further locked external testing, not clinical deployment.</w:t>
       </w:r>
     </w:p>
     <w:p>
@@ -2809,7 +2847,17 @@
     </w:p>
     <w:p>
       <w:r>
-        <w:t>A further practical feature is data-minimising model portability. Preprocessing values, latent weights and coefficients are sufficient for continuous prediction, with compact LDA parameters added for binary classification. TITANPred publicly distributes these fitted objects and applies every cancer-matched model to correctly ordered TITAN features without distributing the original patient embeddings or outcomes [32]. This reduces the patient-level data that must be exchanged, although it does not itself confer privacy, satisfy local governance requirements or establish transportability. The COAD examples show how the package summarizes divergent multi-endpoint profiles; because the examples were selected for maximal separation within TCGA and were predicted by full-cohort fits, they must not be interpreted as new accuracy evidence.</w:t>
+        <w:t>The ridge benchmark prevents interpreting that design choice as proof of PLS superiority. Median ridge-minus-PLS differences were small (0.007 balanced accuracy for binary and 0.014 Q² for continuous models), although paired intervals favoured ridge for two binary and seven continuous highlighted endpoints and favoured PLS for one binary and two continuous endpoints. The remaining 12 comparisons were uncertain. Both approaches yield compact exportable parameters, so portability is not unique to PLS. PLS remains the prespecified atlas method because the benchmark was performed only on PLS-highlighted models and switching methods after that selection would add another optimistic selection layer. Future external validation can compare locked PLS and ridge candidates prospectively.</w:t>
+      </w:r>
+    </w:p>
+    <w:p>
+      <w:r>
+        <w:t>Site grouping revealed heterogeneity that the median attenuation concealed: 83/323 screen-positive models (25.7%) fell below their original effect threshold. READ–APC and COAD–APC declined from balanced accuracies 0.862 and 0.793 to 0.495 and 0.543, respectively. Smaller and less balanced training folds contribute to grouped-validation loss, but performance close to chance requires these models to be labelled site-sensitive rather than robust biological signals. This reinforces the need for multi-institutional external validation and for publishing target-level, not only median, sensitivity results.</w:t>
+      </w:r>
+    </w:p>
+    <w:p>
+      <w:r>
+        <w:t>A further practical feature is data-minimising model portability. Preprocessing values, latent weights and coefficients are sufficient for continuous prediction, with compact LDA parameters added for binary classification. TITANPred publicly distributes these fitted objects and applies every cancer-matched model to correctly ordered TITAN features without distributing the original patient embeddings or outcomes [32]. This reduces the patient-level data that must be exchanged, although it does not itself confer privacy, satisfy local governance requirements or establish transportability. The matched COAD examples show how the package summarizes differing multi-endpoint profiles among cases with shared clinicopathological attributes. Because both examples were chosen within TCGA and were predicted by full-cohort fits, neither their molecular contrast nor their recorded treatment outcomes constitute new accuracy or response-prediction evidence.</w:t>
       </w:r>
     </w:p>
     <w:p>
@@ -2933,7 +2981,7 @@
     </w:p>
     <w:p>
       <w:r>
-        <w:t>The analysis used the public TITAN TCGA feature artifact (TCGA_TITAN_features.pkl) through its supplied 768-feature CSV export. TCGA molecular data and the cited public supplementary records remain available from their original repositories. Exact source locations, access information and SHA-256 checksums are recorded in the companion analysis repository [30]. Controlled-access whole-slide images are not redistributed. All 323 fitted research models, their registry, inference code and HTML/PDF report template are distributed in the separate TITANPred repository [32].</w:t>
+        <w:t>The analysis used the gated public TITAN TCGA feature artifact TCGA_TITAN_features.pkl, downloaded from https://huggingface.co/MahmoodLab/TITAN/blob/main/TCGA_TITAN_features.pkl and converted to the documented 768-feature CSV schema with tools/convert_tcga_titan_pickle.py in the companion repository [30]. The analysed CSV contained 11,658 slide rows (SHA-256 d3d91fb0f83a6de440eda5ff437a63e3ca13f50095e6841fb8efcc40e58763f0). TCGA molecular data and the cited public supplementary records remain available from their original repositories. Exact source locations, access conditions and checksums are recorded in the companion repository. Controlled-access whole-slide images are not redistributed. All 323 fitted research models, their registry, inference code and HTML/PDF report template are distributed in the separate TITANPred repository [32].</w:t>
       </w:r>
     </w:p>
     <w:p>
@@ -3003,12 +3051,12 @@
     </w:p>
     <w:p>
       <w:r>
-        <w:t>Additional file 2 (.pdf): COAD example A (TCGA-AD-6964) TITANPred single-sample report. Illustrative full-cohort research-model predictions for the COAD example with high MSI, mutation-rate and immune-feature predictions and low aneuploidy prediction.</w:t>
+        <w:t>Additional file 2 (.pdf): COAD example A (TCGA-AA-A01F) TITANPred single-sample report. Illustrative full-cohort research-model predictions for the COAD example with high MSI, mutation-rate and immune-feature predictions and low aneuploidy prediction.</w:t>
       </w:r>
     </w:p>
     <w:p>
       <w:r>
-        <w:t>Additional file 3 (.pdf): COAD example B (TCGA-5M-AAT5) TITANPred single-sample report. Illustrative full-cohort research-model predictions for the contrasting COAD example with high aneuploidy prediction and lower MSI and immune-feature predictions.</w:t>
+        <w:t>Additional file 3 (.pdf): COAD example B (TCGA-AA-3972) TITANPred single-sample report. Illustrative full-cohort research-model predictions for the contrasting COAD example with high aneuploidy prediction and lower MSI and immune-feature predictions.</w:t>
       </w:r>
     </w:p>
     <w:p>
@@ -3177,6 +3225,21 @@
     <w:p>
       <w:r>
         <w:t>32. TITANPred R package and fitted-model repository. GitHub. https://github.com/tkcaccia/TITANPred. Accessed 16 Aug 2026.</w:t>
+      </w:r>
+    </w:p>
+    <w:p>
+      <w:r>
+        <w:t>33. National Cancer Institute. Genomic Data Commons Cases API. https://api.gdc.cancer.gov/cases. Accessed 16 Aug 2026.</w:t>
+      </w:r>
+    </w:p>
+    <w:p>
+      <w:r>
+        <w:t>34. Fernandes G. Morpho-genomic deep learning for ovarian cancer subtype and gene mutation prediction from histopathology. arXiv. 2025;arXiv:2511.03365. doi:10.48550/arXiv.2511.03365.</w:t>
+      </w:r>
+    </w:p>
+    <w:p>
+      <w:r>
+        <w:t>35. Wells K, Lamrca A, Papaxoinis G, et al. Unique correlation between GTF2I mutation and spindle cell morphology in thymomas (type A and AB thymomas). J Clin Pathol. 2023;76:463–466. doi:10.1136/jclinpath-2021-207837.</w:t>
       </w:r>
     </w:p>
     <w:sectPr>

</xml_diff>

<commit_message>
Add Piazza and Gupta to author list
</commit_message>
<xml_diff>
--- a/manuscript/manuscript_JTM_patient_level_TITAN.docx
+++ b/manuscript/manuscript_JTM_patient_level_TITAN.docx
@@ -124,6 +124,36 @@
         <w:rPr>
           <w:b/>
         </w:rPr>
+        <w:t>Silvano Piazza</w:t>
+      </w:r>
+      <w:r>
+        <w:rPr>
+          <w:vertAlign w:val="superscript"/>
+        </w:rPr>
+        <w:t>6</w:t>
+      </w:r>
+      <w:r>
+        <w:t xml:space="preserve">, </w:t>
+      </w:r>
+      <w:r>
+        <w:rPr>
+          <w:b/>
+        </w:rPr>
+        <w:t>Dinesh Gupta</w:t>
+      </w:r>
+      <w:r>
+        <w:rPr>
+          <w:vertAlign w:val="superscript"/>
+        </w:rPr>
+        <w:t>7</w:t>
+      </w:r>
+      <w:r>
+        <w:t xml:space="preserve">, </w:t>
+      </w:r>
+      <w:r>
+        <w:rPr>
+          <w:b/>
+        </w:rPr>
         <w:t>Stefano Cacciatore</w:t>
       </w:r>
       <w:r>
@@ -201,6 +231,34 @@
       </w:r>
       <w:r>
         <w:t>Division of Anatomical Pathology, University of Cape Town and National Health Laboratory Service, Observatory, Cape Town, South Africa</w:t>
+      </w:r>
+    </w:p>
+    <w:p>
+      <w:pPr>
+        <w:jc w:val="center"/>
+      </w:pPr>
+      <w:r>
+        <w:rPr>
+          <w:b/>
+        </w:rPr>
+        <w:t xml:space="preserve">6 </w:t>
+      </w:r>
+      <w:r>
+        <w:t>Computational Biology Group, International Centre for Genetic Engineering and Biotechnology (ICGEB), Padriciano 99, 34149 Trieste, Italy</w:t>
+      </w:r>
+    </w:p>
+    <w:p>
+      <w:pPr>
+        <w:jc w:val="center"/>
+      </w:pPr>
+      <w:r>
+        <w:rPr>
+          <w:b/>
+        </w:rPr>
+        <w:t xml:space="preserve">7 </w:t>
+      </w:r>
+      <w:r>
+        <w:t>Translational Bioinformatics Group, International Centre for Genetic Engineering and Biotechnology (ICGEB), Aruna Asaf Ali Marg, New Delhi 110067, India</w:t>
       </w:r>
     </w:p>
     <w:p>

</xml_diff>

<commit_message>
Add Piazza dual affiliations
</commit_message>
<xml_diff>
--- a/manuscript/manuscript_JTM_patient_level_TITAN.docx
+++ b/manuscript/manuscript_JTM_patient_level_TITAN.docx
@@ -130,7 +130,7 @@
         <w:rPr>
           <w:vertAlign w:val="superscript"/>
         </w:rPr>
-        <w:t>6</w:t>
+        <w:t>6,8</w:t>
       </w:r>
       <w:r>
         <w:t xml:space="preserve">, </w:t>
@@ -244,7 +244,7 @@
         <w:t xml:space="preserve">6 </w:t>
       </w:r>
       <w:r>
-        <w:t>Computational Biology Group, International Centre for Genetic Engineering and Biotechnology (ICGEB), Padriciano 99, 34149 Trieste, Italy</w:t>
+        <w:t>Computational Biology Group, International Centre for Genetic Engineering and Biotechnology (ICGEB), Trieste, Italy</w:t>
       </w:r>
     </w:p>
     <w:p>
@@ -259,6 +259,20 @@
       </w:r>
       <w:r>
         <w:t>Translational Bioinformatics Group, International Centre for Genetic Engineering and Biotechnology (ICGEB), Aruna Asaf Ali Marg, New Delhi 110067, India</w:t>
+      </w:r>
+    </w:p>
+    <w:p>
+      <w:pPr>
+        <w:jc w:val="center"/>
+      </w:pPr>
+      <w:r>
+        <w:rPr>
+          <w:b/>
+        </w:rPr>
+        <w:t xml:space="preserve">8 </w:t>
+      </w:r>
+      <w:r>
+        <w:t>Bioinformatics Facility, Department of Cellular, Computational and Integrative Biology - CIBIO, University of Trento, Trento, Italy</w:t>
       </w:r>
     </w:p>
     <w:p>

</xml_diff>

<commit_message>
Reframe manuscript as patient-level benchmark
</commit_message>
<xml_diff>
--- a/manuscript/manuscript_JTM_patient_level_TITAN.docx
+++ b/manuscript/manuscript_JTM_patient_level_TITAN.docx
@@ -8,7 +8,7 @@
         <w:jc w:val="center"/>
       </w:pPr>
       <w:r>
-        <w:t>A patient-level TCGA discovery atlas of molecular and immune predictability from pretrained TITAN whole-slide representations across 32 cancers</w:t>
+        <w:t>A systematic patient-level benchmark and reusable model resource for molecular and immune prediction from pretrained TITAN whole-slide representations across 32 TCGA cancers</w:t>
       </w:r>
     </w:p>
     <w:p>
@@ -329,7 +329,7 @@
         <w:t xml:space="preserve">Background. </w:t>
       </w:r>
       <w:r>
-        <w:t>Deep-learning studies have shown that haematoxylin-and-eosin images encode mutations, microsatellite instability, transcriptomic programmes and tumour-microenvironment phenotypes. We evaluated which individual molecular, genomic-instability and immune endpoints are predictable within cancer type from reusable TITAN whole-slide representations.</w:t>
+        <w:t>Pan-cancer histology studies have already screened broad molecular endpoint spaces: Arslan and colleagues trained 12,093 models for 4,031 biomarkers across the same 32 TCGA cancers. We therefore evaluated TITAN as a reproducible patient-level benchmark and reusable model resource, rather than claiming a first pan-cancer screen or unprecedented mutation targets.</w:t>
       </w:r>
     </w:p>
     <w:p>
@@ -351,7 +351,7 @@
         <w:t xml:space="preserve">Results. </w:t>
       </w:r>
       <w:r>
-        <w:t>Within-cancer screening identified 219 continuous and 104 binary higher- or moderate-effect candidates. Highlighted repeated-CV results included TGCT–TGF-beta Response (Q² 0.670, 95% bootstrap interval 0.573–0.741; RMSE 0.303, Spearman 0.791) and LGG–TP53 (sensitivity 0.839, specificity 0.885, balanced accuracy 0.862, 95% bootstrap interval 0.833–0.888; AUROC 0.908). Under the multiplicity sensitivity, 219 continuous and 39 cancer–mutation pairs passed the stricter across-cancer correction; its attainable q-values in large families were limited by the 0.001 empirical-p resolution. Site grouping reduced 83/323 candidates (25.7%) below the original effect threshold. In a selection-conditioned 24-model benchmark, median ridge-minus-PLS differences were 0.007 balanced accuracy and 0.014 Q², showing no uniform PLS advantage.</w:t>
+        <w:t>Within-cancer screening identified 219 continuous and 104 binary higher- or moderate-effect candidates. Highlighted repeated-CV results included TGCT–TGF-beta Response (Q² 0.670, 95% bootstrap interval 0.573–0.741; RMSE 0.303, Spearman 0.791) and LGG–TP53 (sensitivity 0.839, specificity 0.885, balanced accuracy 0.862, 95% bootstrap interval 0.833–0.888; AUROC 0.908). The literature audit found prior statistical support for 38/41 screen-positive cancer–gene pairs. Under the multiplicity sensitivity, 219 continuous and 39 cancer–mutation pairs passed the stricter across-cancer correction; its attainable q-values in large families were limited by the 0.001 empirical-p resolution. Site grouping reduced 83/323 candidates (25.7%) below the original effect threshold. In a selection-conditioned 24-model benchmark, median ridge-minus-PLS differences were 0.007 balanced accuracy and 0.014 Q², showing no uniform PLS advantage.</w:t>
       </w:r>
     </w:p>
     <w:p>
@@ -362,7 +362,7 @@
         <w:t xml:space="preserve">Conclusions. </w:t>
       </w:r>
       <w:r>
-        <w:t>Pretrained TITAN representations support a cancer-specific TCGA discovery atlas spanning immune and molecular phenotypes. The models are internally validated research candidates, do not replace molecular assays, and require independent external validation before clinical interpretation.</w:t>
+        <w:t>This systematic patient-level TCGA benchmark defines target-specific predictability under one fixed pretrained TITAN representation and distributes compact fitted research models. Its contribution is methodological and resource-oriented rather than mutation-target novelty; independent external validation remains required before clinical interpretation.</w:t>
       </w:r>
     </w:p>
     <w:p>
@@ -396,7 +396,12 @@
     </w:p>
     <w:p>
       <w:r>
-        <w:t>However, the published landscape remains fragmented across selected cancers, endpoint classes, representations and reporting conventions. What is missing is a single patient-level, reusable discovery atlas that applies one fixed pretrained whole-slide representation and one transparent validation framework to many individual mutation, immune, pathway, instability, aneuploidy and fusion endpoints while retaining negative results, class counts, uncertainty and deployable fitted models. This study addresses that gap; it does not claim that the individual endpoint classes themselves are unprecedented.</w:t>
+        <w:t>Breadth alone is not the gap. Fu et al. analysed 17,355 slides across 28 cancers [4], Kather et al. applied one workflow to more than 5,000 patients across 14 cancers [5], Saldanha et al. externally tested mutation models across seven matched TCGA and CPTAC cancers [11], and Arslan et al. trained 12,093 models for 4,031 genomic, transcriptomic, proteomic and clinical biomarkers in 8,890 TCGA patients across the same 32 cancers [13]. The present study consequently does not claim the first pan-cancer molecular screen, a larger endpoint catalogue, or general mutation-target novelty.</w:t>
+      </w:r>
+    </w:p>
+    <w:p>
+      <w:r>
+        <w:t>The narrower unresolved gap is a reproducible benchmark that applies one fixed pretrained representation to every target; deterministically aggregates slides before outcome matching; performs nested validation with the patient as the unit; preserves tested-negative and sample-size-ineligible results; reports target-level tissue-source-site sensitivity; models selected immune and genomic-context measurements continuously; and distributes compact fitted predictors with deployment metadata. These design and resource features—not unprecedented endpoint classes—define the contribution of this study (Table 1).</w:t>
       </w:r>
     </w:p>
     <w:p>
@@ -413,6 +418,1079 @@
       <w:r>
         <w:t>The primary question was cancer-specific: which individual mutations, inflammatory measurements, oncogenic pathways, MSI phenotypes, aneuploidy measures and fusions are predictable within each cancer? Molecular subtype association was not analysed. PLS–LDA was preferred for individual binary molecular endpoints. The methodological PLS1–PLS2 comparison for correlated inflammatory panels is reported in the Supplementary Material.</w:t>
       </w:r>
+    </w:p>
+    <w:p>
+      <w:pPr>
+        <w:sectPr>
+          <w:headerReference w:type="default" r:id="rId9"/>
+          <w:footerReference w:type="default" r:id="rId10"/>
+          <w:pgSz w:w="12240" w:h="15840"/>
+          <w:pgMar w:top="1134" w:right="1247" w:bottom="1134" w:left="1247" w:header="720" w:footer="720" w:gutter="0"/>
+          <w:cols w:space="720"/>
+          <w:docGrid w:linePitch="360"/>
+          <w:lnNumType w:countBy="1" w:restart="continuous"/>
+        </w:sectPr>
+      </w:pPr>
+    </w:p>
+    <w:p>
+      <w:pPr>
+        <w:pStyle w:val="Caption"/>
+      </w:pPr>
+      <w:r>
+        <w:t>Table 1. Comparison with major pan-cancer histology–molecular prediction studies. Panel A summarises cohort, endpoint and representation design; Panel B summarises validation, robustness, reporting and reusable predictor availability.</w:t>
+      </w:r>
+    </w:p>
+    <w:p>
+      <w:pPr>
+        <w:pStyle w:val="Caption"/>
+      </w:pPr>
+      <w:r>
+        <w:t>Panel A. Cohort, endpoints, representation and patient aggregation.</w:t>
+      </w:r>
+    </w:p>
+    <w:tbl>
+      <w:tblPr>
+        <w:tblStyle w:val="TableGrid"/>
+        <w:tblW w:type="auto" w:w="0"/>
+        <w:jc w:val="center"/>
+        <w:tblLook w:firstColumn="1" w:firstRow="1" w:lastColumn="0" w:lastRow="0" w:noHBand="0" w:noVBand="1" w:val="04A0"/>
+      </w:tblPr>
+      <w:tblGrid>
+        <w:gridCol w:w="3028"/>
+        <w:gridCol w:w="3028"/>
+        <w:gridCol w:w="3028"/>
+        <w:gridCol w:w="3028"/>
+        <w:gridCol w:w="3028"/>
+      </w:tblGrid>
+      <w:tr>
+        <w:trPr>
+          <w:tblHeader w:val="true"/>
+          <w:cantSplit/>
+        </w:trPr>
+        <w:tc>
+          <w:tcPr>
+            <w:tcW w:type="dxa" w:w="1701"/>
+          </w:tcPr>
+          <w:p>
+            <w:r>
+              <w:rPr>
+                <w:b/>
+                <w:sz w:val="17"/>
+              </w:rPr>
+              <w:t>Study</w:t>
+            </w:r>
+          </w:p>
+        </w:tc>
+        <w:tc>
+          <w:tcPr>
+            <w:tcW w:type="dxa" w:w="2268"/>
+          </w:tcPr>
+          <w:p>
+            <w:r>
+              <w:rPr>
+                <w:b/>
+                <w:sz w:val="17"/>
+              </w:rPr>
+              <w:t>Patients; cancers</w:t>
+            </w:r>
+          </w:p>
+        </w:tc>
+        <w:tc>
+          <w:tcPr>
+            <w:tcW w:type="dxa" w:w="1701"/>
+          </w:tcPr>
+          <w:p>
+            <w:r>
+              <w:rPr>
+                <w:b/>
+                <w:sz w:val="17"/>
+              </w:rPr>
+              <w:t>Slides</w:t>
+            </w:r>
+          </w:p>
+        </w:tc>
+        <w:tc>
+          <w:tcPr>
+            <w:tcW w:type="dxa" w:w="4252"/>
+          </w:tcPr>
+          <w:p>
+            <w:r>
+              <w:rPr>
+                <w:b/>
+                <w:sz w:val="17"/>
+              </w:rPr>
+              <w:t>Endpoint classes</w:t>
+            </w:r>
+          </w:p>
+        </w:tc>
+        <w:tc>
+          <w:tcPr>
+            <w:tcW w:type="dxa" w:w="5102"/>
+          </w:tcPr>
+          <w:p>
+            <w:r>
+              <w:rPr>
+                <w:b/>
+                <w:sz w:val="17"/>
+              </w:rPr>
+              <w:t>Representation; patient aggregation</w:t>
+            </w:r>
+          </w:p>
+        </w:tc>
+      </w:tr>
+      <w:tr>
+        <w:trPr>
+          <w:cantSplit/>
+        </w:trPr>
+        <w:tc>
+          <w:tcPr>
+            <w:tcW w:type="dxa" w:w="1701"/>
+            <w:vAlign w:val="center"/>
+          </w:tcPr>
+          <w:p>
+            <w:r>
+              <w:rPr>
+                <w:sz w:val="16"/>
+              </w:rPr>
+              <w:t>Fu et al. [4]</w:t>
+            </w:r>
+          </w:p>
+        </w:tc>
+        <w:tc>
+          <w:tcPr>
+            <w:tcW w:type="dxa" w:w="2268"/>
+            <w:vAlign w:val="center"/>
+          </w:tcPr>
+          <w:p>
+            <w:r>
+              <w:rPr>
+                <w:sz w:val="16"/>
+              </w:rPr>
+              <w:t>Not reported as one total in the main article; 28 cancers</w:t>
+            </w:r>
+          </w:p>
+        </w:tc>
+        <w:tc>
+          <w:tcPr>
+            <w:tcW w:type="dxa" w:w="1701"/>
+            <w:vAlign w:val="center"/>
+          </w:tcPr>
+          <w:p>
+            <w:r>
+              <w:rPr>
+                <w:sz w:val="16"/>
+              </w:rPr>
+              <w:t>17,355</w:t>
+            </w:r>
+          </w:p>
+        </w:tc>
+        <w:tc>
+          <w:tcPr>
+            <w:tcW w:type="dxa" w:w="4252"/>
+            <w:vAlign w:val="center"/>
+          </w:tcPr>
+          <w:p>
+            <w:r>
+              <w:rPr>
+                <w:sz w:val="16"/>
+              </w:rPr>
+              <w:t>Cancer and tissue class; mutations; whole-genome duplication and copy-number alterations; transcriptomic and tumour-composition features; prognosis</w:t>
+            </w:r>
+          </w:p>
+        </w:tc>
+        <w:tc>
+          <w:tcPr>
+            <w:tcW w:type="dxa" w:w="5102"/>
+            <w:vAlign w:val="center"/>
+          </w:tcPr>
+          <w:p>
+            <w:r>
+              <w:rPr>
+                <w:sz w:val="16"/>
+              </w:rPr>
+              <w:t>Inception-v4 deep-transfer image features (1,536 dimensions). A deterministic pre-model patient-vector pooling rule was not described in the main article</w:t>
+            </w:r>
+          </w:p>
+        </w:tc>
+      </w:tr>
+      <w:tr>
+        <w:trPr>
+          <w:cantSplit/>
+        </w:trPr>
+        <w:tc>
+          <w:tcPr>
+            <w:tcW w:type="dxa" w:w="1701"/>
+            <w:vAlign w:val="center"/>
+          </w:tcPr>
+          <w:p>
+            <w:r>
+              <w:rPr>
+                <w:sz w:val="16"/>
+              </w:rPr>
+              <w:t>Kather et al. [5]</w:t>
+            </w:r>
+          </w:p>
+        </w:tc>
+        <w:tc>
+          <w:tcPr>
+            <w:tcW w:type="dxa" w:w="2268"/>
+            <w:vAlign w:val="center"/>
+          </w:tcPr>
+          <w:p>
+            <w:r>
+              <w:rPr>
+                <w:sz w:val="16"/>
+              </w:rPr>
+              <w:t>&gt;5,000; 14 cancers</w:t>
+            </w:r>
+          </w:p>
+        </w:tc>
+        <w:tc>
+          <w:tcPr>
+            <w:tcW w:type="dxa" w:w="1701"/>
+            <w:vAlign w:val="center"/>
+          </w:tcPr>
+          <w:p>
+            <w:r>
+              <w:rPr>
+                <w:sz w:val="16"/>
+              </w:rPr>
+              <w:t>Not reported as one total in the main article</w:t>
+            </w:r>
+          </w:p>
+        </w:tc>
+        <w:tc>
+          <w:tcPr>
+            <w:tcW w:type="dxa" w:w="4252"/>
+            <w:vAlign w:val="center"/>
+          </w:tcPr>
+          <w:p>
+            <w:r>
+              <w:rPr>
+                <w:sz w:val="16"/>
+              </w:rPr>
+              <w:t>Mutations; oncogenic drivers; molecular subtypes and expression signatures; standard-of-care biomarkers</w:t>
+            </w:r>
+          </w:p>
+        </w:tc>
+        <w:tc>
+          <w:tcPr>
+            <w:tcW w:type="dxa" w:w="5102"/>
+            <w:vAlign w:val="center"/>
+          </w:tcPr>
+          <w:p>
+            <w:r>
+              <w:rPr>
+                <w:sz w:val="16"/>
+              </w:rPr>
+              <w:t>Task-specific CNN workflow using tumour regions and tile aggregation. Tile predictions aggregated to the patient; patients, not tiles, assigned to folds</w:t>
+            </w:r>
+          </w:p>
+        </w:tc>
+      </w:tr>
+      <w:tr>
+        <w:trPr>
+          <w:cantSplit/>
+        </w:trPr>
+        <w:tc>
+          <w:tcPr>
+            <w:tcW w:type="dxa" w:w="1701"/>
+            <w:vAlign w:val="center"/>
+          </w:tcPr>
+          <w:p>
+            <w:r>
+              <w:rPr>
+                <w:sz w:val="16"/>
+              </w:rPr>
+              <w:t>Saldanha et al. [11]</w:t>
+            </w:r>
+          </w:p>
+        </w:tc>
+        <w:tc>
+          <w:tcPr>
+            <w:tcW w:type="dxa" w:w="2268"/>
+            <w:vAlign w:val="center"/>
+          </w:tcPr>
+          <w:p>
+            <w:r>
+              <w:rPr>
+                <w:sz w:val="16"/>
+              </w:rPr>
+              <w:t>3,743 TCGA; 776 CPTAC; 7 cancers</w:t>
+            </w:r>
+          </w:p>
+        </w:tc>
+        <w:tc>
+          <w:tcPr>
+            <w:tcW w:type="dxa" w:w="1701"/>
+            <w:vAlign w:val="center"/>
+          </w:tcPr>
+          <w:p>
+            <w:r>
+              <w:rPr>
+                <w:sz w:val="16"/>
+              </w:rPr>
+              <w:t>Not reported as one total in the main article</w:t>
+            </w:r>
+          </w:p>
+        </w:tc>
+        <w:tc>
+          <w:tcPr>
+            <w:tcW w:type="dxa" w:w="4252"/>
+            <w:vAlign w:val="center"/>
+          </w:tcPr>
+          <w:p>
+            <w:r>
+              <w:rPr>
+                <w:sz w:val="16"/>
+              </w:rPr>
+              <w:t>Somatic alterations in eligible OncoKB oncogenes and tumour-suppressor genes</w:t>
+            </w:r>
+          </w:p>
+        </w:tc>
+        <w:tc>
+          <w:tcPr>
+            <w:tcW w:type="dxa" w:w="5102"/>
+            <w:vAlign w:val="center"/>
+          </w:tcPr>
+          <w:p>
+            <w:r>
+              <w:rPr>
+                <w:sz w:val="16"/>
+              </w:rPr>
+              <w:t>RetCCL self-supervised tile features plus attention-based multiple-instance learning. Attention aggregation yielded patient-level predictions; a deterministic multi-slide pooling rule was not specified in the main report</w:t>
+            </w:r>
+          </w:p>
+        </w:tc>
+      </w:tr>
+      <w:tr>
+        <w:trPr>
+          <w:cantSplit/>
+        </w:trPr>
+        <w:tc>
+          <w:tcPr>
+            <w:tcW w:type="dxa" w:w="1701"/>
+            <w:vAlign w:val="center"/>
+          </w:tcPr>
+          <w:p>
+            <w:r>
+              <w:rPr>
+                <w:sz w:val="16"/>
+              </w:rPr>
+              <w:t>Arslan et al. [13]</w:t>
+            </w:r>
+          </w:p>
+        </w:tc>
+        <w:tc>
+          <w:tcPr>
+            <w:tcW w:type="dxa" w:w="2268"/>
+            <w:vAlign w:val="center"/>
+          </w:tcPr>
+          <w:p>
+            <w:r>
+              <w:rPr>
+                <w:sz w:val="16"/>
+              </w:rPr>
+              <w:t>8,890 TCGA; 1,329 CPTAC; 32 TCGA; 7 CPTAC cancers</w:t>
+            </w:r>
+          </w:p>
+        </w:tc>
+        <w:tc>
+          <w:tcPr>
+            <w:tcW w:type="dxa" w:w="1701"/>
+            <w:vAlign w:val="center"/>
+          </w:tcPr>
+          <w:p>
+            <w:r>
+              <w:rPr>
+                <w:sz w:val="16"/>
+              </w:rPr>
+              <w:t>10,954 TCGA; 3,481 CPTAC</w:t>
+            </w:r>
+          </w:p>
+        </w:tc>
+        <w:tc>
+          <w:tcPr>
+            <w:tcW w:type="dxa" w:w="4252"/>
+            <w:vAlign w:val="center"/>
+          </w:tcPr>
+          <w:p>
+            <w:r>
+              <w:rPr>
+                <w:sz w:val="16"/>
+              </w:rPr>
+              <w:t>4,031 genomic, transcriptomic, proteomic, standard-of-care, subtype, signature, clinical-outcome and treatment-response biomarkers; 12,093 TCGA models</w:t>
+            </w:r>
+          </w:p>
+        </w:tc>
+        <w:tc>
+          <w:tcPr>
+            <w:tcW w:type="dxa" w:w="5102"/>
+            <w:vAlign w:val="center"/>
+          </w:tcPr>
+          <w:p>
+            <w:r>
+              <w:rPr>
+                <w:sz w:val="16"/>
+              </w:rPr>
+              <w:t>Target-specific ResNet34 encoder-decoder CNNs trained from scratch. Tile scores averaged to slides and slide scores averaged within patient for patient-level AUROC; patient-level folds</w:t>
+            </w:r>
+          </w:p>
+        </w:tc>
+      </w:tr>
+      <w:tr>
+        <w:trPr>
+          <w:cantSplit/>
+        </w:trPr>
+        <w:tc>
+          <w:tcPr>
+            <w:tcW w:type="dxa" w:w="1701"/>
+            <w:vAlign w:val="center"/>
+          </w:tcPr>
+          <w:p>
+            <w:r>
+              <w:rPr>
+                <w:sz w:val="16"/>
+              </w:rPr>
+              <w:t>Present study</w:t>
+            </w:r>
+          </w:p>
+        </w:tc>
+        <w:tc>
+          <w:tcPr>
+            <w:tcW w:type="dxa" w:w="2268"/>
+            <w:vAlign w:val="center"/>
+          </w:tcPr>
+          <w:p>
+            <w:r>
+              <w:rPr>
+                <w:sz w:val="16"/>
+              </w:rPr>
+              <w:t>9,404; 32 cancers</w:t>
+            </w:r>
+          </w:p>
+        </w:tc>
+        <w:tc>
+          <w:tcPr>
+            <w:tcW w:type="dxa" w:w="1701"/>
+            <w:vAlign w:val="center"/>
+          </w:tcPr>
+          <w:p>
+            <w:r>
+              <w:rPr>
+                <w:sz w:val="16"/>
+              </w:rPr>
+              <w:t>11,449</w:t>
+            </w:r>
+          </w:p>
+        </w:tc>
+        <w:tc>
+          <w:tcPr>
+            <w:tcW w:type="dxa" w:w="4252"/>
+            <w:vAlign w:val="center"/>
+          </w:tcPr>
+          <w:p>
+            <w:r>
+              <w:rPr>
+                <w:sz w:val="16"/>
+              </w:rPr>
+              <w:t>1,614 continuous and 459 binary cancer-endpoint pairs: immune and genomic-context scores; mutations; pathways; MSI; aneuploidy; fusions</w:t>
+            </w:r>
+          </w:p>
+        </w:tc>
+        <w:tc>
+          <w:tcPr>
+            <w:tcW w:type="dxa" w:w="5102"/>
+            <w:vAlign w:val="center"/>
+          </w:tcPr>
+          <w:p>
+            <w:r>
+              <w:rPr>
+                <w:sz w:val="16"/>
+              </w:rPr>
+              <w:t>One fixed pretrained 768-dimensional TITAN whole-slide representation with PLS1 or PLS-LDA. All eligible diagnostic slides deterministically mean-pooled before outcome matching; one vector and one fold assignment per patient</w:t>
+            </w:r>
+          </w:p>
+        </w:tc>
+      </w:tr>
+    </w:tbl>
+    <w:p/>
+    <w:p>
+      <w:pPr>
+        <w:pStyle w:val="Caption"/>
+      </w:pPr>
+      <w:r>
+        <w:t>Panel B. Validation, site sensitivity, negative-result reporting and predictor availability.</w:t>
+      </w:r>
+    </w:p>
+    <w:tbl>
+      <w:tblPr>
+        <w:tblStyle w:val="TableGrid"/>
+        <w:tblW w:type="auto" w:w="0"/>
+        <w:jc w:val="center"/>
+        <w:tblLook w:firstColumn="1" w:firstRow="1" w:lastColumn="0" w:lastRow="0" w:noHBand="0" w:noVBand="1" w:val="04A0"/>
+      </w:tblPr>
+      <w:tblGrid>
+        <w:gridCol w:w="2523"/>
+        <w:gridCol w:w="2523"/>
+        <w:gridCol w:w="2523"/>
+        <w:gridCol w:w="2523"/>
+        <w:gridCol w:w="2523"/>
+        <w:gridCol w:w="2523"/>
+      </w:tblGrid>
+      <w:tr>
+        <w:trPr>
+          <w:tblHeader w:val="true"/>
+          <w:cantSplit/>
+        </w:trPr>
+        <w:tc>
+          <w:tcPr>
+            <w:tcW w:type="dxa" w:w="1701"/>
+          </w:tcPr>
+          <w:p>
+            <w:r>
+              <w:rPr>
+                <w:b/>
+                <w:sz w:val="17"/>
+              </w:rPr>
+              <w:t>Study</w:t>
+            </w:r>
+          </w:p>
+        </w:tc>
+        <w:tc>
+          <w:tcPr>
+            <w:tcW w:type="dxa" w:w="2665"/>
+          </w:tcPr>
+          <w:p>
+            <w:r>
+              <w:rPr>
+                <w:b/>
+                <w:sz w:val="17"/>
+              </w:rPr>
+              <w:t>Validation design</w:t>
+            </w:r>
+          </w:p>
+        </w:tc>
+        <w:tc>
+          <w:tcPr>
+            <w:tcW w:type="dxa" w:w="2154"/>
+          </w:tcPr>
+          <w:p>
+            <w:r>
+              <w:rPr>
+                <w:b/>
+                <w:sz w:val="17"/>
+              </w:rPr>
+              <w:t>Site sensitivity</w:t>
+            </w:r>
+          </w:p>
+        </w:tc>
+        <w:tc>
+          <w:tcPr>
+            <w:tcW w:type="dxa" w:w="2835"/>
+          </w:tcPr>
+          <w:p>
+            <w:r>
+              <w:rPr>
+                <w:b/>
+                <w:sz w:val="17"/>
+              </w:rPr>
+              <w:t>External validation</w:t>
+            </w:r>
+          </w:p>
+        </w:tc>
+        <w:tc>
+          <w:tcPr>
+            <w:tcW w:type="dxa" w:w="3118"/>
+          </w:tcPr>
+          <w:p>
+            <w:r>
+              <w:rPr>
+                <w:b/>
+                <w:sz w:val="17"/>
+              </w:rPr>
+              <w:t>Negative/ineligible reporting</w:t>
+            </w:r>
+          </w:p>
+        </w:tc>
+        <w:tc>
+          <w:tcPr>
+            <w:tcW w:type="dxa" w:w="2551"/>
+          </w:tcPr>
+          <w:p>
+            <w:r>
+              <w:rPr>
+                <w:b/>
+                <w:sz w:val="17"/>
+              </w:rPr>
+              <w:t>Fitted predictors</w:t>
+            </w:r>
+          </w:p>
+        </w:tc>
+      </w:tr>
+      <w:tr>
+        <w:trPr>
+          <w:cantSplit/>
+        </w:trPr>
+        <w:tc>
+          <w:tcPr>
+            <w:tcW w:type="dxa" w:w="1701"/>
+            <w:vAlign w:val="center"/>
+          </w:tcPr>
+          <w:p>
+            <w:r>
+              <w:rPr>
+                <w:sz w:val="16"/>
+              </w:rPr>
+              <w:t>Fu et al. [4]</w:t>
+            </w:r>
+          </w:p>
+        </w:tc>
+        <w:tc>
+          <w:tcPr>
+            <w:tcW w:type="dxa" w:w="2665"/>
+            <w:vAlign w:val="center"/>
+          </w:tcPr>
+          <w:p>
+            <w:r>
+              <w:rPr>
+                <w:sz w:val="16"/>
+              </w:rPr>
+              <w:t>Internal TCGA analyses; not nested patient-level cross-validation</w:t>
+            </w:r>
+          </w:p>
+        </w:tc>
+        <w:tc>
+          <w:tcPr>
+            <w:tcW w:type="dxa" w:w="2154"/>
+            <w:vAlign w:val="center"/>
+          </w:tcPr>
+          <w:p>
+            <w:r>
+              <w:rPr>
+                <w:sz w:val="16"/>
+              </w:rPr>
+              <w:t>No target-level tissue-source-site analysis</w:t>
+            </w:r>
+          </w:p>
+        </w:tc>
+        <w:tc>
+          <w:tcPr>
+            <w:tcW w:type="dxa" w:w="2835"/>
+            <w:vAlign w:val="center"/>
+          </w:tcPr>
+          <w:p>
+            <w:r>
+              <w:rPr>
+                <w:sz w:val="16"/>
+              </w:rPr>
+              <w:t>No independent cohort for the pan-cancer molecular screen; selected breast prognostic analyses used METABRIC</w:t>
+            </w:r>
+          </w:p>
+        </w:tc>
+        <w:tc>
+          <w:tcPr>
+            <w:tcW w:type="dxa" w:w="3118"/>
+            <w:vAlign w:val="center"/>
+          </w:tcPr>
+          <w:p>
+            <w:r>
+              <w:rPr>
+                <w:sz w:val="16"/>
+              </w:rPr>
+              <w:t>Broad association and performance landscape; no explicit tested-negative versus sample-size-ineligible taxonomy</w:t>
+            </w:r>
+          </w:p>
+        </w:tc>
+        <w:tc>
+          <w:tcPr>
+            <w:tcW w:type="dxa" w:w="2551"/>
+            <w:vAlign w:val="center"/>
+          </w:tcPr>
+          <w:p>
+            <w:r>
+              <w:rPr>
+                <w:sz w:val="16"/>
+              </w:rPr>
+              <w:t>Code, trained feature extractor and extracted image features released; no target-specific fitted predictor library identified</w:t>
+            </w:r>
+          </w:p>
+        </w:tc>
+      </w:tr>
+      <w:tr>
+        <w:trPr>
+          <w:cantSplit/>
+        </w:trPr>
+        <w:tc>
+          <w:tcPr>
+            <w:tcW w:type="dxa" w:w="1701"/>
+            <w:vAlign w:val="center"/>
+          </w:tcPr>
+          <w:p>
+            <w:r>
+              <w:rPr>
+                <w:sz w:val="16"/>
+              </w:rPr>
+              <w:t>Kather et al. [5]</w:t>
+            </w:r>
+          </w:p>
+        </w:tc>
+        <w:tc>
+          <w:tcPr>
+            <w:tcW w:type="dxa" w:w="2665"/>
+            <w:vAlign w:val="center"/>
+          </w:tcPr>
+          <w:p>
+            <w:r>
+              <w:rPr>
+                <w:sz w:val="16"/>
+              </w:rPr>
+              <w:t>Three-fold patient-level cross-validation</w:t>
+            </w:r>
+          </w:p>
+        </w:tc>
+        <w:tc>
+          <w:tcPr>
+            <w:tcW w:type="dxa" w:w="2154"/>
+            <w:vAlign w:val="center"/>
+          </w:tcPr>
+          <w:p>
+            <w:r>
+              <w:rPr>
+                <w:sz w:val="16"/>
+              </w:rPr>
+              <w:t>No target-level tissue-source-site analysis</w:t>
+            </w:r>
+          </w:p>
+        </w:tc>
+        <w:tc>
+          <w:tcPr>
+            <w:tcW w:type="dxa" w:w="2835"/>
+            <w:vAlign w:val="center"/>
+          </w:tcPr>
+          <w:p>
+            <w:r>
+              <w:rPr>
+                <w:sz w:val="16"/>
+              </w:rPr>
+              <w:t>Selected targets externally tested, including BRAF and CIMP in 408 DACHS colorectal cases</w:t>
+            </w:r>
+          </w:p>
+        </w:tc>
+        <w:tc>
+          <w:tcPr>
+            <w:tcW w:type="dxa" w:w="3118"/>
+            <w:vAlign w:val="center"/>
+          </w:tcPr>
+          <w:p>
+            <w:r>
+              <w:rPr>
+                <w:sz w:val="16"/>
+              </w:rPr>
+              <w:t>Tested-target results and FDR reported; no explicit sample-size-ineligible taxonomy comparable with the present study</w:t>
+            </w:r>
+          </w:p>
+        </w:tc>
+        <w:tc>
+          <w:tcPr>
+            <w:tcW w:type="dxa" w:w="2551"/>
+            <w:vAlign w:val="center"/>
+          </w:tcPr>
+          <w:p>
+            <w:r>
+              <w:rPr>
+                <w:sz w:val="16"/>
+              </w:rPr>
+              <w:t>Workflow and source code released; no pan-cancer fitted predictor library identified</w:t>
+            </w:r>
+          </w:p>
+        </w:tc>
+      </w:tr>
+      <w:tr>
+        <w:trPr>
+          <w:cantSplit/>
+        </w:trPr>
+        <w:tc>
+          <w:tcPr>
+            <w:tcW w:type="dxa" w:w="1701"/>
+            <w:vAlign w:val="center"/>
+          </w:tcPr>
+          <w:p>
+            <w:r>
+              <w:rPr>
+                <w:sz w:val="16"/>
+              </w:rPr>
+              <w:t>Saldanha et al. [11]</w:t>
+            </w:r>
+          </w:p>
+        </w:tc>
+        <w:tc>
+          <w:tcPr>
+            <w:tcW w:type="dxa" w:w="2665"/>
+            <w:vAlign w:val="center"/>
+          </w:tcPr>
+          <w:p>
+            <w:r>
+              <w:rPr>
+                <w:sz w:val="16"/>
+              </w:rPr>
+              <w:t>Five replicate experiments in TCGA with locked evaluation in CPTAC</w:t>
+            </w:r>
+          </w:p>
+        </w:tc>
+        <w:tc>
+          <w:tcPr>
+            <w:tcW w:type="dxa" w:w="2154"/>
+            <w:vAlign w:val="center"/>
+          </w:tcPr>
+          <w:p>
+            <w:r>
+              <w:rPr>
+                <w:sz w:val="16"/>
+              </w:rPr>
+              <w:t>No target-level tissue-source-site analysis</w:t>
+            </w:r>
+          </w:p>
+        </w:tc>
+        <w:tc>
+          <w:tcPr>
+            <w:tcW w:type="dxa" w:w="2835"/>
+            <w:vAlign w:val="center"/>
+          </w:tcPr>
+          <w:p>
+            <w:r>
+              <w:rPr>
+                <w:sz w:val="16"/>
+              </w:rPr>
+              <w:t>Direct TCGA-to-CPTAC testing across seven matched cancers</w:t>
+            </w:r>
+          </w:p>
+        </w:tc>
+        <w:tc>
+          <w:tcPr>
+            <w:tcW w:type="dxa" w:w="3118"/>
+            <w:vAlign w:val="center"/>
+          </w:tcPr>
+          <w:p>
+            <w:r>
+              <w:rPr>
+                <w:sz w:val="16"/>
+              </w:rPr>
+              <w:t>Analysed-gene outputs reported after a minimum-25-mutant rule; no explicit tested-negative versus ineligible taxonomy</w:t>
+            </w:r>
+          </w:p>
+        </w:tc>
+        <w:tc>
+          <w:tcPr>
+            <w:tcW w:type="dxa" w:w="2551"/>
+            <w:vAlign w:val="center"/>
+          </w:tcPr>
+          <w:p>
+            <w:r>
+              <w:rPr>
+                <w:sz w:val="16"/>
+              </w:rPr>
+              <w:t>Open-source pipeline released; no fitted pan-cancer predictor library identified</w:t>
+            </w:r>
+          </w:p>
+        </w:tc>
+      </w:tr>
+      <w:tr>
+        <w:trPr>
+          <w:cantSplit/>
+        </w:trPr>
+        <w:tc>
+          <w:tcPr>
+            <w:tcW w:type="dxa" w:w="1701"/>
+            <w:vAlign w:val="center"/>
+          </w:tcPr>
+          <w:p>
+            <w:r>
+              <w:rPr>
+                <w:sz w:val="16"/>
+              </w:rPr>
+              <w:t>Arslan et al. [13]</w:t>
+            </w:r>
+          </w:p>
+        </w:tc>
+        <w:tc>
+          <w:tcPr>
+            <w:tcW w:type="dxa" w:w="2665"/>
+            <w:vAlign w:val="center"/>
+          </w:tcPr>
+          <w:p>
+            <w:r>
+              <w:rPr>
+                <w:sz w:val="16"/>
+              </w:rPr>
+              <w:t>Three-fold patient-level cross-validation; not nested</w:t>
+            </w:r>
+          </w:p>
+        </w:tc>
+        <w:tc>
+          <w:tcPr>
+            <w:tcW w:type="dxa" w:w="2154"/>
+            <w:vAlign w:val="center"/>
+          </w:tcPr>
+          <w:p>
+            <w:r>
+              <w:rPr>
+                <w:sz w:val="16"/>
+              </w:rPr>
+              <w:t>No target-level tissue-source-site analysis</w:t>
+            </w:r>
+          </w:p>
+        </w:tc>
+        <w:tc>
+          <w:tcPr>
+            <w:tcW w:type="dxa" w:w="2835"/>
+            <w:vAlign w:val="center"/>
+          </w:tcPr>
+          <w:p>
+            <w:r>
+              <w:rPr>
+                <w:sz w:val="16"/>
+              </w:rPr>
+              <w:t>CPTAC replication for matched subsets; not reported as locked transfer of every TCGA model</w:t>
+            </w:r>
+          </w:p>
+        </w:tc>
+        <w:tc>
+          <w:tcPr>
+            <w:tcW w:type="dxa" w:w="3118"/>
+            <w:vAlign w:val="center"/>
+          </w:tcPr>
+          <w:p>
+            <w:r>
+              <w:rPr>
+                <w:sz w:val="16"/>
+              </w:rPr>
+              <w:t>Endpoint-level outputs and significance reported; targets with fewer than 10 positives excluded, without a separate tested-negative/ineligible taxonomy</w:t>
+            </w:r>
+          </w:p>
+        </w:tc>
+        <w:tc>
+          <w:tcPr>
+            <w:tcW w:type="dxa" w:w="2551"/>
+            <w:vAlign w:val="center"/>
+          </w:tcPr>
+          <w:p>
+            <w:r>
+              <w:rPr>
+                <w:sz w:val="16"/>
+              </w:rPr>
+              <w:t>Code and result outputs released; no reusable target-specific fitted model library identified</w:t>
+            </w:r>
+          </w:p>
+        </w:tc>
+      </w:tr>
+      <w:tr>
+        <w:trPr>
+          <w:cantSplit/>
+        </w:trPr>
+        <w:tc>
+          <w:tcPr>
+            <w:tcW w:type="dxa" w:w="1701"/>
+            <w:vAlign w:val="center"/>
+          </w:tcPr>
+          <w:p>
+            <w:r>
+              <w:rPr>
+                <w:sz w:val="16"/>
+              </w:rPr>
+              <w:t>Present study</w:t>
+            </w:r>
+          </w:p>
+        </w:tc>
+        <w:tc>
+          <w:tcPr>
+            <w:tcW w:type="dxa" w:w="2665"/>
+            <w:vAlign w:val="center"/>
+          </w:tcPr>
+          <w:p>
+            <w:r>
+              <w:rPr>
+                <w:sz w:val="16"/>
+              </w:rPr>
+              <w:t>Nested patient-level 5x5 cross-validation; permutations; five independently seeded repeats</w:t>
+            </w:r>
+          </w:p>
+        </w:tc>
+        <w:tc>
+          <w:tcPr>
+            <w:tcW w:type="dxa" w:w="2154"/>
+            <w:vAlign w:val="center"/>
+          </w:tcPr>
+          <w:p>
+            <w:r>
+              <w:rPr>
+                <w:sz w:val="16"/>
+              </w:rPr>
+              <w:t>Target-level tissue-source-site-grouped sensitivity for every screen-positive model</w:t>
+            </w:r>
+          </w:p>
+        </w:tc>
+        <w:tc>
+          <w:tcPr>
+            <w:tcW w:type="dxa" w:w="2835"/>
+            <w:vAlign w:val="center"/>
+          </w:tcPr>
+          <w:p>
+            <w:r>
+              <w:rPr>
+                <w:sz w:val="16"/>
+              </w:rPr>
+              <w:t>None; TCGA-only internal validation</w:t>
+            </w:r>
+          </w:p>
+        </w:tc>
+        <w:tc>
+          <w:tcPr>
+            <w:tcW w:type="dxa" w:w="3118"/>
+            <w:vAlign w:val="center"/>
+          </w:tcPr>
+          <w:p>
+            <w:r>
+              <w:rPr>
+                <w:sz w:val="16"/>
+              </w:rPr>
+              <w:t>Complete machine-readable tested-negative and sample-size-ineligible results with outcome-specific denominators</w:t>
+            </w:r>
+          </w:p>
+        </w:tc>
+        <w:tc>
+          <w:tcPr>
+            <w:tcW w:type="dxa" w:w="2551"/>
+            <w:vAlign w:val="center"/>
+          </w:tcPr>
+          <w:p>
+            <w:r>
+              <w:rPr>
+                <w:sz w:val="16"/>
+              </w:rPr>
+              <w:t>323 compact research-only fitted PLS and PLS-LDA predictors with feature order, checksums, metadata and inference code</w:t>
+            </w:r>
+          </w:p>
+        </w:tc>
+      </w:tr>
+    </w:tbl>
+    <w:p/>
+    <w:p>
+      <w:r>
+        <w:t>NR, not reported as a single total in the main article. 'No fitted predictor library identified' means that code or outputs may be public, but the primary report did not describe a reusable target-specific fitted-model collection comparable with TITANPred.</w:t>
+      </w:r>
+    </w:p>
+    <w:p>
+      <w:pPr>
+        <w:sectPr>
+          <w:pgSz w:w="16838" w:h="11906" w:orient="landscape"/>
+          <w:pgMar w:top="850" w:right="850" w:bottom="850" w:left="850" w:header="720" w:footer="720" w:gutter="0"/>
+          <w:cols w:space="720"/>
+          <w:docGrid w:linePitch="360"/>
+          <w:lnNumType w:countBy="1" w:restart="continuous"/>
+          <w:lnNumType w:countBy="1" w:restart="continuous"/>
+        </w:sectPr>
+      </w:pPr>
     </w:p>
     <w:p>
       <w:pPr>
@@ -546,7 +1624,7 @@
     </w:p>
     <w:p>
       <w:r>
-        <w:t>As a secondary algorithmic benchmark, the 24 manuscript-highlighted models were refitted on the same five repeated outer partitions using ridge-penalised Gaussian regression for continuous endpoints and ridge logistic regression for binary endpoints. Ridge hyperparameters were selected inside each outer training set; binary operating thresholds maximised balanced accuracy using inner out-of-fold probabilities. The primary paired differences were ridge-minus-PLS Q² and balanced accuracy, with AUROC or Spearman correlation retained as secondary metrics. We report the magnitude, interquartile range and 95% paired-repeat interval rather than declaring a winner from counts alone. Because models were selected for this benchmark after the PLS screen, it is a conditional sensitivity analysis and cannot establish atlas-wide algorithmic superiority. Ridge was chosen as a simple linear baseline whose fitted coefficients can be exported without retaining training embeddings; nonlinear kernel predictors that require training observations or landmarks at inference did not satisfy that deployment constraint.</w:t>
+        <w:t>As a secondary algorithmic benchmark, the 24 manuscript-highlighted models were refitted on the same five repeated outer partitions using ridge-penalised Gaussian regression for continuous endpoints and ridge logistic regression for binary endpoints. Ridge hyperparameters were selected inside each outer training set; binary operating thresholds maximised balanced accuracy using inner out-of-fold probabilities. The primary paired differences were ridge-minus-PLS Q² and balanced accuracy, with AUROC or Spearman correlation retained as secondary metrics. We report the magnitude, interquartile range and 95% paired-repeat interval rather than declaring a winner from counts alone. Because models were selected for this benchmark after the PLS screen, it is a conditional sensitivity analysis and cannot establish screen-wide algorithmic superiority. Ridge was chosen as a simple linear baseline whose fitted coefficients can be exported without retaining training embeddings; nonlinear kernel predictors that require training observations or landmarks at inference did not satisfy that deployment constraint.</w:t>
       </w:r>
     </w:p>
     <w:p>
@@ -556,7 +1634,7 @@
     </w:p>
     <w:p>
       <w:r>
-        <w:t>Nested performance was first checkpointed for the complete atlas. Only models with Q²≥0.20 or chance-corrected balanced accuracy≥0.20 entered permutation testing. A 99-permutation checkpoint was followed by refinement toward 999 patient-label permutations. During final refinement, evaluation stopped conservatively after 49 exceedances because raw p&lt;0.05 was then impossible even if every remaining null statistic were less extreme; stopped endpoints were assigned p=1. Early-stopped checkpoint jobs resumed from the exact number attempted, so no permutation indices were skipped. Regression extremeness used lower RMSE, whereas classification used higher balanced accuracy. Completed finite p values were (b+1)/(B+1), giving minimum resolution 0.001. Because each disease defines a separate prediction and intended-use population, Benjamini–Hochberg FDR was controlled separately for continuous and binary screens within cancer and prespecified endpoint family [27]; a q-value across cancers within the same outcome type and family was retained as a stricter multiplicity sensitivity. Effect denotes Q² for continuous outcomes and 2×balanced accuracy−1 for binary outcomes. Screen-positive candidates were described as higher effect (primary q&lt;0.05 and effect≥0.40) or moderate effect (primary q&lt;0.05 and effect 0.20–0.39). Screen-negative tested pairs and pairs ineligible by sample-size rules were reported separately. These categories prioritise discovery candidates and are not clinical grades.</w:t>
+        <w:t>Nested performance was first checkpointed for the complete screen. Only models with Q²≥0.20 or chance-corrected balanced accuracy≥0.20 entered permutation testing. A 99-permutation checkpoint was followed by refinement toward 999 patient-label permutations. During final refinement, evaluation stopped conservatively after 49 exceedances because raw p&lt;0.05 was then impossible even if every remaining null statistic were less extreme; stopped endpoints were assigned p=1. Early-stopped checkpoint jobs resumed from the exact number attempted, so no permutation indices were skipped. Regression extremeness used lower RMSE, whereas classification used higher balanced accuracy. Completed finite p values were (b+1)/(B+1), giving minimum resolution 0.001. Because each disease defines a separate prediction and intended-use population, Benjamini–Hochberg FDR was controlled separately for continuous and binary screens within cancer and prespecified endpoint family [27]; a q-value across cancers within the same outcome type and family was retained as a stricter multiplicity sensitivity. Effect denotes Q² for continuous outcomes and 2×balanced accuracy−1 for binary outcomes. Screen-positive candidates were described as higher effect (primary q&lt;0.05 and effect≥0.40) or moderate effect (primary q&lt;0.05 and effect 0.20–0.39). Screen-negative tested pairs and pairs ineligible by sample-size rules were reported separately. These categories prioritise candidates for further testing and are not clinical grades.</w:t>
       </w:r>
     </w:p>
     <w:p>
@@ -623,7 +1701,7 @@
     </w:p>
     <w:p>
       <w:r>
-        <w:t>The embedding cohort contained 9,404 patients represented by 11,449 slides; 843 patients (9.0%) had more than one eligible diagnostic slide. The maximum was 30 slides for one patient, and no patient contributed slides from multiple primary sample barcodes. Exact slide-report coverage was 10,106/11,449 (88.3%). Cancer labels were available for 9,395 patients across 32 cancers. The atlas evaluated 1,614 continuous and 459 binary cancer–endpoint pairs (Table 1). Of 537 prespecified cancer–gene mutation pairs with a profiled denominator, 238 met the 20-positive/20-negative rule and 299 were reported as ineligible rather than tested-negative. Molecular coverage varied by source and cancer; missing cases were excluded outcome by outcome.</w:t>
+        <w:t>The embedding cohort contained 9,404 patients represented by 11,449 slides; 843 patients (9.0%) had more than one eligible diagnostic slide. The maximum was 30 slides for one patient, and no patient contributed slides from multiple primary sample barcodes. Exact slide-report coverage was 10,106/11,449 (88.3%). Cancer labels were available for 9,395 patients across 32 cancers. The benchmark evaluated 1,614 continuous and 459 binary cancer–endpoint pairs (Table 2). Of 537 prespecified cancer–gene mutation pairs with a profiled denominator, 238 met the 20-positive/20-negative rule and 299 were reported as ineligible rather than tested-negative. Molecular coverage varied by source and cancer; missing cases were excluded outcome by outcome.</w:t>
       </w:r>
     </w:p>
     <w:p>
@@ -636,7 +1714,7 @@
         <w:pStyle w:val="Caption"/>
       </w:pPr>
       <w:r>
-        <w:t>Table 1. Eligible cancer–endpoint models and within-cancer screening categories.</w:t>
+        <w:t>Table 2. Eligible cancer–endpoint models and within-cancer screening categories.</w:t>
       </w:r>
     </w:p>
     <w:tbl>
@@ -647,13 +1725,13 @@
         <w:tblLook w:firstColumn="1" w:firstRow="1" w:lastColumn="0" w:lastRow="0" w:noHBand="0" w:noVBand="1" w:val="04A0"/>
       </w:tblPr>
       <w:tblGrid>
-        <w:gridCol w:w="1392"/>
-        <w:gridCol w:w="1392"/>
-        <w:gridCol w:w="1392"/>
-        <w:gridCol w:w="1392"/>
-        <w:gridCol w:w="1392"/>
-        <w:gridCol w:w="1392"/>
-        <w:gridCol w:w="1392"/>
+        <w:gridCol w:w="1345"/>
+        <w:gridCol w:w="1345"/>
+        <w:gridCol w:w="1345"/>
+        <w:gridCol w:w="1345"/>
+        <w:gridCol w:w="1345"/>
+        <w:gridCol w:w="1345"/>
+        <w:gridCol w:w="1345"/>
       </w:tblGrid>
       <w:tr>
         <w:trPr>
@@ -1854,7 +2932,7 @@
         <w:jc w:val="center"/>
       </w:pPr>
       <w:r>
-        <w:t>Figure 2. Strongest within-cancer screen-positive continuous cancer–endpoint results. Q² is calculated from genuine patient-level outer-fold predictions; all tests remain available in the machine-readable atlas.</w:t>
+        <w:t>Figure 2. Strongest within-cancer screen-positive continuous cancer–endpoint results. Q² is calculated from genuine patient-level outer-fold predictions; all tests remain available in the machine-readable benchmark results.</w:t>
       </w:r>
     </w:p>
     <w:p>
@@ -1867,7 +2945,7 @@
     </w:p>
     <w:p>
       <w:r>
-        <w:t>The binary atlas yielded 29 within-cancer higher-effect and 75 moderate-effect candidates. Leading results were THYM–GTF2I [mutation] (0.883); READ–APC [mutation] (0.862); READ–TP53 [mutation] (0.861); LGG–TP53 [mutation] (0.846); THCA–BRAF [mutation] (0.830); LGG–TP53 [pathway] (0.822); LGG–HIPPO [pathway] (0.811); COAD–APC [mutation] (0.793); UCEC–Any called fusion [fusion] (0.792); LGG–IDH1 [mutation] (0.786); COAD–MSI-H strict (MANTIS &gt;0.6) [strict MSI] (0.784); COAD–TP53 [mutation] (0.779). The complete table distinguishes tested-negative pairs from outcomes that failed prevalence or sample-size eligibility.</w:t>
+        <w:t>The binary screen yielded 29 within-cancer higher-effect and 75 moderate-effect candidates. Leading results were THYM–GTF2I [mutation] (0.883); READ–APC [mutation] (0.862); READ–TP53 [mutation] (0.861); LGG–TP53 [mutation] (0.846); THCA–BRAF [mutation] (0.830); LGG–TP53 [pathway] (0.822); LGG–HIPPO [pathway] (0.811); COAD–APC [mutation] (0.793); UCEC–Any called fusion [fusion] (0.792); LGG–IDH1 [mutation] (0.786); COAD–MSI-H strict (MANTIS &gt;0.6) [strict MSI] (0.784); COAD–TP53 [mutation] (0.779). The complete table distinguishes tested-negative pairs from outcomes that failed prevalence or sample-size eligibility.</w:t>
       </w:r>
     </w:p>
     <w:p>
@@ -1976,7 +3054,7 @@
         <w:pStyle w:val="Caption"/>
       </w:pPr>
       <w:r>
-        <w:t>Table 2. Highlighted repeated nested-cross-validation performance with 95% patient-cluster bootstrap intervals.</w:t>
+        <w:t>Table 3. Highlighted repeated nested-cross-validation performance with 95% patient-cluster bootstrap intervals.</w:t>
       </w:r>
     </w:p>
     <w:tbl>
@@ -1987,11 +3065,11 @@
         <w:tblLook w:firstColumn="1" w:firstRow="1" w:lastColumn="0" w:lastRow="0" w:noHBand="0" w:noVBand="1" w:val="04A0"/>
       </w:tblPr>
       <w:tblGrid>
-        <w:gridCol w:w="1949"/>
-        <w:gridCol w:w="1949"/>
-        <w:gridCol w:w="1949"/>
-        <w:gridCol w:w="1949"/>
-        <w:gridCol w:w="1949"/>
+        <w:gridCol w:w="1882"/>
+        <w:gridCol w:w="1882"/>
+        <w:gridCol w:w="1882"/>
+        <w:gridCol w:w="1882"/>
+        <w:gridCol w:w="1882"/>
       </w:tblGrid>
       <w:tr>
         <w:trPr>
@@ -2000,7 +3078,7 @@
         </w:trPr>
         <w:tc>
           <w:tcPr>
-            <w:tcW w:type="dxa" w:w="1949"/>
+            <w:tcW w:type="dxa" w:w="1882"/>
           </w:tcPr>
           <w:p>
             <w:r>
@@ -2014,7 +3092,7 @@
         </w:tc>
         <w:tc>
           <w:tcPr>
-            <w:tcW w:type="dxa" w:w="1949"/>
+            <w:tcW w:type="dxa" w:w="1882"/>
           </w:tcPr>
           <w:p>
             <w:r>
@@ -2028,7 +3106,7 @@
         </w:tc>
         <w:tc>
           <w:tcPr>
-            <w:tcW w:type="dxa" w:w="1949"/>
+            <w:tcW w:type="dxa" w:w="1882"/>
           </w:tcPr>
           <w:p>
             <w:r>
@@ -2042,7 +3120,7 @@
         </w:tc>
         <w:tc>
           <w:tcPr>
-            <w:tcW w:type="dxa" w:w="1949"/>
+            <w:tcW w:type="dxa" w:w="1882"/>
           </w:tcPr>
           <w:p>
             <w:r>
@@ -2056,7 +3134,7 @@
         </w:tc>
         <w:tc>
           <w:tcPr>
-            <w:tcW w:type="dxa" w:w="1949"/>
+            <w:tcW w:type="dxa" w:w="1882"/>
           </w:tcPr>
           <w:p>
             <w:r>
@@ -2075,7 +3153,7 @@
         </w:trPr>
         <w:tc>
           <w:tcPr>
-            <w:tcW w:type="dxa" w:w="1949"/>
+            <w:tcW w:type="dxa" w:w="1882"/>
             <w:vAlign w:val="center"/>
           </w:tcPr>
           <w:p>
@@ -2089,7 +3167,7 @@
         </w:tc>
         <w:tc>
           <w:tcPr>
-            <w:tcW w:type="dxa" w:w="1949"/>
+            <w:tcW w:type="dxa" w:w="1882"/>
             <w:vAlign w:val="center"/>
           </w:tcPr>
           <w:p>
@@ -2103,7 +3181,7 @@
         </w:tc>
         <w:tc>
           <w:tcPr>
-            <w:tcW w:type="dxa" w:w="1949"/>
+            <w:tcW w:type="dxa" w:w="1882"/>
             <w:vAlign w:val="center"/>
           </w:tcPr>
           <w:p>
@@ -2117,7 +3195,7 @@
         </w:tc>
         <w:tc>
           <w:tcPr>
-            <w:tcW w:type="dxa" w:w="1949"/>
+            <w:tcW w:type="dxa" w:w="1882"/>
             <w:vAlign w:val="center"/>
           </w:tcPr>
           <w:p>
@@ -2131,7 +3209,7 @@
         </w:tc>
         <w:tc>
           <w:tcPr>
-            <w:tcW w:type="dxa" w:w="1949"/>
+            <w:tcW w:type="dxa" w:w="1882"/>
             <w:vAlign w:val="center"/>
           </w:tcPr>
           <w:p>
@@ -2150,7 +3228,7 @@
         </w:trPr>
         <w:tc>
           <w:tcPr>
-            <w:tcW w:type="dxa" w:w="1949"/>
+            <w:tcW w:type="dxa" w:w="1882"/>
             <w:vAlign w:val="center"/>
           </w:tcPr>
           <w:p>
@@ -2164,7 +3242,7 @@
         </w:tc>
         <w:tc>
           <w:tcPr>
-            <w:tcW w:type="dxa" w:w="1949"/>
+            <w:tcW w:type="dxa" w:w="1882"/>
             <w:vAlign w:val="center"/>
           </w:tcPr>
           <w:p>
@@ -2178,7 +3256,7 @@
         </w:tc>
         <w:tc>
           <w:tcPr>
-            <w:tcW w:type="dxa" w:w="1949"/>
+            <w:tcW w:type="dxa" w:w="1882"/>
             <w:vAlign w:val="center"/>
           </w:tcPr>
           <w:p>
@@ -2192,7 +3270,7 @@
         </w:tc>
         <w:tc>
           <w:tcPr>
-            <w:tcW w:type="dxa" w:w="1949"/>
+            <w:tcW w:type="dxa" w:w="1882"/>
             <w:vAlign w:val="center"/>
           </w:tcPr>
           <w:p>
@@ -2206,7 +3284,7 @@
         </w:tc>
         <w:tc>
           <w:tcPr>
-            <w:tcW w:type="dxa" w:w="1949"/>
+            <w:tcW w:type="dxa" w:w="1882"/>
             <w:vAlign w:val="center"/>
           </w:tcPr>
           <w:p>
@@ -2225,7 +3303,7 @@
         </w:trPr>
         <w:tc>
           <w:tcPr>
-            <w:tcW w:type="dxa" w:w="1949"/>
+            <w:tcW w:type="dxa" w:w="1882"/>
             <w:vAlign w:val="center"/>
           </w:tcPr>
           <w:p>
@@ -2239,7 +3317,7 @@
         </w:tc>
         <w:tc>
           <w:tcPr>
-            <w:tcW w:type="dxa" w:w="1949"/>
+            <w:tcW w:type="dxa" w:w="1882"/>
             <w:vAlign w:val="center"/>
           </w:tcPr>
           <w:p>
@@ -2253,7 +3331,7 @@
         </w:tc>
         <w:tc>
           <w:tcPr>
-            <w:tcW w:type="dxa" w:w="1949"/>
+            <w:tcW w:type="dxa" w:w="1882"/>
             <w:vAlign w:val="center"/>
           </w:tcPr>
           <w:p>
@@ -2267,7 +3345,7 @@
         </w:tc>
         <w:tc>
           <w:tcPr>
-            <w:tcW w:type="dxa" w:w="1949"/>
+            <w:tcW w:type="dxa" w:w="1882"/>
             <w:vAlign w:val="center"/>
           </w:tcPr>
           <w:p>
@@ -2281,7 +3359,7 @@
         </w:tc>
         <w:tc>
           <w:tcPr>
-            <w:tcW w:type="dxa" w:w="1949"/>
+            <w:tcW w:type="dxa" w:w="1882"/>
             <w:vAlign w:val="center"/>
           </w:tcPr>
           <w:p>
@@ -2300,7 +3378,7 @@
         </w:trPr>
         <w:tc>
           <w:tcPr>
-            <w:tcW w:type="dxa" w:w="1949"/>
+            <w:tcW w:type="dxa" w:w="1882"/>
             <w:vAlign w:val="center"/>
           </w:tcPr>
           <w:p>
@@ -2314,7 +3392,7 @@
         </w:tc>
         <w:tc>
           <w:tcPr>
-            <w:tcW w:type="dxa" w:w="1949"/>
+            <w:tcW w:type="dxa" w:w="1882"/>
             <w:vAlign w:val="center"/>
           </w:tcPr>
           <w:p>
@@ -2328,7 +3406,7 @@
         </w:tc>
         <w:tc>
           <w:tcPr>
-            <w:tcW w:type="dxa" w:w="1949"/>
+            <w:tcW w:type="dxa" w:w="1882"/>
             <w:vAlign w:val="center"/>
           </w:tcPr>
           <w:p>
@@ -2342,7 +3420,7 @@
         </w:tc>
         <w:tc>
           <w:tcPr>
-            <w:tcW w:type="dxa" w:w="1949"/>
+            <w:tcW w:type="dxa" w:w="1882"/>
             <w:vAlign w:val="center"/>
           </w:tcPr>
           <w:p>
@@ -2356,7 +3434,7 @@
         </w:tc>
         <w:tc>
           <w:tcPr>
-            <w:tcW w:type="dxa" w:w="1949"/>
+            <w:tcW w:type="dxa" w:w="1882"/>
             <w:vAlign w:val="center"/>
           </w:tcPr>
           <w:p>
@@ -2375,7 +3453,7 @@
         </w:trPr>
         <w:tc>
           <w:tcPr>
-            <w:tcW w:type="dxa" w:w="1949"/>
+            <w:tcW w:type="dxa" w:w="1882"/>
             <w:vAlign w:val="center"/>
           </w:tcPr>
           <w:p>
@@ -2389,7 +3467,7 @@
         </w:tc>
         <w:tc>
           <w:tcPr>
-            <w:tcW w:type="dxa" w:w="1949"/>
+            <w:tcW w:type="dxa" w:w="1882"/>
             <w:vAlign w:val="center"/>
           </w:tcPr>
           <w:p>
@@ -2403,7 +3481,7 @@
         </w:tc>
         <w:tc>
           <w:tcPr>
-            <w:tcW w:type="dxa" w:w="1949"/>
+            <w:tcW w:type="dxa" w:w="1882"/>
             <w:vAlign w:val="center"/>
           </w:tcPr>
           <w:p>
@@ -2417,7 +3495,7 @@
         </w:tc>
         <w:tc>
           <w:tcPr>
-            <w:tcW w:type="dxa" w:w="1949"/>
+            <w:tcW w:type="dxa" w:w="1882"/>
             <w:vAlign w:val="center"/>
           </w:tcPr>
           <w:p>
@@ -2431,7 +3509,7 @@
         </w:tc>
         <w:tc>
           <w:tcPr>
-            <w:tcW w:type="dxa" w:w="1949"/>
+            <w:tcW w:type="dxa" w:w="1882"/>
             <w:vAlign w:val="center"/>
           </w:tcPr>
           <w:p>
@@ -2450,7 +3528,7 @@
         </w:trPr>
         <w:tc>
           <w:tcPr>
-            <w:tcW w:type="dxa" w:w="1949"/>
+            <w:tcW w:type="dxa" w:w="1882"/>
             <w:vAlign w:val="center"/>
           </w:tcPr>
           <w:p>
@@ -2464,7 +3542,7 @@
         </w:tc>
         <w:tc>
           <w:tcPr>
-            <w:tcW w:type="dxa" w:w="1949"/>
+            <w:tcW w:type="dxa" w:w="1882"/>
             <w:vAlign w:val="center"/>
           </w:tcPr>
           <w:p>
@@ -2478,7 +3556,7 @@
         </w:tc>
         <w:tc>
           <w:tcPr>
-            <w:tcW w:type="dxa" w:w="1949"/>
+            <w:tcW w:type="dxa" w:w="1882"/>
             <w:vAlign w:val="center"/>
           </w:tcPr>
           <w:p>
@@ -2492,7 +3570,7 @@
         </w:tc>
         <w:tc>
           <w:tcPr>
-            <w:tcW w:type="dxa" w:w="1949"/>
+            <w:tcW w:type="dxa" w:w="1882"/>
             <w:vAlign w:val="center"/>
           </w:tcPr>
           <w:p>
@@ -2506,7 +3584,7 @@
         </w:tc>
         <w:tc>
           <w:tcPr>
-            <w:tcW w:type="dxa" w:w="1949"/>
+            <w:tcW w:type="dxa" w:w="1882"/>
             <w:vAlign w:val="center"/>
           </w:tcPr>
           <w:p>
@@ -2525,7 +3603,7 @@
         </w:trPr>
         <w:tc>
           <w:tcPr>
-            <w:tcW w:type="dxa" w:w="1949"/>
+            <w:tcW w:type="dxa" w:w="1882"/>
             <w:vAlign w:val="center"/>
           </w:tcPr>
           <w:p>
@@ -2539,7 +3617,7 @@
         </w:tc>
         <w:tc>
           <w:tcPr>
-            <w:tcW w:type="dxa" w:w="1949"/>
+            <w:tcW w:type="dxa" w:w="1882"/>
             <w:vAlign w:val="center"/>
           </w:tcPr>
           <w:p>
@@ -2553,7 +3631,7 @@
         </w:tc>
         <w:tc>
           <w:tcPr>
-            <w:tcW w:type="dxa" w:w="1949"/>
+            <w:tcW w:type="dxa" w:w="1882"/>
             <w:vAlign w:val="center"/>
           </w:tcPr>
           <w:p>
@@ -2567,7 +3645,7 @@
         </w:tc>
         <w:tc>
           <w:tcPr>
-            <w:tcW w:type="dxa" w:w="1949"/>
+            <w:tcW w:type="dxa" w:w="1882"/>
             <w:vAlign w:val="center"/>
           </w:tcPr>
           <w:p>
@@ -2581,7 +3659,7 @@
         </w:tc>
         <w:tc>
           <w:tcPr>
-            <w:tcW w:type="dxa" w:w="1949"/>
+            <w:tcW w:type="dxa" w:w="1882"/>
             <w:vAlign w:val="center"/>
           </w:tcPr>
           <w:p>
@@ -2600,7 +3678,7 @@
         </w:trPr>
         <w:tc>
           <w:tcPr>
-            <w:tcW w:type="dxa" w:w="1949"/>
+            <w:tcW w:type="dxa" w:w="1882"/>
             <w:vAlign w:val="center"/>
           </w:tcPr>
           <w:p>
@@ -2614,7 +3692,7 @@
         </w:tc>
         <w:tc>
           <w:tcPr>
-            <w:tcW w:type="dxa" w:w="1949"/>
+            <w:tcW w:type="dxa" w:w="1882"/>
             <w:vAlign w:val="center"/>
           </w:tcPr>
           <w:p>
@@ -2628,7 +3706,7 @@
         </w:tc>
         <w:tc>
           <w:tcPr>
-            <w:tcW w:type="dxa" w:w="1949"/>
+            <w:tcW w:type="dxa" w:w="1882"/>
             <w:vAlign w:val="center"/>
           </w:tcPr>
           <w:p>
@@ -2642,7 +3720,7 @@
         </w:tc>
         <w:tc>
           <w:tcPr>
-            <w:tcW w:type="dxa" w:w="1949"/>
+            <w:tcW w:type="dxa" w:w="1882"/>
             <w:vAlign w:val="center"/>
           </w:tcPr>
           <w:p>
@@ -2656,7 +3734,7 @@
         </w:tc>
         <w:tc>
           <w:tcPr>
-            <w:tcW w:type="dxa" w:w="1949"/>
+            <w:tcW w:type="dxa" w:w="1882"/>
             <w:vAlign w:val="center"/>
           </w:tcPr>
           <w:p>
@@ -2729,7 +3807,7 @@
     </w:p>
     <w:p>
       <w:r>
-        <w:t>Among the 12 highlighted binary models, the median ridge-minus-PLS balanced-accuracy difference was 0.007 (IQR -0.004 to 0.014); ridge had a paired-repeat interval above zero for 2 models, PLS for 1, and 9 differences were uncertain. For the 12 continuous models, the median ridge-minus-PLS Q² difference was 0.014 (IQR 0.007 to 0.017); ridge was favoured for 7, PLS for 2, and 3 were uncertain. Thus PLS was competitive but not uniformly superior to a simpler exportable linear model. Because the benchmark was restricted to PLS-highlighted results, the prespecified PLS atlas was retained and the comparison is reported as selection-conditioned sensitivity evidence rather than a basis for post-screen method switching.</w:t>
+        <w:t>Among the 12 highlighted binary models, the median ridge-minus-PLS balanced-accuracy difference was 0.007 (IQR -0.004 to 0.014); ridge had a paired-repeat interval above zero for 2 models, PLS for 1, and 9 differences were uncertain. For the 12 continuous models, the median ridge-minus-PLS Q² difference was 0.014 (IQR 0.007 to 0.017); ridge was favoured for 7, PLS for 2, and 3 were uncertain. Thus PLS was competitive but not uniformly superior to a simpler exportable linear model. Because the benchmark was restricted to PLS-highlighted results, the prespecified PLS workflow was retained and the comparison is reported as selection-conditioned sensitivity evidence rather than a basis for post-screen method switching.</w:t>
       </w:r>
     </w:p>
     <w:p>
@@ -2879,7 +3957,12 @@
     </w:p>
     <w:p>
       <w:r>
-        <w:t>This study answers a target-by-target, cancer-specific question rather than asking whether molecular subtype and mutation status are associated. Fixed pretrained TITAN representations contain useful signal for selected immune programmes, mutations and higher-level genomic phenotypes, but most eligible pairs do not satisfy both multiplicity and effect thresholds. That heterogeneity—and transparent negative reporting—is the primary result. Under the stricter across-cancer family correction, 219 continuous and 39 mutation pairs passed; the remaining within-cancer candidates should not be interpreted as pan-cancer biomarkers. Conversely, global non-passage cannot be interpreted as evidence of no signal because the 0.001 empirical-p resolution restricts attainable q-values in large families.</w:t>
+        <w:t>This study is best interpreted as a systematic patient-level benchmark and reusable fitted-model resource, not as the first pan-cancer molecular-prediction study or a catalogue of unprecedented mutation targets. It answers a target-by-target, cancer-specific question using one fixed pretrained TITAN representation. Selected immune programmes, mutations and higher-level genomic phenotypes were predictable, but most eligible pairs did not satisfy both multiplicity and effect thresholds. That heterogeneity—and transparent negative and ineligible reporting—is the primary empirical result. Under the stricter across-cancer family correction, 219 continuous and 39 mutation pairs passed; the remaining within-cancer candidates should not be interpreted as pan-cancer biomarkers. Conversely, global non-passage cannot be interpreted as evidence of no signal because the 0.001 empirical-p resolution restricts attainable q-values in large families.</w:t>
+      </w:r>
+    </w:p>
+    <w:p>
+      <w:r>
+        <w:t>The closest breadth comparator is Arslan et al., who already trained 12,093 target-specific models for 4,031 multi-omic biomarkers in 8,890 TCGA patients across the same 32 cancers [13]. The present study is smaller in endpoint breadth and lacks external validation. Its differentiating elements are instead the fixed pretrained representation, deterministic pre-outcome patient aggregation, nested patient-level validation, complete tested-negative and ineligible outputs, target-level site-grouped sensitivity, continuous modelling of selected immune and genomic-context measures, and distribution of compact fitted linear predictors. Table 1 makes these distinctions explicit and prevents breadth or endpoint novelty from being inferred from the study framing.</w:t>
       </w:r>
     </w:p>
     <w:p>
@@ -2904,7 +3987,7 @@
     </w:p>
     <w:p>
       <w:r>
-        <w:t>The immune measurements, oncogenic pathways, MSI, aneuploidy and fusion endpoints extend the analysis beyond the exact cancer–gene mutation pairs used for the literature crosswalk. They are newly screened in this TITAN–PLS atlas, but the manuscript does not claim that histological prediction of those broad endpoint classes is unprecedented. Their novelty is the unified patient-level, cancer-specific screen and directly reusable linear modelling framework.</w:t>
+        <w:t>The immune measurements, oncogenic pathways, MSI, aneuploidy and fusion endpoints extend the analysis beyond the exact cancer–gene mutation pairs used for the literature crosswalk. They are systematically benchmarked here with the same TITAN–PLS design, but the manuscript does not claim that histological prediction of those broad endpoint classes is unprecedented. Their contribution is the unified patient-level, cancer-specific evaluation and directly reusable linear modelling framework.</w:t>
       </w:r>
     </w:p>
     <w:p>
@@ -2919,7 +4002,7 @@
     </w:p>
     <w:p>
       <w:r>
-        <w:t>The ridge benchmark prevents interpreting that design choice as proof of PLS superiority. Median ridge-minus-PLS differences were small (0.007 balanced accuracy for binary and 0.014 Q² for continuous models), although paired intervals favoured ridge for two binary and seven continuous highlighted endpoints and favoured PLS for one binary and two continuous endpoints. The remaining 12 comparisons were uncertain. Both approaches yield compact exportable parameters, so portability is not unique to PLS. PLS remains the prespecified atlas method because the benchmark was performed only on PLS-highlighted models and switching methods after that selection would add another optimistic selection layer. Future external validation can compare locked PLS and ridge candidates prospectively.</w:t>
+        <w:t>The ridge benchmark prevents interpreting that design choice as proof of PLS superiority. Median ridge-minus-PLS differences were small (0.007 balanced accuracy for binary and 0.014 Q² for continuous models), although paired intervals favoured ridge for two binary and seven continuous highlighted endpoints and favoured PLS for one binary and two continuous endpoints. The remaining 12 comparisons were uncertain. Both approaches yield compact exportable parameters, so portability is not unique to PLS. PLS remains the prespecified primary method because the benchmark was performed only on PLS-highlighted models and switching methods after that selection would add another optimistic selection layer. Future external validation can compare locked PLS and ridge candidates prospectively.</w:t>
       </w:r>
     </w:p>
     <w:p>
@@ -2944,7 +4027,7 @@
     </w:p>
     <w:p>
       <w:r>
-        <w:t>The repeated nested-CV estimates and patient-cluster bootstrap intervals are also conditional on selecting endpoints in this same TCGA atlas. They quantify partition and sampling variability for highlighted candidates but do not correct winner's-curse optimism from highlighting the strongest screen results. Consequently, the intervals should not be read as external-performance intervals; locked-model evaluation in an untouched cohort is required for unbiased transportability assessment.</w:t>
+        <w:t>The repeated nested-CV estimates and patient-cluster bootstrap intervals are also conditional on selecting endpoints in this same TCGA benchmark. They quantify partition and sampling variability for highlighted candidates but do not correct winner's-curse optimism from highlighting the strongest screen results. Consequently, the intervals should not be read as external-performance intervals; locked-model evaluation in an untouched cohort is required for unbiased transportability assessment.</w:t>
       </w:r>
     </w:p>
     <w:p>
@@ -2967,7 +4050,7 @@
     </w:p>
     <w:p>
       <w:r>
-        <w:t>Mean-pooled TITAN representations enable a cancer-specific TCGA discovery atlas of selected immune, mutation, pathway, MSI, aneuploidy and fusion phenotypes. The public TITANPred package applies all cancer-matched fitted PLS and PLS–LDA models without distributing patient-level training data, providing a practical route to independent external research validation. The resource prioritises hypotheses and exposes screen-negative targets, but remains internally validated and non-clinical.</w:t>
+        <w:t>Using mean-pooled fixed pretrained TITAN representations, this study provides a systematic patient-level TCGA benchmark of selected immune, mutation, pathway, MSI, aneuploidy and fusion phenotypes. The public TITANPred package applies all cancer-matched fitted PLS and PLS–LDA models without distributing patient-level training data. The contribution is a transparent evaluation and reusable research resource—not broad endpoint novelty or clinical validation—and locked independent testing remains essential.</w:t>
       </w:r>
     </w:p>
     <w:p>
@@ -3286,7 +4369,7 @@
     </w:p>
     <w:p>
       <w:r>
-        <w:t>30. TITAN prediction atlas repository. GitHub. https://github.com/tkcaccia/titan-prediction. Accessed 15 Aug 2026.</w:t>
+        <w:t>30. TITAN patient-level benchmark repository. GitHub. https://github.com/tkcaccia/titan-prediction. Accessed 15 Aug 2026.</w:t>
       </w:r>
     </w:p>
     <w:p>
@@ -3315,12 +4398,12 @@
       </w:r>
     </w:p>
     <w:sectPr>
-      <w:headerReference w:type="default" r:id="rId9"/>
-      <w:footerReference w:type="default" r:id="rId10"/>
-      <w:pgSz w:w="12240" w:h="15840"/>
+      <w:pgSz w:w="11906" w:h="16838"/>
       <w:pgMar w:top="1134" w:right="1247" w:bottom="1134" w:left="1247" w:header="720" w:footer="720" w:gutter="0"/>
       <w:cols w:space="720"/>
       <w:docGrid w:linePitch="360"/>
+      <w:lnNumType w:countBy="1" w:restart="continuous"/>
+      <w:lnNumType w:countBy="1" w:restart="continuous"/>
       <w:lnNumType w:countBy="1" w:restart="continuous"/>
     </w:sectPr>
   </w:body>
@@ -3354,7 +4437,7 @@
         <w:color w:val="64748B"/>
         <w:sz w:val="16"/>
       </w:rPr>
-      <w:t>TCGA TITAN molecular and immune discovery atlas</w:t>
+      <w:t>TITAN patient-level benchmark and model resource</w:t>
     </w:r>
   </w:p>
 </w:hdr>

</xml_diff>

<commit_message>
Address external validation limitation
</commit_message>
<xml_diff>
--- a/manuscript/manuscript_JTM_patient_level_TITAN.docx
+++ b/manuscript/manuscript_JTM_patient_level_TITAN.docx
@@ -362,7 +362,7 @@
         <w:t xml:space="preserve">Conclusions. </w:t>
       </w:r>
       <w:r>
-        <w:t>This systematic patient-level TCGA benchmark defines target-specific predictability under one fixed pretrained TITAN representation and distributes compact fitted research models. Its contribution is methodological and resource-oriented rather than mutation-target novelty; independent external validation remains required before clinical interpretation.</w:t>
+        <w:t>This systematic patient-level benchmark defines internally derived TCGA estimates under one fixed pretrained TITAN representation and constructs compact research models for future locked evaluation. Its contribution is methodological and resource-oriented rather than mutation-target novelty. No independent performance evidence is presented, and clinical interpretation or application is not supported.</w:t>
       </w:r>
     </w:p>
     <w:p>
@@ -401,7 +401,7 @@
     </w:p>
     <w:p>
       <w:r>
-        <w:t>The narrower unresolved gap is a reproducible benchmark that applies one fixed pretrained representation to every target; deterministically aggregates slides before outcome matching; performs nested validation with the patient as the unit; preserves tested-negative and sample-size-ineligible results; reports target-level tissue-source-site sensitivity; models selected immune and genomic-context measurements continuously; and distributes compact fitted predictors with deployment metadata. These design and resource features—not unprecedented endpoint classes—define the contribution of this study (Table 1).</w:t>
+        <w:t>The narrower unresolved gap is a reproducible benchmark that applies one fixed pretrained representation to every target; deterministically aggregates slides before outcome matching; performs nested validation with the patient as the unit; preserves tested-negative and sample-size-ineligible results; reports target-level tissue-source-site sensitivity; models selected immune and genomic-context measurements continuously; and constructs compact fitted predictors with research-use provenance metadata. These design and resource features—not unprecedented endpoint classes—define the contribution of this study (Table 1).</w:t>
       </w:r>
     </w:p>
     <w:p>
@@ -1468,7 +1468,7 @@
               <w:rPr>
                 <w:sz w:val="16"/>
               </w:rPr>
-              <w:t>323 compact research-only fitted PLS and PLS-LDA predictors with feature order, checksums, metadata and inference code</w:t>
+              <w:t>323 compact research-only fitted PLS and PLS-LDA predictors with feature order, checksums, metadata and inference code; artifacts currently access-controlled and not claimed as publicly released</w:t>
             </w:r>
           </w:p>
         </w:tc>
@@ -1624,7 +1624,7 @@
     </w:p>
     <w:p>
       <w:r>
-        <w:t>As a secondary algorithmic benchmark, the 24 manuscript-highlighted models were refitted on the same five repeated outer partitions using ridge-penalised Gaussian regression for continuous endpoints and ridge logistic regression for binary endpoints. Ridge hyperparameters were selected inside each outer training set; binary operating thresholds maximised balanced accuracy using inner out-of-fold probabilities. The primary paired differences were ridge-minus-PLS Q² and balanced accuracy, with AUROC or Spearman correlation retained as secondary metrics. We report the magnitude, interquartile range and 95% paired-repeat interval rather than declaring a winner from counts alone. Because models were selected for this benchmark after the PLS screen, it is a conditional sensitivity analysis and cannot establish screen-wide algorithmic superiority. Ridge was chosen as a simple linear baseline whose fitted coefficients can be exported without retaining training embeddings; nonlinear kernel predictors that require training observations or landmarks at inference did not satisfy that deployment constraint.</w:t>
+        <w:t>As a secondary algorithmic benchmark, the 24 manuscript-highlighted models were refitted on the same five repeated outer partitions using ridge-penalised Gaussian regression for continuous endpoints and ridge logistic regression for binary endpoints. Ridge hyperparameters were selected inside each outer training set; binary operating thresholds maximised balanced accuracy using inner out-of-fold probabilities. The primary paired differences were ridge-minus-PLS Q² and balanced accuracy, with AUROC or Spearman correlation retained as secondary metrics. We report the magnitude, interquartile range and 95% paired-repeat interval rather than declaring a winner from counts alone. Because models were selected for this benchmark after the PLS screen, it is a conditional sensitivity analysis and cannot establish screen-wide algorithmic superiority. Ridge was chosen as a simple linear baseline whose fitted coefficients can be exported without retaining training embeddings; nonlinear kernel predictors that require training observations or landmarks at inference did not satisfy that portability constraint.</w:t>
       </w:r>
     </w:p>
     <w:p>
@@ -1652,12 +1652,12 @@
     </w:p>
     <w:p>
       <w:r>
-        <w:t>TITANPred retains the binary LDA score but does not convert it to a probability. In reports, its position is labelled 'TCGA out-of-fold score rank (not probability)' rather than percentile or risk, and is displayed beside total training n, positive and negative counts, prevalence, repeated-CV balanced accuracy and AUROC. Models with fewer than 50 patients in either class receive an explicit limited-class-size warning; this reporting flag does not change the prespecified 20-per-class eligibility rule. Probability calibration was not added post hoc because it would require an independently evaluated or fully nested calibration procedure, which is not available in this TCGA discovery analysis.</w:t>
+        <w:t>TITANPred retains the binary LDA score but does not convert it to a probability. In the research-software demonstration, its position is labelled 'TCGA out-of-fold score rank (not probability)' rather than percentile or risk, and is displayed beside total training n, positive and negative counts, prevalence, repeated-CV balanced accuracy and AUROC. Models with fewer than 50 patients in either class receive an explicit limited-class-size warning; this reporting flag does not change the prespecified 20-per-class eligibility rule. Probability calibration was not added post hoc because it would require an independently evaluated or fully nested calibration procedure, which is not available in this TCGA benchmark.</w:t>
       </w:r>
     </w:p>
     <w:p>
       <w:r>
-        <w:t>The fitted PLS and PLS–LDA objects contain the learned transformations and coefficients needed for inference but no patient-level training rows. The public inference interface validates the 768-feature order and applies the prespecified patient-level slide aggregation. The secondary PLS1–PLS2 inflammatory comparison, including matched folds and cancer-bootstrap intervals, is described in the Supplementary Methods.</w:t>
+        <w:t>The fitted PLS and PLS–LDA objects contain the learned transformations and coefficients needed for research inference but no patient-level training rows. The access-controlled inference interface validates the 768-feature order and applies the prespecified patient-level slide aggregation. The secondary PLS1–PLS2 inflammatory comparison, including matched folds and cancer-bootstrap intervals, is described in the Supplementary Methods.</w:t>
       </w:r>
     </w:p>
     <w:p>
@@ -1670,7 +1670,25 @@
     </w:p>
     <w:p>
       <w:r>
-        <w:t>Analyses used R 4.6.0 and fastPLS 0.99.20 (Git commit dcf45cc). MC3 objects were loaded with TCGAmutations 0.4.0 from the GitHub source pinned in the software manifest. Version-controlled code, source manifests, released target catalogues, out-of-fold prediction summaries, figures and model registry are organized in the companion analysis repository [30]. A separate GPL-3 R package bundles all fitted models, their SHA-256 registry, reference distributions, inference interface and report template [32]. The bundled artifacts contain learned parameters and training-range summaries but no patient-level training rows. No independent cohort with compatible TITAN features and the required labels was included; all performance estimates remain internal to TCGA.</w:t>
+        <w:t>Analyses used R 4.6.0 and fastPLS 0.99.20 (Git commit dcf45cc). MC3 objects were loaded with TCGAmutations 0.4.0 from the GitHub source pinned in the software manifest. Version-controlled code, source manifests, target catalogues, out-of-fold prediction summaries, figures and the model registry are organized in the public companion analysis repository [30]. A separate access-controlled GPL-3 R package contains the fitted models, their SHA-256 registry, reference distributions, inference interface and research-software output template [32]. That repository is private and the manuscript does not claim public availability of the fitted artifacts. The artifacts contain learned parameters and training-range summaries but no patient-level training rows. No independent cohort with compatible TITAN features and the required labels was included; every performance estimate is an internally derived TCGA estimate.</w:t>
+      </w:r>
+    </w:p>
+    <w:p>
+      <w:pPr>
+        <w:pStyle w:val="Heading2"/>
+      </w:pPr>
+      <w:r>
+        <w:t>Prospectively locked protocol for future independent evaluation</w:t>
+      </w:r>
+    </w:p>
+    <w:p>
+      <w:r>
+        <w:t>After the internal TCGA screen, but before accessing any external features, outcomes or predictions, we fixed a three-model UCEC subset for future independent evaluation: TP53 mutation, genome doubling and continuous aneuploidy score. The exact fitted-object SHA-256 hashes are c39ba2caeefc148e67412647f3e1835dbcd719088a4d379b53068482ebb2ede0, 8f9fd73578189bab5d5c88bb8005415a07b93a662f2b0adb893f0b04e1cc3604 and 0c520d8a9d57dd5af109416c5b82ffb0f0862e3505cd9888965fdeee4aa60f3b, respectively. Their internal performance is selection-conditioned; locking them now does not convert TCGA estimates into external evidence.</w:t>
+      </w:r>
+    </w:p>
+    <w:p>
+      <w:r>
+        <w:t>A future evaluation must extract every eligible primary-tumour diagnostic slide with the documented CONCH v1.5–TITAN pipeline, apply the same deterministic patient mean pooling, preserve the 768-feature order and use the hashed artifacts without refitting, recalibration, class-prior changes or threshold adjustment. Outcomes must be constructed independently of image predictions using definitions compatible with the TCGA targets; an irreproducible endpoint must be reported as non-evaluable rather than replaced with an externally optimised surrogate. Binary primary performance is balanced accuracy, with AUROC, sensitivity and specificity secondary; continuous primary performance is Q², with RMSE, Spearman correlation, calibration intercept and calibration slope secondary. Patient/slide flow, molecular missingness, exclusions, denominators, uncertainty and all three outcomes—including failures—must be reported. The executable specification and machine-readable lock file are provided in the companion repository.</w:t>
       </w:r>
     </w:p>
     <w:p>
@@ -3876,17 +3894,417 @@
         <w:pStyle w:val="Heading2"/>
       </w:pPr>
       <w:r>
-        <w:t>Reusable multi-endpoint inference and COAD illustration</w:t>
+        <w:t>External-validation readiness audit</w:t>
       </w:r>
     </w:p>
     <w:p>
       <w:r>
-        <w:t>The TITANPred R package exposes 323 fitted models (219 continuous and 104 binary) across 27 cancers [32]. Users supply a cancer vector and correctly named 768-dimensional TITAN features; the interface applies every bundled model available for that cancer. Repeated patient identifiers are mean-pooled before inference. Continuous outputs retain source endpoint units and are positioned against repeated out-of-fold reference distributions; binary outputs comprise the fitted PLS-LDA class and uncalibrated LDA score. The binary display labels its TCGA out-of-fold score rank explicitly as a rank rather than a probability and places training positive/negative counts, prevalence, repeated-CV performance and any limited-class-size warning beside the call. A single-sample report renders all available continuous endpoints as a radar, with the exact reference percentile and original prediction printed at every corner, and displays binary calls with provenance and out-of-distribution diagnostics. The report ends with definitions of every displayed endpoint and citations for the data source used to construct each TCGA model target.</w:t>
+        <w:t>No non-TCGA patient entered model evaluation, and no external performance result is reported. The official TITAN release provided the precomputed TCGA representation used here, but the audit did not identify a compatible non-TCGA TITAN embedding set carrying the required outcomes. CPTAC-UCEC is a plausible future cohort: its official TCIA collection reports 250 subjects, 887 pathology whole-slide images (approximately 154 GB) and links to genomic, proteomic and clinical resources [36]. Those slides were not downloaded or processed in this study, and the availability of linked data does not by itself guarantee exact reconstruction of each endpoint.</w:t>
       </w:r>
     </w:p>
     <w:p>
       <w:r>
-        <w:t>COAD was chosen as a deployment illustration because colorectal cancer, of which colon adenocarcinoma is a major component, accounted for 1,926,425 new cases worldwide in 2022 [31], and COAD contributed 20 supported models (10 continuous and 10 binary). APC, TP53, KRAS and BRAF prediction from colorectal histology had already been evaluated in pooled colorectal and/or exact-COAD studies; these models are therefore replications or extensions under a different representation and validation framework, not bibliographically novel mutation targets. For visualization, we first restricted candidates to cases with a non-empty slide report that described a sigmoid-colon, moderately differentiated, pT3 adenocarcinoma with clear margins, and then required that no case had more than two of ten continuous predictions outside the first to 99th percentile. Among pairs sharing recorded sex and site, TCGA-AA-A01F and TCGA-AA-3972 had the largest Euclidean separation across the complete continuous prediction-percentile profile. This produced clinically comparable examples with predominantly intermediate rather than saturated values. Example A had higher MSI, mutation-rate and TIL predictions and lower aneuploidy predictions, whereas example B showed the converse pattern (Figure 7). The selection is an internal deployment demonstration, not a validation analysis or an estimate of clinical prevalence.</w:t>
+        <w:t>Table 4 records the three fitted UCEC artifacts locked for any future untouched evaluation. The displayed performance values are internally derived TCGA estimates included only to document why the targets were selected; they are not external benchmarks. All three must be reported under the protocol, including chance-level performance, extraction failure or endpoint non-evaluability.</w:t>
+      </w:r>
+    </w:p>
+    <w:tbl>
+      <w:tblPr>
+        <w:tblStyle w:val="TableGrid"/>
+        <w:tblW w:type="auto" w:w="0"/>
+        <w:jc w:val="center"/>
+        <w:tblLook w:firstColumn="1" w:firstRow="1" w:lastColumn="0" w:lastRow="0" w:noHBand="0" w:noVBand="1" w:val="04A0"/>
+      </w:tblPr>
+      <w:tblGrid>
+        <w:gridCol w:w="1569"/>
+        <w:gridCol w:w="1569"/>
+        <w:gridCol w:w="1569"/>
+        <w:gridCol w:w="1569"/>
+        <w:gridCol w:w="1569"/>
+        <w:gridCol w:w="1569"/>
+      </w:tblGrid>
+      <w:tr>
+        <w:trPr>
+          <w:tblHeader w:val="true"/>
+          <w:cantSplit/>
+        </w:trPr>
+        <w:tc>
+          <w:tcPr>
+            <w:tcW w:type="dxa" w:w="1474"/>
+          </w:tcPr>
+          <w:p>
+            <w:r>
+              <w:rPr>
+                <w:b/>
+                <w:sz w:val="17"/>
+              </w:rPr>
+              <w:t>Locked target</w:t>
+            </w:r>
+          </w:p>
+        </w:tc>
+        <w:tc>
+          <w:tcPr>
+            <w:tcW w:type="dxa" w:w="1587"/>
+          </w:tcPr>
+          <w:p>
+            <w:r>
+              <w:rPr>
+                <w:b/>
+                <w:sz w:val="17"/>
+              </w:rPr>
+              <w:t>Artifact SHA-256 (prefix)</w:t>
+            </w:r>
+          </w:p>
+        </w:tc>
+        <w:tc>
+          <w:tcPr>
+            <w:tcW w:type="dxa" w:w="1928"/>
+          </w:tcPr>
+          <w:p>
+            <w:r>
+              <w:rPr>
+                <w:b/>
+                <w:sz w:val="17"/>
+              </w:rPr>
+              <w:t>Internal repeated-CV estimate</w:t>
+            </w:r>
+          </w:p>
+        </w:tc>
+        <w:tc>
+          <w:tcPr>
+            <w:tcW w:type="dxa" w:w="1814"/>
+          </w:tcPr>
+          <w:p>
+            <w:r>
+              <w:rPr>
+                <w:b/>
+                <w:sz w:val="17"/>
+              </w:rPr>
+              <w:t>Site-grouped estimate</w:t>
+            </w:r>
+          </w:p>
+        </w:tc>
+        <w:tc>
+          <w:tcPr>
+            <w:tcW w:type="dxa" w:w="1474"/>
+          </w:tcPr>
+          <w:p>
+            <w:r>
+              <w:rPr>
+                <w:b/>
+                <w:sz w:val="17"/>
+              </w:rPr>
+              <w:t>Future primary metric</w:t>
+            </w:r>
+          </w:p>
+        </w:tc>
+        <w:tc>
+          <w:tcPr>
+            <w:tcW w:type="dxa" w:w="1134"/>
+          </w:tcPr>
+          <w:p>
+            <w:r>
+              <w:rPr>
+                <w:b/>
+                <w:sz w:val="17"/>
+              </w:rPr>
+              <w:t>Status</w:t>
+            </w:r>
+          </w:p>
+        </w:tc>
+      </w:tr>
+      <w:tr>
+        <w:trPr>
+          <w:cantSplit/>
+        </w:trPr>
+        <w:tc>
+          <w:tcPr>
+            <w:tcW w:type="dxa" w:w="1474"/>
+            <w:vAlign w:val="center"/>
+          </w:tcPr>
+          <w:p>
+            <w:r>
+              <w:rPr>
+                <w:sz w:val="16"/>
+              </w:rPr>
+              <w:t>UCEC–TP53</w:t>
+            </w:r>
+          </w:p>
+        </w:tc>
+        <w:tc>
+          <w:tcPr>
+            <w:tcW w:type="dxa" w:w="1587"/>
+            <w:vAlign w:val="center"/>
+          </w:tcPr>
+          <w:p>
+            <w:r>
+              <w:rPr>
+                <w:sz w:val="16"/>
+              </w:rPr>
+              <w:t>c39ba2caeefc</w:t>
+            </w:r>
+          </w:p>
+        </w:tc>
+        <w:tc>
+          <w:tcPr>
+            <w:tcW w:type="dxa" w:w="1928"/>
+            <w:vAlign w:val="center"/>
+          </w:tcPr>
+          <w:p>
+            <w:r>
+              <w:rPr>
+                <w:sz w:val="16"/>
+              </w:rPr>
+              <w:t>balanced accuracy 0.744</w:t>
+            </w:r>
+          </w:p>
+        </w:tc>
+        <w:tc>
+          <w:tcPr>
+            <w:tcW w:type="dxa" w:w="1814"/>
+            <w:vAlign w:val="center"/>
+          </w:tcPr>
+          <w:p>
+            <w:r>
+              <w:rPr>
+                <w:sz w:val="16"/>
+              </w:rPr>
+              <w:t>site-grouped balanced accuracy 0.740</w:t>
+            </w:r>
+          </w:p>
+        </w:tc>
+        <w:tc>
+          <w:tcPr>
+            <w:tcW w:type="dxa" w:w="1474"/>
+            <w:vAlign w:val="center"/>
+          </w:tcPr>
+          <w:p>
+            <w:r>
+              <w:rPr>
+                <w:sz w:val="16"/>
+              </w:rPr>
+              <w:t>balanced accuracy</w:t>
+            </w:r>
+          </w:p>
+        </w:tc>
+        <w:tc>
+          <w:tcPr>
+            <w:tcW w:type="dxa" w:w="1134"/>
+            <w:vAlign w:val="center"/>
+          </w:tcPr>
+          <w:p>
+            <w:r>
+              <w:rPr>
+                <w:sz w:val="16"/>
+              </w:rPr>
+              <w:t>Not performed</w:t>
+            </w:r>
+          </w:p>
+        </w:tc>
+      </w:tr>
+      <w:tr>
+        <w:trPr>
+          <w:cantSplit/>
+        </w:trPr>
+        <w:tc>
+          <w:tcPr>
+            <w:tcW w:type="dxa" w:w="1474"/>
+            <w:vAlign w:val="center"/>
+          </w:tcPr>
+          <w:p>
+            <w:r>
+              <w:rPr>
+                <w:sz w:val="16"/>
+              </w:rPr>
+              <w:t>UCEC–Genome doubling</w:t>
+            </w:r>
+          </w:p>
+        </w:tc>
+        <w:tc>
+          <w:tcPr>
+            <w:tcW w:type="dxa" w:w="1587"/>
+            <w:vAlign w:val="center"/>
+          </w:tcPr>
+          <w:p>
+            <w:r>
+              <w:rPr>
+                <w:sz w:val="16"/>
+              </w:rPr>
+              <w:t>8f9fd7357818</w:t>
+            </w:r>
+          </w:p>
+        </w:tc>
+        <w:tc>
+          <w:tcPr>
+            <w:tcW w:type="dxa" w:w="1928"/>
+            <w:vAlign w:val="center"/>
+          </w:tcPr>
+          <w:p>
+            <w:r>
+              <w:rPr>
+                <w:sz w:val="16"/>
+              </w:rPr>
+              <w:t>balanced accuracy 0.722</w:t>
+            </w:r>
+          </w:p>
+        </w:tc>
+        <w:tc>
+          <w:tcPr>
+            <w:tcW w:type="dxa" w:w="1814"/>
+            <w:vAlign w:val="center"/>
+          </w:tcPr>
+          <w:p>
+            <w:r>
+              <w:rPr>
+                <w:sz w:val="16"/>
+              </w:rPr>
+              <w:t>site-grouped balanced accuracy 0.722</w:t>
+            </w:r>
+          </w:p>
+        </w:tc>
+        <w:tc>
+          <w:tcPr>
+            <w:tcW w:type="dxa" w:w="1474"/>
+            <w:vAlign w:val="center"/>
+          </w:tcPr>
+          <w:p>
+            <w:r>
+              <w:rPr>
+                <w:sz w:val="16"/>
+              </w:rPr>
+              <w:t>balanced accuracy</w:t>
+            </w:r>
+          </w:p>
+        </w:tc>
+        <w:tc>
+          <w:tcPr>
+            <w:tcW w:type="dxa" w:w="1134"/>
+            <w:vAlign w:val="center"/>
+          </w:tcPr>
+          <w:p>
+            <w:r>
+              <w:rPr>
+                <w:sz w:val="16"/>
+              </w:rPr>
+              <w:t>Not performed</w:t>
+            </w:r>
+          </w:p>
+        </w:tc>
+      </w:tr>
+      <w:tr>
+        <w:trPr>
+          <w:cantSplit/>
+        </w:trPr>
+        <w:tc>
+          <w:tcPr>
+            <w:tcW w:type="dxa" w:w="1474"/>
+            <w:vAlign w:val="center"/>
+          </w:tcPr>
+          <w:p>
+            <w:r>
+              <w:rPr>
+                <w:sz w:val="16"/>
+              </w:rPr>
+              <w:t>UCEC–Aneuploidy score</w:t>
+            </w:r>
+          </w:p>
+        </w:tc>
+        <w:tc>
+          <w:tcPr>
+            <w:tcW w:type="dxa" w:w="1587"/>
+            <w:vAlign w:val="center"/>
+          </w:tcPr>
+          <w:p>
+            <w:r>
+              <w:rPr>
+                <w:sz w:val="16"/>
+              </w:rPr>
+              <w:t>0c520d8a9d57</w:t>
+            </w:r>
+          </w:p>
+        </w:tc>
+        <w:tc>
+          <w:tcPr>
+            <w:tcW w:type="dxa" w:w="1928"/>
+            <w:vAlign w:val="center"/>
+          </w:tcPr>
+          <w:p>
+            <w:r>
+              <w:rPr>
+                <w:sz w:val="16"/>
+              </w:rPr>
+              <w:t>Q2 0.347</w:t>
+            </w:r>
+          </w:p>
+        </w:tc>
+        <w:tc>
+          <w:tcPr>
+            <w:tcW w:type="dxa" w:w="1814"/>
+            <w:vAlign w:val="center"/>
+          </w:tcPr>
+          <w:p>
+            <w:r>
+              <w:rPr>
+                <w:sz w:val="16"/>
+              </w:rPr>
+              <w:t>site-grouped Q2 0.328</w:t>
+            </w:r>
+          </w:p>
+        </w:tc>
+        <w:tc>
+          <w:tcPr>
+            <w:tcW w:type="dxa" w:w="1474"/>
+            <w:vAlign w:val="center"/>
+          </w:tcPr>
+          <w:p>
+            <w:r>
+              <w:rPr>
+                <w:sz w:val="16"/>
+              </w:rPr>
+              <w:t>Q2</w:t>
+            </w:r>
+          </w:p>
+        </w:tc>
+        <w:tc>
+          <w:tcPr>
+            <w:tcW w:type="dxa" w:w="1134"/>
+            <w:vAlign w:val="center"/>
+          </w:tcPr>
+          <w:p>
+            <w:r>
+              <w:rPr>
+                <w:sz w:val="16"/>
+              </w:rPr>
+              <w:t>Not performed</w:t>
+            </w:r>
+          </w:p>
+        </w:tc>
+      </w:tr>
+    </w:tbl>
+    <w:p/>
+    <w:p>
+      <w:pPr>
+        <w:pStyle w:val="Caption"/>
+      </w:pPr>
+      <w:r>
+        <w:t>Table 4. Prospectively locked subset for future independent evaluation. Model selection occurred after the TCGA screen but before any external feature, outcome or prediction was inspected. Full hashes, secondary metrics, endpoint-compatibility rules and mandatory failure reporting are provided in Supplementary Table S6c and the machine-readable lock file.</w:t>
+      </w:r>
+    </w:p>
+    <w:p>
+      <w:pPr>
+        <w:pStyle w:val="Heading2"/>
+      </w:pPr>
+      <w:r>
+        <w:t>Research-software demonstration and COAD illustration</w:t>
+      </w:r>
+    </w:p>
+    <w:p>
+      <w:r>
+        <w:t>The access-controlled TITANPred R package contains 323 fitted models (219 continuous and 104 binary) across 27 cancers [32]. An authorised research user supplies a cancer vector and correctly named 768-dimensional TITAN features; the interface applies every bundled model available for that cancer. Repeated patient identifiers are mean-pooled before inference. Continuous outputs retain source endpoint units and are positioned against repeated out-of-fold reference distributions; binary outputs comprise the fitted PLS-LDA class and uncalibrated LDA score. The binary display labels its TCGA out-of-fold score rank explicitly as a rank rather than a probability and places training positive/negative counts, prevalence, repeated-CV performance and any limited-class-size warning beside the call. A single-sample research-software output renders all available continuous endpoints as a radar, with the exact reference percentile and original prediction printed at every corner, and displays binary calls with provenance and out-of-distribution diagnostics. The demonstration ends with definitions of every displayed endpoint and citations for the data source used to construct each TCGA model target.</w:t>
+      </w:r>
+    </w:p>
+    <w:p>
+      <w:r>
+        <w:t>COAD was chosen for a research-software demonstration because colorectal cancer, of which colon adenocarcinoma is a major component, accounted for 1,926,425 new cases worldwide in 2022 [31], and COAD contributed 20 supported models (10 continuous and 10 binary). APC, TP53, KRAS and BRAF prediction from colorectal histology had already been evaluated in pooled colorectal and/or exact-COAD studies; these models are therefore replications or extensions under a different representation and validation framework, not bibliographically novel mutation targets. For visualization, we first restricted candidates to cases with a non-empty slide report that described a sigmoid-colon, moderately differentiated, pT3 adenocarcinoma with clear margins, and then required that no case had more than two of ten continuous predictions outside the first to 99th percentile. Among pairs sharing recorded sex and site, TCGA-AA-A01F and TCGA-AA-3972 had the largest Euclidean separation across the complete continuous prediction-percentile profile. This produced clinically comparable examples with predominantly intermediate rather than saturated values. Example A had higher MSI, mutation-rate and TIL predictions and lower aneuploidy predictions, whereas example B showed the converse pattern (Figure 7). The selection is a research-software demonstration of internally derived TCGA estimates, not a validation analysis or an estimate of clinical prevalence.</w:t>
       </w:r>
     </w:p>
     <w:p>
@@ -3944,7 +4362,7 @@
         <w:jc w:val="center"/>
       </w:pPr>
       <w:r>
-        <w:t>Figure 7. TITANPred deployment illustration in two clinically comparable COAD cases. Panels A and B show all ten continuous predictions for TCGA-AA-A01F and TCGA-AA-3972, respectively. Silent mutation rate and SNV neoantigens flank nonsilent mutation rate in the semantic axis order. Every radar corner reports the exact percentile relative to corrected repeated out-of-fold TCGA predictions and the original model prediction in the analysed endpoint units; the percentiles are not clinical reference ranges. Panel C shows binary PLS-LDA calls and explicitly labelled TCGA out-of-fold LDA-score ranks; filled points denote positive calls, and ranks are not probabilities. Training n and class counts accompany each binary endpoint. The cases share sex, sigmoid site, grade, pT3 category and clear margins and were selected after limiting saturated continuous profiles. They are full-cohort deployment examples and do not provide external validation.</w:t>
+        <w:t>Figure 7. TITANPred research-software demonstration in two clinically comparable COAD cases. Panels A and B show all ten internally derived TCGA continuous estimates for TCGA-AA-A01F and TCGA-AA-3972, respectively. Silent mutation rate and SNV neoantigens flank nonsilent mutation rate in the semantic axis order. Every radar corner reports the exact percentile relative to corrected repeated out-of-fold TCGA predictions and the original model estimate in the analysed endpoint units; the percentiles are not clinical reference ranges. Panel C shows binary PLS-LDA calls and explicitly labelled TCGA out-of-fold LDA-score ranks; filled points denote positive calls, and ranks are not probabilities. Training n and class counts accompany each binary endpoint. The cases share sex, sigmoid site, grade, pT3 category and clear margins and were selected after limiting saturated continuous profiles. They are full-cohort research-software examples and do not provide external validation.</w:t>
       </w:r>
     </w:p>
     <w:p>
@@ -3982,7 +4400,7 @@
     </w:p>
     <w:p>
       <w:r>
-        <w:t>External results also caution against equating internal discrimination with transportability. For PAAD–TP53, the current TCGA balanced accuracy was 0.619 and Arslan et al. reported mean internal AUROC 0.672, whereas Saldanha et al. reported internal AUROC 0.554 and external CPTAC AUROC 0.443±0.064 [11,13]. Differences can arise from cohort composition, slide preparation, mutation definition, model class and validation design. The present result therefore supports further locked external testing, not clinical deployment.</w:t>
+        <w:t>External results also caution against equating internal discrimination with transportability. For PAAD–TP53, the current TCGA balanced accuracy was 0.619 and Arslan et al. reported mean internal AUROC 0.672, whereas Saldanha et al. reported internal AUROC 0.554 and external CPTAC AUROC 0.443±0.064 [11,13]. Differences can arise from cohort composition, slide preparation, mutation definition, model class and validation design. The present result therefore supports further locked external testing, not clinical application.</w:t>
       </w:r>
     </w:p>
     <w:p>
@@ -4012,7 +4430,7 @@
     </w:p>
     <w:p>
       <w:r>
-        <w:t>A further practical feature is data-minimising model portability. Preprocessing values, latent weights and coefficients are sufficient for continuous prediction, with compact LDA parameters added for binary classification. TITANPred publicly distributes these fitted objects and applies every cancer-matched model to correctly ordered TITAN features without distributing the original patient embeddings or outcomes [32]. This reduces the patient-level data that must be exchanged, although it does not itself confer privacy, satisfy local governance requirements or establish transportability. The matched COAD examples show how the package summarizes differing multi-endpoint profiles among cases with shared clinicopathological attributes. Because both examples were chosen within TCGA and were predicted by full-cohort fits, neither their molecular contrast nor their recorded treatment outcomes constitute new accuracy or response-prediction evidence.</w:t>
+        <w:t>A further practical feature is data-minimising model portability. Preprocessing values, latent weights and coefficients are sufficient for continuous prediction, with compact LDA parameters added for binary classification. The access-controlled TITANPred package applies cancer-matched models to correctly ordered TITAN features without requiring the original patient embeddings or outcomes [32]. Its current private status is stated explicitly; the manuscript makes no public-artifact availability claim. This design reduces the patient-level data that would need to be exchanged in authorised research, although it does not itself confer privacy, satisfy local governance requirements or establish transportability. The matched COAD cases demonstrate software output for internally derived TCGA estimates. Because both examples were chosen within TCGA and were evaluated by full-cohort fits, neither their molecular contrast nor their recorded treatment outcomes constitute new accuracy or response-prediction evidence.</w:t>
       </w:r>
     </w:p>
     <w:p>
@@ -4022,7 +4440,12 @@
     </w:p>
     <w:p>
       <w:r>
-        <w:t>The principal limitation is absence of independent external validation. TCGA resampling, even with site separation, cannot establish transportability to another institution, scanner, stain distribution or patient population. The study is retrospective and exploratory; thresholds are prioritisation rules, not clinical operating points. Although TCGA was excluded from TITAN's Mass-340K pretraining corpus, it was used in the original paper's downstream evaluation; the present cohort is therefore neither a pretraining cohort nor an independent validation cohort. Predictability does not establish biological causality, and image-derived predictions cannot justify omitting a molecular assay. External feature extraction and prospective evaluation are required before clinical use.</w:t>
+        <w:t>The principal limitation is absence of independent external validation. TCGA resampling, even with site separation, cannot establish transportability to another institution, scanner, stain distribution or patient population. The study is retrospective and exploratory; thresholds are prioritisation rules, not clinical operating points. Although TCGA was excluded from TITAN's Mass-340K pretraining corpus, it was used in the original paper's downstream evaluation; the present cohort is therefore neither a pretraining cohort nor an independent validation cohort. Predictability does not establish biological causality, and image-derived estimates cannot justify omitting a molecular assay. The three-model UCEC subset is locked only for future independent evaluation. Until that untouched analysis reports every target, the work should be evaluated as a computational pathology benchmark and research-software resource rather than a translational prediction study.</w:t>
+      </w:r>
+    </w:p>
+    <w:p>
+      <w:r>
+        <w:t>CPTAC-UCEC illustrates both feasibility and the remaining work: the official collection provides pathology images and links to molecular data, but the approximately 154-GB slide archive requires de novo TITAN extraction and exact outcome harmonisation [36]. Neither the slides nor external labels were inspected here. The locked protocol prohibits model refitting, recalibration and threshold changes; mandates the same patient-level pooling; and requires failure or non-evaluability to be reported. This protocol improves readiness and guards against post hoc target selection, but it is not external validation evidence.</w:t>
       </w:r>
     </w:p>
     <w:p>
@@ -4050,7 +4473,7 @@
     </w:p>
     <w:p>
       <w:r>
-        <w:t>Using mean-pooled fixed pretrained TITAN representations, this study provides a systematic patient-level TCGA benchmark of selected immune, mutation, pathway, MSI, aneuploidy and fusion phenotypes. The public TITANPred package applies all cancer-matched fitted PLS and PLS–LDA models without distributing patient-level training data. The contribution is a transparent evaluation and reusable research resource—not broad endpoint novelty or clinical validation—and locked independent testing remains essential.</w:t>
+        <w:t>Using mean-pooled fixed pretrained TITAN representations, this study provides a systematic patient-level TCGA benchmark of selected immune, mutation, pathway, MSI, aneuploidy and fusion phenotypes. The access-controlled TITANPred package demonstrates how fitted PLS and PLS–LDA objects can be applied without distributing patient-level training data. All reported performance and example outputs are internally derived TCGA estimates. The contribution is a transparent computational pathology benchmark and research-software framework—not broad endpoint novelty, external performance evidence or clinical validation—and locked independent testing remains essential.</w:t>
       </w:r>
     </w:p>
     <w:p>
@@ -4136,7 +4559,7 @@
     </w:p>
     <w:p>
       <w:r>
-        <w:t>The analysis used the gated public TITAN TCGA feature artifact TCGA_TITAN_features.pkl, downloaded from https://huggingface.co/MahmoodLab/TITAN/blob/main/TCGA_TITAN_features.pkl and converted to the documented 768-feature CSV schema with tools/convert_tcga_titan_pickle.py in the companion repository [30]. The analysed CSV contained 11,658 slide rows (SHA-256 d3d91fb0f83a6de440eda5ff437a63e3ca13f50095e6841fb8efcc40e58763f0). TCGA molecular data and the cited public supplementary records remain available from their original repositories. Exact source locations, access conditions and checksums are recorded in the companion repository. Controlled-access whole-slide images are not redistributed. All 323 fitted research models, their registry, inference code and HTML/PDF report template are distributed in the separate TITANPred repository [32].</w:t>
+        <w:t>The analysis used the gated public TITAN TCGA feature artifact TCGA_TITAN_features.pkl, downloaded from https://huggingface.co/MahmoodLab/TITAN/blob/main/TCGA_TITAN_features.pkl and converted to the documented 768-feature CSV schema with tools/convert_tcga_titan_pickle.py in the companion repository [30]. The analysed CSV contained 11,658 slide rows (SHA-256 d3d91fb0f83a6de440eda5ff437a63e3ca13f50095e6841fb8efcc40e58763f0). TCGA molecular data and the cited public supplementary records remain available from their original repositories. Exact source locations, access conditions and checksums are recorded in the companion repository. Controlled-access whole-slide images are not redistributed. The model registry, hashes, inference example and future external-evaluation protocol are in the public analysis repository. The separate TITANPred package and 323 fitted research objects are currently maintained in a private access-controlled repository [32]; this manuscript does not claim that those artifacts are publicly downloadable.</w:t>
       </w:r>
     </w:p>
     <w:p>
@@ -4206,12 +4629,12 @@
     </w:p>
     <w:p>
       <w:r>
-        <w:t>Additional file 2 (.pdf): COAD example A (TCGA-AA-A01F) TITANPred single-sample report. Illustrative full-cohort research-model predictions for the COAD example with high MSI, mutation-rate and immune-feature predictions and low aneuploidy prediction.</w:t>
+        <w:t>Additional file 2 (.pdf): COAD example A (TCGA-AA-A01F) TITANPred research-software output. Illustrative internally derived full-cohort TCGA estimates for the COAD example with high MSI, mutation-rate and immune-feature predictions and low aneuploidy prediction.</w:t>
       </w:r>
     </w:p>
     <w:p>
       <w:r>
-        <w:t>Additional file 3 (.pdf): COAD example B (TCGA-AA-3972) TITANPred single-sample report. Illustrative full-cohort research-model predictions for the contrasting COAD example with high aneuploidy prediction and lower MSI and immune-feature predictions.</w:t>
+        <w:t>Additional file 3 (.pdf): COAD example B (TCGA-AA-3972) TITANPred research-software output. Illustrative internally derived full-cohort TCGA estimates for the contrasting COAD example with high aneuploidy prediction and lower MSI and immune-feature predictions.</w:t>
       </w:r>
     </w:p>
     <w:p>
@@ -4395,6 +4818,11 @@
     <w:p>
       <w:r>
         <w:t>35. Wells K, Lamrca A, Papaxoinis G, et al. Unique correlation between GTF2I mutation and spindle cell morphology in thymomas (type A and AB thymomas). J Clin Pathol. 2023;76:463–466. doi:10.1136/jclinpath-2021-207837.</w:t>
+      </w:r>
+    </w:p>
+    <w:p>
+      <w:r>
+        <w:t>36. National Cancer Institute Clinical Proteomic Tumor Analysis Consortium. CPTAC-UCEC: The Clinical Proteomic Tumor Analysis Consortium Uterine Corpus Endometrial Carcinoma Collection. The Cancer Imaging Archive. doi:10.7937/K9/TCIA.2018.3R3JUISW. Accessed 24 Aug 2026.</w:t>
       </w:r>
     </w:p>
     <w:sectPr>

</xml_diff>

<commit_message>
Elevate tissue-source-site sensitivity analysis
</commit_message>
<xml_diff>
--- a/manuscript/manuscript_JTM_patient_level_TITAN.docx
+++ b/manuscript/manuscript_JTM_patient_level_TITAN.docx
@@ -351,7 +351,7 @@
         <w:t xml:space="preserve">Results. </w:t>
       </w:r>
       <w:r>
-        <w:t>Within-cancer screening identified 219 continuous and 104 binary higher- or moderate-effect candidates. Highlighted repeated-CV results included TGCT–TGF-beta Response (Q² 0.670, 95% bootstrap interval 0.573–0.741; RMSE 0.303, Spearman 0.791) and LGG–TP53 (sensitivity 0.839, specificity 0.885, balanced accuracy 0.862, 95% bootstrap interval 0.833–0.888; AUROC 0.908). The literature audit found prior statistical support for 38/41 screen-positive cancer–gene pairs. Under the multiplicity sensitivity, 219 continuous and 39 cancer–mutation pairs passed the stricter across-cancer correction; its attainable q-values in large families were limited by the 0.001 empirical-p resolution. Site grouping reduced 83/323 candidates (25.7%) below the original effect threshold. In a selection-conditioned 24-model benchmark, median ridge-minus-PLS differences were 0.007 balanced accuracy and 0.014 Q², showing no uniform PLS advantage.</w:t>
+        <w:t>Within-cancer screening identified 219 continuous and 104 binary higher- or moderate-effect candidates. Highlighted repeated-CV results included BRCA–Proliferation (Q² 0.515, 95% bootstrap interval 0.467–0.560; RMSE 0.441, Spearman 0.740) and COAD–APC (sensitivity 0.883, specificity 0.705, balanced accuracy 0.794, 95% bootstrap interval 0.756–0.830; AUROC 0.848). The literature audit found prior statistical support for 38/41 screen-positive cancer–gene pairs. Under the multiplicity sensitivity, 219 continuous and 39 cancer–mutation pairs passed the stricter across-cancer correction; its attainable q-values in large families were limited by the 0.001 empirical-p resolution. Tissue-source-site grouping reduced 83/323 candidates (25.7%) below the original effect threshold. Within-cancer TITAN representations predicted tissue-source site in 27/32 cancers, with median multiclass macro balanced accuracy 0.628. In a selection-conditioned 24-model benchmark, median ridge-minus-PLS differences were 0.007 balanced accuracy and 0.014 Q², showing no uniform PLS advantage.</w:t>
       </w:r>
     </w:p>
     <w:p>
@@ -1647,7 +1647,12 @@
     </w:p>
     <w:p>
       <w:r>
-        <w:t>Screen-positive models were repeated under five independently seeded nested-CV partitions; each repeat seed governed both fold construction and rSVD. Sensitivity, specificity, balanced accuracy and AUROC were calculated within each repeat for binary endpoints; Q², RMSE and Spearman correlation were calculated within each repeat for continuous endpoints. Reported repeated-CV point estimates were the arithmetic mean of the five repeat-specific metrics, so LDA scores from independently fitted repeats were never pooled onto an assumed common scale. For highlighted models, 1,000 patient-cluster bootstrap resamples retained all five held-out predictions for each sampled patient, recalculated metrics within repeat and then averaged them; percentile 2.5th and 97.5th quantiles formed the 95% intervals. Site-grouped validation assigned all patients sharing a two-character TCGA tissue-source-site code to the same outer fold, preventing a site from appearing in both training and test partitions for that fold. A sensitivity analysis replaced each mean-pooled vector with the lexicographically first eligible diagnostic slide while preserving patients and seeds. Full-data research models were tuned by ten-fold CV and saved with feature order and checksum, training ranges, aggregation rule, endpoint transformation and output units, class coding and priors, decision rule, calibration status, class counts, exact software version and commit, computation backend, rSVD controls, external-validation status and intended-use metadata.</w:t>
+        <w:t>Screen-positive models were repeated under five independently seeded nested-CV partitions; each repeat seed governed both fold construction and rSVD. Sensitivity, specificity, balanced accuracy and AUROC were calculated within each repeat for binary endpoints; Q², RMSE and Spearman correlation were calculated within each repeat for continuous endpoints. Reported repeated-CV point estimates were the arithmetic mean of the five repeat-specific metrics, so LDA scores from independently fitted repeats were never pooled onto an assumed common scale. For highlighted models, 1,000 patient-cluster bootstrap resamples retained all five held-out predictions for each sampled patient, recalculated metrics within repeat and then averaged them; percentile 2.5th and 97.5th quantiles formed the 95% intervals. Tissue-source-site-grouped validation assigned all patients sharing a two-character TCGA tissue-source-site code to the same outer fold. The same site constraint was passed to every inner component-selection split within the outer training set; thus neither outer performance estimation nor inner tuning divided a tissue-source site across folds. For every model and outer fold, we recorded test and training patients, sites, and—where applicable—positive and negative cases. A sensitivity analysis replaced each mean-pooled vector with the lexicographically first eligible diagnostic slide while preserving patients and seeds. Full-data research models were tuned by ten-fold CV and saved with feature order and checksum, training ranges, aggregation rule, endpoint transformation and output units, class coding and priors, decision rule, calibration status, class counts, exact software version and commit, computation backend, rSVD controls, external-validation status and intended-use metadata.</w:t>
+      </w:r>
+    </w:p>
+    <w:p>
+      <w:r>
+        <w:t>To quantify whether TITAN itself retained submitting-site information, we treated tissue-source site as a multiclass outcome within each cancer. This dedicated confounding analysis retained sites with at least 10 patients, required at least two eligible sites per cancer, and used five independently seeded nested five-fold PLS–LDA validations with the same component range and rSVD controls. The primary metric was multiclass macro balanced accuracy (mean per-site recall); chance was 1/k for k analysed sites, and a chance-normalised value, (balanced accuracy − 1/k)/(1 − 1/k), was calculated for cross-cancer description. Patients from rare sites excluded from this site-classification analysis remained in all eligible molecular-endpoint analyses. This analysis tests whether the representation encodes TCGA submitting-site signatures; it does not identify their scanner, laboratory, staining or population causes.</w:t>
       </w:r>
     </w:p>
     <w:p>
@@ -3072,7 +3077,7 @@
         <w:pStyle w:val="Caption"/>
       </w:pPr>
       <w:r>
-        <w:t>Table 3. Highlighted repeated nested-cross-validation performance with 95% patient-cluster bootstrap intervals.</w:t>
+        <w:t>Table 3. Highlighted repeated nested-cross-validation performance with 95% patient-cluster bootstrap intervals and tissue-source-site-grouped internal sensitivity. Site-grouped values are internal TCGA estimates, not external-validation results.</w:t>
       </w:r>
     </w:p>
     <w:tbl>
@@ -3083,11 +3088,12 @@
         <w:tblLook w:firstColumn="1" w:firstRow="1" w:lastColumn="0" w:lastRow="0" w:noHBand="0" w:noVBand="1" w:val="04A0"/>
       </w:tblPr>
       <w:tblGrid>
-        <w:gridCol w:w="1882"/>
-        <w:gridCol w:w="1882"/>
-        <w:gridCol w:w="1882"/>
-        <w:gridCol w:w="1882"/>
-        <w:gridCol w:w="1882"/>
+        <w:gridCol w:w="1569"/>
+        <w:gridCol w:w="1569"/>
+        <w:gridCol w:w="1569"/>
+        <w:gridCol w:w="1569"/>
+        <w:gridCol w:w="1569"/>
+        <w:gridCol w:w="1569"/>
       </w:tblGrid>
       <w:tr>
         <w:trPr>
@@ -3096,7 +3102,7 @@
         </w:trPr>
         <w:tc>
           <w:tcPr>
-            <w:tcW w:type="dxa" w:w="1882"/>
+            <w:tcW w:type="dxa" w:w="1569"/>
           </w:tcPr>
           <w:p>
             <w:r>
@@ -3110,7 +3116,7 @@
         </w:tc>
         <w:tc>
           <w:tcPr>
-            <w:tcW w:type="dxa" w:w="1882"/>
+            <w:tcW w:type="dxa" w:w="1569"/>
           </w:tcPr>
           <w:p>
             <w:r>
@@ -3124,7 +3130,7 @@
         </w:tc>
         <w:tc>
           <w:tcPr>
-            <w:tcW w:type="dxa" w:w="1882"/>
+            <w:tcW w:type="dxa" w:w="1569"/>
           </w:tcPr>
           <w:p>
             <w:r>
@@ -3138,7 +3144,7 @@
         </w:tc>
         <w:tc>
           <w:tcPr>
-            <w:tcW w:type="dxa" w:w="1882"/>
+            <w:tcW w:type="dxa" w:w="1569"/>
           </w:tcPr>
           <w:p>
             <w:r>
@@ -3152,7 +3158,7 @@
         </w:tc>
         <w:tc>
           <w:tcPr>
-            <w:tcW w:type="dxa" w:w="1882"/>
+            <w:tcW w:type="dxa" w:w="1569"/>
           </w:tcPr>
           <w:p>
             <w:r>
@@ -3164,6 +3170,20 @@
             </w:r>
           </w:p>
         </w:tc>
+        <w:tc>
+          <w:tcPr>
+            <w:tcW w:type="dxa" w:w="1569"/>
+          </w:tcPr>
+          <w:p>
+            <w:r>
+              <w:rPr>
+                <w:b/>
+                <w:sz w:val="17"/>
+              </w:rPr>
+              <w:t>TSS-grouped metric/status</w:t>
+            </w:r>
+          </w:p>
+        </w:tc>
       </w:tr>
       <w:tr>
         <w:trPr>
@@ -3171,7 +3191,7 @@
         </w:trPr>
         <w:tc>
           <w:tcPr>
-            <w:tcW w:type="dxa" w:w="1882"/>
+            <w:tcW w:type="dxa" w:w="1569"/>
             <w:vAlign w:val="center"/>
           </w:tcPr>
           <w:p>
@@ -3179,13 +3199,13 @@
               <w:rPr>
                 <w:sz w:val="16"/>
               </w:rPr>
-              <w:t>TGCT–TGF-beta Response</w:t>
+              <w:t>BRCA–Proliferation</w:t>
             </w:r>
           </w:p>
         </w:tc>
         <w:tc>
           <w:tcPr>
-            <w:tcW w:type="dxa" w:w="1882"/>
+            <w:tcW w:type="dxa" w:w="1569"/>
             <w:vAlign w:val="center"/>
           </w:tcPr>
           <w:p>
@@ -3199,7 +3219,7 @@
         </w:tc>
         <w:tc>
           <w:tcPr>
-            <w:tcW w:type="dxa" w:w="1882"/>
+            <w:tcW w:type="dxa" w:w="1569"/>
             <w:vAlign w:val="center"/>
           </w:tcPr>
           <w:p>
@@ -3207,13 +3227,13 @@
               <w:rPr>
                 <w:sz w:val="16"/>
               </w:rPr>
-              <w:t>0.670 (0.573–0.741)</w:t>
+              <w:t>0.515 (0.467–0.560)</w:t>
             </w:r>
           </w:p>
         </w:tc>
         <w:tc>
           <w:tcPr>
-            <w:tcW w:type="dxa" w:w="1882"/>
+            <w:tcW w:type="dxa" w:w="1569"/>
             <w:vAlign w:val="center"/>
           </w:tcPr>
           <w:p>
@@ -3221,13 +3241,13 @@
               <w:rPr>
                 <w:sz w:val="16"/>
               </w:rPr>
-              <w:t>0.303 (0.269–0.337)</w:t>
+              <w:t>0.441 (0.418–0.466)</w:t>
             </w:r>
           </w:p>
         </w:tc>
         <w:tc>
           <w:tcPr>
-            <w:tcW w:type="dxa" w:w="1882"/>
+            <w:tcW w:type="dxa" w:w="1569"/>
             <w:vAlign w:val="center"/>
           </w:tcPr>
           <w:p>
@@ -3235,7 +3255,21 @@
               <w:rPr>
                 <w:sz w:val="16"/>
               </w:rPr>
-              <w:t>0.791 (0.713–0.842)</w:t>
+              <w:t>0.740 (0.710–0.770)</w:t>
+            </w:r>
+          </w:p>
+        </w:tc>
+        <w:tc>
+          <w:tcPr>
+            <w:tcW w:type="dxa" w:w="1569"/>
+            <w:vAlign w:val="center"/>
+          </w:tcPr>
+          <w:p>
+            <w:r>
+              <w:rPr>
+                <w:sz w:val="16"/>
+              </w:rPr>
+              <w:t>Q² 0.498; retained original effect threshold</w:t>
             </w:r>
           </w:p>
         </w:tc>
@@ -3246,7 +3280,7 @@
         </w:trPr>
         <w:tc>
           <w:tcPr>
-            <w:tcW w:type="dxa" w:w="1882"/>
+            <w:tcW w:type="dxa" w:w="1569"/>
             <w:vAlign w:val="center"/>
           </w:tcPr>
           <w:p>
@@ -3254,13 +3288,13 @@
               <w:rPr>
                 <w:sz w:val="16"/>
               </w:rPr>
-              <w:t>THYM–Th17 Cells</w:t>
+              <w:t>BRCA–Wound Healing</w:t>
             </w:r>
           </w:p>
         </w:tc>
         <w:tc>
           <w:tcPr>
-            <w:tcW w:type="dxa" w:w="1882"/>
+            <w:tcW w:type="dxa" w:w="1569"/>
             <w:vAlign w:val="center"/>
           </w:tcPr>
           <w:p>
@@ -3274,7 +3308,7 @@
         </w:tc>
         <w:tc>
           <w:tcPr>
-            <w:tcW w:type="dxa" w:w="1882"/>
+            <w:tcW w:type="dxa" w:w="1569"/>
             <w:vAlign w:val="center"/>
           </w:tcPr>
           <w:p>
@@ -3282,13 +3316,13 @@
               <w:rPr>
                 <w:sz w:val="16"/>
               </w:rPr>
-              <w:t>0.594 (0.455–0.698)</w:t>
+              <w:t>0.528 (0.483–0.569)</w:t>
             </w:r>
           </w:p>
         </w:tc>
         <w:tc>
           <w:tcPr>
-            <w:tcW w:type="dxa" w:w="1882"/>
+            <w:tcW w:type="dxa" w:w="1569"/>
             <w:vAlign w:val="center"/>
           </w:tcPr>
           <w:p>
@@ -3296,13 +3330,13 @@
               <w:rPr>
                 <w:sz w:val="16"/>
               </w:rPr>
-              <w:t>1743.443 (1514.535–1979.481)</w:t>
+              <w:t>0.111 (0.106–0.116)</w:t>
             </w:r>
           </w:p>
         </w:tc>
         <w:tc>
           <w:tcPr>
-            <w:tcW w:type="dxa" w:w="1882"/>
+            <w:tcW w:type="dxa" w:w="1569"/>
             <w:vAlign w:val="center"/>
           </w:tcPr>
           <w:p>
@@ -3310,7 +3344,21 @@
               <w:rPr>
                 <w:sz w:val="16"/>
               </w:rPr>
-              <w:t>0.738 (0.636–0.811)</w:t>
+              <w:t>0.724 (0.694–0.753)</w:t>
+            </w:r>
+          </w:p>
+        </w:tc>
+        <w:tc>
+          <w:tcPr>
+            <w:tcW w:type="dxa" w:w="1569"/>
+            <w:vAlign w:val="center"/>
+          </w:tcPr>
+          <w:p>
+            <w:r>
+              <w:rPr>
+                <w:sz w:val="16"/>
+              </w:rPr>
+              <w:t>Q² 0.508; retained original effect threshold</w:t>
             </w:r>
           </w:p>
         </w:tc>
@@ -3321,7 +3369,7 @@
         </w:trPr>
         <w:tc>
           <w:tcPr>
-            <w:tcW w:type="dxa" w:w="1882"/>
+            <w:tcW w:type="dxa" w:w="1569"/>
             <w:vAlign w:val="center"/>
           </w:tcPr>
           <w:p>
@@ -3329,13 +3377,13 @@
               <w:rPr>
                 <w:sz w:val="16"/>
               </w:rPr>
-              <w:t>THCA–Lymphocyte Infiltration Signature Score</w:t>
+              <w:t>KIRP–Proliferation</w:t>
             </w:r>
           </w:p>
         </w:tc>
         <w:tc>
           <w:tcPr>
-            <w:tcW w:type="dxa" w:w="1882"/>
+            <w:tcW w:type="dxa" w:w="1569"/>
             <w:vAlign w:val="center"/>
           </w:tcPr>
           <w:p>
@@ -3349,7 +3397,7 @@
         </w:tc>
         <w:tc>
           <w:tcPr>
-            <w:tcW w:type="dxa" w:w="1882"/>
+            <w:tcW w:type="dxa" w:w="1569"/>
             <w:vAlign w:val="center"/>
           </w:tcPr>
           <w:p>
@@ -3357,13 +3405,13 @@
               <w:rPr>
                 <w:sz w:val="16"/>
               </w:rPr>
-              <w:t>0.577 (0.511–0.636)</w:t>
+              <w:t>0.499 (0.386–0.585)</w:t>
             </w:r>
           </w:p>
         </w:tc>
         <w:tc>
           <w:tcPr>
-            <w:tcW w:type="dxa" w:w="1882"/>
+            <w:tcW w:type="dxa" w:w="1569"/>
             <w:vAlign w:val="center"/>
           </w:tcPr>
           <w:p>
@@ -3371,13 +3419,13 @@
               <w:rPr>
                 <w:sz w:val="16"/>
               </w:rPr>
-              <w:t>0.781 (0.722–0.844)</w:t>
+              <w:t>0.400 (0.364–0.429)</w:t>
             </w:r>
           </w:p>
         </w:tc>
         <w:tc>
           <w:tcPr>
-            <w:tcW w:type="dxa" w:w="1882"/>
+            <w:tcW w:type="dxa" w:w="1569"/>
             <w:vAlign w:val="center"/>
           </w:tcPr>
           <w:p>
@@ -3385,7 +3433,21 @@
               <w:rPr>
                 <w:sz w:val="16"/>
               </w:rPr>
-              <w:t>0.742 (0.693–0.786)</w:t>
+              <w:t>0.605 (0.521–0.688)</w:t>
+            </w:r>
+          </w:p>
+        </w:tc>
+        <w:tc>
+          <w:tcPr>
+            <w:tcW w:type="dxa" w:w="1569"/>
+            <w:vAlign w:val="center"/>
+          </w:tcPr>
+          <w:p>
+            <w:r>
+              <w:rPr>
+                <w:sz w:val="16"/>
+              </w:rPr>
+              <w:t>Q² 0.516; retained original effect threshold</w:t>
             </w:r>
           </w:p>
         </w:tc>
@@ -3396,7 +3458,7 @@
         </w:trPr>
         <w:tc>
           <w:tcPr>
-            <w:tcW w:type="dxa" w:w="1882"/>
+            <w:tcW w:type="dxa" w:w="1569"/>
             <w:vAlign w:val="center"/>
           </w:tcPr>
           <w:p>
@@ -3404,13 +3466,13 @@
               <w:rPr>
                 <w:sz w:val="16"/>
               </w:rPr>
-              <w:t>BRCA–Wound Healing</w:t>
+              <w:t>LUAD–Proliferation</w:t>
             </w:r>
           </w:p>
         </w:tc>
         <w:tc>
           <w:tcPr>
-            <w:tcW w:type="dxa" w:w="1882"/>
+            <w:tcW w:type="dxa" w:w="1569"/>
             <w:vAlign w:val="center"/>
           </w:tcPr>
           <w:p>
@@ -3424,7 +3486,7 @@
         </w:tc>
         <w:tc>
           <w:tcPr>
-            <w:tcW w:type="dxa" w:w="1882"/>
+            <w:tcW w:type="dxa" w:w="1569"/>
             <w:vAlign w:val="center"/>
           </w:tcPr>
           <w:p>
@@ -3432,13 +3494,13 @@
               <w:rPr>
                 <w:sz w:val="16"/>
               </w:rPr>
-              <w:t>0.528 (0.483–0.569)</w:t>
+              <w:t>0.524 (0.443–0.591)</w:t>
             </w:r>
           </w:p>
         </w:tc>
         <w:tc>
           <w:tcPr>
-            <w:tcW w:type="dxa" w:w="1882"/>
+            <w:tcW w:type="dxa" w:w="1569"/>
             <w:vAlign w:val="center"/>
           </w:tcPr>
           <w:p>
@@ -3446,13 +3508,13 @@
               <w:rPr>
                 <w:sz w:val="16"/>
               </w:rPr>
-              <w:t>0.111 (0.106–0.116)</w:t>
+              <w:t>0.450 (0.413–0.486)</w:t>
             </w:r>
           </w:p>
         </w:tc>
         <w:tc>
           <w:tcPr>
-            <w:tcW w:type="dxa" w:w="1882"/>
+            <w:tcW w:type="dxa" w:w="1569"/>
             <w:vAlign w:val="center"/>
           </w:tcPr>
           <w:p>
@@ -3460,7 +3522,21 @@
               <w:rPr>
                 <w:sz w:val="16"/>
               </w:rPr>
-              <w:t>0.724 (0.694–0.753)</w:t>
+              <w:t>0.729 (0.674–0.777)</w:t>
+            </w:r>
+          </w:p>
+        </w:tc>
+        <w:tc>
+          <w:tcPr>
+            <w:tcW w:type="dxa" w:w="1569"/>
+            <w:vAlign w:val="center"/>
+          </w:tcPr>
+          <w:p>
+            <w:r>
+              <w:rPr>
+                <w:sz w:val="16"/>
+              </w:rPr>
+              <w:t>Q² 0.490; retained original effect threshold</w:t>
             </w:r>
           </w:p>
         </w:tc>
@@ -3471,7 +3547,274 @@
         </w:trPr>
         <w:tc>
           <w:tcPr>
-            <w:tcW w:type="dxa" w:w="1882"/>
+            <w:tcW w:type="dxa" w:w="1569"/>
+            <w:vAlign w:val="center"/>
+          </w:tcPr>
+          <w:p>
+            <w:r>
+              <w:rPr>
+                <w:sz w:val="16"/>
+              </w:rPr>
+              <w:t>COAD–APC</w:t>
+            </w:r>
+          </w:p>
+        </w:tc>
+        <w:tc>
+          <w:tcPr>
+            <w:tcW w:type="dxa" w:w="1569"/>
+            <w:vAlign w:val="center"/>
+          </w:tcPr>
+          <w:p>
+            <w:r>
+              <w:rPr>
+                <w:sz w:val="16"/>
+              </w:rPr>
+              <w:t>binary</w:t>
+            </w:r>
+          </w:p>
+        </w:tc>
+        <w:tc>
+          <w:tcPr>
+            <w:tcW w:type="dxa" w:w="1569"/>
+            <w:vAlign w:val="center"/>
+          </w:tcPr>
+          <w:p>
+            <w:r>
+              <w:rPr>
+                <w:sz w:val="16"/>
+              </w:rPr>
+              <w:t>Se 0.883 (0.838–0.923); Sp 0.705 (0.642–0.765)</w:t>
+            </w:r>
+          </w:p>
+        </w:tc>
+        <w:tc>
+          <w:tcPr>
+            <w:tcW w:type="dxa" w:w="1569"/>
+            <w:vAlign w:val="center"/>
+          </w:tcPr>
+          <w:p>
+            <w:r>
+              <w:rPr>
+                <w:sz w:val="16"/>
+              </w:rPr>
+              <w:t>BA 0.794 (0.756–0.830)</w:t>
+            </w:r>
+          </w:p>
+        </w:tc>
+        <w:tc>
+          <w:tcPr>
+            <w:tcW w:type="dxa" w:w="1569"/>
+            <w:vAlign w:val="center"/>
+          </w:tcPr>
+          <w:p>
+            <w:r>
+              <w:rPr>
+                <w:sz w:val="16"/>
+              </w:rPr>
+              <w:t>AUROC 0.848 (0.805–0.885)</w:t>
+            </w:r>
+          </w:p>
+        </w:tc>
+        <w:tc>
+          <w:tcPr>
+            <w:tcW w:type="dxa" w:w="1569"/>
+            <w:vAlign w:val="center"/>
+          </w:tcPr>
+          <w:p>
+            <w:r>
+              <w:rPr>
+                <w:sz w:val="16"/>
+              </w:rPr>
+              <w:t>BA 0.543; WARNING: near chance or worse</w:t>
+            </w:r>
+          </w:p>
+        </w:tc>
+      </w:tr>
+      <w:tr>
+        <w:trPr>
+          <w:cantSplit/>
+        </w:trPr>
+        <w:tc>
+          <w:tcPr>
+            <w:tcW w:type="dxa" w:w="1569"/>
+            <w:vAlign w:val="center"/>
+          </w:tcPr>
+          <w:p>
+            <w:r>
+              <w:rPr>
+                <w:sz w:val="16"/>
+              </w:rPr>
+              <w:t>COAD–TP53</w:t>
+            </w:r>
+          </w:p>
+        </w:tc>
+        <w:tc>
+          <w:tcPr>
+            <w:tcW w:type="dxa" w:w="1569"/>
+            <w:vAlign w:val="center"/>
+          </w:tcPr>
+          <w:p>
+            <w:r>
+              <w:rPr>
+                <w:sz w:val="16"/>
+              </w:rPr>
+              <w:t>binary</w:t>
+            </w:r>
+          </w:p>
+        </w:tc>
+        <w:tc>
+          <w:tcPr>
+            <w:tcW w:type="dxa" w:w="1569"/>
+            <w:vAlign w:val="center"/>
+          </w:tcPr>
+          <w:p>
+            <w:r>
+              <w:rPr>
+                <w:sz w:val="16"/>
+              </w:rPr>
+              <w:t>Se 0.779 (0.720–0.834); Sp 0.777 (0.723–0.827)</w:t>
+            </w:r>
+          </w:p>
+        </w:tc>
+        <w:tc>
+          <w:tcPr>
+            <w:tcW w:type="dxa" w:w="1569"/>
+            <w:vAlign w:val="center"/>
+          </w:tcPr>
+          <w:p>
+            <w:r>
+              <w:rPr>
+                <w:sz w:val="16"/>
+              </w:rPr>
+              <w:t>BA 0.778 (0.740–0.814)</w:t>
+            </w:r>
+          </w:p>
+        </w:tc>
+        <w:tc>
+          <w:tcPr>
+            <w:tcW w:type="dxa" w:w="1569"/>
+            <w:vAlign w:val="center"/>
+          </w:tcPr>
+          <w:p>
+            <w:r>
+              <w:rPr>
+                <w:sz w:val="16"/>
+              </w:rPr>
+              <w:t>AUROC 0.854 (0.815–0.889)</w:t>
+            </w:r>
+          </w:p>
+        </w:tc>
+        <w:tc>
+          <w:tcPr>
+            <w:tcW w:type="dxa" w:w="1569"/>
+            <w:vAlign w:val="center"/>
+          </w:tcPr>
+          <w:p>
+            <w:r>
+              <w:rPr>
+                <w:sz w:val="16"/>
+              </w:rPr>
+              <w:t>BA 0.648; retained original effect threshold</w:t>
+            </w:r>
+          </w:p>
+        </w:tc>
+      </w:tr>
+      <w:tr>
+        <w:trPr>
+          <w:cantSplit/>
+        </w:trPr>
+        <w:tc>
+          <w:tcPr>
+            <w:tcW w:type="dxa" w:w="1569"/>
+            <w:vAlign w:val="center"/>
+          </w:tcPr>
+          <w:p>
+            <w:r>
+              <w:rPr>
+                <w:sz w:val="16"/>
+              </w:rPr>
+              <w:t>LGG–IDH1</w:t>
+            </w:r>
+          </w:p>
+        </w:tc>
+        <w:tc>
+          <w:tcPr>
+            <w:tcW w:type="dxa" w:w="1569"/>
+            <w:vAlign w:val="center"/>
+          </w:tcPr>
+          <w:p>
+            <w:r>
+              <w:rPr>
+                <w:sz w:val="16"/>
+              </w:rPr>
+              <w:t>binary</w:t>
+            </w:r>
+          </w:p>
+        </w:tc>
+        <w:tc>
+          <w:tcPr>
+            <w:tcW w:type="dxa" w:w="1569"/>
+            <w:vAlign w:val="center"/>
+          </w:tcPr>
+          <w:p>
+            <w:r>
+              <w:rPr>
+                <w:sz w:val="16"/>
+              </w:rPr>
+              <w:t>Se 0.940 (0.921–0.957); Sp 0.624 (0.540–0.702)</w:t>
+            </w:r>
+          </w:p>
+        </w:tc>
+        <w:tc>
+          <w:tcPr>
+            <w:tcW w:type="dxa" w:w="1569"/>
+            <w:vAlign w:val="center"/>
+          </w:tcPr>
+          <w:p>
+            <w:r>
+              <w:rPr>
+                <w:sz w:val="16"/>
+              </w:rPr>
+              <w:t>BA 0.782 (0.740–0.823)</w:t>
+            </w:r>
+          </w:p>
+        </w:tc>
+        <w:tc>
+          <w:tcPr>
+            <w:tcW w:type="dxa" w:w="1569"/>
+            <w:vAlign w:val="center"/>
+          </w:tcPr>
+          <w:p>
+            <w:r>
+              <w:rPr>
+                <w:sz w:val="16"/>
+              </w:rPr>
+              <w:t>AUROC 0.853 (0.807–0.898)</w:t>
+            </w:r>
+          </w:p>
+        </w:tc>
+        <w:tc>
+          <w:tcPr>
+            <w:tcW w:type="dxa" w:w="1569"/>
+            <w:vAlign w:val="center"/>
+          </w:tcPr>
+          <w:p>
+            <w:r>
+              <w:rPr>
+                <w:sz w:val="16"/>
+              </w:rPr>
+              <w:t>BA 0.793; retained original effect threshold</w:t>
+            </w:r>
+          </w:p>
+        </w:tc>
+      </w:tr>
+      <w:tr>
+        <w:trPr>
+          <w:cantSplit/>
+        </w:trPr>
+        <w:tc>
+          <w:tcPr>
+            <w:tcW w:type="dxa" w:w="1569"/>
             <w:vAlign w:val="center"/>
           </w:tcPr>
           <w:p>
@@ -3485,7 +3828,7 @@
         </w:tc>
         <w:tc>
           <w:tcPr>
-            <w:tcW w:type="dxa" w:w="1882"/>
+            <w:tcW w:type="dxa" w:w="1569"/>
             <w:vAlign w:val="center"/>
           </w:tcPr>
           <w:p>
@@ -3499,7 +3842,7 @@
         </w:tc>
         <w:tc>
           <w:tcPr>
-            <w:tcW w:type="dxa" w:w="1882"/>
+            <w:tcW w:type="dxa" w:w="1569"/>
             <w:vAlign w:val="center"/>
           </w:tcPr>
           <w:p>
@@ -3513,7 +3856,7 @@
         </w:tc>
         <w:tc>
           <w:tcPr>
-            <w:tcW w:type="dxa" w:w="1882"/>
+            <w:tcW w:type="dxa" w:w="1569"/>
             <w:vAlign w:val="center"/>
           </w:tcPr>
           <w:p>
@@ -3527,7 +3870,7 @@
         </w:tc>
         <w:tc>
           <w:tcPr>
-            <w:tcW w:type="dxa" w:w="1882"/>
+            <w:tcW w:type="dxa" w:w="1569"/>
             <w:vAlign w:val="center"/>
           </w:tcPr>
           <w:p>
@@ -3539,14 +3882,9 @@
             </w:r>
           </w:p>
         </w:tc>
-      </w:tr>
-      <w:tr>
-        <w:trPr>
-          <w:cantSplit/>
-        </w:trPr>
         <w:tc>
           <w:tcPr>
-            <w:tcW w:type="dxa" w:w="1882"/>
+            <w:tcW w:type="dxa" w:w="1569"/>
             <w:vAlign w:val="center"/>
           </w:tcPr>
           <w:p>
@@ -3554,213 +3892,7 @@
               <w:rPr>
                 <w:sz w:val="16"/>
               </w:rPr>
-              <w:t>THYM–GTF2I</w:t>
-            </w:r>
-          </w:p>
-        </w:tc>
-        <w:tc>
-          <w:tcPr>
-            <w:tcW w:type="dxa" w:w="1882"/>
-            <w:vAlign w:val="center"/>
-          </w:tcPr>
-          <w:p>
-            <w:r>
-              <w:rPr>
-                <w:sz w:val="16"/>
-              </w:rPr>
-              <w:t>binary</w:t>
-            </w:r>
-          </w:p>
-        </w:tc>
-        <w:tc>
-          <w:tcPr>
-            <w:tcW w:type="dxa" w:w="1882"/>
-            <w:vAlign w:val="center"/>
-          </w:tcPr>
-          <w:p>
-            <w:r>
-              <w:rPr>
-                <w:sz w:val="16"/>
-              </w:rPr>
-              <w:t>Se 0.878 (0.804–0.940); Sp 0.839 (0.748–0.916)</w:t>
-            </w:r>
-          </w:p>
-        </w:tc>
-        <w:tc>
-          <w:tcPr>
-            <w:tcW w:type="dxa" w:w="1882"/>
-            <w:vAlign w:val="center"/>
-          </w:tcPr>
-          <w:p>
-            <w:r>
-              <w:rPr>
-                <w:sz w:val="16"/>
-              </w:rPr>
-              <w:t>BA 0.859 (0.803–0.905)</w:t>
-            </w:r>
-          </w:p>
-        </w:tc>
-        <w:tc>
-          <w:tcPr>
-            <w:tcW w:type="dxa" w:w="1882"/>
-            <w:vAlign w:val="center"/>
-          </w:tcPr>
-          <w:p>
-            <w:r>
-              <w:rPr>
-                <w:sz w:val="16"/>
-              </w:rPr>
-              <w:t>AUROC 0.907 (0.852–0.955)</w:t>
-            </w:r>
-          </w:p>
-        </w:tc>
-      </w:tr>
-      <w:tr>
-        <w:trPr>
-          <w:cantSplit/>
-        </w:trPr>
-        <w:tc>
-          <w:tcPr>
-            <w:tcW w:type="dxa" w:w="1882"/>
-            <w:vAlign w:val="center"/>
-          </w:tcPr>
-          <w:p>
-            <w:r>
-              <w:rPr>
-                <w:sz w:val="16"/>
-              </w:rPr>
-              <w:t>READ–TP53</w:t>
-            </w:r>
-          </w:p>
-        </w:tc>
-        <w:tc>
-          <w:tcPr>
-            <w:tcW w:type="dxa" w:w="1882"/>
-            <w:vAlign w:val="center"/>
-          </w:tcPr>
-          <w:p>
-            <w:r>
-              <w:rPr>
-                <w:sz w:val="16"/>
-              </w:rPr>
-              <w:t>binary</w:t>
-            </w:r>
-          </w:p>
-        </w:tc>
-        <w:tc>
-          <w:tcPr>
-            <w:tcW w:type="dxa" w:w="1882"/>
-            <w:vAlign w:val="center"/>
-          </w:tcPr>
-          <w:p>
-            <w:r>
-              <w:rPr>
-                <w:sz w:val="16"/>
-              </w:rPr>
-              <w:t>Se 0.912 (0.855–0.966); Sp 0.803 (0.704–0.890)</w:t>
-            </w:r>
-          </w:p>
-        </w:tc>
-        <w:tc>
-          <w:tcPr>
-            <w:tcW w:type="dxa" w:w="1882"/>
-            <w:vAlign w:val="center"/>
-          </w:tcPr>
-          <w:p>
-            <w:r>
-              <w:rPr>
-                <w:sz w:val="16"/>
-              </w:rPr>
-              <w:t>BA 0.858 (0.801–0.910)</w:t>
-            </w:r>
-          </w:p>
-        </w:tc>
-        <w:tc>
-          <w:tcPr>
-            <w:tcW w:type="dxa" w:w="1882"/>
-            <w:vAlign w:val="center"/>
-          </w:tcPr>
-          <w:p>
-            <w:r>
-              <w:rPr>
-                <w:sz w:val="16"/>
-              </w:rPr>
-              <w:t>AUROC 0.912 (0.860–0.956)</w:t>
-            </w:r>
-          </w:p>
-        </w:tc>
-      </w:tr>
-      <w:tr>
-        <w:trPr>
-          <w:cantSplit/>
-        </w:trPr>
-        <w:tc>
-          <w:tcPr>
-            <w:tcW w:type="dxa" w:w="1882"/>
-            <w:vAlign w:val="center"/>
-          </w:tcPr>
-          <w:p>
-            <w:r>
-              <w:rPr>
-                <w:sz w:val="16"/>
-              </w:rPr>
-              <w:t>THCA–BRAF</w:t>
-            </w:r>
-          </w:p>
-        </w:tc>
-        <w:tc>
-          <w:tcPr>
-            <w:tcW w:type="dxa" w:w="1882"/>
-            <w:vAlign w:val="center"/>
-          </w:tcPr>
-          <w:p>
-            <w:r>
-              <w:rPr>
-                <w:sz w:val="16"/>
-              </w:rPr>
-              <w:t>binary</w:t>
-            </w:r>
-          </w:p>
-        </w:tc>
-        <w:tc>
-          <w:tcPr>
-            <w:tcW w:type="dxa" w:w="1882"/>
-            <w:vAlign w:val="center"/>
-          </w:tcPr>
-          <w:p>
-            <w:r>
-              <w:rPr>
-                <w:sz w:val="16"/>
-              </w:rPr>
-              <w:t>Se 0.926 (0.897–0.952); Sp 0.747 (0.688–0.801)</w:t>
-            </w:r>
-          </w:p>
-        </w:tc>
-        <w:tc>
-          <w:tcPr>
-            <w:tcW w:type="dxa" w:w="1882"/>
-            <w:vAlign w:val="center"/>
-          </w:tcPr>
-          <w:p>
-            <w:r>
-              <w:rPr>
-                <w:sz w:val="16"/>
-              </w:rPr>
-              <w:t>BA 0.837 (0.805–0.866)</w:t>
-            </w:r>
-          </w:p>
-        </w:tc>
-        <w:tc>
-          <w:tcPr>
-            <w:tcW w:type="dxa" w:w="1882"/>
-            <w:vAlign w:val="center"/>
-          </w:tcPr>
-          <w:p>
-            <w:r>
-              <w:rPr>
-                <w:sz w:val="16"/>
-              </w:rPr>
-              <w:t>AUROC 0.894 (0.862–0.924)</w:t>
+              <w:t>BA 0.841; retained original effect threshold</w:t>
             </w:r>
           </w:p>
         </w:tc>
@@ -3833,12 +3965,22 @@
         <w:pStyle w:val="Heading2"/>
       </w:pPr>
       <w:r>
-        <w:t>Site and multiple-slide sensitivity</w:t>
+        <w:t>Tissue-source-site sensitivity and submitting-site prediction</w:t>
       </w:r>
     </w:p>
     <w:p>
       <w:r>
-        <w:t>Site-grouped validation was feasible for 323 screen-positive models. Although the median grouped-minus-random performance change was only -0.026, 83/323 models (25.7%) fell below the original effect threshold: 58/219 continuous models and 25/104 binary models. Prominent attenuations were READ–APC (balanced accuracy 0.862 to 0.495); COAD–APC (balanced accuracy 0.793 to 0.543); PCPG–Cell Cycle (balanced accuracy 0.686 to 0.476); LIHC–CTNNB1 (balanced accuracy 0.668 to 0.565); OV–TCR Shannon (Q² 0.206 to -0.551); COAD–SNV Neoantigens (Q² 0.239 to -0.013). The site-grouped folds contain fewer and less evenly distributed training patients, so the decline cannot be attributed solely to site artefact; nevertheless, the near-chance colorectal APC results are not adequately summarised by the median and are treated as site-sensitive. The first-slide-minus-mean-pool median change across screen-positive models was -0.001.</w:t>
+        <w:t xml:space="preserve">Tissue-source-site-grouped internal validation was feasible for 323 screen-positive models. Although the median grouped-minus-random performance change was only -0.026, 83/323 models (25.7%) fell below the original effect threshold: 58/219 continuous models and 25/104 binary models. Prominent attenuations were READ–APC (balanced accuracy 0.862 to 0.495); COAD–APC (balanced accuracy 0.793 to 0.543); PCPG–Cell Cycle (balanced accuracy 0.686 to 0.476); LIHC–CTNNB1 (balanced accuracy 0.668 to 0.565); OV–TCR Shannon (Q² 0.206 to -0.551); COAD–SNV Neoantigens (Q² 0.239 to -0.013). The site-grouped folds contain fewer and less evenly distributed training and test patients, so the decline cannot be attributed solely to site artefact; nevertheless, the near-chance colorectal APC results are not adequately summarised by the median and are labelled site-sensitive in the main model table, registry and research-software output. </w:t>
+      </w:r>
+    </w:p>
+    <w:p>
+      <w:r>
+        <w:t>Across 1,613 outer folds, test partitions contained 1–445 patients and 1–9 tissue-source sites; binary folds contained 0–130 positive and 0–269 negative patients. These imbalances are intrinsic to keeping complete sites together and are reported model by model and fold by fold. The deterministic fold audit confirmed that no site crossed an outer fold and that the same separation was maintained in every inner component-selection split.</w:t>
+      </w:r>
+    </w:p>
+    <w:p>
+      <w:r>
+        <w:t>The dedicated within-cancer site-classification analysis was evaluable in 27/32 cancers and included 7,863 patients from sites with at least 10 patients. All 27 observed macro balanced accuracies exceeded their cancer-specific 1/k chance reference; the median was 0.628 (range 0.425–0.966). The strongest chance-normalised site predictability occurred in UVM (macro balanced accuracy 0.966; 3 sites); OV (macro balanced accuracy 0.963; 2 sites); PAAD (macro balanced accuracy 0.911; 5 sites); ESCA (macro balanced accuracy 0.861; 7 sites); READ (macro balanced accuracy 0.862; 5 sites). ACC, CHOL, DLBC, MESO and UCS had fewer than two sites meeting the 10-patient requirement and were reported as ineligible. This result shows substantial submitting-site information in the fixed TITAN representation and strengthens the confounding concern; it does not identify a causal scanner, laboratory or staining effect.</w:t>
       </w:r>
     </w:p>
     <w:p>
@@ -3848,7 +3990,7 @@
       <w:r>
         <w:drawing>
           <wp:inline xmlns:a="http://schemas.openxmlformats.org/drawingml/2006/main" xmlns:pic="http://schemas.openxmlformats.org/drawingml/2006/picture">
-            <wp:extent cx="5806440" cy="3182376"/>
+            <wp:extent cx="5806440" cy="5195236"/>
             <wp:docPr id="6" name="Picture 6"/>
             <wp:cNvGraphicFramePr>
               <a:graphicFrameLocks noChangeAspect="1"/>
@@ -3869,7 +4011,7 @@
                   <pic:spPr>
                     <a:xfrm>
                       <a:off x="0" y="0"/>
-                      <a:ext cx="5806440" cy="3182376"/>
+                      <a:ext cx="5806440" cy="5195236"/>
                     </a:xfrm>
                     <a:prstGeom prst="rect"/>
                   </pic:spPr>
@@ -3886,7 +4028,20 @@
         <w:jc w:val="center"/>
       </w:pPr>
       <w:r>
-        <w:t>Figure 6. Random-fold versus tissue-source-site-grouped internal validation. Values below the diagonal indicate attenuation when submitting tissue-source sites are separated.</w:t>
+        <w:t>Figure 6. Tissue-source-site sensitivity as a principal result. Panel A compares random-fold and tissue-source-site-grouped internal performance for all 323 screen-positive models; Panel B names the largest attenuations; Panel C quantifies within-cancer prediction of tissue-source site from TITAN representations. Grouping is internal to TCGA, and tissue-source site is an imperfect proxy rather than institutional or scanner-level external validation.</w:t>
+      </w:r>
+    </w:p>
+    <w:p>
+      <w:pPr>
+        <w:pStyle w:val="Heading2"/>
+      </w:pPr>
+      <w:r>
+        <w:t>Multiple-slide sensitivity</w:t>
+      </w:r>
+    </w:p>
+    <w:p>
+      <w:r>
+        <w:t>Replacing each deterministic patient mean with the lexicographically first eligible diagnostic slide produced a median first-slide-minus-mean-pool performance change of -0.001 across screen-positive models. This patient-level sensitivity is distinct from the tissue-source-site analysis.</w:t>
       </w:r>
     </w:p>
     <w:p>
@@ -4299,7 +4454,7 @@
     </w:p>
     <w:p>
       <w:r>
-        <w:t>The access-controlled TITANPred R package contains 323 fitted models (219 continuous and 104 binary) across 27 cancers [32]. An authorised research user supplies a cancer vector and correctly named 768-dimensional TITAN features; the interface applies every bundled model available for that cancer. Repeated patient identifiers are mean-pooled before inference. Continuous outputs retain source endpoint units and are positioned against repeated out-of-fold reference distributions; binary outputs comprise the fitted PLS-LDA class and uncalibrated LDA score. The binary display labels its TCGA out-of-fold score rank explicitly as a rank rather than a probability and places training positive/negative counts, prevalence, repeated-CV performance and any limited-class-size warning beside the call. A single-sample research-software output renders all available continuous endpoints as a radar, with the exact reference percentile and original prediction printed at every corner, and displays binary calls with provenance and out-of-distribution diagnostics. The demonstration ends with definitions of every displayed endpoint and citations for the data source used to construct each TCGA model target.</w:t>
+        <w:t>The access-controlled TITANPred R package contains 323 fitted models (219 continuous and 104 binary) across 27 cancers [32]. An authorised research user supplies a cancer vector and correctly named 768-dimensional TITAN features; the interface applies every bundled model available for that cancer. Repeated patient identifiers are mean-pooled before inference. Continuous outputs retain source endpoint units and are positioned against repeated out-of-fold reference distributions; binary outputs comprise the fitted PLS-LDA class and uncalibrated LDA score. The binary display labels its TCGA out-of-fold score rank explicitly as a rank rather than a probability and places training positive/negative counts, prevalence, repeated-CV performance, the tissue-source-site-grouped metric and any limited-class-size or site-sensitivity warning beside the call. A single-sample research-software output renders all available continuous endpoints as a radar, with the exact reference percentile and original prediction printed at every corner, and displays binary calls with provenance and out-of-distribution diagnostics. The demonstration ends with definitions of every displayed endpoint and citations for the data source used to construct each TCGA model target.</w:t>
       </w:r>
     </w:p>
     <w:p>
@@ -4425,7 +4580,12 @@
     </w:p>
     <w:p>
       <w:r>
-        <w:t>Site grouping revealed heterogeneity that the median attenuation concealed: 83/323 screen-positive models (25.7%) fell below their original effect threshold. READ–APC and COAD–APC declined from balanced accuracies 0.862 and 0.793 to 0.495 and 0.543, respectively. Smaller and less balanced training folds contribute to grouped-validation loss, but performance close to chance requires these models to be labelled site-sensitive rather than robust biological signals. This reinforces the need for multi-institutional external validation and for publishing target-level, not only median, sensitivity results.</w:t>
+        <w:t>Tissue-source-site sensitivity is a central result rather than a generic robustness footnote. Grouping revealed heterogeneity that the median attenuation concealed: 83/323 screen-positive models (25.7%) fell below their original effect threshold. READ–APC and COAD–APC declined from balanced accuracies 0.862 and 0.793 to 0.495 and 0.543, respectively. Smaller and less balanced training folds contribute to grouped-validation loss, but performance close to chance requires these models to be labelled site-sensitive rather than robust biological signals. The model registry and inference output therefore expose the grouped metric, delta, number of sites, threshold-retention status and a prominent warning for every affected endpoint.</w:t>
+      </w:r>
+    </w:p>
+    <w:p>
+      <w:r>
+        <w:t>The complementary site-classification analysis strengthens this interpretation: the fixed TITAN representation predicted submitting site within 27/32 evaluable cancers, with median macro balanced accuracy 0.628 despite cancer-specific chance references from 0.053 to 0.500. This demonstrates that site information is present in the representation and could support confounding. It does not show that each attenuated molecular model is wholly artifactual, because site correlates with case mix and molecular prevalence as well as technical acquisition. Conversely, successful tissue-source-site grouping cannot prove transportability: the barcode-derived site is an imperfect proxy for institutions, scanners, staining laboratories and batch effects.</w:t>
       </w:r>
     </w:p>
     <w:p>
@@ -4440,7 +4600,7 @@
     </w:p>
     <w:p>
       <w:r>
-        <w:t>The principal limitation is absence of independent external validation. TCGA resampling, even with site separation, cannot establish transportability to another institution, scanner, stain distribution or patient population. The study is retrospective and exploratory; thresholds are prioritisation rules, not clinical operating points. Although TCGA was excluded from TITAN's Mass-340K pretraining corpus, it was used in the original paper's downstream evaluation; the present cohort is therefore neither a pretraining cohort nor an independent validation cohort. Predictability does not establish biological causality, and image-derived estimates cannot justify omitting a molecular assay. The three-model UCEC subset is locked only for future independent evaluation. Until that untouched analysis reports every target, the work should be evaluated as a computational pathology benchmark and research-software resource rather than a translational prediction study.</w:t>
+        <w:t>The principal limitation is absence of independent external validation. TCGA resampling—including the analysis termed 'TCGA tissue-source-site-grouped internal validation'—cannot establish transportability to another institution, scanner, stain distribution or patient population. Tissue-source site is not a complete scanner or laboratory identifier. The study is retrospective and exploratory; thresholds are prioritisation rules, not clinical operating points. Although TCGA was excluded from TITAN's Mass-340K pretraining corpus, it was used in the original paper's downstream evaluation; the present cohort is therefore neither a pretraining cohort nor an independent validation cohort. Predictability does not establish biological causality, and image-derived estimates cannot justify omitting a molecular assay. The three-model UCEC subset is locked only for future independent evaluation. Until that untouched analysis reports every target, the work should be evaluated as a computational pathology benchmark and research-software resource rather than a translational prediction study.</w:t>
       </w:r>
     </w:p>
     <w:p>

</xml_diff>

<commit_message>
Correct binary PLS-ridge decision-rule comparison
</commit_message>
<xml_diff>
--- a/manuscript/manuscript_JTM_patient_level_TITAN.docx
+++ b/manuscript/manuscript_JTM_patient_level_TITAN.docx
@@ -351,7 +351,7 @@
         <w:t xml:space="preserve">Results. </w:t>
       </w:r>
       <w:r>
-        <w:t>Within-cancer screening identified 219 continuous and 104 binary higher- or moderate-effect candidates. Highlighted repeated-CV results included BRCA–Proliferation (Q² 0.515, 95% bootstrap interval 0.467–0.560; RMSE 0.441, Spearman 0.740) and COAD–APC (sensitivity 0.883, specificity 0.705, balanced accuracy 0.794, 95% bootstrap interval 0.756–0.830; AUROC 0.848). The literature audit found prior statistical support for 38/41 screen-positive cancer–gene pairs. Under the multiplicity sensitivity, 219 continuous and 39 cancer–mutation pairs passed the stricter across-cancer correction; its attainable q-values in large families were limited by the 0.001 empirical-p resolution. Tissue-source-site grouping reduced 83/323 candidates (25.7%) below the original effect threshold. Within-cancer TITAN representations predicted tissue-source site in 27/32 cancers, with median multiclass macro balanced accuracy 0.628. In a selection-conditioned 24-model benchmark, median ridge-minus-PLS differences were 0.007 balanced accuracy and 0.014 Q², showing no uniform PLS advantage.</w:t>
+        <w:t>Within-cancer screening identified 219 continuous and 104 binary higher- or moderate-effect candidates. Highlighted repeated-CV results included BRCA–Proliferation (Q² 0.515, 95% bootstrap interval 0.467–0.560; RMSE 0.441, Spearman 0.740) and COAD–APC (sensitivity 0.883, specificity 0.705, balanced accuracy 0.794, 95% bootstrap interval 0.756–0.830; AUROC 0.848). The literature audit found prior statistical support for 38/41 screen-positive cancer–gene pairs. Under the multiplicity sensitivity, 219 continuous and 39 cancer–mutation pairs passed the stricter across-cancer correction; its attainable q-values in large families were limited by the 0.001 empirical-p resolution. Tissue-source-site grouping reduced 83/323 candidates (25.7%) below the original effect threshold. Within-cancer TITAN representations predicted tissue-source site in 27/32 cancers, with median multiclass macro balanced accuracy 0.628. In a selection-conditioned 24-model benchmark, median ridge-minus-PLS differences were 0.004 AUROC for binary models and 0.014 Q² for continuous models; the median binary balanced-accuracy difference under identical inner-CV threshold selection was 0.005.</w:t>
       </w:r>
     </w:p>
     <w:p>
@@ -1624,12 +1624,12 @@
     </w:p>
     <w:p>
       <w:r>
-        <w:t>As a secondary algorithmic benchmark, the 24 manuscript-highlighted models were refitted on the same five repeated outer partitions using ridge-penalised Gaussian regression for continuous endpoints and ridge logistic regression for binary endpoints. Ridge hyperparameters were selected inside each outer training set; binary operating thresholds maximised balanced accuracy using inner out-of-fold probabilities. The primary paired differences were ridge-minus-PLS Q² and balanced accuracy, with AUROC or Spearman correlation retained as secondary metrics. We report the magnitude, interquartile range and 95% paired-repeat interval rather than declaring a winner from counts alone. Because models were selected for this benchmark after the PLS screen, it is a conditional sensitivity analysis and cannot establish screen-wide algorithmic superiority. Ridge was chosen as a simple linear baseline whose fitted coefficients can be exported without retaining training embeddings; nonlinear kernel predictors that require training observations or landmarks at inference did not satisfy that portability constraint.</w:t>
+        <w:t>As a secondary algorithmic benchmark, the 24 manuscript-highlighted models were refitted on the same five repeated outer partitions using ridge-penalised Gaussian regression for continuous endpoints and ridge logistic regression for binary endpoints. For every binary outer fold, PLS–LDA and ridge used the identical outer split and identical inner splits. PLS component count and ridge penalty were selected entirely within the outer training set. Crucially, each method's operating threshold was then selected by the same rule: maximise balanced accuracy on that method's inner out-of-fold continuous scores, without access to the outer test fold. Threshold-independent AUROC was the primary binary algorithm-comparison metric, and balanced accuracy from these symmetrically selected thresholds was secondary. Continuous comparisons retained Q² as primary and Spearman correlation as secondary. We report magnitude, interquartile range and 95% paired-repeat intervals rather than winner counts alone. Because endpoints entered this benchmark after the PLS screen, it is a conditional sensitivity analysis and cannot establish screen-wide algorithmic superiority. Ridge was chosen as a simple linear baseline whose fitted coefficients can be exported without retaining training embeddings; nonlinear kernel predictors requiring training observations or landmarks at inference did not satisfy that portability constraint.</w:t>
       </w:r>
     </w:p>
     <w:p>
       <w:r>
-        <w:t>No class under-sampling, over-sampling or synthetic augmentation was used. LDA used the observed training-fold class priors and returned a class plus an uncalibrated discriminant score, not a probability or clinical-risk threshold. Outcome tables were constructed independently of TITAN feature processing and joined only after patient-level aggregation.</w:t>
+        <w:t>No class under-sampling, over-sampling or synthetic augmentation was used. The prespecified atlas—not the secondary method benchmark—retained the fitted LDA class rule with observed training-fold class priors and returned a class plus an uncalibrated discriminant score, not a probability or clinical-risk threshold. The symmetric benchmark applied its nested threshold rule to both PLS–LDA and ridge and did not replace the primary atlas predictions or fitted models. Outcome tables were constructed independently of TITAN feature processing and joined only after patient-level aggregation.</w:t>
       </w:r>
     </w:p>
     <w:p>
@@ -3957,7 +3957,7 @@
     </w:p>
     <w:p>
       <w:r>
-        <w:t>Among the 12 highlighted binary models, the median ridge-minus-PLS balanced-accuracy difference was 0.007 (IQR -0.004 to 0.014); ridge had a paired-repeat interval above zero for 2 models, PLS for 1, and 9 differences were uncertain. For the 12 continuous models, the median ridge-minus-PLS Q² difference was 0.014 (IQR 0.007 to 0.017); ridge was favoured for 7, PLS for 2, and 3 were uncertain. Thus PLS was competitive but not uniformly superior to a simpler exportable linear model. Because the benchmark was restricted to PLS-highlighted results, the prespecified PLS workflow was retained and the comparison is reported as selection-conditioned sensitivity evidence rather than a basis for post-screen method switching.</w:t>
+        <w:t>Among the 12 highlighted binary models, the median ridge-minus-PLS AUROC difference was 0.004 (IQR -0.001 to 0.010); ridge had a paired-repeat interval above zero for 1 model, PLS for 0, and 11 AUROC differences were uncertain. With the same inner-CV balanced-accuracy threshold rule applied to both methods, the median ridge-minus-PLS balanced-accuracy difference was 0.005 (IQR 0.001 to 0.012); ridge had a paired interval above zero for 1 model, PLS for 0, and 11 were uncertain. For the 12 continuous models, the median ridge-minus-PLS Q² difference was 0.014 (IQR 0.007 to 0.017); ridge was favoured for 7, PLS for 2, and 3 were uncertain. The symmetric binary results do not support a general advantage for either algorithm; only THYM–GTF2I favoured ridge by the AUROC interval, whereas READ–APC favoured ridge by the thresholded balanced-accuracy interval. Because the benchmark was restricted to PLS-highlighted results, the prespecified atlas was retained and the comparison is reported as selection-conditioned sensitivity evidence rather than a basis for post-screen method switching.</w:t>
       </w:r>
     </w:p>
     <w:p>
@@ -4575,7 +4575,7 @@
     </w:p>
     <w:p>
       <w:r>
-        <w:t>The ridge benchmark prevents interpreting that design choice as proof of PLS superiority. Median ridge-minus-PLS differences were small (0.007 balanced accuracy for binary and 0.014 Q² for continuous models), although paired intervals favoured ridge for two binary and seven continuous highlighted endpoints and favoured PLS for one binary and two continuous endpoints. The remaining 12 comparisons were uncertain. Both approaches yield compact exportable parameters, so portability is not unique to PLS. PLS remains the prespecified primary method because the benchmark was performed only on PLS-highlighted models and switching methods after that selection would add another optimistic selection layer. Future external validation can compare locked PLS and ridge candidates prospectively.</w:t>
+        <w:t>The ridge benchmark prevents interpreting that design choice as proof of PLS superiority. The corrected binary comparison removed the previous decision-rule asymmetry: both methods used identical outer and inner folds and selected operating thresholds from inner out-of-fold scores using the same balanced-accuracy criterion. Threshold-independent AUROC was primary for this method comparison. The median ridge-minus-PLS AUROC difference was 0.004, with one endpoint favouring ridge and 11 uncertain; the median balanced-accuracy difference under symmetric thresholding was 0.005, again with one favouring ridge and 11 uncertain. The continuous median Q² difference was 0.014. Both approaches yield compact exportable parameters, so portability is not unique to PLS. PLS remains the prespecified atlas method because the benchmark was performed only on PLS-highlighted models and switching methods after that selection would add another optimistic selection layer. Future external validation can compare locked PLS and ridge candidates prospectively.</w:t>
       </w:r>
     </w:p>
     <w:p>

</xml_diff>

<commit_message>
Address permutation resolution and atlas-wide multiplicity
</commit_message>
<xml_diff>
--- a/manuscript/manuscript_JTM_patient_level_TITAN.docx
+++ b/manuscript/manuscript_JTM_patient_level_TITAN.docx
@@ -340,7 +340,7 @@
         <w:t xml:space="preserve">Methods. </w:t>
       </w:r>
       <w:r>
-        <w:t>We mean-pooled 11,449 primary diagnostic slide embeddings into 9,404 patient vectors across 32 TCGA cancers; 843 patients contributed multiple slides. We tested 1,614 continuous and 459 binary cancer–endpoint pairs. PLS1 regression was used for continuous targets; binary targets used PLS latent scores with LDA. Patient-level nested 5×5 cross-validation selected 1–10 components. Effect-eligible models underwent a 999-permutation refinement with conservative sequential stopping, Benjamini–Hochberg control within cancer and endpoint family, and a stricter across-cancer family correction.</w:t>
+        <w:t>We mean-pooled 11,449 primary diagnostic slide embeddings into 9,404 patient vectors across 32 TCGA cancers; 843 patients contributed multiple slides. We tested 1,614 continuous and 459 binary cancer–endpoint pairs using patient-level nested PLS1 or PLS–LDA. Effect-eligible models underwent 999 complete-process permutations with conservative stopping, exact Monte Carlo intervals and Benjamini–Hochberg corrections locally, across cancers and atlas-wide. Eight prespecified leading models were extended to 9,999 permutations.</w:t>
       </w:r>
     </w:p>
     <w:p>
@@ -351,7 +351,7 @@
         <w:t xml:space="preserve">Results. </w:t>
       </w:r>
       <w:r>
-        <w:t>Within-cancer screening identified 219 continuous and 104 binary higher- or moderate-effect candidates. Highlighted repeated-CV results included BRCA–Proliferation (Q² 0.515, 95% bootstrap interval 0.467–0.560; RMSE 0.441, Spearman 0.740) and COAD–APC (sensitivity 0.883, specificity 0.705, balanced accuracy 0.794, 95% bootstrap interval 0.756–0.830; AUROC 0.848). The literature audit found prior statistical support for 38/41 screen-positive cancer–gene pairs. Under the multiplicity sensitivity, 219 continuous and 39 cancer–mutation pairs passed the stricter across-cancer correction; its attainable q-values in large families were limited by the 0.001 empirical-p resolution. Tissue-source-site grouping reduced 83/323 candidates (25.7%) below the original effect threshold. Within-cancer TITAN representations predicted tissue-source site in 27/32 cancers, with median multiclass macro balanced accuracy 0.628. In a selection-conditioned 24-model benchmark, median ridge-minus-PLS differences were 0.004 AUROC for binary models and 0.014 Q² for continuous models; the median binary balanced-accuracy difference under identical inner-CV threshold selection was 0.005.</w:t>
+        <w:t>Within-cancer screening identified 219 continuous and 104 binary higher- or moderate-effect candidates. Highlighted repeated-CV results included TGCT–TGF-beta Response (Q² 0.670, 95% bootstrap interval 0.573–0.741; RMSE 0.303, Spearman 0.791) and COAD–APC (sensitivity 0.883, specificity 0.705, balanced accuracy 0.794, 95% bootstrap interval 0.756–0.830; AUROC 0.848). Prior studies supported 38/41 screen-positive cancer–gene pairs. 320/323 local candidates passed single BH correction across all 2,073 eligible tests. For zero exceedances among 999 permutations, the 95% Monte Carlo interval was 0–0.003686; targeted 9,999-permutation p-values were all 0.0001. Tissue-source-site grouping reduced 83/323 candidates (25.7%) below the original effect threshold. In a selection-conditioned benchmark, median ridge-minus-PLS differences were 0.004 AUROC and 0.014 Q².</w:t>
       </w:r>
     </w:p>
     <w:p>
@@ -1634,7 +1634,12 @@
     </w:p>
     <w:p>
       <w:r>
-        <w:t>Nested performance was first checkpointed for the complete screen. Only models with Q²≥0.20 or chance-corrected balanced accuracy≥0.20 entered permutation testing. A 99-permutation checkpoint was followed by refinement toward 999 patient-label permutations. During final refinement, evaluation stopped conservatively after 49 exceedances because raw p&lt;0.05 was then impossible even if every remaining null statistic were less extreme; stopped endpoints were assigned p=1. Early-stopped checkpoint jobs resumed from the exact number attempted, so no permutation indices were skipped. Regression extremeness used lower RMSE, whereas classification used higher balanced accuracy. Completed finite p values were (b+1)/(B+1), giving minimum resolution 0.001. Because each disease defines a separate prediction and intended-use population, Benjamini–Hochberg FDR was controlled separately for continuous and binary screens within cancer and prespecified endpoint family [27]; a q-value across cancers within the same outcome type and family was retained as a stricter multiplicity sensitivity. Effect denotes Q² for continuous outcomes and 2×balanced accuracy−1 for binary outcomes. Screen-positive candidates were described as higher effect (primary q&lt;0.05 and effect≥0.40) or moderate effect (primary q&lt;0.05 and effect 0.20–0.39). Screen-negative tested pairs and pairs ineligible by sample-size rules were reported separately. These categories prioritise candidates for further testing and are not clinical grades.</w:t>
+        <w:t>Nested performance was first checkpointed for the complete screen. Only models with Q²≥0.20 or chance-corrected balanced accuracy≥0.20 entered permutation testing. For every permutation, patient labels were reassigned and the complete modelling process was repeated: training-fold centering, five-fold inner selection of 1–10 components, outer-fold refitting and held-out prediction. Thus neither scaling parameters, component counts nor outer predictions were reused from the observed-label fit. A 99-permutation checkpoint was followed by refinement toward 999 permutations. During final refinement, evaluation stopped conservatively after 49 exceedances because raw p&lt;0.05 was then impossible even if every remaining null statistic were less extreme; stopped endpoints were assigned p=1. Early-stopped jobs resumed from the exact number attempted, so no permutation indices were skipped. Regression extremeness used lower RMSE, whereas classification used higher balanced accuracy. Completed finite p values were (b+1)/(B+1), giving minimum resolution 0.001. Exact two-sided 95% Clopper–Pearson intervals for the underlying null exceedance probability quantify Monte Carlo uncertainty; with zero exceedances among 999 permutations this interval is 0–0.003686.</w:t>
+      </w:r>
+    </w:p>
+    <w:p>
+      <w:r>
+        <w:t>Because each disease defines a separate prediction and intended-use population, Benjamini–Hochberg FDR was controlled separately for continuous and binary screens within cancer and prespecified endpoint family [27]. Two stricter sensitivities were retained: BH across cancers within the same outcome type and family, and a single BH correction across all eligible continuous and binary cancer–endpoint tests in the atlas. Eight models were locked before high-resolution results were generated: four leading continuous immune programmes and four leading binary claims spanning mutation, strict MSI and fusion endpoints. Their saved first 999 permutations were extended without early stopping to 9,999 complete-process permutations. This targeted analysis improves Monte Carlo resolution for leading claims but was not substituted into the prespecified 999-permutation FDR screen. Effect denotes Q² for continuous outcomes and 2×balanced accuracy−1 for binary outcomes. Screen-positive candidates were described as higher effect (primary q&lt;0.05 and effect≥0.40) or moderate effect (primary q&lt;0.05 and effect 0.20–0.39). Screen-negative tested pairs and pairs ineligible by sample-size rules were reported separately. Models are ordered by effect magnitude, with repeated and site-grouped stability reported alongside; tied permutation q-values are not used for ranking. These categories prioritise candidates for further testing and are not clinical grades.</w:t>
       </w:r>
     </w:p>
     <w:p>
@@ -2974,6 +2979,24 @@
     <w:p>
       <w:r>
         <w:t>Of 104 within-cancer screen-positive binary pairs, 102 also met the stricter across-cancer family q&lt;0.05, including 39 cancer–gene mutation pairs. Mutation pairs passing this stricter sensitivity are distinguished from those supported only within cancer; the 0.001 permutation resolution remains relevant for the full mutation family.</w:t>
+      </w:r>
+    </w:p>
+    <w:p>
+      <w:pPr>
+        <w:pStyle w:val="Heading2"/>
+      </w:pPr>
+      <w:r>
+        <w:t>Permutation resolution and atlas-wide multiplicity sensitivity</w:t>
+      </w:r>
+    </w:p>
+    <w:p>
+      <w:r>
+        <w:t>The primary within-cancer/family procedure identified 323 candidates. Of these, 321 passed BH within outcome type and endpoint family across cancers, 321 passed BH across all eligible tests within their outcome type, and 320 passed one BH correction across all 2,073 eligible continuous and binary atlas tests. The three local candidates not retaining atlas-wide q&lt;0.05 were READ genome doubling, OV–TP53 mutation and SKCM–BRAF mutation. The candidate count should therefore be read as a collection of locally controlled cancer-specific questions, with the atlas-wide result as a stricter sensitivity—not as if the primary procedure were one global 5% FDR analysis.</w:t>
+      </w:r>
+    </w:p>
+    <w:p>
+      <w:r>
+        <w:t>Among completed 999-permutation tests, 308 had zero null statistics at least as extreme as observed. Their finite empirical p-value was 0.001, but the exact two-sided 95% Monte Carlo interval for the underlying exceedance probability was 0–0.003686. The prespecified high-resolution subset extended 8 leading models to 9,999 full nested permutations; 8 had zero exceedances and refined p-values were all 0.0001. The refined values are a targeted precision sensitivity and were not inserted into the primary FDR calculations. Because many primary p- and q-values remain tied at their attainable minimum, figures and tables are ordered by predictive effect magnitude, with repeated and site-grouped stability reported alongside; q-values are not used for ranking.</w:t>
       </w:r>
     </w:p>
     <w:p>
@@ -4530,7 +4553,7 @@
     </w:p>
     <w:p>
       <w:r>
-        <w:t>This study is best interpreted as a systematic patient-level benchmark and reusable fitted-model resource, not as the first pan-cancer molecular-prediction study or a catalogue of unprecedented mutation targets. It answers a target-by-target, cancer-specific question using one fixed pretrained TITAN representation. Selected immune programmes, mutations and higher-level genomic phenotypes were predictable, but most eligible pairs did not satisfy both multiplicity and effect thresholds. That heterogeneity—and transparent negative and ineligible reporting—is the primary empirical result. Under the stricter across-cancer family correction, 219 continuous and 39 mutation pairs passed; the remaining within-cancer candidates should not be interpreted as pan-cancer biomarkers. Conversely, global non-passage cannot be interpreted as evidence of no signal because the 0.001 empirical-p resolution restricts attainable q-values in large families.</w:t>
+        <w:t>This study is best interpreted as a systematic patient-level benchmark and reusable fitted-model resource, not as the first pan-cancer molecular-prediction study or a catalogue of unprecedented mutation targets. It answers a target-by-target, cancer-specific question using one fixed pretrained TITAN representation. Selected immune programmes, mutations and higher-level genomic phenotypes were predictable, but most eligible pairs did not satisfy both multiplicity and effect thresholds. That heterogeneity—and transparent negative and ineligible reporting—is the primary empirical result. The primary analysis controls local cancer-specific families; it does not attach one global 5% FDR interpretation to the aggregate 323 candidates. In sensitivity analyses, 219 continuous and 39 mutation pairs passed the across-cancer family correction, and 320/323 local candidates passed a single BH correction across all eligible atlas tests. These large counts partly reflect extensive ties at the 0.001 empirical-p floor: a zero-exceedance 999-permutation result still has a 95% Monte Carlo interval extending to 0.003686. The 9,999-permutation refinement sharpened precision for eight leading claims but does not resolve the entire atlas or justify ranking by q-value; predictive magnitude and stability remain the appropriate ordering criteria.</w:t>
       </w:r>
     </w:p>
     <w:p>

</xml_diff>

<commit_message>
Strengthen binary class-size reliability
</commit_message>
<xml_diff>
--- a/manuscript/manuscript_JTM_patient_level_TITAN.docx
+++ b/manuscript/manuscript_JTM_patient_level_TITAN.docx
@@ -351,7 +351,7 @@
         <w:t xml:space="preserve">Results. </w:t>
       </w:r>
       <w:r>
-        <w:t>Within-cancer screening identified 219 continuous and 104 binary higher- or moderate-effect candidates. Highlighted repeated-CV results included TGCT–TGF-beta Response (Q² 0.670, 95% bootstrap interval 0.573–0.741; RMSE 0.303, Spearman 0.791) and COAD–APC (sensitivity 0.883, specificity 0.705, balanced accuracy 0.794, 95% bootstrap interval 0.756–0.830; AUROC 0.848). Prior studies supported 38/41 screen-positive cancer–gene pairs. 320/323 local candidates passed single BH correction across all 2,073 eligible tests. For zero exceedances among 999 permutations, the 95% Monte Carlo interval was 0–0.003686; targeted 9,999-permutation p-values were all 0.0001. Tissue-source-site grouping reduced 83/323 candidates (25.7%) below the original effect threshold. In a selection-conditioned benchmark, median ridge-minus-PLS differences were 0.004 AUROC and 0.014 Q².</w:t>
+        <w:t>Within-cancer screening identified 219 continuous and 104 binary higher- or moderate-effect candidates. A stricter ≥50-per-class sensitivity retained 87/104 binary candidates; 17 smaller-class models were separated as exploratory and excluded from default inference. Highlighted repeated-CV results included TGCT–TGF-beta Response (Q² 0.670, 95% bootstrap interval 0.573–0.741; RMSE 0.303, Spearman 0.791) and COAD–APC (sensitivity 0.883, specificity 0.705, balanced accuracy 0.794, 95% bootstrap interval 0.756–0.830; AUROC 0.848). Prior studies supported 38/41 screen-positive cancer–gene pairs. 320/323 local candidates passed single BH correction across all 2,073 eligible tests. For zero exceedances among 999 permutations, the 95% Monte Carlo interval was 0–0.003686; targeted 9,999-permutation p-values were all 0.0001. Tissue-source-site grouping reduced 83/323 candidates (25.7%) below the original effect threshold. In a selection-conditioned benchmark, median ridge-minus-PLS differences were 0.004 AUROC and 0.014 Q².</w:t>
       </w:r>
     </w:p>
     <w:p>
@@ -1601,7 +1601,7 @@
     </w:p>
     <w:p>
       <w:r>
-        <w:t>Continuous pairs required at least 50 non-missing patients. Binary pairs required at least 20 positive and 20 negative patients. Eligibility was decided before modelling and every eligible test remained in its endpoint-family multiplicity denominator.</w:t>
+        <w:t>Continuous pairs required at least 50 non-missing patients. Binary screening eligibility required at least 20 positive and 20 negative patients. Eligibility was decided before modelling and every eligible test remained in its endpoint-family multiplicity denominator. Because this lower binary limit can produce sparse nested folds, we additionally repeated the eligibility and candidate-retention summary at 50 patients per class. Screen-positive models below that stricter threshold were retained in the complete atlas as exploratory/limited evidence, but were separated from standard-evidence models and excluded from the default inference interface.</w:t>
       </w:r>
     </w:p>
     <w:p>
@@ -1614,12 +1614,12 @@
     </w:p>
     <w:p>
       <w:r>
-        <w:t>For each cancer–endpoint pair, five outer folds estimated performance and five inner folds selected 1–10 PLS components. Scaling and component selection were learned from training patients only. All primary, permutation, repeated, sensitivity, PLS1–PLS2 and final-model fits used CPU rSVD with 10 oversampling vectors, two power iterations and explicit seeds. Continuous performance was out-of-fold Q², with RMSE and Spearman correlation secondary. Binary models supplied PLS latent scores to ridge-stabilised LDA; balanced accuracy was primary and AUROC from continuous LDA scores was secondary in repeated validation.</w:t>
+        <w:t>For each cancer–endpoint pair, five outer folds estimated performance and five inner folds selected 1–10 PLS components. Scaling and component selection were learned from training patients only. All primary, permutation, repeated, sensitivity, PLS1–PLS2 and final-model fits used CPU rSVD with 10 oversampling vectors, two power iterations and explicit seeds. Continuous performance was out-of-fold Q², with RMSE and Spearman correlation secondary. Binary models supplied PLS latent scores to ridge-stabilised LDA; balanced accuracy was primary, with AUROC and precision–recall area under the curve (PR-AUC) calculated from continuous LDA scores in repeated validation.</w:t>
       </w:r>
     </w:p>
     <w:p>
       <w:r>
-        <w:t>Q² was 1−Σ(y−ŷ)²/Σ(y−ȳ)² over outer-fold predictions, and RMSE was the square root of the mean squared prediction error. For binary outcomes, class 1 denoted altered or positive and class 0 denoted wild type or negative within the outcome-specific covered denominator. Sensitivity was the class-1 true-positive rate, specificity the class-0 true-negative rate, and balanced accuracy their arithmetic mean. AUROC used the continuous class-1-minus-class-0 LDA discriminant score; Spearman correlation used observed and held-out continuous predictions.</w:t>
+        <w:t>Q² was 1−Σ(y−ŷ)²/Σ(y−ȳ)² over outer-fold predictions, and RMSE was the square root of the mean squared prediction error. For binary outcomes, class 1 denoted altered or positive and class 0 denoted wild type or negative within the outcome-specific covered denominator. Sensitivity was the class-1 true-positive rate, specificity the class-0 true-negative rate, and balanced accuracy their arithmetic mean. AUROC used the continuous class-1-minus-class-0 LDA discriminant score. PR-AUC was non-interpolated average precision, so its no-skill reference equals outcome prevalence. Positive and negative predictive values (PPV and NPV) were calculated from held-out class calls at the observed outcome prevalence in the analysed TCGA cohort; they are cohort-specific descriptive estimates, not calibrated probabilities or transportable operating characteristics. Spearman correlation used observed and held-out continuous predictions.</w:t>
       </w:r>
     </w:p>
     <w:p>
@@ -1657,12 +1657,17 @@
     </w:p>
     <w:p>
       <w:r>
+        <w:t>For every screen-positive binary model, we recorded positive and negative counts in all 25 repeated outer test folds and reconstructed the exact five-fold inner component-selection partitions within every outer training set. We summarized the selected-component distribution across the resulting 25 fits. Repeat stability was quantified using pairwise Spearman correlations of patient-level standardized held-out scores and agreement of held-out class calls across repeats. For the limited-evidence subset, learning curves retained each repeat's original outer test fold while fitting on stratified 50%, 75% and 100% subsets of the outer training data; the five repeats were analysed separately. This design isolates training-size sensitivity without moving patients between training and evaluation. These analyses do not convert sparse internal validation into external evidence.</w:t>
+      </w:r>
+    </w:p>
+    <w:p>
+      <w:r>
         <w:t>To quantify whether TITAN itself retained submitting-site information, we treated tissue-source site as a multiclass outcome within each cancer. This dedicated confounding analysis retained sites with at least 10 patients, required at least two eligible sites per cancer, and used five independently seeded nested five-fold PLS–LDA validations with the same component range and rSVD controls. The primary metric was multiclass macro balanced accuracy (mean per-site recall); chance was 1/k for k analysed sites, and a chance-normalised value, (balanced accuracy − 1/k)/(1 − 1/k), was calculated for cross-cancer description. Patients from rare sites excluded from this site-classification analysis remained in all eligible molecular-endpoint analyses. This analysis tests whether the representation encodes TCGA submitting-site signatures; it does not identify their scanner, laboratory, staining or population causes.</w:t>
       </w:r>
     </w:p>
     <w:p>
       <w:r>
-        <w:t>TITANPred retains the binary LDA score but does not convert it to a probability. In the research-software demonstration, its position is labelled 'TCGA out-of-fold score rank (not probability)' rather than percentile or risk, and is displayed beside total training n, positive and negative counts, prevalence, repeated-CV balanced accuracy and AUROC. Models with fewer than 50 patients in either class receive an explicit limited-class-size warning; this reporting flag does not change the prespecified 20-per-class eligibility rule. Probability calibration was not added post hoc because it would require an independently evaluated or fully nested calibration procedure, which is not available in this TCGA benchmark.</w:t>
+        <w:t>TITANPred retains the binary LDA score but does not convert it to a probability. In the research-software demonstration, its position is labelled 'TCGA out-of-fold score rank (not probability)' rather than percentile or risk. Binary output displays total training n, class counts and prevalence; balanced accuracy, AUROC and PR-AUC; TCGA-prevalence PPV and NPV; fold minima, component-selection variability and repeat stability; and site sensitivity. The 17 screen-positive models with fewer than 50 patients in either class are marked exploratory/limited evidence, omitted from default inference and available only through explicit opt-in with a warning. Probability calibration was not added post hoc because it would require an independently evaluated or fully nested calibration procedure, which is not available in this TCGA benchmark.</w:t>
       </w:r>
     </w:p>
     <w:p>
@@ -1708,7 +1713,7 @@
     </w:p>
     <w:p>
       <w:r>
-        <w:t>Supplementary methods, Tables S1–S12, Figures S1–S2 and the machine-readable-file inventory are provided in Additional file 1. The two illustrative single-sample TITANPred reports are supplied separately as Additional files 2 and 3.</w:t>
+        <w:t>Supplementary methods, Tables S1–S12, Figures S1–S3 and the machine-readable-file inventory are provided in Additional file 1. The two illustrative single-sample TITANPred reports are supplied separately as Additional files 2 and 3.</w:t>
       </w:r>
     </w:p>
     <w:p>
@@ -2986,6 +2991,29 @@
         <w:pStyle w:val="Heading2"/>
       </w:pPr>
       <w:r>
+        <w:t>Binary class-size sensitivity and development stability</w:t>
+      </w:r>
+    </w:p>
+    <w:p>
+      <w:r>
+        <w:t>Of 459 binary pairs eligible at 20 patients per class, 244 (53.2%) also met a 50-per-class rule. Among the 104 screen-positive models, 87 (83.7%) met that stricter standard. The other 17 were designated exploratory/limited evidence; none of the highlighted binary models was in this group. The complete atlas retains these results for transparency, whereas default TITANPred inference now includes 87 binary and 219 continuous models and omits the limited subset unless explicitly requested.</w:t>
+      </w:r>
+    </w:p>
+    <w:p>
+      <w:r>
+        <w:t>Across all 104 screen-positive binary models, the smallest repeated outer test fold contained 4 positive and 6 negative patients. Within the limited subset, exact reconstructed inner folds contained as few as 12 positive and 19 negative training patients and 3 positive and 4 negative validation patients. Selected components were therefore reported for every one of the 25 repeated outer fits: 7/17 limited models selected one component in at least one fit, 14/17 reached the ten-component ceiling, and 5 spanned both extremes.</w:t>
+      </w:r>
+    </w:p>
+    <w:p>
+      <w:r>
+        <w:t>For the 17 limited models, median learning-curve balanced accuracy was 0.603, 0.640 and 0.636 at 50%, 75% and 100% of the outer-training data; median AUROC was 0.679, 0.730 and 0.738, and median PR-AUC was 0.304, 0.381 and 0.389. Median repeat score correlation was 0.674 in the limited subset versus 0.795 in the ≥50-per-class subset. Class-call agreement was also reported, but can appear high under marked imbalance and is not interpreted alone. Endpoint-level PR-AUC, TCGA-prevalence PPV/NPV, fold counts, component distributions, learning curves and stability are provided in Supplementary Table S10g and Figure S3.</w:t>
+      </w:r>
+    </w:p>
+    <w:p>
+      <w:pPr>
+        <w:pStyle w:val="Heading2"/>
+      </w:pPr>
+      <w:r>
         <w:t>Permutation resolution and atlas-wide multiplicity sensitivity</w:t>
       </w:r>
     </w:p>
@@ -3044,7 +3072,7 @@
         <w:jc w:val="center"/>
       </w:pPr>
       <w:r>
-        <w:t>Figure 3. Strongest within-cancer screen-positive binary molecular predictions using PLS latent scores and LDA. Point size represents the number of positive patients; colour indicates endpoint family and symbols report across-cancer correction status.</w:t>
+        <w:t>Figure 3. Strongest within-cancer screen-positive binary molecular predictions among the 87 models with at least 50 positive and 50 negative patients. Point size represents the number of positive patients; colour indicates endpoint family and symbols report across-cancer correction status. The 17 exploratory/limited-evidence models are excluded from this main panel and shown separately in Supplementary Figure S3.</w:t>
       </w:r>
     </w:p>
     <w:p>
@@ -3100,7 +3128,15 @@
         <w:pStyle w:val="Caption"/>
       </w:pPr>
       <w:r>
-        <w:t>Table 3. Highlighted repeated nested-cross-validation performance with 95% patient-cluster bootstrap intervals and tissue-source-site-grouped internal sensitivity. Site-grouped values are internal TCGA estimates, not external-validation results.</w:t>
+        <w:t>Table 3. Highlighted repeated nested-cross-validation performance, binary reliability and tissue-source-site-grouped internal sensitivity. Panel A reports discrimination/error metrics with 95% patient-cluster bootstrap intervals and grouped sensitivity. Panel B adds class-size and prevalence-dependent binary metrics. Site-grouped and predictive-value estimates are internal to TCGA, not external-validation results.</w:t>
+      </w:r>
+    </w:p>
+    <w:p>
+      <w:pPr>
+        <w:pStyle w:val="Caption"/>
+      </w:pPr>
+      <w:r>
+        <w:t>Panel A. Primary and secondary performance metrics.</w:t>
       </w:r>
     </w:p>
     <w:tbl>
@@ -3924,6 +3960,477 @@
     <w:p/>
     <w:p>
       <w:pPr>
+        <w:pStyle w:val="Caption"/>
+      </w:pPr>
+      <w:r>
+        <w:t>Panel B. Binary class-size and prevalence-dependent reliability metrics.</w:t>
+      </w:r>
+    </w:p>
+    <w:tbl>
+      <w:tblPr>
+        <w:tblStyle w:val="TableGrid"/>
+        <w:tblW w:type="auto" w:w="0"/>
+        <w:jc w:val="center"/>
+        <w:tblLook w:firstColumn="1" w:firstRow="1" w:lastColumn="0" w:lastRow="0" w:noHBand="0" w:noVBand="1" w:val="04A0"/>
+      </w:tblPr>
+      <w:tblGrid>
+        <w:gridCol w:w="1569"/>
+        <w:gridCol w:w="1569"/>
+        <w:gridCol w:w="1569"/>
+        <w:gridCol w:w="1569"/>
+        <w:gridCol w:w="1569"/>
+        <w:gridCol w:w="1569"/>
+      </w:tblGrid>
+      <w:tr>
+        <w:trPr>
+          <w:tblHeader w:val="true"/>
+          <w:cantSplit/>
+        </w:trPr>
+        <w:tc>
+          <w:tcPr>
+            <w:tcW w:type="dxa" w:w="2098"/>
+          </w:tcPr>
+          <w:p>
+            <w:r>
+              <w:rPr>
+                <w:b/>
+                <w:sz w:val="17"/>
+              </w:rPr>
+              <w:t>Cancer–endpoint</w:t>
+            </w:r>
+          </w:p>
+        </w:tc>
+        <w:tc>
+          <w:tcPr>
+            <w:tcW w:type="dxa" w:w="850"/>
+          </w:tcPr>
+          <w:p>
+            <w:r>
+              <w:rPr>
+                <w:b/>
+                <w:sz w:val="17"/>
+              </w:rPr>
+              <w:t>+/−</w:t>
+            </w:r>
+          </w:p>
+        </w:tc>
+        <w:tc>
+          <w:tcPr>
+            <w:tcW w:type="dxa" w:w="1701"/>
+          </w:tcPr>
+          <w:p>
+            <w:r>
+              <w:rPr>
+                <w:b/>
+                <w:sz w:val="17"/>
+              </w:rPr>
+              <w:t>PR-AUC (95% CI)</w:t>
+            </w:r>
+          </w:p>
+        </w:tc>
+        <w:tc>
+          <w:tcPr>
+            <w:tcW w:type="dxa" w:w="1871"/>
+          </w:tcPr>
+          <w:p>
+            <w:r>
+              <w:rPr>
+                <w:b/>
+                <w:sz w:val="17"/>
+              </w:rPr>
+              <w:t>PPV at TCGA prevalence (95% CI)</w:t>
+            </w:r>
+          </w:p>
+        </w:tc>
+        <w:tc>
+          <w:tcPr>
+            <w:tcW w:type="dxa" w:w="1871"/>
+          </w:tcPr>
+          <w:p>
+            <w:r>
+              <w:rPr>
+                <w:b/>
+                <w:sz w:val="17"/>
+              </w:rPr>
+              <w:t>NPV at TCGA prevalence (95% CI)</w:t>
+            </w:r>
+          </w:p>
+        </w:tc>
+        <w:tc>
+          <w:tcPr>
+            <w:tcW w:type="dxa" w:w="1984"/>
+          </w:tcPr>
+          <w:p>
+            <w:r>
+              <w:rPr>
+                <w:b/>
+                <w:sz w:val="17"/>
+              </w:rPr>
+              <w:t>Evidence/default</w:t>
+            </w:r>
+          </w:p>
+        </w:tc>
+      </w:tr>
+      <w:tr>
+        <w:trPr>
+          <w:cantSplit/>
+        </w:trPr>
+        <w:tc>
+          <w:tcPr>
+            <w:tcW w:type="dxa" w:w="2098"/>
+            <w:vAlign w:val="center"/>
+          </w:tcPr>
+          <w:p>
+            <w:r>
+              <w:rPr>
+                <w:sz w:val="16"/>
+              </w:rPr>
+              <w:t>COAD–APC</w:t>
+            </w:r>
+          </w:p>
+        </w:tc>
+        <w:tc>
+          <w:tcPr>
+            <w:tcW w:type="dxa" w:w="850"/>
+            <w:vAlign w:val="center"/>
+          </w:tcPr>
+          <w:p>
+            <w:r>
+              <w:rPr>
+                <w:sz w:val="16"/>
+              </w:rPr>
+              <w:t>196/186</w:t>
+            </w:r>
+          </w:p>
+        </w:tc>
+        <w:tc>
+          <w:tcPr>
+            <w:tcW w:type="dxa" w:w="1701"/>
+            <w:vAlign w:val="center"/>
+          </w:tcPr>
+          <w:p>
+            <w:r>
+              <w:rPr>
+                <w:sz w:val="16"/>
+              </w:rPr>
+              <w:t>0.814 (0.754–0.875)</w:t>
+            </w:r>
+          </w:p>
+        </w:tc>
+        <w:tc>
+          <w:tcPr>
+            <w:tcW w:type="dxa" w:w="1871"/>
+            <w:vAlign w:val="center"/>
+          </w:tcPr>
+          <w:p>
+            <w:r>
+              <w:rPr>
+                <w:sz w:val="16"/>
+              </w:rPr>
+              <w:t>0.760 (0.702–0.817)</w:t>
+            </w:r>
+          </w:p>
+        </w:tc>
+        <w:tc>
+          <w:tcPr>
+            <w:tcW w:type="dxa" w:w="1871"/>
+            <w:vAlign w:val="center"/>
+          </w:tcPr>
+          <w:p>
+            <w:r>
+              <w:rPr>
+                <w:sz w:val="16"/>
+              </w:rPr>
+              <w:t>0.851 (0.797–0.899)</w:t>
+            </w:r>
+          </w:p>
+        </w:tc>
+        <w:tc>
+          <w:tcPr>
+            <w:tcW w:type="dxa" w:w="1984"/>
+            <w:vAlign w:val="center"/>
+          </w:tcPr>
+          <w:p>
+            <w:r>
+              <w:rPr>
+                <w:sz w:val="16"/>
+              </w:rPr>
+              <w:t>standard internal evidence; included</w:t>
+            </w:r>
+          </w:p>
+        </w:tc>
+      </w:tr>
+      <w:tr>
+        <w:trPr>
+          <w:cantSplit/>
+        </w:trPr>
+        <w:tc>
+          <w:tcPr>
+            <w:tcW w:type="dxa" w:w="2098"/>
+            <w:vAlign w:val="center"/>
+          </w:tcPr>
+          <w:p>
+            <w:r>
+              <w:rPr>
+                <w:sz w:val="16"/>
+              </w:rPr>
+              <w:t>COAD–TP53</w:t>
+            </w:r>
+          </w:p>
+        </w:tc>
+        <w:tc>
+          <w:tcPr>
+            <w:tcW w:type="dxa" w:w="850"/>
+            <w:vAlign w:val="center"/>
+          </w:tcPr>
+          <w:p>
+            <w:r>
+              <w:rPr>
+                <w:sz w:val="16"/>
+              </w:rPr>
+              <w:t>161/221</w:t>
+            </w:r>
+          </w:p>
+        </w:tc>
+        <w:tc>
+          <w:tcPr>
+            <w:tcW w:type="dxa" w:w="1701"/>
+            <w:vAlign w:val="center"/>
+          </w:tcPr>
+          <w:p>
+            <w:r>
+              <w:rPr>
+                <w:sz w:val="16"/>
+              </w:rPr>
+              <w:t>0.793 (0.730–0.855)</w:t>
+            </w:r>
+          </w:p>
+        </w:tc>
+        <w:tc>
+          <w:tcPr>
+            <w:tcW w:type="dxa" w:w="1871"/>
+            <w:vAlign w:val="center"/>
+          </w:tcPr>
+          <w:p>
+            <w:r>
+              <w:rPr>
+                <w:sz w:val="16"/>
+              </w:rPr>
+              <w:t>0.718 (0.658–0.783)</w:t>
+            </w:r>
+          </w:p>
+        </w:tc>
+        <w:tc>
+          <w:tcPr>
+            <w:tcW w:type="dxa" w:w="1871"/>
+            <w:vAlign w:val="center"/>
+          </w:tcPr>
+          <w:p>
+            <w:r>
+              <w:rPr>
+                <w:sz w:val="16"/>
+              </w:rPr>
+              <w:t>0.828 (0.778–0.872)</w:t>
+            </w:r>
+          </w:p>
+        </w:tc>
+        <w:tc>
+          <w:tcPr>
+            <w:tcW w:type="dxa" w:w="1984"/>
+            <w:vAlign w:val="center"/>
+          </w:tcPr>
+          <w:p>
+            <w:r>
+              <w:rPr>
+                <w:sz w:val="16"/>
+              </w:rPr>
+              <w:t>standard internal evidence; included</w:t>
+            </w:r>
+          </w:p>
+        </w:tc>
+      </w:tr>
+      <w:tr>
+        <w:trPr>
+          <w:cantSplit/>
+        </w:trPr>
+        <w:tc>
+          <w:tcPr>
+            <w:tcW w:type="dxa" w:w="2098"/>
+            <w:vAlign w:val="center"/>
+          </w:tcPr>
+          <w:p>
+            <w:r>
+              <w:rPr>
+                <w:sz w:val="16"/>
+              </w:rPr>
+              <w:t>LGG–IDH1</w:t>
+            </w:r>
+          </w:p>
+        </w:tc>
+        <w:tc>
+          <w:tcPr>
+            <w:tcW w:type="dxa" w:w="850"/>
+            <w:vAlign w:val="center"/>
+          </w:tcPr>
+          <w:p>
+            <w:r>
+              <w:rPr>
+                <w:sz w:val="16"/>
+              </w:rPr>
+              <w:t>375/110</w:t>
+            </w:r>
+          </w:p>
+        </w:tc>
+        <w:tc>
+          <w:tcPr>
+            <w:tcW w:type="dxa" w:w="1701"/>
+            <w:vAlign w:val="center"/>
+          </w:tcPr>
+          <w:p>
+            <w:r>
+              <w:rPr>
+                <w:sz w:val="16"/>
+              </w:rPr>
+              <w:t>0.933 (0.906–0.961)</w:t>
+            </w:r>
+          </w:p>
+        </w:tc>
+        <w:tc>
+          <w:tcPr>
+            <w:tcW w:type="dxa" w:w="1871"/>
+            <w:vAlign w:val="center"/>
+          </w:tcPr>
+          <w:p>
+            <w:r>
+              <w:rPr>
+                <w:sz w:val="16"/>
+              </w:rPr>
+              <w:t>0.895 (0.866–0.922)</w:t>
+            </w:r>
+          </w:p>
+        </w:tc>
+        <w:tc>
+          <w:tcPr>
+            <w:tcW w:type="dxa" w:w="1871"/>
+            <w:vAlign w:val="center"/>
+          </w:tcPr>
+          <w:p>
+            <w:r>
+              <w:rPr>
+                <w:sz w:val="16"/>
+              </w:rPr>
+              <w:t>0.753 (0.679–0.820)</w:t>
+            </w:r>
+          </w:p>
+        </w:tc>
+        <w:tc>
+          <w:tcPr>
+            <w:tcW w:type="dxa" w:w="1984"/>
+            <w:vAlign w:val="center"/>
+          </w:tcPr>
+          <w:p>
+            <w:r>
+              <w:rPr>
+                <w:sz w:val="16"/>
+              </w:rPr>
+              <w:t>standard internal evidence; included</w:t>
+            </w:r>
+          </w:p>
+        </w:tc>
+      </w:tr>
+      <w:tr>
+        <w:trPr>
+          <w:cantSplit/>
+        </w:trPr>
+        <w:tc>
+          <w:tcPr>
+            <w:tcW w:type="dxa" w:w="2098"/>
+            <w:vAlign w:val="center"/>
+          </w:tcPr>
+          <w:p>
+            <w:r>
+              <w:rPr>
+                <w:sz w:val="16"/>
+              </w:rPr>
+              <w:t>LGG–TP53</w:t>
+            </w:r>
+          </w:p>
+        </w:tc>
+        <w:tc>
+          <w:tcPr>
+            <w:tcW w:type="dxa" w:w="850"/>
+            <w:vAlign w:val="center"/>
+          </w:tcPr>
+          <w:p>
+            <w:r>
+              <w:rPr>
+                <w:sz w:val="16"/>
+              </w:rPr>
+              <w:t>232/253</w:t>
+            </w:r>
+          </w:p>
+        </w:tc>
+        <w:tc>
+          <w:tcPr>
+            <w:tcW w:type="dxa" w:w="1701"/>
+            <w:vAlign w:val="center"/>
+          </w:tcPr>
+          <w:p>
+            <w:r>
+              <w:rPr>
+                <w:sz w:val="16"/>
+              </w:rPr>
+              <w:t>0.880 (0.831–0.926)</w:t>
+            </w:r>
+          </w:p>
+        </w:tc>
+        <w:tc>
+          <w:tcPr>
+            <w:tcW w:type="dxa" w:w="1871"/>
+            <w:vAlign w:val="center"/>
+          </w:tcPr>
+          <w:p>
+            <w:r>
+              <w:rPr>
+                <w:sz w:val="16"/>
+              </w:rPr>
+              <w:t>0.870 (0.825–0.906)</w:t>
+            </w:r>
+          </w:p>
+        </w:tc>
+        <w:tc>
+          <w:tcPr>
+            <w:tcW w:type="dxa" w:w="1871"/>
+            <w:vAlign w:val="center"/>
+          </w:tcPr>
+          <w:p>
+            <w:r>
+              <w:rPr>
+                <w:sz w:val="16"/>
+              </w:rPr>
+              <w:t>0.857 (0.818–0.893)</w:t>
+            </w:r>
+          </w:p>
+        </w:tc>
+        <w:tc>
+          <w:tcPr>
+            <w:tcW w:type="dxa" w:w="1984"/>
+            <w:vAlign w:val="center"/>
+          </w:tcPr>
+          <w:p>
+            <w:r>
+              <w:rPr>
+                <w:sz w:val="16"/>
+              </w:rPr>
+              <w:t>standard internal evidence; included</w:t>
+            </w:r>
+          </w:p>
+        </w:tc>
+      </w:tr>
+    </w:tbl>
+    <w:p/>
+    <w:p>
+      <w:pPr>
         <w:jc w:val="center"/>
       </w:pPr>
       <w:r>
@@ -4477,7 +4984,7 @@
     </w:p>
     <w:p>
       <w:r>
-        <w:t>The access-controlled TITANPred R package contains 323 fitted models (219 continuous and 104 binary) across 27 cancers [32]. An authorised research user supplies a cancer vector and correctly named 768-dimensional TITAN features; the interface applies every bundled model available for that cancer. Repeated patient identifiers are mean-pooled before inference. Continuous outputs retain source endpoint units and are positioned against repeated out-of-fold reference distributions; binary outputs comprise the fitted PLS-LDA class and uncalibrated LDA score. The binary display labels its TCGA out-of-fold score rank explicitly as a rank rather than a probability and places training positive/negative counts, prevalence, repeated-CV performance, the tissue-source-site-grouped metric and any limited-class-size or site-sensitivity warning beside the call. A single-sample research-software output renders all available continuous endpoints as a radar, with the exact reference percentile and original prediction printed at every corner, and displays binary calls with provenance and out-of-distribution diagnostics. The demonstration ends with definitions of every displayed endpoint and citations for the data source used to construct each TCGA model target.</w:t>
+        <w:t>The access-controlled TITANPred R package contains 323 fitted models (219 continuous and 104 binary) across 27 cancers [32]. An authorised research user supplies a cancer vector and correctly named 768-dimensional TITAN features; the interface applies every bundled model available for that cancer. Repeated patient identifiers are mean-pooled before inference. Continuous outputs retain source endpoint units and are positioned against repeated out-of-fold reference distributions; binary outputs comprise the fitted PLS-LDA class and uncalibrated LDA score. Default inference exposes 306 models; the 17 limited-evidence binary models require explicit opt-in. The binary display labels its TCGA out-of-fold score rank explicitly as a rank rather than a probability and places training positive/negative counts, prevalence, repeated-CV balanced accuracy, AUROC, PR-AUC, TCGA-prevalence PPV/NPV, fold minima, component variability, repeat stability, the tissue-source-site-grouped metric and any limited-class-size or site-sensitivity warning beside the call. A single-sample research-software output renders all available continuous endpoints as a radar, with the exact reference percentile and original prediction printed at every corner, and displays binary calls with provenance and out-of-distribution diagnostics. The demonstration ends with definitions of every displayed endpoint and citations for the data source used to construct each TCGA model target.</w:t>
       </w:r>
     </w:p>
     <w:p>
@@ -4603,6 +5110,11 @@
     </w:p>
     <w:p>
       <w:r>
+        <w:t>The prespecified 20-per-class rule supported an inclusive atlas screen, but it was too permissive for presenting every selected binary model as equally mature. Only 87/104 screen-positive binary models met the stricter 50-per-class criterion. The 17 smaller-class models had sparse inner validation folds, frequently selected components across a wide range and showed lower median repeat score correlation than the ≥50-per-class group. Their learning curves showed no uniformly monotonic performance gain, illustrating that the available data cannot establish a stable sample-size plateau. We therefore retain them only as transparently reported exploratory results and exclude them from default inference. PR-AUC adds prevalence-aware discrimination information, whereas PPV and NPV are explicitly conditional on each analysed TCGA prevalence and should not be exported to another population. High call agreement under imbalance can be misleading and does not supersede score stability, sensitivity, PR-AUC or external validation.</w:t>
+      </w:r>
+    </w:p>
+    <w:p>
+      <w:r>
         <w:t>Tissue-source-site sensitivity is a central result rather than a generic robustness footnote. Grouping revealed heterogeneity that the median attenuation concealed: 83/323 screen-positive models (25.7%) fell below their original effect threshold. READ–APC and COAD–APC declined from balanced accuracies 0.862 and 0.793 to 0.495 and 0.543, respectively. Smaller and less balanced training folds contribute to grouped-validation loss, but performance close to chance requires these models to be labelled site-sensitive rather than robust biological signals. The model registry and inference output therefore expose the grouped metric, delta, number of sites, threshold-retention status and a prominent warning for every affected endpoint.</w:t>
       </w:r>
     </w:p>
@@ -4656,7 +5168,7 @@
     </w:p>
     <w:p>
       <w:r>
-        <w:t>Using mean-pooled fixed pretrained TITAN representations, this study provides a systematic patient-level TCGA benchmark of selected immune, mutation, pathway, MSI, aneuploidy and fusion phenotypes. The access-controlled TITANPred package demonstrates how fitted PLS and PLS–LDA objects can be applied without distributing patient-level training data. All reported performance and example outputs are internally derived TCGA estimates. The contribution is a transparent computational pathology benchmark and research-software framework—not broad endpoint novelty, external performance evidence or clinical validation—and locked independent testing remains essential.</w:t>
+        <w:t>Using mean-pooled fixed pretrained TITAN representations, this study provides a systematic patient-level TCGA benchmark of selected immune, mutation, pathway, MSI, aneuploidy and fusion phenotypes. The access-controlled TITANPred package demonstrates how fitted PLS and PLS–LDA objects can be applied without distributing patient-level training data. Its default interface includes all 219 continuous models and the 87 binary models meeting at least 50 patients per class; 17 smaller-class binary models require explicit exploratory opt-in. All reported performance and example outputs are internally derived TCGA estimates. The contribution is a transparent computational pathology benchmark and research-software framework—not broad endpoint novelty, external performance evidence or clinical validation—and locked independent testing remains essential.</w:t>
       </w:r>
     </w:p>
     <w:p>
@@ -4807,7 +5319,7 @@
     </w:p>
     <w:p>
       <w:r>
-        <w:t>Additional file 1 (.docx): Supplementary material. Contains Supplementary Methods, Tables S1–S12, Figures S1–S2 and an inventory of the companion machine-readable result files.</w:t>
+        <w:t>Additional file 1 (.docx): Supplementary material. Contains Supplementary Methods, Tables S1–S12, Figures S1–S3 and an inventory of the companion machine-readable result files.</w:t>
       </w:r>
     </w:p>
     <w:p>

</xml_diff>

<commit_message>
Add representative PLS-ridge benchmark
</commit_message>
<xml_diff>
--- a/manuscript/manuscript_JTM_patient_level_TITAN.docx
+++ b/manuscript/manuscript_JTM_patient_level_TITAN.docx
@@ -351,7 +351,7 @@
         <w:t xml:space="preserve">Results. </w:t>
       </w:r>
       <w:r>
-        <w:t>Within-cancer screening identified 219 continuous and 104 binary higher- or moderate-effect candidates. A stricter ≥50-per-class sensitivity retained 87/104 binary candidates; 17 smaller-class models were separated as exploratory and excluded from default inference. Highlighted repeated-CV results included TGCT–TGF-beta Response (Q² 0.670, selection-conditioned 95% patient-resampling interval 0.573–0.741; RMSE 0.303, Spearman 0.791) and LGG–TP53 (sensitivity 0.839, specificity 0.885, balanced accuracy 0.862, selection-conditioned 95% patient-resampling interval 0.833–0.888; AUROC 0.908). Prior studies supported 38/41 screen-positive cancer–gene pairs. 320/323 local candidates passed single BH correction across all 2,073 eligible tests. For zero exceedances among 999 permutations, the 95% Monte Carlo interval was 0–0.003686; targeted 9,999-permutation p-values were all 0.0001. Tissue-source-site grouping reduced 83/323 candidates (25.7%) below the original effect threshold. In a selection-conditioned benchmark, median ridge-minus-PLS differences were 0.004 AUROC and 0.014 Q².</w:t>
+        <w:t>Within-cancer screening identified 219 continuous and 104 binary higher- or moderate-effect candidates. A stricter ≥50-per-class sensitivity retained 87/104 binary candidates; 17 smaller-class models were separated as exploratory and excluded from default inference. Highlighted repeated-CV results included TGCT–TGF-beta Response (Q² 0.670, selection-conditioned 95% patient-resampling interval 0.573–0.741; RMSE 0.303, Spearman 0.791) and LGG–TP53 (sensitivity 0.839, specificity 0.885, balanced accuracy 0.862, selection-conditioned 95% patient-resampling interval 0.833–0.888; AUROC 0.908). Prior studies supported 38/41 screen-positive cancer–gene pairs. 320/323 local candidates passed single BH correction across all 2,073 eligible tests. Tissue-source-site grouping reduced 83/323 candidates (25.7%) below the original effect threshold. In a 47-target metadata-stratified benchmark selected without PLS performance, median ridge-minus-PLS differences were 0.008 AUROC and 0.053 Q²; paired intervals favoured ridge for 8/35 binary and 10/12 continuous targets, and PLS for none.</w:t>
       </w:r>
     </w:p>
     <w:p>
@@ -362,7 +362,7 @@
         <w:t xml:space="preserve">Conclusions. </w:t>
       </w:r>
       <w:r>
-        <w:t>This systematic patient-level benchmark defines internally derived TCGA estimates under one fixed pretrained TITAN representation and constructs compact research models for future locked evaluation. Its contribution is methodological and resource-oriented rather than mutation-target novelty. No independent performance evidence is presented, and clinical interpretation or application is not supported.</w:t>
+        <w:t>This systematic patient-level benchmark defines internally derived TCGA estimates under one fixed pretrained TITAN representation and constructs compact PLS reference models for future locked evaluation. PLS is the prespecified reference method, not an empirically optimal algorithm; the representative comparison more often favoured ridge. No independent performance evidence or basis for clinical application is presented.</w:t>
       </w:r>
     </w:p>
     <w:p>
@@ -406,17 +406,17 @@
     </w:p>
     <w:p>
       <w:r>
-        <w:t>TITAN is a multimodal whole-slide foundation model pretrained on 335,645 slides with visual self-supervision and vision–language alignment [16]. The published Mass-340K pretraining corpus explicitly excluded TCGA and PANDA; TCGA was instead used for downstream evaluation of the pretrained model. The present work therefore has no reported TCGA pretraining overlap, but it is a secondary analysis of a cohort previously used to benchmark TITAN and is not independent external validation. We use its fixed 768-dimensional slide representation with PLS, a latent-variable method suited to correlated high-dimensional predictors [17,18].</w:t>
+        <w:t>TITAN is a multimodal whole-slide foundation model pretrained on 335,645 slides with visual self-supervision and vision–language alignment [16]. The published Mass-340K pretraining corpus explicitly excluded TCGA and PANDA; TCGA was instead used for downstream evaluation of the pretrained model. The present work therefore has no reported TCGA pretraining overlap, but it is a secondary analysis of a cohort previously used to benchmark TITAN and is not independent external validation. We use its fixed 768-dimensional slide representation with PLS as one prespecified supervised linear reference; the study does not assume that PLS is algorithmically optimal [17,18].</w:t>
       </w:r>
     </w:p>
     <w:p>
       <w:r>
-        <w:t>A practical feature of the fitted analysis is model portability. A PLS or PLS–LDA predictor can be distributed as preprocessing parameters, latent-variable weights, regression coefficients and LDA parameters. Prediction therefore does not require release of the patient-level training embeddings or outcomes. This supports external research testing while minimising distribution of patient-level data, but does not itself establish privacy, licensing compatibility or transportability.</w:t>
+        <w:t>A practical feature of the fitted analysis is model portability. PLS, PLS–LDA and ridge predictors can all be represented by compact learned preprocessing and coefficient objects and applied without release of patient-level training embeddings or outcomes. Portability therefore motivates comparison within the linear-model family but is not a unique advantage of PLS. It supports external research testing while minimising distribution of patient-level data, but does not itself establish privacy, licensing compatibility or transportability.</w:t>
       </w:r>
     </w:p>
     <w:p>
       <w:r>
-        <w:t>The primary question was cancer-specific: which individual mutations, inflammatory measurements, oncogenic pathways, MSI phenotypes, aneuploidy measures and fusions are predictable within each cancer? Molecular subtype association was not analysed. PLS–LDA was preferred for individual binary molecular endpoints. The methodological PLS1–PLS2 comparison for correlated inflammatory panels is reported in the Supplementary Material.</w:t>
+        <w:t>The primary question was cancer-specific: which individual mutations, inflammatory measurements, oncogenic pathways, MSI phenotypes, aneuploidy measures and fusions are predictable within each cancer? Molecular subtype association was not analysed. One-at-a-time PLS1 and PLS–LDA formed the prespecified reference screen because they preserve outcome-specific denominators and yield one independently usable model per endpoint. Joint PLS2 was evaluated secondarily only for coherent continuous inflammatory panels; its complete-case panel, shared latent structure and multiresponse estimand are not interchangeable with the endpoint-specific atlas.</w:t>
       </w:r>
     </w:p>
     <w:p>
@@ -1624,7 +1624,12 @@
     </w:p>
     <w:p>
       <w:r>
-        <w:t>As a secondary algorithmic benchmark, the 24 manuscript-highlighted models were refitted on the same five repeated outer partitions using ridge-penalised Gaussian regression for continuous endpoints and ridge logistic regression for binary endpoints. For every outer fold, PLS and ridge used identical patients, outer splits and inner splits. PLS component count and ridge penalty were selected entirely within the outer training set. For binary models, each method's operating threshold was selected by the same rule: maximise balanced accuracy on that method's inner out-of-fold continuous scores, without access to the outer test fold. Threshold-independent AUROC was the primary binary algorithm-comparison metric, and balanced accuracy from these symmetrically selected thresholds was secondary. Continuous comparisons retained Q² as primary and Spearman correlation as secondary. For repeat r, the paired difference was d_r=M_r(ridge)−M_r(PLS), and the reported point difference was Δ=(1/5)Σ_r d_r. We formed 2,000 selection-conditioned paired patient-resampling replicates by sampling patients with replacement, retaining all five matched out-of-fold predictions from both algorithms for each sampled patient, recalculating d_r within repeat and then Δ. The 2.5th and 97.5th percentiles formed the paired interval. No new partitions were generated and neither algorithm was refitted within a bootstrap replicate. Because endpoints entered this benchmark after the PLS screen, the interval also excludes screening and highlighting uncertainty and cannot establish screen-wide algorithmic superiority. Ridge was chosen as a simple linear baseline whose fitted coefficients can be exported without retaining training embeddings; nonlinear kernel predictors requiring training observations or landmarks at inference did not satisfy that portability constraint.</w:t>
+        <w:t>As a secondary algorithmic benchmark, targets were selected from all 2,073 eligible cancer–endpoint tests without using PLS performance. Continuous and binary sampling frames were divided into empirical sample-size terciles; binary endpoints were additionally divided into empirical terciles of minority-class fraction. Within each non-empty outcome-family × sample-size cell—and binary family × size × imbalance cell—the endpoint with the lowest salted SHA-256 rank was selected. The fixed rule yielded 12 continuous and 35 binary targets, including 14 screen-positive and 33 screen-negative endpoints. The complete sampling frame, salt, hashes and selected jobs are released. This is a representative metadata-stratified comparison, not an atlas-wide fit of ridge to every endpoint.</w:t>
+      </w:r>
+    </w:p>
+    <w:p>
+      <w:r>
+        <w:t>Each selected target was fitted across five repeated nested partitions using PLS1 or PLS–LDA and ridge-penalised Gaussian or logistic regression. Within every repeat, both methods used identical patients, outer folds and inner folds. For continuous outcomes, both PLS component count and ridge penalty maximised pooled inner out-of-fold Q²; maximising Q² is equivalent to minimising pooled squared error because the validation outcome denominator is fixed. For binary outcomes, each method's operating threshold maximised balanced accuracy on its own inner out-of-fold continuous scores, without access to the outer test fold. Threshold-independent AUROC was the primary binary comparison metric and symmetrically thresholded balanced accuracy was secondary; continuous comparisons used Q² and Spearman correlation. For repeat r, d_r=M_r(ridge)−M_r(PLS) and Δ=(1/5)Σ_r d_r. Two thousand paired patient-resampling replicates sampled patients with replacement, retained both methods and all five matched predictions, and recalculated d_r and Δ; percentile 2.5 and 97.5 formed the interval. The interval does not repeat metadata-stratified target selection, generate new partitions or refit either algorithm. Ridge was chosen as a simple portable linear baseline; portability is not unique to PLS.</w:t>
       </w:r>
     </w:p>
     <w:p>
@@ -1672,7 +1677,7 @@
     </w:p>
     <w:p>
       <w:r>
-        <w:t>The fitted PLS and PLS–LDA objects contain the learned transformations and coefficients needed for research inference but no patient-level training rows. The access-controlled inference interface validates the 768-feature order and applies the prespecified patient-level slide aggregation. The secondary PLS1–PLS2 inflammatory comparison, including matched folds and cancer-bootstrap intervals, is described in the Supplementary Methods.</w:t>
+        <w:t>The fitted PLS and PLS–LDA objects contain the learned transformations and coefficients needed for research inference but no patient-level training rows. They are distributed as prespecified reference models, not as models shown to outperform ridge. The access-controlled inference interface validates the 768-feature order and applies the prespecified patient-level slide aggregation. The secondary PLS1–PLS2 inflammatory comparison, including matched folds and cancer-bootstrap intervals, is described in the Supplementary Methods.</w:t>
       </w:r>
     </w:p>
     <w:p>
@@ -4482,12 +4487,12 @@
         <w:pStyle w:val="Heading2"/>
       </w:pPr>
       <w:r>
-        <w:t>Exportable linear baseline comparison</w:t>
+        <w:t>Metadata-stratified linear-model comparison</w:t>
       </w:r>
     </w:p>
     <w:p>
       <w:r>
-        <w:t>Among the 12 highlighted binary models, the median ridge-minus-PLS AUROC difference was 0.004 (IQR -0.001 to 0.010); ridge had a selection-conditioned paired patient-resampling interval above zero for 2 models, PLS for 0, and 10 AUROC differences were uncertain. With the same inner-CV balanced-accuracy threshold rule applied to both methods, the median ridge-minus-PLS balanced-accuracy difference was 0.005 (IQR 0.001 to 0.012); ridge had a selection-conditioned paired patient-resampling interval above zero for 0 models, PLS for 0, and 12 were uncertain. For the 12 continuous models, the median ridge-minus-PLS Q² difference was 0.014 (IQR 0.007 to 0.017); ridge was favoured for 5, PLS for 0, and 7 were uncertain. The symmetric binary results do not support a general advantage for either algorithm: the AUROC interval excluded zero in favour of ridge for THYM–GTF2I and COAD–TP53, while no symmetrically thresholded balanced-accuracy interval excluded zero. For continuous Q², ridge-favouring intervals were observed for THYM–Th17 Cells, BRCA–Wound Healing, BRCA–Proliferation, THCA–Th1 Cells, SARC–Macrophage Regulation. These are conditional comparisons of highlighted endpoints, not multiplicity-controlled algorithm discoveries. Because the benchmark was restricted to PLS-highlighted results, the prespecified atlas was retained and the comparison is reported as selection-conditioned sensitivity evidence rather than a basis for post-screen method switching.</w:t>
+        <w:t>The deterministic representative benchmark contained 35 binary and 12 continuous targets selected from all eligible tests without reference to PLS performance; 14/47 happened to be screen-positive. For binary targets, the median ridge-minus-PLS AUROC difference was 0.008 (IQR -0.002 to 0.027); ridge had a selection-conditioned paired patient-resampling interval above zero for 8 models, PLS for 0, and 27 AUROC differences were uncertain. With the same inner-CV balanced-accuracy threshold rule applied to both methods, the median ridge-minus-PLS balanced-accuracy difference was 0.012 (IQR 0.005 to 0.025); ridge had a selection-conditioned paired patient-resampling interval above zero for 4 models, PLS for 0, and 31 were uncertain. For continuous targets, the median ridge-minus-PLS Q² difference was 0.053 (IQR 0.031 to 0.136); ridge was favoured for 10, PLS for 0, and 2 were uncertain. For continuous Spearman correlation, ridge was favoured for 3, PLS for 2 and 7 were uncertain. Thus the benchmark did not establish PLS superiority and more often favoured ridge, especially for continuous Q². These are representative paired comparisons rather than multiplicity-controlled algorithm discoveries or an atlas-wide ridge screen.</w:t>
       </w:r>
     </w:p>
     <w:p>
@@ -5100,12 +5105,17 @@
     </w:p>
     <w:p>
       <w:r>
-        <w:t>The contribution of TITAN plus PLS is a uniform, auditable screen over many prespecified outcomes using one fixed pretrained representation, with one-at-a-time PLS–LDA retained for the prespecified individual binary endpoints and PLS2 examined secondarily for correlated inflammatory panels.</w:t>
+        <w:t>The contribution is therefore not that TITAN plus PLS is an optimal algorithmic combination. It is the uniform, auditable patient-level screen over prespecified outcomes using one fixed representation, complete negative reporting and compact fitted reference models. PLS1 and PLS–LDA remain the prespecified reference analysis, but the released PLS objects should not be interpreted as the best available models.</w:t>
       </w:r>
     </w:p>
     <w:p>
       <w:r>
-        <w:t>The ridge benchmark prevents interpreting that design choice as proof of PLS superiority. The corrected binary comparison removed the previous decision-rule asymmetry: both methods used identical outer and inner folds and selected operating thresholds from inner out-of-fold scores using the same balanced-accuracy criterion. Threshold-independent AUROC was primary for this method comparison. The median ridge-minus-PLS AUROC difference was 0.004, with 2 endpoints favouring ridge and 10 uncertain; the median balanced-accuracy difference under symmetric thresholding was 0.005, with 0 favouring ridge, 0 favouring PLS and 12 uncertain. The continuous median Q² difference was 0.014; 5 intervals excluded zero in favour of ridge. These paired patient-resampling intervals condition on the PLS screen and five existing matched prediction sets; they do not repeat endpoint selection, generate new partitions or refit models within bootstrap samples. Both approaches yield compact exportable parameters, so portability is not unique to PLS. PLS remains the prespecified atlas method because the benchmark was performed only on PLS-highlighted models and switching methods after that selection would add another optimistic selection layer. Future external validation can compare locked PLS and ridge candidates prospectively.</w:t>
+        <w:t>The metadata-stratified benchmark directly weakens any stronger PLS claim. Selection depended only on outcome family, sample size, binary minority-class fraction and a fixed hash, not on PLS performance. Both algorithms used matched outer and inner folds; continuous hyperparameters maximised the same pooled inner Q² and binary thresholds maximised the same inner balanced accuracy. Median ridge-minus-PLS differences were 0.008 AUROC and 0.053 Q². Paired intervals favoured ridge for 8/35 binary and 10/12 continuous targets, PLS for none, and were otherwise uncertain. Portability cannot justify PLS over ridge because both yield compact exportable parameters. We did not replace the locked primary analysis or add post hoc method switching; instead, we report PLS as the prespecified reference and make clear that future model-resource development should compare locked PLS and ridge candidates in independent cohorts.</w:t>
+      </w:r>
+    </w:p>
+    <w:p>
+      <w:r>
+        <w:t>PLS2 addresses a different question. Its mean cancer-level ΔQ² relative to response-by-response PLS1 was 0.066 for inferred cell fractions, 0.017 for infiltration signatures and 0.056 for immune-repertoire measures, supporting shared inflammatory structure. It remains secondary because each joint fit uses only the complete-case intersection for a coherent continuous response block, shares one latent representation across a fixed ordered panel and cannot replace individual mutation, pathway, MSI, aneuploidy or fusion classifiers. The positive internal averages therefore nominate PLS2 for a future locked multiresponse immune resource; they do not establish a generally preferable main model without external validation and a matched multiresponse baseline.</w:t>
       </w:r>
     </w:p>
     <w:p>

</xml_diff>

<commit_message>
Address endpoint provenance and morphology context
</commit_message>
<xml_diff>
--- a/manuscript/manuscript_JTM_patient_level_TITAN.docx
+++ b/manuscript/manuscript_JTM_patient_level_TITAN.docx
@@ -8,7 +8,7 @@
         <w:jc w:val="center"/>
       </w:pPr>
       <w:r>
-        <w:t>A systematic patient-level benchmark and reusable model resource for molecular and immune prediction from pretrained TITAN whole-slide representations across 32 TCGA cancers</w:t>
+        <w:t>A systematic patient-level benchmark and reusable model resource for molecular and derived immune-feature prediction from pretrained TITAN whole-slide representations across 32 TCGA cancers</w:t>
       </w:r>
     </w:p>
     <w:p>
@@ -340,7 +340,7 @@
         <w:t xml:space="preserve">Methods. </w:t>
       </w:r>
       <w:r>
-        <w:t>We mean-pooled 11,449 primary diagnostic slide embeddings into 9,404 patient vectors across 32 TCGA cancers; 843 patients contributed multiple slides. We tested 1,614 continuous and 459 binary cancer–endpoint pairs using patient-level nested PLS1 or PLS–LDA. Effect-eligible models underwent 999 complete-process permutations with conservative stopping, exact Monte Carlo intervals and Benjamini–Hochberg corrections locally, across cancers and atlas-wide. Eight prespecified leading models were extended to 9,999 permutations.</w:t>
+        <w:t>We mean-pooled 11,449 primary diagnostic slide embeddings into 9,404 patient vectors across 32 TCGA cancers; 843 patients contributed multiple slides. We tested 1,614 continuous and 459 binary cancer–endpoint pairs using patient-level nested PLS1 or PLS–LDA. Targets were classified as direct alteration calls, sequencing-derived burdens, inferred immune-cell fractions, transcriptomic signatures, pathology-derived quantities or composite scores. Effect-eligible models underwent 999 complete-process permutations with conservative stopping, exact Monte Carlo intervals and Benjamini–Hochberg corrections locally, across cancers and atlas-wide. Eight prespecified leading models were extended to 9,999 permutations.</w:t>
       </w:r>
     </w:p>
     <w:p>
@@ -401,7 +401,7 @@
     </w:p>
     <w:p>
       <w:r>
-        <w:t>The narrower unresolved gap is a reproducible benchmark that applies one fixed pretrained representation to every target; deterministically aggregates slides before outcome matching; performs nested validation with the patient as the unit; preserves tested-negative and sample-size-ineligible results; reports target-level tissue-source-site sensitivity; models selected immune and genomic-context measurements continuously; and constructs compact fitted predictors with research-use provenance metadata. These design and resource features—not unprecedented endpoint classes—define the contribution of this study (Table 1).</w:t>
+        <w:t>The narrower unresolved gap is a reproducible benchmark that applies one fixed pretrained representation to every target; deterministically aggregates slides before outcome matching; performs nested validation with the patient as the unit; preserves tested-negative and sample-size-ineligible results; reports target-level tissue-source-site sensitivity; models selected derived immune and genomic-context features continuously; and constructs compact fitted predictors with research-use provenance metadata. These design and resource features—not unprecedented endpoint classes—define the contribution of this study (Table 1).</w:t>
       </w:r>
     </w:p>
     <w:p>
@@ -416,7 +416,7 @@
     </w:p>
     <w:p>
       <w:r>
-        <w:t>The primary question was cancer-specific: which individual mutations, inflammatory measurements, oncogenic pathways, MSI phenotypes, aneuploidy measures and fusions are predictable within each cancer? Molecular subtype association was not analysed. One-at-a-time PLS1 and PLS–LDA formed the prespecified reference screen because they preserve outcome-specific denominators and yield one independently usable model per endpoint. Joint PLS2 was evaluated secondarily only for coherent continuous inflammatory panels; its complete-case panel, shared latent structure and multiresponse estimand are not interchangeable with the endpoint-specific atlas.</w:t>
+        <w:t>The primary question was cancer-specific: which individual mutations, derived inflammatory features, oncogenic pathways, MSI phenotypes, aneuploidy measures and fusions are predictable within each cancer? Molecular subtype association was not analysed. One-at-a-time PLS1 and PLS–LDA formed the prespecified reference screen because they preserve outcome-specific denominators and yield one independently usable model per endpoint. Joint PLS2 was evaluated secondarily only for coherent continuous inflammatory panels; its complete-case panel, shared latent structure and multiresponse estimand are not interchangeable with the endpoint-specific atlas.</w:t>
       </w:r>
     </w:p>
     <w:p>
@@ -1520,7 +1520,7 @@
     </w:p>
     <w:p>
       <w:r>
-        <w:t>All available eligible TCGA participants were used; no formal power calculation was performed. Minimum outcome-specific denominators were prespecified to support nested folds. Treatments were not modelled because the endpoints were contemporaneous molecular or immune measurements rather than prognosis or treatment response. Available demographic fields, subgroup sizes and endpoint-specific missingness did not provide a basis for representative subgroup performance or fairness evaluation; this is considered a limitation rather than evidence of equivalent performance across groups.</w:t>
+        <w:t>All available eligible TCGA participants were used; no formal power calculation was performed. Minimum outcome-specific denominators were prespecified to support nested folds. Treatments were not modelled because the endpoints were contemporaneous molecular or derived immune/genomic features rather than prognosis or treatment response. Available demographic fields, subgroup sizes and endpoint-specific missingness did not provide a basis for representative subgroup performance or fairness evaluation; this is considered a limitation rather than evidence of equivalent performance across groups.</w:t>
       </w:r>
     </w:p>
     <w:p>
@@ -1592,6 +1592,11 @@
     <w:p>
       <w:r>
         <w:t>The Thorsson Nonsilent Mutation Rate, Silent Mutation Rate, SNV Neoantigens, Indel Neoantigens and Number of Segments variables, and the Gao fusion burden, were analysed as log(1+x); all other continuous endpoints retained their source scale. Reported RMSE values therefore use these analysed units.</w:t>
+      </w:r>
+    </w:p>
+    <w:p>
+      <w:r>
+        <w:t>The Thorsson umbrella does not denote a single immune assay. Its targets include CIBERSORT relative leukocyte fractions inferred by deconvolving bulk RNA sequencing [37], a leukocyte fraction inferred from DNA methylation, bulk-RNA gene-set signatures, BCR/TCR repertoire quantities reconstructed from RNA sequencing, in-silico neoantigen burdens, purity- and copy-number-derived genomic-context scores, and TIL Regional Fraction inferred from H&amp;E by the Saltz deep-learning workflow [19,38]. The last target is a same-histology-modality concordance task rather than cross-modal molecular prediction. None of these inferred quantities is treated as equivalent to flow cytometry, immunohistochemistry, a directly counted immune-cell assay or a clinically certified biomarker. A 2,073-row endpoint dictionary records source modality, direct/inferred status, derivation, source scale, transformation, outcome-specific missingness, expected measurement error, biological interpretation and an assay-equivalence caveat for every modelled target; its 194 unique definitions are supplied separately.</w:t>
       </w:r>
     </w:p>
     <w:p>
@@ -1672,6 +1677,11 @@
     </w:p>
     <w:p>
       <w:r>
+        <w:t>For qualitative morphological context, we selected five representative models spanning an H&amp;E-derived TIL quantity, an RNA-derived CIBERSORT fraction, an RNA-expression signature, a copy-number burden and a sequence-supported mutation. Within each model, high and low anchors were chosen from concordant extremes of mean repeated out-of-fold predictions. The closest within-cancer patient was then retrieved by cosine similarity of patient-level mean TITAN representations. For display only, a report-covered slide closest to each patient mean was selected deterministically, and prespecified morphological terms were extracted from TITAN-generated TCGA-Slide-Reports text. Neither report text nor example selection entered model fitting. Only global 768-dimensional pooled representations were available; no patch embeddings, attention maps or slide pixels were retained. The analysis is therefore descriptive nearest-neighbour context, not patch-level relevance, causal attribution or blinded pathologist review.</w:t>
+      </w:r>
+    </w:p>
+    <w:p>
+      <w:r>
         <w:t>TITANPred retains the binary LDA score but does not convert it to a probability. In the research-software demonstration, its position is labelled 'TCGA out-of-fold score rank (not probability)' rather than percentile or risk. Binary output displays total training n, class counts and prevalence; balanced accuracy, AUROC and PR-AUC; TCGA-prevalence PPV and NPV; fold minima, component-selection variability and repeat stability; and site sensitivity. The 17 screen-positive models with fewer than 50 patients in either class are marked exploratory/limited evidence, omitted from default inference and available only through explicit opt-in with a warning. Probability calibration was not added post hoc because it would require an independently evaluated or fully nested calibration procedure, which is not available in this TCGA benchmark.</w:t>
       </w:r>
     </w:p>
@@ -1718,7 +1728,7 @@
     </w:p>
     <w:p>
       <w:r>
-        <w:t>Supplementary methods, Tables S1–S12, Figures S1–S3 and the machine-readable-file inventory are provided in Additional file 1. The two illustrative single-sample TITANPred reports are supplied separately as Additional files 2 and 3.</w:t>
+        <w:t>Supplementary methods, Tables S1–S14, Figures S1–S4 and the machine-readable-file inventory are provided in Additional file 1. The two illustrative single-sample TITANPred reports are supplied separately as Additional files 2 and 3.</w:t>
       </w:r>
     </w:p>
     <w:p>
@@ -2912,7 +2922,20 @@
         <w:pStyle w:val="Heading2"/>
       </w:pPr>
       <w:r>
-        <w:t>Continuous immune, genomic-context and instability phenotypes</w:t>
+        <w:t>Endpoint provenance and assay equivalence</w:t>
+      </w:r>
+    </w:p>
+    <w:p>
+      <w:r>
+        <w:t>The target-level audit classified the 2,073 eligible tests as 265 directly observed genomic alteration; 439 sequencing-derived continuous burden; 685 computationally inferred immune-cell fraction; 299 transcriptomic signature; 13 pathology-associated quantity; 372 composite genomic-context score. These categories describe the label-generation modality, not the modality of the TITAN predictor. Only the 13 cancer-specific TIL Regional Fraction tests used an outcome derived from H&amp;E itself. Thus, apparent predictability of CIBERSORT fractions, leukocyte fraction or RNA signatures is agreement with another computational phenotype and cannot be interpreted as recovery of a directly measured immune-cell count. The complete target-level dictionary and the 194-definition dictionary are Supplementary Table S13 machine-readable companions.</w:t>
+      </w:r>
+    </w:p>
+    <w:p>
+      <w:pPr>
+        <w:pStyle w:val="Heading2"/>
+      </w:pPr>
+      <w:r>
+        <w:t>Continuous derived immune, genomic-context and instability phenotypes</w:t>
       </w:r>
     </w:p>
     <w:p>
@@ -4584,6 +4607,19 @@
         <w:pStyle w:val="Heading2"/>
       </w:pPr>
       <w:r>
+        <w:t>Qualitative morphology context</w:t>
+      </w:r>
+    </w:p>
+    <w:p>
+      <w:r>
+        <w:t>Five representative models were examined using high/low repeated out-of-fold anchors and their nearest within-cancer patient-level TITAN neighbours. The anchors were BLCA–TIL Regional Fraction: high TCGA-FD-A5BS, low TCGA-BL-A0C8; TGCT–Macrophages M2: high TCGA-YU-A94D, low TCGA-2G-AAF6; BRCA–Wound Healing: high TCGA-AR-A1AH, low TCGA-E9-A5UO; UCEC–Aneuploidy score: high TCGA-AJ-A23M, low TCGA-D1-A1NS; THYM–GTF2I: high TCGA-ZB-A96H, low TCGA-4V-A9QS. Exact slide identifiers, observed values, original prediction values, prediction ranks, embedding cosine similarities and generated-report excerpts are reported in Supplementary Table S14 and the machine-readable file; Figure S4 places all held-out patients behind the selected examples. The BLCA TIL Regional Fraction example is explicitly a same-H&amp;E-modality concordance control. The remaining examples provide descriptive embedding context only. No patch-level attribution or blinded pathologist interpretation was possible from the released global embeddings and automated reports.</w:t>
+      </w:r>
+    </w:p>
+    <w:p>
+      <w:pPr>
+        <w:pStyle w:val="Heading2"/>
+      </w:pPr>
+      <w:r>
         <w:t>External-validation readiness audit</w:t>
       </w:r>
     </w:p>
@@ -5095,12 +5131,12 @@
     </w:p>
     <w:p>
       <w:r>
-        <w:t>The immune measurements, oncogenic pathways, MSI, aneuploidy and fusion endpoints extend the analysis beyond the exact cancer–gene mutation pairs used for the literature crosswalk. They are systematically benchmarked here with the same TITAN–PLS design, but the manuscript does not claim that histological prediction of those broad endpoint classes is unprecedented. Their contribution is the unified patient-level, cancer-specific evaluation and directly reusable linear modelling framework.</w:t>
+        <w:t>The non-mutation endpoints extend the analysis beyond the exact cancer–gene pairs used for the literature crosswalk, but they must not be collapsed under the phrase 'immune measurements'. Direct sequence-supported alterations, sequencing-derived burdens, inferred immune-cell fractions, transcriptomic signatures, pathology-derived quantities and composite genomic-context scores have different error models and biological meanings. In particular, prediction of a CIBERSORT fraction or RNA signature is agreement with a computational phenotype derived from a bulk specimen; it is not equivalent to flow cytometry, immunohistochemistry, a direct cell count or a clinically certified biomarker. TIL Regional Fraction is an even more specific same-modality case because both predictor and target originate from H&amp;E. Its result is best interpreted as concordance between two image-derived summaries rather than molecular inference.</w:t>
       </w:r>
     </w:p>
     <w:p>
       <w:r>
-        <w:t>For continuous outcomes, prior work predicted RNA expression [6], tumour composition [4], continuous HRD and microenvironment measures [12], and externally evaluated tumour-microenvironment composition in non-small cell lung cancer [15]. The present study instead screens the prespecified Thorsson immune panel, genomic-context scores, MSI scores, fusion burden and aneuploidy burdens across eligible TCGA cancers using the same patient-level validation design. Only 219 continuous pairs passed the stricter across-cancer correction; the others should be treated as endpoint- and cancer-specific nominations, not as replications of the external HistoTME results or as evidence of general immune profiling.</w:t>
+        <w:t>For continuous outcomes, prior work predicted RNA expression [6], tumour composition [4], continuous HRD and microenvironment features [12], and externally evaluated tumour-microenvironment composition in non-small cell lung cancer [15]. The present study instead screens the prespecified Thorsson-derived panel, genomic-context scores, MSI scores, fusion burden and aneuploidy burdens across eligible TCGA cancers using the same patient-level validation design. Only 219 continuous pairs passed the stricter across-cancer correction; the others should be treated as endpoint- and cancer-specific nominations, not as replications of the external HistoTME results or as evidence of general immune profiling.</w:t>
       </w:r>
     </w:p>
     <w:p>
@@ -5165,6 +5201,11 @@
     </w:p>
     <w:p>
       <w:r>
+        <w:t>The 768-dimensional TITAN representation is not morphologically self-explanatory. The new high/low anchor and within-cancer nearest-neighbour analysis places representative predictions in the context of globally similar patient embeddings and preserves exact slide/report provenance, but it cannot determine which patch or tissue compartment drove a prediction. The available TCGA-Slide-Reports text was generated by TITAN from the same slides and is neither an independent annotation nor a blinded pathologist review. Consequently, descriptive terms such as lymphoid infiltrate, stromal pattern or necrosis are hypotheses for future review, not validated mechanisms. Tile-level representations or relevance maps retained prospectively, followed by blinded pathologist assessment, are required before morphological explanations can be claimed.</w:t>
+      </w:r>
+    </w:p>
+    <w:p>
+      <w:r>
         <w:t>Demographic subgroup performance and algorithmic fairness were not evaluated. The TCGA Clinical Data Resource provides descriptive age, recorded gender, race and stage fields, but coverage and subgroup sizes vary across cancers and would fragment further under endpoint-specific molecular missingness. Tissue-source-site grouping probes one form of institutional heterogeneity but cannot establish fairness across ancestry, sex, age or access-to-care groups. Any external evaluation should prespecify representative sampling and subgroup performance, calibration and failure analysis.</w:t>
       </w:r>
     </w:p>
@@ -5178,7 +5219,7 @@
     </w:p>
     <w:p>
       <w:r>
-        <w:t>Using mean-pooled fixed pretrained TITAN representations, this study provides a systematic patient-level TCGA benchmark of selected immune, mutation, pathway, MSI, aneuploidy and fusion phenotypes. The access-controlled TITANPred package demonstrates how fitted PLS and PLS–LDA objects can be applied without distributing patient-level training data. Its default interface includes all 219 continuous models and the 87 binary models meeting at least 50 patients per class; 17 smaller-class binary models require explicit exploratory opt-in. All reported performance and example outputs are internally derived TCGA estimates. The contribution is a transparent computational pathology benchmark and research-software framework—not broad endpoint novelty, external performance evidence or clinical validation—and locked independent testing remains essential.</w:t>
+        <w:t>Using mean-pooled fixed pretrained TITAN representations, this study provides a systematic patient-level TCGA benchmark of direct genomic alterations and derived immune, genomic-context, MSI, aneuploidy and fusion phenotypes. The access-controlled TITANPred package demonstrates how fitted PLS and PLS–LDA objects can be applied without distributing patient-level training data. Its default interface includes all 219 continuous models and the 87 binary models meeting at least 50 patients per class; 17 smaller-class binary models require explicit exploratory opt-in. All reported performance and example outputs are internally derived TCGA estimates. Prediction of a computationally inferred target is not evidence that a direct assay has been reproduced, and the qualitative neighbour examples are not patch-level explanation. The contribution is a transparent computational pathology benchmark and research-software framework—not broad endpoint novelty, external performance evidence or clinical validation—and locked independent testing remains essential.</w:t>
       </w:r>
     </w:p>
     <w:p>
@@ -5329,7 +5370,7 @@
     </w:p>
     <w:p>
       <w:r>
-        <w:t>Additional file 1 (.docx): Supplementary material. Contains Supplementary Methods, Tables S1–S12, Figures S1–S3 and an inventory of the companion machine-readable result files.</w:t>
+        <w:t>Additional file 1 (.docx): Supplementary material. Contains Supplementary Methods, Tables S1–S14, Figures S1–S4 and an inventory of the companion machine-readable result files.</w:t>
       </w:r>
     </w:p>
     <w:p>
@@ -5528,6 +5569,16 @@
     <w:p>
       <w:r>
         <w:t>36. National Cancer Institute Clinical Proteomic Tumor Analysis Consortium. CPTAC-UCEC: The Clinical Proteomic Tumor Analysis Consortium Uterine Corpus Endometrial Carcinoma Collection. The Cancer Imaging Archive. doi:10.7937/K9/TCIA.2018.3R3JUISW. Accessed 24 Aug 2026.</w:t>
+      </w:r>
+    </w:p>
+    <w:p>
+      <w:r>
+        <w:t>37. Newman AM, et al. Robust enumeration of cell subsets from tissue expression profiles. Nat Methods. 2015;12:453–457. doi:10.1038/nmeth.3337.</w:t>
+      </w:r>
+    </w:p>
+    <w:p>
+      <w:r>
+        <w:t>38. Saltz J, et al. Spatial organization and molecular correlation of tumor-infiltrating lymphocytes using deep learning on pathology images. Cell Rep. 2018;23:181–193.e7. doi:10.1016/j.celrep.2018.03.086.</w:t>
       </w:r>
     </w:p>
     <w:sectPr>

</xml_diff>

<commit_message>
Address COAD demonstration overinterpretation
</commit_message>
<xml_diff>
--- a/manuscript/manuscript_JTM_patient_level_TITAN.docx
+++ b/manuscript/manuscript_JTM_patient_level_TITAN.docx
@@ -1728,7 +1728,7 @@
     </w:p>
     <w:p>
       <w:r>
-        <w:t>Supplementary methods, Tables S1–S14, Figures S1–S4 and the machine-readable-file inventory are provided in Additional file 1. The two illustrative single-sample TITANPred reports are supplied separately as Additional files 2 and 3.</w:t>
+        <w:t>Supplementary methods, Tables S1–S14, Figures S1–S4 and the machine-readable-file inventory are provided in Additional file 1. The two post hoc illustrative COAD research-software outputs are supplied separately as Additional files 2 and 3.</w:t>
       </w:r>
     </w:p>
     <w:p>
@@ -5020,27 +5020,17 @@
         <w:pStyle w:val="Heading2"/>
       </w:pPr>
       <w:r>
-        <w:t>Research-software demonstration and COAD illustration</w:t>
+        <w:t>Research-software interface and COAD radar illustration</w:t>
       </w:r>
     </w:p>
     <w:p>
       <w:r>
-        <w:t>The access-controlled TITANPred R package contains 323 fitted models (219 continuous and 104 binary) across 27 cancers [32]. An authorised research user supplies a cancer vector and correctly named 768-dimensional TITAN features; the interface applies every bundled model available for that cancer. Repeated patient identifiers are mean-pooled before inference. Continuous outputs retain source endpoint units and are positioned against repeated out-of-fold reference distributions; binary outputs comprise the fitted PLS-LDA class and uncalibrated LDA score. Default inference exposes 306 models; the 17 limited-evidence binary models require explicit opt-in. The binary display labels its TCGA out-of-fold score rank explicitly as a rank rather than a probability and places training positive/negative counts, prevalence, repeated-CV balanced accuracy, AUROC, PR-AUC, TCGA-prevalence PPV/NPV, fold minima, component variability, repeat stability, the tissue-source-site-grouped metric and any limited-class-size or site-sensitivity warning beside the call. A single-sample research-software output renders all available continuous endpoints as a radar, with the exact reference percentile and original prediction printed at every corner, and displays binary calls with provenance and out-of-distribution diagnostics. The demonstration ends with definitions of every displayed endpoint and citations for the data source used to construct each TCGA model target.</w:t>
+        <w:t>The access-controlled TITANPred R package contains 323 fitted models (219 continuous and 104 binary) across 27 cancers [32]. An authorised research user supplies a cancer vector and correctly named 768-dimensional TITAN features; the interface applies every bundled model available for that cancer. Repeated patient identifiers are mean-pooled before inference. Continuous outputs retain source endpoint units and are positioned against repeated out-of-fold reference distributions; binary outputs comprise the fitted PLS-LDA class and uncalibrated LDA score. Default inference exposes 306 models; the 17 limited-evidence binary models require explicit opt-in. Every binary display uses the adjacent label 'TCGA OOF score rank (not probability)' and places training positive/negative counts, prevalence, repeated-CV balanced accuracy, AUROC, PR-AUC, TCGA-prevalence PPV/NPV, fold minima, component variability, repeat stability, the tissue-source-site-grouped metric and any limited-class-size or site-sensitivity warning beside the call. A single-sample research-software output renders all available continuous endpoints as a radar, with the exact reference percentile and original prediction printed at every corner, and displays binary calls with provenance and out-of-distribution diagnostics. The demonstration ends with definitions of every displayed endpoint and citations for the data source used to construct each TCGA model target. A prominent report banner states that the output lacks independent external validation, is uncalibrated for probability and is not for diagnosis, treatment selection or clinical-risk estimation. The package provides a synthetic feature vector constructed from stored training-feature means for interface examples and smoke tests; it is explicitly labelled as not being a patient record.</w:t>
       </w:r>
     </w:p>
     <w:p>
       <w:r>
-        <w:t>COAD was chosen for a research-software demonstration because colorectal cancer, of which colon adenocarcinoma is a major component, accounted for 1,926,425 new cases worldwide in 2022 [31], and COAD contributed 20 supported models (10 continuous and 10 binary). APC, TP53, KRAS and BRAF prediction from colorectal histology had already been evaluated in pooled colorectal and/or exact-COAD studies; these models are therefore replications or extensions under a different representation and validation framework, not bibliographically novel mutation targets. For visualization, we first restricted candidates to cases with a non-empty slide report that described a sigmoid-colon, moderately differentiated, pT3 adenocarcinoma with clear margins, and then required that no case had more than two of ten continuous predictions outside the first to 99th percentile. Among pairs sharing recorded sex and site, TCGA-AA-A01F and TCGA-AA-3972 had the largest Euclidean separation across the complete continuous prediction-percentile profile. This produced clinically comparable examples with predominantly intermediate rather than saturated values. Example A had higher MSI, mutation-rate and TIL predictions and lower aneuploidy predictions, whereas example B showed the converse pattern (Figure 7). The selection is a research-software demonstration of internally derived TCGA estimates, not a validation analysis or an estimate of clinical prevalence.</w:t>
-      </w:r>
-    </w:p>
-    <w:p>
-      <w:r>
-        <w:t>The accompanying pathology text is paraphrased from TCGA-Slide-Reports.csv rather than reproduced verbatim. For TCGA-AA-A01F, the report describes an ulcerated grade-2 sigmoid adenocarcinoma extending through the muscular wall into pericolic fat (pT3), with uninvolved resection ends, lymphatic invasion and two involved nodes among 30 examined (pN1). For TCGA-AA-3972, it describes an ulcerated grade-2 sigmoid colorectal adenocarcinoma extending through the bowel wall into mesocolic fat (pT3), with uninvolved proximal and distal margins; a nodal category was not stated in the supplied slide summary.</w:t>
-      </w:r>
-    </w:p>
-    <w:p>
-      <w:r>
-        <w:t>Public NCI Genomic Data Commons case records provide treatment context [33]. TCGA-AA-A01F received fluorouracil, leucovorin and oxaliplatin, for which the recorded treatment outcome was complete response. TCGA-AA-3972 received capecitabine plus oxaliplatin and, later, fluorouracil, leucovorin, oxaliplatin and bevacizumab; progressive disease was recorded for both treatment records, with recurrence documented later in follow-up. These fields are descriptive public metadata and were not predictors, training targets or validation outcomes. The examples therefore do not evaluate response prediction or treatment effect.</w:t>
+        <w:t>Two COAD participants, TCGA-AA-A01F and TCGA-AA-3972, are retained solely to show the radar and binary-output interface (Figure 7). The pair was chosen post hoc after clinical-text and profile-saturation restrictions and then maximising Euclidean separation across continuous TCGA OOF prediction percentiles; the procedure intentionally enhances visual contrast. Nodal status was not matched: TCGA-AA-A01F was reported as pN1, whereas the available slide summary for TCGA-AA-3972 did not state a nodal category. The cases are not presented as a matched clinical comparison, and treatment, response, recurrence, follow-up and survival are neither shown nor interpreted. This is a visualization example, not performance, prevalence, prognosis or treatment-response evidence.</w:t>
       </w:r>
     </w:p>
     <w:p>
@@ -5088,7 +5078,7 @@
         <w:jc w:val="center"/>
       </w:pPr>
       <w:r>
-        <w:t>Figure 7. TITANPred research-software demonstration in two clinically comparable COAD cases. Panels A and B show all ten internally derived TCGA continuous estimates for TCGA-AA-A01F and TCGA-AA-3972, respectively. Silent mutation rate and SNV neoantigens flank nonsilent mutation rate in the semantic axis order. Every radar corner reports the exact percentile relative to corrected repeated out-of-fold TCGA predictions and the original model estimate in the analysed endpoint units; the percentiles are not clinical reference ranges. Panel C shows binary PLS-LDA calls and explicitly labelled TCGA out-of-fold LDA-score ranks; filled points denote positive calls, and ranks are not probabilities. Training n and class counts accompany each binary endpoint. The cases share sex, sigmoid site, grade, pT3 category and clear margins and were selected after limiting saturated continuous profiles. They are full-cohort research-software examples and do not provide external validation.</w:t>
+        <w:t>Figure 7. Post hoc TITANPred research-software visualization for two COAD participants. Panels A and B show internally derived full-cohort TCGA continuous estimates for TCGA-AA-A01F and TCGA-AA-3972; every radar corner gives the TCGA OOF prediction percentile and original estimate. Panel C shows PLS-LDA calls with the adjacent label 'TCGA OOF score rank (not probability)' and development class counts. The pair was selected after clinical-text and saturation restrictions by maximising continuous-profile separation, intentionally enhancing visual contrast. Treatment and outcomes are not displayed. The figure is an interface illustration, not probability-calibrated output, external validation, representative case sampling, prognosis or treatment-response evidence.</w:t>
       </w:r>
     </w:p>
     <w:p>
@@ -5171,7 +5161,7 @@
     </w:p>
     <w:p>
       <w:r>
-        <w:t>A further practical feature is data-minimising model portability. Preprocessing values, latent weights and coefficients are sufficient for continuous prediction, with compact LDA parameters added for binary classification. The access-controlled TITANPred package applies cancer-matched models to correctly ordered TITAN features without requiring the original patient embeddings or outcomes [32]. Its current private status is stated explicitly; the manuscript makes no public-artifact availability claim. This design reduces the patient-level data that would need to be exchanged in authorised research, although it does not itself confer privacy, satisfy local governance requirements or establish transportability. The matched COAD cases demonstrate software output for internally derived TCGA estimates. Because both examples were chosen within TCGA and were evaluated by full-cohort fits, neither their molecular contrast nor their recorded treatment outcomes constitute new accuracy or response-prediction evidence.</w:t>
+        <w:t>A further practical feature is data-minimising model portability. Preprocessing values, latent weights and coefficients are sufficient for continuous prediction, with compact LDA parameters added for binary classification. The access-controlled TITANPred package applies cancer-matched models to correctly ordered TITAN features without requiring the original patient embeddings or outcomes [32]. Its current private status is stated explicitly; the manuscript makes no public-artifact availability claim. This design reduces the patient-level data that would need to be exchanged in authorised research, although it does not itself confer privacy, satisfy local governance requirements or establish transportability. The synthetic smoke-test vector supports routine interface testing without creating a patient narrative. The two main-text COAD radar examples remain explicitly post hoc and cannot provide new accuracy, prognosis or response-prediction evidence.</w:t>
       </w:r>
     </w:p>
     <w:p>
@@ -5375,12 +5365,12 @@
     </w:p>
     <w:p>
       <w:r>
-        <w:t>Additional file 2 (.pdf): COAD example A (TCGA-AA-A01F) TITANPred research-software output. Illustrative internally derived full-cohort TCGA estimates for the COAD example with high MSI, mutation-rate and immune-feature predictions and low aneuploidy prediction.</w:t>
+        <w:t>Additional file 2 (.pdf): COAD example A (TCGA-AA-A01F) TITANPred research-software output. Post hoc supplementary interface illustration containing internally derived full-cohort TCGA estimates; not probability-calibrated or externally validated.</w:t>
       </w:r>
     </w:p>
     <w:p>
       <w:r>
-        <w:t>Additional file 3 (.pdf): COAD example B (TCGA-AA-3972) TITANPred research-software output. Illustrative internally derived full-cohort TCGA estimates for the contrasting COAD example with high aneuploidy prediction and lower MSI and immune-feature predictions.</w:t>
+        <w:t>Additional file 3 (.pdf): COAD example B (TCGA-AA-3972) TITANPred research-software output. Post hoc supplementary interface illustration containing internally derived full-cohort TCGA estimates; not probability-calibrated or externally validated.</w:t>
       </w:r>
     </w:p>
     <w:p>

</xml_diff>

<commit_message>
Clarify screening tiers and repeated validation estimates
</commit_message>
<xml_diff>
--- a/manuscript/manuscript_JTM_patient_level_TITAN.docx
+++ b/manuscript/manuscript_JTM_patient_level_TITAN.docx
@@ -329,7 +329,7 @@
         <w:t xml:space="preserve">Background. </w:t>
       </w:r>
       <w:r>
-        <w:t>Pan-cancer histology studies have already screened broad molecular endpoint spaces: Arslan and colleagues trained 12,093 models for 4,031 biomarkers across the same 32 TCGA cancers. We therefore evaluated TITAN as a reproducible patient-level benchmark and reusable model resource, rather than claiming a first pan-cancer screen or unprecedented mutation targets.</w:t>
+        <w:t>Pan-cancer histology studies span molecular endpoints: Arslan et al. trained 12,093 models for 4,031 biomarkers across 32 TCGA cancers. We evaluated TITAN as a patient-level benchmark and model resource, without claiming the first pan-cancer screen or unprecedented mutation targets.</w:t>
       </w:r>
     </w:p>
     <w:p>
@@ -340,7 +340,7 @@
         <w:t xml:space="preserve">Methods. </w:t>
       </w:r>
       <w:r>
-        <w:t>We mean-pooled 11,449 primary diagnostic slide embeddings into 9,404 patient vectors across 32 TCGA cancers; 843 patients contributed multiple slides. We tested 1,614 continuous and 459 binary cancer–endpoint pairs using patient-level nested PLS1 or PLS–LDA. Targets were classified as direct alteration calls, sequencing-derived burdens, inferred immune-cell fractions, transcriptomic signatures, pathology-derived quantities or composite scores. Effect-eligible models underwent 999 complete-process permutations with conservative stopping, exact Monte Carlo intervals and Benjamini–Hochberg corrections locally, across cancers and atlas-wide. Eight prespecified leading models were extended to 9,999 permutations.</w:t>
+        <w:t>We mean-pooled 11,449 primary diagnostic slide embeddings into 9,404 patient vectors across 32 TCGA cancers; 843 patients contributed multiple slides. We tested 1,614 continuous and 459 binary cancer–endpoint pairs using patient-level nested PLS1 or PLS–LDA. Targets were classified as direct alteration calls, sequencing-derived burdens, inferred immune-cell fractions, transcriptomic signatures, pathology-derived quantities or composite scores. Models meeting the prespecified screening-statistic threshold underwent 999 complete-process permutations with conservative stopping, exact Monte Carlo intervals and Benjamini–Hochberg corrections locally, across cancers and atlas-wide. Eight prespecified leading models were extended to 9,999 permutations.</w:t>
       </w:r>
     </w:p>
     <w:p>
@@ -351,7 +351,7 @@
         <w:t xml:space="preserve">Results. </w:t>
       </w:r>
       <w:r>
-        <w:t>Within-cancer screening identified 219 continuous and 104 binary higher- or moderate-effect candidates. A stricter ≥50-per-class sensitivity retained 87/104 binary candidates; 17 smaller-class models were separated as exploratory and excluded from default inference. Highlighted repeated-CV results included TGCT–TGF-beta Response (Q² 0.670, selection-conditioned 95% patient-resampling interval 0.573–0.741; RMSE 0.303, Spearman 0.791) and LGG–TP53 (sensitivity 0.839, specificity 0.885, balanced accuracy 0.862, selection-conditioned 95% patient-resampling interval 0.833–0.888; AUROC 0.908). Prior studies supported 38/41 screen-positive cancer–gene pairs. 320/323 local candidates passed single BH correction across all 2,073 eligible tests. Tissue-source-site grouping reduced 83/323 candidates (25.7%) below the original effect threshold. In a 47-target metadata-stratified benchmark selected without PLS performance, median ridge-minus-PLS differences were 0.008 AUROC and 0.053 Q²; paired intervals favoured ridge for 8/35 binary and 10/12 continuous targets, and PLS for none.</w:t>
+        <w:t>Screening identified 219 continuous and 104 binary candidates in prespecified screening tiers A or B. A stricter ≥50-per-class sensitivity retained 87/104 binary candidates; 17 smaller-class models were exploratory and excluded from default inference. Highlighted repeated-CV results included TGCT–TGF-beta Response (five-repeat mean Q² 0.670, selection-conditioned 95% patient-resampling interval 0.573–0.741; RMSE 0.303, Spearman 0.791) and LGG–TP53 (five-repeat mean sensitivity 0.839, specificity 0.885, balanced accuracy 0.862, selection-conditioned 95% patient-resampling interval 0.833–0.888; AUROC 0.908). Prior studies supported 38/41 screen-positive cancer–gene pairs. 320/323 local candidates passed single BH correction across all 2,073 eligible tests. Tissue-source-site grouping reduced 83/323 candidates (25.7%) below the original screening threshold. In a 47-target metadata-stratified benchmark selected without PLS performance, median ridge-minus-PLS differences were 0.008 AUROC and 0.053 Q²; paired intervals favoured ridge for 8/35 binary and 10/12 continuous targets, and PLS for none.</w:t>
       </w:r>
     </w:p>
     <w:p>
@@ -1649,7 +1649,7 @@
     </w:p>
     <w:p>
       <w:r>
-        <w:t>Because each disease defines a separate prediction and intended-use population, Benjamini–Hochberg FDR was controlled separately for continuous and binary screens within cancer and prespecified endpoint family [27]. Two stricter sensitivities were retained: BH across cancers within the same outcome type and family, and a single BH correction across all eligible continuous and binary cancer–endpoint tests in the atlas. Eight models were locked before high-resolution results were generated: four leading continuous immune programmes and four leading binary claims spanning mutation, strict MSI and fusion endpoints. Their saved first 999 permutations were extended without early stopping to 9,999 complete-process permutations. This targeted analysis improves Monte Carlo resolution for leading claims but was not substituted into the prespecified 999-permutation FDR screen. Effect denotes Q² for continuous outcomes and 2×balanced accuracy−1 for binary outcomes. Screen-positive candidates were described as higher effect (primary q&lt;0.05 and effect≥0.40) or moderate effect (primary q&lt;0.05 and effect 0.20–0.39). Screen-negative tested pairs and pairs ineligible by sample-size rules were reported separately. Models are ordered by effect magnitude, with repeated and site-grouped stability reported alongside; tied permutation q-values are not used for ranking. These categories prioritise candidates for further testing and are not clinical grades.</w:t>
+        <w:t>Because each disease defines a separate prediction and intended-use population, Benjamini–Hochberg FDR was controlled separately for continuous and binary screens within cancer and prespecified endpoint family [27]. Two stricter sensitivities were retained: BH across cancers within the same outcome type and family, and a single BH correction across all eligible continuous and binary cancer–endpoint tests in the atlas. Eight models were locked before high-resolution results were generated: four leading continuous immune programmes and four leading binary claims spanning mutation, strict MSI and fusion endpoints. Their saved first 999 permutations were extended without early stopping to 9,999 complete-process permutations. This targeted analysis improves Monte Carlo resolution for leading claims but was not substituted into the prespecified 999-permutation FDR screen. The screening statistic is Q² for continuous outcomes and 2×balanced accuracy−1 for binary outcomes. Screen-positive candidates were assigned to prespecified screening tier A (primary q&lt;0.05 and screening statistic≥0.40) or prespecified screening tier B (primary q&lt;0.05 and screening statistic from 0.20 to &lt;0.40). For binary outcomes these cut-offs correspond to balanced accuracy≥0.70 and 0.60 to &lt;0.70, respectively; for continuous outcomes they correspond to Q²≥0.40 and 0.20 to &lt;0.40. Screen-negative tested pairs and pairs ineligible by sample-size rules were reported separately. Models are ordered by the outcome-appropriate predictive metric, with repeated and site-grouped stability reported alongside; tied permutation q-values are not used for ranking. The tiers are prespecified prioritisation rules, not established clinical or statistical effect categories, and their numerical values are not interpreted as directly commensurate across outcome types.</w:t>
       </w:r>
     </w:p>
     <w:p>
@@ -1662,7 +1662,7 @@
     </w:p>
     <w:p>
       <w:r>
-        <w:t>Only endpoints passing the initial atlas screen entered five independently seeded repeated nested-CV partitions; each repeat seed governed both fold construction and rSVD. Sensitivity, specificity, balanced accuracy and AUROC were calculated within each repeat for binary endpoints; Q², RMSE and Spearman correlation were calculated within each repeat for continuous endpoints. Reported repeated-CV point estimates were the arithmetic mean of the five repeat-specific metrics, so LDA scores from independently fitted repeats were never pooled onto an assumed common scale. For highlighted models, 1,000 patient-cluster bootstrap resamples retained all five existing held-out predictions for each sampled patient, recalculated the metric within repeat and then averaged the five repeat metrics; the 2.5th and 97.5th percentiles formed the reported 95% selection-conditioned patient-resampling interval for repeated out-of-fold predictions. This interval represents patient sampling variability conditional on the five fitted nested-CV prediction sets. It includes neither the initial screen and endpoint highlighting nor new partition generation, scaling or component reselection, model refitting inside bootstrap replicates, winner's-curse correction, or external cohort, site, scanner and population variation. Tissue-source-site-grouped validation assigned all patients sharing a two-character TCGA tissue-source-site code to the same outer fold. The same site constraint was passed to every inner component-selection split within the outer training set; thus neither outer performance estimation nor inner tuning divided a tissue-source site across folds. For every model and outer fold, we recorded test and training patients, sites, and—where applicable—positive and negative cases. A sensitivity analysis replaced each mean-pooled vector with the lexicographically first eligible diagnostic slide while preserving patients and seeds. Full-data research models were tuned by ten-fold CV and saved with feature order and checksum, training ranges, aggregation rule, endpoint transformation and output units, class coding and priors, decision rule, calibration status, class counts, exact software version and commit, computation backend, rSVD controls, external-validation status and intended-use metadata.</w:t>
+        <w:t>The initial nested-CV estimate used for candidate screening, permutation testing and tier assignment is termed the primary screening estimate. Only endpoints passing that initial atlas screen entered five additional independently seeded nested-CV partitions; their reported repeated-validation estimate is the arithmetic mean of the five repeat-specific metrics. The two estimates answer different questions and need not be numerically identical because they use different fold partitions and rSVD seeds. The primary screening estimate preserves the prespecified selection and multiplicity path, whereas the five-repeat estimate describes post-selection resampling stability; it does not replace or retroactively alter screen membership. For example, THYM–Th17 had primary screening Q²=0.638 and five-repeat mean Q²=0.594. Each repeat seed governed both fold construction and rSVD. Sensitivity, specificity, balanced accuracy and AUROC were calculated within each repeat for binary endpoints; Q², RMSE and Spearman correlation were calculated within each repeat for continuous endpoints. LDA scores from independently fitted repeats were never pooled onto an assumed common scale. For highlighted models, 1,000 patient-cluster bootstrap resamples retained all five existing held-out predictions for each sampled patient, recalculated the metric within repeat and then averaged the five repeat metrics; the 2.5th and 97.5th percentiles formed the reported 95% selection-conditioned patient-resampling interval for repeated out-of-fold predictions. This interval represents patient sampling variability conditional on the five fitted nested-CV prediction sets. It includes neither the initial screen and endpoint highlighting nor new partition generation, scaling or component reselection, model refitting inside bootstrap replicates, winner's-curse correction, or external cohort, site, scanner and population variation. Tissue-source-site-grouped validation assigned all patients sharing a two-character TCGA tissue-source-site code to the same outer fold. The same site constraint was passed to every inner component-selection split within the outer training set; thus neither outer performance estimation nor inner tuning divided a tissue-source site across folds. For every model and outer fold, we recorded test and training patients, sites, and—where applicable—positive and negative cases. A sensitivity analysis replaced each mean-pooled vector with the lexicographically first eligible diagnostic slide while preserving patients and seeds. Full-data research models were tuned by ten-fold CV and saved with feature order and checksum, training ranges, aggregation rule, endpoint transformation and output units, class coding and priors, decision rule, calibration status, class counts, exact software version and commit, computation backend, rSVD controls, external-validation status and intended-use metadata.</w:t>
       </w:r>
     </w:p>
     <w:p>
@@ -1852,7 +1852,7 @@
                 <w:b/>
                 <w:sz w:val="17"/>
               </w:rPr>
-              <w:t>Higher effect</w:t>
+              <w:t>Screening tier A</w:t>
             </w:r>
           </w:p>
         </w:tc>
@@ -1866,7 +1866,7 @@
                 <w:b/>
                 <w:sz w:val="17"/>
               </w:rPr>
-              <w:t>Moderate effect</w:t>
+              <w:t>Screening tier B</w:t>
             </w:r>
           </w:p>
         </w:tc>
@@ -2940,7 +2940,12 @@
     </w:p>
     <w:p>
       <w:r>
-        <w:t>Among continuous targets, 37 were within-cancer screen-positive with higher effects and 182 with moderate effects. The strongest effects were TGCT–TGF-beta Response (0.670); THYM–Th17 Cells (0.638); THCA–Lymphocyte Infiltration Signature Score (0.580); BRCA–Wound Healing (0.527); THCA–TGF-beta Response (0.522); SARC–Macrophage Regulation (0.520); KIRP–Proliferation (0.515); LUAD–Proliferation (0.512); BRCA–Proliferation (0.510); THCA–Th1 Cells (0.503). These results were cancer specific: the same endpoint could be strongly predictable in one tumour type and screen-negative in another.</w:t>
+        <w:t>Among continuous targets, 37 were assigned to prespecified screening tier A and 182 to tier B. The largest primary screening Q² values were TGCT–TGF-beta Response (0.670); THYM–Th17 Cells (0.638); THCA–Lymphocyte Infiltration Signature Score (0.580); BRCA–Wound Healing (0.527); THCA–TGF-beta Response (0.522); SARC–Macrophage Regulation (0.520); KIRP–Proliferation (0.515); LUAD–Proliferation (0.512); BRCA–Proliferation (0.510); THCA–Th1 Cells (0.503). These initial nested-CV values determined screening and tier assignment; five-repeat means are reported separately for stability. These results were cancer specific: the same endpoint could be predictable in one tumour type and screen-negative in another.</w:t>
+      </w:r>
+    </w:p>
+    <w:p>
+      <w:r>
+        <w:t>As an explicit example of the two reporting stages, THYM–Th17 had primary screening Q²=0.638 and a five-repeat mean repeated-validation Q²=0.594. This difference reflects independently seeded nested-CV partitions and is not a discrepancy or a change to the primary screen result.</w:t>
       </w:r>
     </w:p>
     <w:p>
@@ -2993,7 +2998,7 @@
         <w:jc w:val="center"/>
       </w:pPr>
       <w:r>
-        <w:t>Figure 2. Strongest within-cancer screen-positive continuous cancer–endpoint results. Q² is calculated from genuine patient-level outer-fold predictions; all tests remain available in the machine-readable benchmark results.</w:t>
+        <w:t>Figure 2. Strongest within-cancer screen-positive continuous cancer–endpoint results, ranked by the primary screening Q² from the initial nested-CV run. Five-repeat mean repeated-validation estimates are reported separately in the model tables and machine-readable summary. All Q² values are calculated from genuine patient-level outer-fold predictions.</w:t>
       </w:r>
     </w:p>
     <w:p>
@@ -3006,7 +3011,7 @@
     </w:p>
     <w:p>
       <w:r>
-        <w:t>The binary screen yielded 29 within-cancer higher-effect and 75 moderate-effect candidates. Leading results were THYM–GTF2I [mutation] (0.883); READ–APC [mutation] (0.862); READ–TP53 [mutation] (0.861); LGG–TP53 [mutation] (0.846); THCA–BRAF [mutation] (0.830); LGG–TP53 [pathway] (0.822); LGG–HIPPO [pathway] (0.811); COAD–APC [mutation] (0.793); UCEC–Any called fusion [fusion] (0.792); LGG–IDH1 [mutation] (0.786); COAD–MSI-H strict (MANTIS &gt;0.6) [strict MSI] (0.784); COAD–TP53 [mutation] (0.779). The complete table distinguishes tested-negative pairs from outcomes that failed prevalence or sample-size eligibility.</w:t>
+        <w:t>The binary screen yielded 29 candidates in prespecified screening tier A and 75 in tier B. The largest primary screening balanced accuracies were THYM–GTF2I [mutation] (0.883); READ–APC [mutation] (0.862); READ–TP53 [mutation] (0.861); LGG–TP53 [mutation] (0.846); THCA–BRAF [mutation] (0.830); LGG–TP53 [pathway] (0.822); LGG–HIPPO [pathway] (0.811); COAD–APC [mutation] (0.793); UCEC–Any called fusion [fusion] (0.792); LGG–IDH1 [mutation] (0.786); COAD–MSI-H strict (MANTIS &gt;0.6) [strict MSI] (0.784); COAD–TP53 [mutation] (0.779). These initial nested-CV values determined screening and tier assignment; five-repeat means are reported separately for stability. The complete table distinguishes tested-negative pairs from outcomes that failed prevalence or sample-size eligibility.</w:t>
       </w:r>
     </w:p>
     <w:p>
@@ -3052,7 +3057,7 @@
     </w:p>
     <w:p>
       <w:r>
-        <w:t>Among completed 999-permutation tests, 308 had zero null statistics at least as extreme as observed. Their finite empirical p-value was 0.001, but the exact two-sided 95% Monte Carlo interval for the underlying exceedance probability was 0–0.003686. The prespecified high-resolution subset extended 8 leading models to 9,999 full nested permutations; 8 had zero exceedances and refined p-values were all 0.0001. The refined values are a targeted precision sensitivity and were not inserted into the primary FDR calculations. Because many primary p- and q-values remain tied at their attainable minimum, figures and tables are ordered by predictive effect magnitude, with repeated and site-grouped stability reported alongside; q-values are not used for ranking.</w:t>
+        <w:t>Among completed 999-permutation tests, 308 had zero null statistics at least as extreme as observed. Their finite empirical p-value was 0.001, but the exact two-sided 95% Monte Carlo interval for the underlying exceedance probability was 0–0.003686. The prespecified high-resolution subset extended 8 leading models to 9,999 full nested permutations; 8 had zero exceedances and refined p-values were all 0.0001. The refined values are a targeted precision sensitivity and were not inserted into the primary FDR calculations. Because many primary p- and q-values remain tied at their attainable minimum, figures and tables are ordered by the outcome-appropriate predictive metric, with repeated and site-grouped stability reported alongside; q-values are not used for ranking.</w:t>
       </w:r>
     </w:p>
     <w:p>
@@ -3100,7 +3105,7 @@
         <w:jc w:val="center"/>
       </w:pPr>
       <w:r>
-        <w:t>Figure 3. Strongest within-cancer screen-positive binary molecular predictions among the 87 models with at least 50 positive and 50 negative patients. Point size represents the number of positive patients; colour indicates endpoint family and symbols report across-cancer correction status. The 17 exploratory/limited-evidence models are excluded from this main panel and shown separately in Supplementary Figure S3.</w:t>
+        <w:t>Figure 3. Strongest within-cancer screen-positive binary molecular predictions among the 87 models with at least 50 positive and 50 negative patients, ranked by primary screening balanced accuracy from the initial nested-CV run. Five-repeat mean repeated-validation estimates are reported separately. Point size represents the number of positive patients; colour indicates endpoint family and symbols report across-cancer correction status. The 17 exploratory/limited-evidence models are excluded from this main panel and shown separately in Supplementary Figure S3.</w:t>
       </w:r>
     </w:p>
     <w:p>
@@ -3148,7 +3153,7 @@
         <w:jc w:val="center"/>
       </w:pPr>
       <w:r>
-        <w:t>Figure 4. Examples comparing observed outcomes with held-out predictions. Panel A shows the strongest primary patient-level nested-CV continuous result (TGCT TGF-beta Response); each point is one patient's observed value and genuine held-out prediction. Panel B shows the binary model with the largest mean repeated-CV balanced accuracy. Because independently fitted LDA scores need not share a raw scale, held-out scores are standardized within repeat before patient-level averaging for display; repeat-specific AUROCs use untransformed scores. These deliberately strong examples are illustrative, selection-conditioned internal TCGA results rather than external validation or calibration.</w:t>
+        <w:t>Figure 4. Examples comparing observed outcomes with held-out predictions. Panel A shows the strongest primary screening estimate from the initial patient-level nested-CV continuous screen (TGCT TGF-beta Response); each point is one patient's observed value and genuine held-out prediction. Panel B shows the binary model with the largest five-repeat mean balanced accuracy. Because independently fitted LDA scores need not share a raw scale, held-out scores are standardized within repeat before patient-level averaging for display; repeat-specific AUROCs use untransformed scores. These deliberately strong examples are illustrative, selection-conditioned internal TCGA results rather than external validation or calibration.</w:t>
       </w:r>
     </w:p>
     <w:p>
@@ -3156,7 +3161,7 @@
         <w:pStyle w:val="Caption"/>
       </w:pPr>
       <w:r>
-        <w:t>Table 3. Highlighted repeated nested-cross-validation performance, binary reliability and tissue-source-site-grouped internal sensitivity. SC interval denotes the 95% selection-conditioned patient-resampling interval for repeated out-of-fold predictions: it resamples patients from five fixed prediction sets without repeating screening, fold generation, tuning or model fitting. Panel A reports discrimination/error metrics and grouped sensitivity. Panel B adds class-size and prevalence-dependent binary metrics. These intervals, grouped estimates and predictive values are internal to TCGA, not generalisation confidence intervals or external-validation results.</w:t>
+        <w:t>Table 3. Highlighted initial-screen and repeated-validation performance, binary reliability and tissue-source-site-grouped internal sensitivity. The primary screening estimate is the initial nested-CV value used for selection, permutation testing and tier assignment. Repeated estimates are means across five additional independently seeded nested-CV partitions. SC interval denotes the 95% selection-conditioned patient-resampling interval for repeated out-of-fold predictions: it resamples patients from five fixed prediction sets without repeating screening, fold generation, tuning or model fitting. Panel A reports both stages explicitly; differences between them are expected resampling variation, not inconsistencies. Panel B adds class-size and prevalence-dependent binary metrics. These intervals, grouped estimates and predictive values are internal to TCGA, not generalisation confidence intervals or external-validation results.</w:t>
       </w:r>
     </w:p>
     <w:p>
@@ -3164,7 +3169,7 @@
         <w:pStyle w:val="Caption"/>
       </w:pPr>
       <w:r>
-        <w:t>Panel A. Primary and secondary performance metrics.</w:t>
+        <w:t>Panel A. Primary screening and five-repeat validation metrics.</w:t>
       </w:r>
     </w:p>
     <w:tbl>
@@ -3211,7 +3216,7 @@
                 <w:b/>
                 <w:sz w:val="17"/>
               </w:rPr>
-              <w:t>Type</w:t>
+              <w:t>Primary screen Q²/BA</w:t>
             </w:r>
           </w:p>
         </w:tc>
@@ -3225,7 +3230,7 @@
                 <w:b/>
                 <w:sz w:val="17"/>
               </w:rPr>
-              <w:t>Q² or Se/Sp (95% SC interval)</w:t>
+              <w:t>Five-repeat Q² or Se/Sp (95% SC interval)</w:t>
             </w:r>
           </w:p>
         </w:tc>
@@ -3239,7 +3244,7 @@
                 <w:b/>
                 <w:sz w:val="17"/>
               </w:rPr>
-              <w:t>RMSE or BA (95% SC interval)</w:t>
+              <w:t>Five-repeat RMSE or BA (95% SC interval)</w:t>
             </w:r>
           </w:p>
         </w:tc>
@@ -3253,7 +3258,7 @@
                 <w:b/>
                 <w:sz w:val="17"/>
               </w:rPr>
-              <w:t>Spearman or AUROC (95% SC interval)</w:t>
+              <w:t>Five-repeat Spearman or AUROC (95% SC interval)</w:t>
             </w:r>
           </w:p>
         </w:tc>
@@ -3300,7 +3305,7 @@
               <w:rPr>
                 <w:sz w:val="16"/>
               </w:rPr>
-              <w:t>continuous</w:t>
+              <w:t>Q² 0.670</w:t>
             </w:r>
           </w:p>
         </w:tc>
@@ -3389,7 +3394,7 @@
               <w:rPr>
                 <w:sz w:val="16"/>
               </w:rPr>
-              <w:t>continuous</w:t>
+              <w:t>Q² 0.638</w:t>
             </w:r>
           </w:p>
         </w:tc>
@@ -3478,7 +3483,7 @@
               <w:rPr>
                 <w:sz w:val="16"/>
               </w:rPr>
-              <w:t>continuous</w:t>
+              <w:t>Q² 0.580</w:t>
             </w:r>
           </w:p>
         </w:tc>
@@ -3567,7 +3572,7 @@
               <w:rPr>
                 <w:sz w:val="16"/>
               </w:rPr>
-              <w:t>continuous</w:t>
+              <w:t>Q² 0.527</w:t>
             </w:r>
           </w:p>
         </w:tc>
@@ -3656,7 +3661,7 @@
               <w:rPr>
                 <w:sz w:val="16"/>
               </w:rPr>
-              <w:t>binary</w:t>
+              <w:t>BA 0.846</w:t>
             </w:r>
           </w:p>
         </w:tc>
@@ -3745,7 +3750,7 @@
               <w:rPr>
                 <w:sz w:val="16"/>
               </w:rPr>
-              <w:t>binary</w:t>
+              <w:t>BA 0.883</w:t>
             </w:r>
           </w:p>
         </w:tc>
@@ -3834,7 +3839,7 @@
               <w:rPr>
                 <w:sz w:val="16"/>
               </w:rPr>
-              <w:t>binary</w:t>
+              <w:t>BA 0.861</w:t>
             </w:r>
           </w:p>
         </w:tc>
@@ -3923,7 +3928,7 @@
               <w:rPr>
                 <w:sz w:val="16"/>
               </w:rPr>
-              <w:t>binary</w:t>
+              <w:t>BA 0.830</w:t>
             </w:r>
           </w:p>
         </w:tc>
@@ -4528,7 +4533,7 @@
     </w:p>
     <w:p>
       <w:r>
-        <w:t xml:space="preserve">Tissue-source-site-grouped internal validation was feasible for 323 screen-positive models. Although the median grouped-minus-random performance change was only -0.026, 83/323 models (25.7%) fell below the original effect threshold: 58/219 continuous models and 25/104 binary models. Prominent attenuations were READ–APC (balanced accuracy 0.862 to 0.495); COAD–APC (balanced accuracy 0.793 to 0.543); PCPG–Cell Cycle (balanced accuracy 0.686 to 0.476); LIHC–CTNNB1 (balanced accuracy 0.668 to 0.565); OV–TCR Shannon (Q² 0.206 to -0.551); COAD–SNV Neoantigens (Q² 0.239 to -0.013). The site-grouped folds contain fewer and less evenly distributed training and test patients, so the decline cannot be attributed solely to site artefact; nevertheless, the near-chance colorectal APC results are not adequately summarised by the median and are labelled site-sensitive in the main model table, registry and research-software output. </w:t>
+        <w:t xml:space="preserve">Tissue-source-site-grouped internal validation was feasible for 323 screen-positive models. Although the median grouped-minus-random performance change was only -0.026, 83/323 models (25.7%) fell below the original prespecified screening threshold: 58/219 continuous models and 25/104 binary models. Prominent attenuations were READ–APC (balanced accuracy 0.862 to 0.495); COAD–APC (balanced accuracy 0.793 to 0.543); PCPG–Cell Cycle (balanced accuracy 0.686 to 0.476); LIHC–CTNNB1 (balanced accuracy 0.668 to 0.565); OV–TCR Shannon (Q² 0.206 to -0.551); COAD–SNV Neoantigens (Q² 0.239 to -0.013). The site-grouped folds contain fewer and less evenly distributed training and test patients, so the decline cannot be attributed solely to site artefact; nevertheless, the near-chance colorectal APC results are not adequately summarised by the median and are labelled site-sensitive in the main model table, registry and research-software output. </w:t>
       </w:r>
     </w:p>
     <w:p>
@@ -5091,7 +5096,7 @@
     </w:p>
     <w:p>
       <w:r>
-        <w:t>This study is best interpreted as a systematic patient-level benchmark and reusable fitted-model resource, not as the first pan-cancer molecular-prediction study or a catalogue of unprecedented mutation targets. It answers a target-by-target, cancer-specific question using one fixed pretrained TITAN representation. Selected immune programmes, mutations and higher-level genomic phenotypes were predictable, but most eligible pairs did not satisfy both multiplicity and effect thresholds. That heterogeneity—and transparent negative and ineligible reporting—is the primary empirical result. The primary analysis controls local cancer-specific families; it does not attach one global 5% FDR interpretation to the aggregate 323 candidates. In sensitivity analyses, 219 continuous and 39 mutation pairs passed the across-cancer family correction, and 320/323 local candidates passed a single BH correction across all eligible atlas tests. These large counts partly reflect extensive ties at the 0.001 empirical-p floor: a zero-exceedance 999-permutation result still has a 95% Monte Carlo interval extending to 0.003686. The 9,999-permutation refinement sharpened precision for eight leading claims but does not resolve the entire atlas or justify ranking by q-value; predictive magnitude and stability remain the appropriate ordering criteria.</w:t>
+        <w:t>This study is best interpreted as a systematic patient-level benchmark and reusable fitted-model resource, not as the first pan-cancer molecular-prediction study or a catalogue of unprecedented mutation targets. It answers a target-by-target, cancer-specific question using one fixed pretrained TITAN representation. Selected immune programmes, mutations and higher-level genomic phenotypes were predictable, but most eligible pairs did not satisfy both multiplicity and prespecified screening-statistic thresholds. That heterogeneity—and transparent negative and ineligible reporting—is the primary empirical result. The primary analysis controls local cancer-specific families; it does not attach one global 5% FDR interpretation to the aggregate 323 candidates. In sensitivity analyses, 219 continuous and 39 mutation pairs passed the across-cancer family correction, and 320/323 local candidates passed a single BH correction across all eligible atlas tests. These large counts partly reflect extensive ties at the 0.001 empirical-p floor: a zero-exceedance 999-permutation result still has a 95% Monte Carlo interval extending to 0.003686. The 9,999-permutation refinement sharpened precision for eight leading claims but does not resolve the entire atlas or justify ranking by q-value; outcome-appropriate predictive magnitude and stability remain the appropriate ordering criteria.</w:t>
       </w:r>
     </w:p>
     <w:p>
@@ -5151,7 +5156,7 @@
     </w:p>
     <w:p>
       <w:r>
-        <w:t>Tissue-source-site sensitivity is a central result rather than a generic robustness footnote. Grouping revealed heterogeneity that the median attenuation concealed: 83/323 screen-positive models (25.7%) fell below their original effect threshold. READ–APC and COAD–APC declined from balanced accuracies 0.862 and 0.793 to 0.495 and 0.543, respectively. Smaller and less balanced training folds contribute to grouped-validation loss, but performance close to chance requires these models to be labelled site-sensitive rather than robust biological signals. The model registry and inference output therefore expose the grouped metric, delta, number of sites, threshold-retention status and a prominent warning for every affected endpoint.</w:t>
+        <w:t>Tissue-source-site sensitivity is a central result rather than a generic robustness footnote. Grouping revealed heterogeneity that the median attenuation concealed: 83/323 screen-positive models (25.7%) fell below their original prespecified screening threshold. READ–APC and COAD–APC declined from balanced accuracies 0.862 and 0.793 to 0.495 and 0.543, respectively. Smaller and less balanced training folds contribute to grouped-validation loss, but performance close to chance requires these models to be labelled site-sensitive rather than robust biological signals. The model registry and inference output therefore expose the grouped metric, delta, number of sites, threshold-retention status and a prominent warning for every affected endpoint.</w:t>
       </w:r>
     </w:p>
     <w:p>

</xml_diff>

<commit_message>
Streamline main manuscript tables
</commit_message>
<xml_diff>
--- a/manuscript/manuscript_JTM_patient_level_TITAN.docx
+++ b/manuscript/manuscript_JTM_patient_level_TITAN.docx
@@ -401,7 +401,7 @@
     </w:p>
     <w:p>
       <w:r>
-        <w:t>The narrower unresolved gap is a reproducible benchmark that applies one fixed pretrained representation to every target; deterministically aggregates slides before outcome matching; performs nested validation with the patient as the unit; preserves tested-negative and sample-size-ineligible results; reports target-level tissue-source-site sensitivity; models selected derived immune and genomic-context features continuously; and constructs compact fitted predictors with research-use provenance metadata. These design and resource features—not unprecedented endpoint classes—define the contribution of this study (Table 1).</w:t>
+        <w:t>The narrower unresolved gap is a reproducible benchmark that applies one fixed pretrained representation to every target; deterministically aggregates slides before outcome matching; performs nested validation with the patient as the unit; preserves tested-negative and sample-size-ineligible results; reports target-level tissue-source-site sensitivity; models selected derived immune and genomic-context features continuously; and constructs compact fitted predictors with research-use provenance metadata. These design and resource features—not unprecedented endpoint classes—define the contribution of this study.</w:t>
       </w:r>
     </w:p>
     <w:p>
@@ -428,1066 +428,6 @@
           <w:pgMar w:top="1134" w:right="1247" w:bottom="1134" w:left="1247" w:header="720" w:footer="720" w:gutter="0"/>
           <w:cols w:space="720"/>
           <w:docGrid w:linePitch="360"/>
-          <w:lnNumType w:countBy="1" w:restart="continuous"/>
-        </w:sectPr>
-      </w:pPr>
-    </w:p>
-    <w:p>
-      <w:pPr>
-        <w:pStyle w:val="Caption"/>
-      </w:pPr>
-      <w:r>
-        <w:t>Table 1. Comparison with major pan-cancer histology–molecular prediction studies. Panel A summarises cohort, endpoint and representation design; Panel B summarises validation, robustness, reporting and reusable predictor availability.</w:t>
-      </w:r>
-    </w:p>
-    <w:p>
-      <w:pPr>
-        <w:pStyle w:val="Caption"/>
-      </w:pPr>
-      <w:r>
-        <w:t>Panel A. Cohort, endpoints, representation and patient aggregation.</w:t>
-      </w:r>
-    </w:p>
-    <w:tbl>
-      <w:tblPr>
-        <w:tblStyle w:val="TableGrid"/>
-        <w:tblW w:type="auto" w:w="0"/>
-        <w:jc w:val="center"/>
-        <w:tblLook w:firstColumn="1" w:firstRow="1" w:lastColumn="0" w:lastRow="0" w:noHBand="0" w:noVBand="1" w:val="04A0"/>
-      </w:tblPr>
-      <w:tblGrid>
-        <w:gridCol w:w="3028"/>
-        <w:gridCol w:w="3028"/>
-        <w:gridCol w:w="3028"/>
-        <w:gridCol w:w="3028"/>
-        <w:gridCol w:w="3028"/>
-      </w:tblGrid>
-      <w:tr>
-        <w:trPr>
-          <w:tblHeader w:val="true"/>
-          <w:cantSplit/>
-        </w:trPr>
-        <w:tc>
-          <w:tcPr>
-            <w:tcW w:type="dxa" w:w="1701"/>
-          </w:tcPr>
-          <w:p>
-            <w:r>
-              <w:rPr>
-                <w:b/>
-                <w:sz w:val="17"/>
-              </w:rPr>
-              <w:t>Study</w:t>
-            </w:r>
-          </w:p>
-        </w:tc>
-        <w:tc>
-          <w:tcPr>
-            <w:tcW w:type="dxa" w:w="2268"/>
-          </w:tcPr>
-          <w:p>
-            <w:r>
-              <w:rPr>
-                <w:b/>
-                <w:sz w:val="17"/>
-              </w:rPr>
-              <w:t>Patients; cancers</w:t>
-            </w:r>
-          </w:p>
-        </w:tc>
-        <w:tc>
-          <w:tcPr>
-            <w:tcW w:type="dxa" w:w="1701"/>
-          </w:tcPr>
-          <w:p>
-            <w:r>
-              <w:rPr>
-                <w:b/>
-                <w:sz w:val="17"/>
-              </w:rPr>
-              <w:t>Slides</w:t>
-            </w:r>
-          </w:p>
-        </w:tc>
-        <w:tc>
-          <w:tcPr>
-            <w:tcW w:type="dxa" w:w="4252"/>
-          </w:tcPr>
-          <w:p>
-            <w:r>
-              <w:rPr>
-                <w:b/>
-                <w:sz w:val="17"/>
-              </w:rPr>
-              <w:t>Endpoint classes</w:t>
-            </w:r>
-          </w:p>
-        </w:tc>
-        <w:tc>
-          <w:tcPr>
-            <w:tcW w:type="dxa" w:w="5102"/>
-          </w:tcPr>
-          <w:p>
-            <w:r>
-              <w:rPr>
-                <w:b/>
-                <w:sz w:val="17"/>
-              </w:rPr>
-              <w:t>Representation; patient aggregation</w:t>
-            </w:r>
-          </w:p>
-        </w:tc>
-      </w:tr>
-      <w:tr>
-        <w:trPr>
-          <w:cantSplit/>
-        </w:trPr>
-        <w:tc>
-          <w:tcPr>
-            <w:tcW w:type="dxa" w:w="1701"/>
-            <w:vAlign w:val="center"/>
-          </w:tcPr>
-          <w:p>
-            <w:r>
-              <w:rPr>
-                <w:sz w:val="16"/>
-              </w:rPr>
-              <w:t>Fu et al. [4]</w:t>
-            </w:r>
-          </w:p>
-        </w:tc>
-        <w:tc>
-          <w:tcPr>
-            <w:tcW w:type="dxa" w:w="2268"/>
-            <w:vAlign w:val="center"/>
-          </w:tcPr>
-          <w:p>
-            <w:r>
-              <w:rPr>
-                <w:sz w:val="16"/>
-              </w:rPr>
-              <w:t>Not reported as one total in the main article; 28 cancers</w:t>
-            </w:r>
-          </w:p>
-        </w:tc>
-        <w:tc>
-          <w:tcPr>
-            <w:tcW w:type="dxa" w:w="1701"/>
-            <w:vAlign w:val="center"/>
-          </w:tcPr>
-          <w:p>
-            <w:r>
-              <w:rPr>
-                <w:sz w:val="16"/>
-              </w:rPr>
-              <w:t>17,355</w:t>
-            </w:r>
-          </w:p>
-        </w:tc>
-        <w:tc>
-          <w:tcPr>
-            <w:tcW w:type="dxa" w:w="4252"/>
-            <w:vAlign w:val="center"/>
-          </w:tcPr>
-          <w:p>
-            <w:r>
-              <w:rPr>
-                <w:sz w:val="16"/>
-              </w:rPr>
-              <w:t>Cancer and tissue class; mutations; whole-genome duplication and copy-number alterations; transcriptomic and tumour-composition features; prognosis</w:t>
-            </w:r>
-          </w:p>
-        </w:tc>
-        <w:tc>
-          <w:tcPr>
-            <w:tcW w:type="dxa" w:w="5102"/>
-            <w:vAlign w:val="center"/>
-          </w:tcPr>
-          <w:p>
-            <w:r>
-              <w:rPr>
-                <w:sz w:val="16"/>
-              </w:rPr>
-              <w:t>Inception-v4 deep-transfer image features (1,536 dimensions). A deterministic pre-model patient-vector pooling rule was not described in the main article</w:t>
-            </w:r>
-          </w:p>
-        </w:tc>
-      </w:tr>
-      <w:tr>
-        <w:trPr>
-          <w:cantSplit/>
-        </w:trPr>
-        <w:tc>
-          <w:tcPr>
-            <w:tcW w:type="dxa" w:w="1701"/>
-            <w:vAlign w:val="center"/>
-          </w:tcPr>
-          <w:p>
-            <w:r>
-              <w:rPr>
-                <w:sz w:val="16"/>
-              </w:rPr>
-              <w:t>Kather et al. [5]</w:t>
-            </w:r>
-          </w:p>
-        </w:tc>
-        <w:tc>
-          <w:tcPr>
-            <w:tcW w:type="dxa" w:w="2268"/>
-            <w:vAlign w:val="center"/>
-          </w:tcPr>
-          <w:p>
-            <w:r>
-              <w:rPr>
-                <w:sz w:val="16"/>
-              </w:rPr>
-              <w:t>&gt;5,000; 14 cancers</w:t>
-            </w:r>
-          </w:p>
-        </w:tc>
-        <w:tc>
-          <w:tcPr>
-            <w:tcW w:type="dxa" w:w="1701"/>
-            <w:vAlign w:val="center"/>
-          </w:tcPr>
-          <w:p>
-            <w:r>
-              <w:rPr>
-                <w:sz w:val="16"/>
-              </w:rPr>
-              <w:t>Not reported as one total in the main article</w:t>
-            </w:r>
-          </w:p>
-        </w:tc>
-        <w:tc>
-          <w:tcPr>
-            <w:tcW w:type="dxa" w:w="4252"/>
-            <w:vAlign w:val="center"/>
-          </w:tcPr>
-          <w:p>
-            <w:r>
-              <w:rPr>
-                <w:sz w:val="16"/>
-              </w:rPr>
-              <w:t>Mutations; oncogenic drivers; molecular subtypes and expression signatures; standard-of-care biomarkers</w:t>
-            </w:r>
-          </w:p>
-        </w:tc>
-        <w:tc>
-          <w:tcPr>
-            <w:tcW w:type="dxa" w:w="5102"/>
-            <w:vAlign w:val="center"/>
-          </w:tcPr>
-          <w:p>
-            <w:r>
-              <w:rPr>
-                <w:sz w:val="16"/>
-              </w:rPr>
-              <w:t>Task-specific CNN workflow using tumour regions and tile aggregation. Tile predictions aggregated to the patient; patients, not tiles, assigned to folds</w:t>
-            </w:r>
-          </w:p>
-        </w:tc>
-      </w:tr>
-      <w:tr>
-        <w:trPr>
-          <w:cantSplit/>
-        </w:trPr>
-        <w:tc>
-          <w:tcPr>
-            <w:tcW w:type="dxa" w:w="1701"/>
-            <w:vAlign w:val="center"/>
-          </w:tcPr>
-          <w:p>
-            <w:r>
-              <w:rPr>
-                <w:sz w:val="16"/>
-              </w:rPr>
-              <w:t>Saldanha et al. [11]</w:t>
-            </w:r>
-          </w:p>
-        </w:tc>
-        <w:tc>
-          <w:tcPr>
-            <w:tcW w:type="dxa" w:w="2268"/>
-            <w:vAlign w:val="center"/>
-          </w:tcPr>
-          <w:p>
-            <w:r>
-              <w:rPr>
-                <w:sz w:val="16"/>
-              </w:rPr>
-              <w:t>3,743 TCGA; 776 CPTAC; 7 cancers</w:t>
-            </w:r>
-          </w:p>
-        </w:tc>
-        <w:tc>
-          <w:tcPr>
-            <w:tcW w:type="dxa" w:w="1701"/>
-            <w:vAlign w:val="center"/>
-          </w:tcPr>
-          <w:p>
-            <w:r>
-              <w:rPr>
-                <w:sz w:val="16"/>
-              </w:rPr>
-              <w:t>Not reported as one total in the main article</w:t>
-            </w:r>
-          </w:p>
-        </w:tc>
-        <w:tc>
-          <w:tcPr>
-            <w:tcW w:type="dxa" w:w="4252"/>
-            <w:vAlign w:val="center"/>
-          </w:tcPr>
-          <w:p>
-            <w:r>
-              <w:rPr>
-                <w:sz w:val="16"/>
-              </w:rPr>
-              <w:t>Somatic alterations in eligible OncoKB oncogenes and tumour-suppressor genes</w:t>
-            </w:r>
-          </w:p>
-        </w:tc>
-        <w:tc>
-          <w:tcPr>
-            <w:tcW w:type="dxa" w:w="5102"/>
-            <w:vAlign w:val="center"/>
-          </w:tcPr>
-          <w:p>
-            <w:r>
-              <w:rPr>
-                <w:sz w:val="16"/>
-              </w:rPr>
-              <w:t>RetCCL self-supervised tile features plus attention-based multiple-instance learning. Attention aggregation yielded patient-level predictions; a deterministic multi-slide pooling rule was not specified in the main report</w:t>
-            </w:r>
-          </w:p>
-        </w:tc>
-      </w:tr>
-      <w:tr>
-        <w:trPr>
-          <w:cantSplit/>
-        </w:trPr>
-        <w:tc>
-          <w:tcPr>
-            <w:tcW w:type="dxa" w:w="1701"/>
-            <w:vAlign w:val="center"/>
-          </w:tcPr>
-          <w:p>
-            <w:r>
-              <w:rPr>
-                <w:sz w:val="16"/>
-              </w:rPr>
-              <w:t>Arslan et al. [13]</w:t>
-            </w:r>
-          </w:p>
-        </w:tc>
-        <w:tc>
-          <w:tcPr>
-            <w:tcW w:type="dxa" w:w="2268"/>
-            <w:vAlign w:val="center"/>
-          </w:tcPr>
-          <w:p>
-            <w:r>
-              <w:rPr>
-                <w:sz w:val="16"/>
-              </w:rPr>
-              <w:t>8,890 TCGA; 1,329 CPTAC; 32 TCGA; 7 CPTAC cancers</w:t>
-            </w:r>
-          </w:p>
-        </w:tc>
-        <w:tc>
-          <w:tcPr>
-            <w:tcW w:type="dxa" w:w="1701"/>
-            <w:vAlign w:val="center"/>
-          </w:tcPr>
-          <w:p>
-            <w:r>
-              <w:rPr>
-                <w:sz w:val="16"/>
-              </w:rPr>
-              <w:t>10,954 TCGA; 3,481 CPTAC</w:t>
-            </w:r>
-          </w:p>
-        </w:tc>
-        <w:tc>
-          <w:tcPr>
-            <w:tcW w:type="dxa" w:w="4252"/>
-            <w:vAlign w:val="center"/>
-          </w:tcPr>
-          <w:p>
-            <w:r>
-              <w:rPr>
-                <w:sz w:val="16"/>
-              </w:rPr>
-              <w:t>4,031 genomic, transcriptomic, proteomic, standard-of-care, subtype, signature, clinical-outcome and treatment-response biomarkers; 12,093 TCGA models</w:t>
-            </w:r>
-          </w:p>
-        </w:tc>
-        <w:tc>
-          <w:tcPr>
-            <w:tcW w:type="dxa" w:w="5102"/>
-            <w:vAlign w:val="center"/>
-          </w:tcPr>
-          <w:p>
-            <w:r>
-              <w:rPr>
-                <w:sz w:val="16"/>
-              </w:rPr>
-              <w:t>Target-specific ResNet34 encoder-decoder CNNs trained from scratch. Tile scores averaged to slides and slide scores averaged within patient for patient-level AUROC; patient-level folds</w:t>
-            </w:r>
-          </w:p>
-        </w:tc>
-      </w:tr>
-      <w:tr>
-        <w:trPr>
-          <w:cantSplit/>
-        </w:trPr>
-        <w:tc>
-          <w:tcPr>
-            <w:tcW w:type="dxa" w:w="1701"/>
-            <w:vAlign w:val="center"/>
-          </w:tcPr>
-          <w:p>
-            <w:r>
-              <w:rPr>
-                <w:sz w:val="16"/>
-              </w:rPr>
-              <w:t>Present study</w:t>
-            </w:r>
-          </w:p>
-        </w:tc>
-        <w:tc>
-          <w:tcPr>
-            <w:tcW w:type="dxa" w:w="2268"/>
-            <w:vAlign w:val="center"/>
-          </w:tcPr>
-          <w:p>
-            <w:r>
-              <w:rPr>
-                <w:sz w:val="16"/>
-              </w:rPr>
-              <w:t>9,404; 32 cancers</w:t>
-            </w:r>
-          </w:p>
-        </w:tc>
-        <w:tc>
-          <w:tcPr>
-            <w:tcW w:type="dxa" w:w="1701"/>
-            <w:vAlign w:val="center"/>
-          </w:tcPr>
-          <w:p>
-            <w:r>
-              <w:rPr>
-                <w:sz w:val="16"/>
-              </w:rPr>
-              <w:t>11,449</w:t>
-            </w:r>
-          </w:p>
-        </w:tc>
-        <w:tc>
-          <w:tcPr>
-            <w:tcW w:type="dxa" w:w="4252"/>
-            <w:vAlign w:val="center"/>
-          </w:tcPr>
-          <w:p>
-            <w:r>
-              <w:rPr>
-                <w:sz w:val="16"/>
-              </w:rPr>
-              <w:t>1,614 continuous and 459 binary cancer-endpoint pairs: immune and genomic-context scores; mutations; pathways; MSI; aneuploidy; fusions</w:t>
-            </w:r>
-          </w:p>
-        </w:tc>
-        <w:tc>
-          <w:tcPr>
-            <w:tcW w:type="dxa" w:w="5102"/>
-            <w:vAlign w:val="center"/>
-          </w:tcPr>
-          <w:p>
-            <w:r>
-              <w:rPr>
-                <w:sz w:val="16"/>
-              </w:rPr>
-              <w:t>One fixed pretrained 768-dimensional TITAN whole-slide representation with PLS1 or PLS-LDA. All eligible diagnostic slides deterministically mean-pooled before outcome matching; one vector and one fold assignment per patient</w:t>
-            </w:r>
-          </w:p>
-        </w:tc>
-      </w:tr>
-    </w:tbl>
-    <w:p/>
-    <w:p>
-      <w:pPr>
-        <w:pStyle w:val="Caption"/>
-      </w:pPr>
-      <w:r>
-        <w:t>Panel B. Validation, site sensitivity, negative-result reporting and predictor availability.</w:t>
-      </w:r>
-    </w:p>
-    <w:tbl>
-      <w:tblPr>
-        <w:tblStyle w:val="TableGrid"/>
-        <w:tblW w:type="auto" w:w="0"/>
-        <w:jc w:val="center"/>
-        <w:tblLook w:firstColumn="1" w:firstRow="1" w:lastColumn="0" w:lastRow="0" w:noHBand="0" w:noVBand="1" w:val="04A0"/>
-      </w:tblPr>
-      <w:tblGrid>
-        <w:gridCol w:w="2523"/>
-        <w:gridCol w:w="2523"/>
-        <w:gridCol w:w="2523"/>
-        <w:gridCol w:w="2523"/>
-        <w:gridCol w:w="2523"/>
-        <w:gridCol w:w="2523"/>
-      </w:tblGrid>
-      <w:tr>
-        <w:trPr>
-          <w:tblHeader w:val="true"/>
-          <w:cantSplit/>
-        </w:trPr>
-        <w:tc>
-          <w:tcPr>
-            <w:tcW w:type="dxa" w:w="1701"/>
-          </w:tcPr>
-          <w:p>
-            <w:r>
-              <w:rPr>
-                <w:b/>
-                <w:sz w:val="17"/>
-              </w:rPr>
-              <w:t>Study</w:t>
-            </w:r>
-          </w:p>
-        </w:tc>
-        <w:tc>
-          <w:tcPr>
-            <w:tcW w:type="dxa" w:w="2665"/>
-          </w:tcPr>
-          <w:p>
-            <w:r>
-              <w:rPr>
-                <w:b/>
-                <w:sz w:val="17"/>
-              </w:rPr>
-              <w:t>Validation design</w:t>
-            </w:r>
-          </w:p>
-        </w:tc>
-        <w:tc>
-          <w:tcPr>
-            <w:tcW w:type="dxa" w:w="2154"/>
-          </w:tcPr>
-          <w:p>
-            <w:r>
-              <w:rPr>
-                <w:b/>
-                <w:sz w:val="17"/>
-              </w:rPr>
-              <w:t>Site sensitivity</w:t>
-            </w:r>
-          </w:p>
-        </w:tc>
-        <w:tc>
-          <w:tcPr>
-            <w:tcW w:type="dxa" w:w="2835"/>
-          </w:tcPr>
-          <w:p>
-            <w:r>
-              <w:rPr>
-                <w:b/>
-                <w:sz w:val="17"/>
-              </w:rPr>
-              <w:t>External validation</w:t>
-            </w:r>
-          </w:p>
-        </w:tc>
-        <w:tc>
-          <w:tcPr>
-            <w:tcW w:type="dxa" w:w="3118"/>
-          </w:tcPr>
-          <w:p>
-            <w:r>
-              <w:rPr>
-                <w:b/>
-                <w:sz w:val="17"/>
-              </w:rPr>
-              <w:t>Negative/ineligible reporting</w:t>
-            </w:r>
-          </w:p>
-        </w:tc>
-        <w:tc>
-          <w:tcPr>
-            <w:tcW w:type="dxa" w:w="2551"/>
-          </w:tcPr>
-          <w:p>
-            <w:r>
-              <w:rPr>
-                <w:b/>
-                <w:sz w:val="17"/>
-              </w:rPr>
-              <w:t>Fitted predictors</w:t>
-            </w:r>
-          </w:p>
-        </w:tc>
-      </w:tr>
-      <w:tr>
-        <w:trPr>
-          <w:cantSplit/>
-        </w:trPr>
-        <w:tc>
-          <w:tcPr>
-            <w:tcW w:type="dxa" w:w="1701"/>
-            <w:vAlign w:val="center"/>
-          </w:tcPr>
-          <w:p>
-            <w:r>
-              <w:rPr>
-                <w:sz w:val="16"/>
-              </w:rPr>
-              <w:t>Fu et al. [4]</w:t>
-            </w:r>
-          </w:p>
-        </w:tc>
-        <w:tc>
-          <w:tcPr>
-            <w:tcW w:type="dxa" w:w="2665"/>
-            <w:vAlign w:val="center"/>
-          </w:tcPr>
-          <w:p>
-            <w:r>
-              <w:rPr>
-                <w:sz w:val="16"/>
-              </w:rPr>
-              <w:t>Internal TCGA analyses; not nested patient-level cross-validation</w:t>
-            </w:r>
-          </w:p>
-        </w:tc>
-        <w:tc>
-          <w:tcPr>
-            <w:tcW w:type="dxa" w:w="2154"/>
-            <w:vAlign w:val="center"/>
-          </w:tcPr>
-          <w:p>
-            <w:r>
-              <w:rPr>
-                <w:sz w:val="16"/>
-              </w:rPr>
-              <w:t>No target-level tissue-source-site analysis</w:t>
-            </w:r>
-          </w:p>
-        </w:tc>
-        <w:tc>
-          <w:tcPr>
-            <w:tcW w:type="dxa" w:w="2835"/>
-            <w:vAlign w:val="center"/>
-          </w:tcPr>
-          <w:p>
-            <w:r>
-              <w:rPr>
-                <w:sz w:val="16"/>
-              </w:rPr>
-              <w:t>No independent cohort for the pan-cancer molecular screen; selected breast prognostic analyses used METABRIC</w:t>
-            </w:r>
-          </w:p>
-        </w:tc>
-        <w:tc>
-          <w:tcPr>
-            <w:tcW w:type="dxa" w:w="3118"/>
-            <w:vAlign w:val="center"/>
-          </w:tcPr>
-          <w:p>
-            <w:r>
-              <w:rPr>
-                <w:sz w:val="16"/>
-              </w:rPr>
-              <w:t>Broad association and performance landscape; no explicit tested-negative versus sample-size-ineligible taxonomy</w:t>
-            </w:r>
-          </w:p>
-        </w:tc>
-        <w:tc>
-          <w:tcPr>
-            <w:tcW w:type="dxa" w:w="2551"/>
-            <w:vAlign w:val="center"/>
-          </w:tcPr>
-          <w:p>
-            <w:r>
-              <w:rPr>
-                <w:sz w:val="16"/>
-              </w:rPr>
-              <w:t>Code, trained feature extractor and extracted image features released; no target-specific fitted predictor library identified</w:t>
-            </w:r>
-          </w:p>
-        </w:tc>
-      </w:tr>
-      <w:tr>
-        <w:trPr>
-          <w:cantSplit/>
-        </w:trPr>
-        <w:tc>
-          <w:tcPr>
-            <w:tcW w:type="dxa" w:w="1701"/>
-            <w:vAlign w:val="center"/>
-          </w:tcPr>
-          <w:p>
-            <w:r>
-              <w:rPr>
-                <w:sz w:val="16"/>
-              </w:rPr>
-              <w:t>Kather et al. [5]</w:t>
-            </w:r>
-          </w:p>
-        </w:tc>
-        <w:tc>
-          <w:tcPr>
-            <w:tcW w:type="dxa" w:w="2665"/>
-            <w:vAlign w:val="center"/>
-          </w:tcPr>
-          <w:p>
-            <w:r>
-              <w:rPr>
-                <w:sz w:val="16"/>
-              </w:rPr>
-              <w:t>Three-fold patient-level cross-validation</w:t>
-            </w:r>
-          </w:p>
-        </w:tc>
-        <w:tc>
-          <w:tcPr>
-            <w:tcW w:type="dxa" w:w="2154"/>
-            <w:vAlign w:val="center"/>
-          </w:tcPr>
-          <w:p>
-            <w:r>
-              <w:rPr>
-                <w:sz w:val="16"/>
-              </w:rPr>
-              <w:t>No target-level tissue-source-site analysis</w:t>
-            </w:r>
-          </w:p>
-        </w:tc>
-        <w:tc>
-          <w:tcPr>
-            <w:tcW w:type="dxa" w:w="2835"/>
-            <w:vAlign w:val="center"/>
-          </w:tcPr>
-          <w:p>
-            <w:r>
-              <w:rPr>
-                <w:sz w:val="16"/>
-              </w:rPr>
-              <w:t>Selected targets externally tested, including BRAF and CIMP in 408 DACHS colorectal cases</w:t>
-            </w:r>
-          </w:p>
-        </w:tc>
-        <w:tc>
-          <w:tcPr>
-            <w:tcW w:type="dxa" w:w="3118"/>
-            <w:vAlign w:val="center"/>
-          </w:tcPr>
-          <w:p>
-            <w:r>
-              <w:rPr>
-                <w:sz w:val="16"/>
-              </w:rPr>
-              <w:t>Tested-target results and FDR reported; no explicit sample-size-ineligible taxonomy comparable with the present study</w:t>
-            </w:r>
-          </w:p>
-        </w:tc>
-        <w:tc>
-          <w:tcPr>
-            <w:tcW w:type="dxa" w:w="2551"/>
-            <w:vAlign w:val="center"/>
-          </w:tcPr>
-          <w:p>
-            <w:r>
-              <w:rPr>
-                <w:sz w:val="16"/>
-              </w:rPr>
-              <w:t>Workflow and source code released; no pan-cancer fitted predictor library identified</w:t>
-            </w:r>
-          </w:p>
-        </w:tc>
-      </w:tr>
-      <w:tr>
-        <w:trPr>
-          <w:cantSplit/>
-        </w:trPr>
-        <w:tc>
-          <w:tcPr>
-            <w:tcW w:type="dxa" w:w="1701"/>
-            <w:vAlign w:val="center"/>
-          </w:tcPr>
-          <w:p>
-            <w:r>
-              <w:rPr>
-                <w:sz w:val="16"/>
-              </w:rPr>
-              <w:t>Saldanha et al. [11]</w:t>
-            </w:r>
-          </w:p>
-        </w:tc>
-        <w:tc>
-          <w:tcPr>
-            <w:tcW w:type="dxa" w:w="2665"/>
-            <w:vAlign w:val="center"/>
-          </w:tcPr>
-          <w:p>
-            <w:r>
-              <w:rPr>
-                <w:sz w:val="16"/>
-              </w:rPr>
-              <w:t>Five replicate experiments in TCGA with locked evaluation in CPTAC</w:t>
-            </w:r>
-          </w:p>
-        </w:tc>
-        <w:tc>
-          <w:tcPr>
-            <w:tcW w:type="dxa" w:w="2154"/>
-            <w:vAlign w:val="center"/>
-          </w:tcPr>
-          <w:p>
-            <w:r>
-              <w:rPr>
-                <w:sz w:val="16"/>
-              </w:rPr>
-              <w:t>No target-level tissue-source-site analysis</w:t>
-            </w:r>
-          </w:p>
-        </w:tc>
-        <w:tc>
-          <w:tcPr>
-            <w:tcW w:type="dxa" w:w="2835"/>
-            <w:vAlign w:val="center"/>
-          </w:tcPr>
-          <w:p>
-            <w:r>
-              <w:rPr>
-                <w:sz w:val="16"/>
-              </w:rPr>
-              <w:t>Direct TCGA-to-CPTAC testing across seven matched cancers</w:t>
-            </w:r>
-          </w:p>
-        </w:tc>
-        <w:tc>
-          <w:tcPr>
-            <w:tcW w:type="dxa" w:w="3118"/>
-            <w:vAlign w:val="center"/>
-          </w:tcPr>
-          <w:p>
-            <w:r>
-              <w:rPr>
-                <w:sz w:val="16"/>
-              </w:rPr>
-              <w:t>Analysed-gene outputs reported after a minimum-25-mutant rule; no explicit tested-negative versus ineligible taxonomy</w:t>
-            </w:r>
-          </w:p>
-        </w:tc>
-        <w:tc>
-          <w:tcPr>
-            <w:tcW w:type="dxa" w:w="2551"/>
-            <w:vAlign w:val="center"/>
-          </w:tcPr>
-          <w:p>
-            <w:r>
-              <w:rPr>
-                <w:sz w:val="16"/>
-              </w:rPr>
-              <w:t>Open-source pipeline released; no fitted pan-cancer predictor library identified</w:t>
-            </w:r>
-          </w:p>
-        </w:tc>
-      </w:tr>
-      <w:tr>
-        <w:trPr>
-          <w:cantSplit/>
-        </w:trPr>
-        <w:tc>
-          <w:tcPr>
-            <w:tcW w:type="dxa" w:w="1701"/>
-            <w:vAlign w:val="center"/>
-          </w:tcPr>
-          <w:p>
-            <w:r>
-              <w:rPr>
-                <w:sz w:val="16"/>
-              </w:rPr>
-              <w:t>Arslan et al. [13]</w:t>
-            </w:r>
-          </w:p>
-        </w:tc>
-        <w:tc>
-          <w:tcPr>
-            <w:tcW w:type="dxa" w:w="2665"/>
-            <w:vAlign w:val="center"/>
-          </w:tcPr>
-          <w:p>
-            <w:r>
-              <w:rPr>
-                <w:sz w:val="16"/>
-              </w:rPr>
-              <w:t>Three-fold patient-level cross-validation; not nested</w:t>
-            </w:r>
-          </w:p>
-        </w:tc>
-        <w:tc>
-          <w:tcPr>
-            <w:tcW w:type="dxa" w:w="2154"/>
-            <w:vAlign w:val="center"/>
-          </w:tcPr>
-          <w:p>
-            <w:r>
-              <w:rPr>
-                <w:sz w:val="16"/>
-              </w:rPr>
-              <w:t>No target-level tissue-source-site analysis</w:t>
-            </w:r>
-          </w:p>
-        </w:tc>
-        <w:tc>
-          <w:tcPr>
-            <w:tcW w:type="dxa" w:w="2835"/>
-            <w:vAlign w:val="center"/>
-          </w:tcPr>
-          <w:p>
-            <w:r>
-              <w:rPr>
-                <w:sz w:val="16"/>
-              </w:rPr>
-              <w:t>CPTAC replication for matched subsets; not reported as locked transfer of every TCGA model</w:t>
-            </w:r>
-          </w:p>
-        </w:tc>
-        <w:tc>
-          <w:tcPr>
-            <w:tcW w:type="dxa" w:w="3118"/>
-            <w:vAlign w:val="center"/>
-          </w:tcPr>
-          <w:p>
-            <w:r>
-              <w:rPr>
-                <w:sz w:val="16"/>
-              </w:rPr>
-              <w:t>Endpoint-level outputs and significance reported; targets with fewer than 10 positives excluded, without a separate tested-negative/ineligible taxonomy</w:t>
-            </w:r>
-          </w:p>
-        </w:tc>
-        <w:tc>
-          <w:tcPr>
-            <w:tcW w:type="dxa" w:w="2551"/>
-            <w:vAlign w:val="center"/>
-          </w:tcPr>
-          <w:p>
-            <w:r>
-              <w:rPr>
-                <w:sz w:val="16"/>
-              </w:rPr>
-              <w:t>Code and result outputs released; no reusable target-specific fitted model library identified</w:t>
-            </w:r>
-          </w:p>
-        </w:tc>
-      </w:tr>
-      <w:tr>
-        <w:trPr>
-          <w:cantSplit/>
-        </w:trPr>
-        <w:tc>
-          <w:tcPr>
-            <w:tcW w:type="dxa" w:w="1701"/>
-            <w:vAlign w:val="center"/>
-          </w:tcPr>
-          <w:p>
-            <w:r>
-              <w:rPr>
-                <w:sz w:val="16"/>
-              </w:rPr>
-              <w:t>Present study</w:t>
-            </w:r>
-          </w:p>
-        </w:tc>
-        <w:tc>
-          <w:tcPr>
-            <w:tcW w:type="dxa" w:w="2665"/>
-            <w:vAlign w:val="center"/>
-          </w:tcPr>
-          <w:p>
-            <w:r>
-              <w:rPr>
-                <w:sz w:val="16"/>
-              </w:rPr>
-              <w:t>Nested patient-level 5x5 cross-validation; permutations; five independently seeded repeats</w:t>
-            </w:r>
-          </w:p>
-        </w:tc>
-        <w:tc>
-          <w:tcPr>
-            <w:tcW w:type="dxa" w:w="2154"/>
-            <w:vAlign w:val="center"/>
-          </w:tcPr>
-          <w:p>
-            <w:r>
-              <w:rPr>
-                <w:sz w:val="16"/>
-              </w:rPr>
-              <w:t>Target-level tissue-source-site-grouped sensitivity for every screen-positive model</w:t>
-            </w:r>
-          </w:p>
-        </w:tc>
-        <w:tc>
-          <w:tcPr>
-            <w:tcW w:type="dxa" w:w="2835"/>
-            <w:vAlign w:val="center"/>
-          </w:tcPr>
-          <w:p>
-            <w:r>
-              <w:rPr>
-                <w:sz w:val="16"/>
-              </w:rPr>
-              <w:t>None; TCGA-only internal validation</w:t>
-            </w:r>
-          </w:p>
-        </w:tc>
-        <w:tc>
-          <w:tcPr>
-            <w:tcW w:type="dxa" w:w="3118"/>
-            <w:vAlign w:val="center"/>
-          </w:tcPr>
-          <w:p>
-            <w:r>
-              <w:rPr>
-                <w:sz w:val="16"/>
-              </w:rPr>
-              <w:t>Complete machine-readable tested-negative and sample-size-ineligible results with outcome-specific denominators</w:t>
-            </w:r>
-          </w:p>
-        </w:tc>
-        <w:tc>
-          <w:tcPr>
-            <w:tcW w:type="dxa" w:w="2551"/>
-            <w:vAlign w:val="center"/>
-          </w:tcPr>
-          <w:p>
-            <w:r>
-              <w:rPr>
-                <w:sz w:val="16"/>
-              </w:rPr>
-              <w:t>323 compact research-only fitted PLS and PLS-LDA predictors with feature order, checksums, metadata and inference code; artifacts currently access-controlled and not claimed as publicly released</w:t>
-            </w:r>
-          </w:p>
-        </w:tc>
-      </w:tr>
-    </w:tbl>
-    <w:p/>
-    <w:p>
-      <w:r>
-        <w:t>NR, not reported as a single total in the main article. 'No fitted predictor library identified' means that code or outputs may be public, but the primary report did not describe a reusable target-specific fitted-model collection comparable with TITANPred.</w:t>
-      </w:r>
-    </w:p>
-    <w:p>
-      <w:pPr>
-        <w:sectPr>
-          <w:pgSz w:w="16838" w:h="11906" w:orient="landscape"/>
-          <w:pgMar w:top="850" w:right="850" w:bottom="850" w:left="850" w:header="720" w:footer="720" w:gutter="0"/>
-          <w:cols w:space="720"/>
-          <w:docGrid w:linePitch="360"/>
-          <w:lnNumType w:countBy="1" w:restart="continuous"/>
           <w:lnNumType w:countBy="1" w:restart="continuous"/>
         </w:sectPr>
       </w:pPr>
@@ -1749,7 +689,7 @@
     </w:p>
     <w:p>
       <w:r>
-        <w:t>The embedding cohort contained 9,404 patients represented by 11,449 slides; 843 patients (9.0%) had more than one eligible diagnostic slide. The maximum was 30 slides for one patient, and no patient contributed slides from multiple primary sample barcodes. Exact slide-report coverage was 10,106/11,449 (88.3%). Cancer labels were available for 9,395 patients across 32 cancers. The benchmark evaluated 1,614 continuous and 459 binary cancer–endpoint pairs (Table 2). Of 537 prespecified cancer–gene mutation pairs with a profiled denominator, 238 met the 20-positive/20-negative rule and 299 were reported as ineligible rather than tested-negative. Molecular coverage varied by source and cancer; missing cases were excluded outcome by outcome.</w:t>
+        <w:t>The embedding cohort contained 9,404 patients represented by 11,449 slides; 843 patients (9.0%) had more than one eligible diagnostic slide. The maximum was 30 slides for one patient, and no patient contributed slides from multiple primary sample barcodes. Exact slide-report coverage was 10,106/11,449 (88.3%). Cancer labels were available for 9,395 patients across 32 cancers. The benchmark evaluated 1,614 continuous and 459 binary cancer–endpoint pairs (Table 1). Of 537 prespecified cancer–gene mutation pairs with a profiled denominator, 238 met the 20-positive/20-negative rule and 299 were reported as ineligible rather than tested-negative. Molecular coverage varied by source and cancer; missing cases were excluded outcome by outcome.</w:t>
       </w:r>
     </w:p>
     <w:p>
@@ -1762,7 +702,7 @@
         <w:pStyle w:val="Caption"/>
       </w:pPr>
       <w:r>
-        <w:t>Table 2. Eligible cancer–endpoint models and within-cancer screening categories.</w:t>
+        <w:t>Table 1. Eligible cancer–endpoint models and within-cancer screening categories.</w:t>
       </w:r>
     </w:p>
     <w:tbl>
@@ -3157,1311 +2097,10 @@
       </w:r>
     </w:p>
     <w:p>
-      <w:pPr>
-        <w:pStyle w:val="Caption"/>
-      </w:pPr>
       <w:r>
-        <w:t>Table 3. Highlighted initial-screen and repeated-validation performance, binary reliability and tissue-source-site-grouped internal sensitivity. The primary screening estimate is the initial nested-CV value used for selection, permutation testing and tier assignment. Repeated estimates are means across five additional independently seeded nested-CV partitions. SC interval denotes the 95% selection-conditioned patient-resampling interval for repeated out-of-fold predictions: it resamples patients from five fixed prediction sets without repeating screening, fold generation, tuning or model fitting. Panel A reports both stages explicitly; differences between them are expected resampling variation, not inconsistencies. Panel B adds class-size and prevalence-dependent binary metrics. These intervals, grouped estimates and predictive values are internal to TCGA, not generalisation confidence intervals or external-validation results.</w:t>
+        <w:t>Complete highlighted-model performance, uncertainty, class-size metrics and tissue-source-site-grouped estimates are reported in Supplementary Table S6a and the machine-readable result files. The main text retains outcome-level summaries and illustrative figures.</w:t>
       </w:r>
     </w:p>
-    <w:p>
-      <w:pPr>
-        <w:pStyle w:val="Caption"/>
-      </w:pPr>
-      <w:r>
-        <w:t>Panel A. Primary screening and five-repeat validation metrics.</w:t>
-      </w:r>
-    </w:p>
-    <w:tbl>
-      <w:tblPr>
-        <w:tblStyle w:val="TableGrid"/>
-        <w:tblW w:type="auto" w:w="0"/>
-        <w:jc w:val="center"/>
-        <w:tblLook w:firstColumn="1" w:firstRow="1" w:lastColumn="0" w:lastRow="0" w:noHBand="0" w:noVBand="1" w:val="04A0"/>
-      </w:tblPr>
-      <w:tblGrid>
-        <w:gridCol w:w="1569"/>
-        <w:gridCol w:w="1569"/>
-        <w:gridCol w:w="1569"/>
-        <w:gridCol w:w="1569"/>
-        <w:gridCol w:w="1569"/>
-        <w:gridCol w:w="1569"/>
-      </w:tblGrid>
-      <w:tr>
-        <w:trPr>
-          <w:tblHeader w:val="true"/>
-          <w:cantSplit/>
-        </w:trPr>
-        <w:tc>
-          <w:tcPr>
-            <w:tcW w:type="dxa" w:w="1569"/>
-          </w:tcPr>
-          <w:p>
-            <w:r>
-              <w:rPr>
-                <w:b/>
-                <w:sz w:val="17"/>
-              </w:rPr>
-              <w:t>Cancer–endpoint</w:t>
-            </w:r>
-          </w:p>
-        </w:tc>
-        <w:tc>
-          <w:tcPr>
-            <w:tcW w:type="dxa" w:w="1569"/>
-          </w:tcPr>
-          <w:p>
-            <w:r>
-              <w:rPr>
-                <w:b/>
-                <w:sz w:val="17"/>
-              </w:rPr>
-              <w:t>Primary screen Q²/BA</w:t>
-            </w:r>
-          </w:p>
-        </w:tc>
-        <w:tc>
-          <w:tcPr>
-            <w:tcW w:type="dxa" w:w="1569"/>
-          </w:tcPr>
-          <w:p>
-            <w:r>
-              <w:rPr>
-                <w:b/>
-                <w:sz w:val="17"/>
-              </w:rPr>
-              <w:t>Five-repeat Q² or Se/Sp (95% SC interval)</w:t>
-            </w:r>
-          </w:p>
-        </w:tc>
-        <w:tc>
-          <w:tcPr>
-            <w:tcW w:type="dxa" w:w="1569"/>
-          </w:tcPr>
-          <w:p>
-            <w:r>
-              <w:rPr>
-                <w:b/>
-                <w:sz w:val="17"/>
-              </w:rPr>
-              <w:t>Five-repeat RMSE or BA (95% SC interval)</w:t>
-            </w:r>
-          </w:p>
-        </w:tc>
-        <w:tc>
-          <w:tcPr>
-            <w:tcW w:type="dxa" w:w="1569"/>
-          </w:tcPr>
-          <w:p>
-            <w:r>
-              <w:rPr>
-                <w:b/>
-                <w:sz w:val="17"/>
-              </w:rPr>
-              <w:t>Five-repeat Spearman or AUROC (95% SC interval)</w:t>
-            </w:r>
-          </w:p>
-        </w:tc>
-        <w:tc>
-          <w:tcPr>
-            <w:tcW w:type="dxa" w:w="1569"/>
-          </w:tcPr>
-          <w:p>
-            <w:r>
-              <w:rPr>
-                <w:b/>
-                <w:sz w:val="17"/>
-              </w:rPr>
-              <w:t>TSS-grouped metric/status</w:t>
-            </w:r>
-          </w:p>
-        </w:tc>
-      </w:tr>
-      <w:tr>
-        <w:trPr>
-          <w:cantSplit/>
-        </w:trPr>
-        <w:tc>
-          <w:tcPr>
-            <w:tcW w:type="dxa" w:w="1569"/>
-            <w:vAlign w:val="center"/>
-          </w:tcPr>
-          <w:p>
-            <w:r>
-              <w:rPr>
-                <w:sz w:val="16"/>
-              </w:rPr>
-              <w:t>TGCT–TGF-beta Response</w:t>
-            </w:r>
-          </w:p>
-        </w:tc>
-        <w:tc>
-          <w:tcPr>
-            <w:tcW w:type="dxa" w:w="1569"/>
-            <w:vAlign w:val="center"/>
-          </w:tcPr>
-          <w:p>
-            <w:r>
-              <w:rPr>
-                <w:sz w:val="16"/>
-              </w:rPr>
-              <w:t>Q² 0.670</w:t>
-            </w:r>
-          </w:p>
-        </w:tc>
-        <w:tc>
-          <w:tcPr>
-            <w:tcW w:type="dxa" w:w="1569"/>
-            <w:vAlign w:val="center"/>
-          </w:tcPr>
-          <w:p>
-            <w:r>
-              <w:rPr>
-                <w:sz w:val="16"/>
-              </w:rPr>
-              <w:t>0.670 (0.573–0.741)</w:t>
-            </w:r>
-          </w:p>
-        </w:tc>
-        <w:tc>
-          <w:tcPr>
-            <w:tcW w:type="dxa" w:w="1569"/>
-            <w:vAlign w:val="center"/>
-          </w:tcPr>
-          <w:p>
-            <w:r>
-              <w:rPr>
-                <w:sz w:val="16"/>
-              </w:rPr>
-              <w:t>0.303 (0.269–0.337)</w:t>
-            </w:r>
-          </w:p>
-        </w:tc>
-        <w:tc>
-          <w:tcPr>
-            <w:tcW w:type="dxa" w:w="1569"/>
-            <w:vAlign w:val="center"/>
-          </w:tcPr>
-          <w:p>
-            <w:r>
-              <w:rPr>
-                <w:sz w:val="16"/>
-              </w:rPr>
-              <w:t>0.791 (0.713–0.842)</w:t>
-            </w:r>
-          </w:p>
-        </w:tc>
-        <w:tc>
-          <w:tcPr>
-            <w:tcW w:type="dxa" w:w="1569"/>
-            <w:vAlign w:val="center"/>
-          </w:tcPr>
-          <w:p>
-            <w:r>
-              <w:rPr>
-                <w:sz w:val="16"/>
-              </w:rPr>
-              <w:t xml:space="preserve">Q² NA; </w:t>
-            </w:r>
-          </w:p>
-        </w:tc>
-      </w:tr>
-      <w:tr>
-        <w:trPr>
-          <w:cantSplit/>
-        </w:trPr>
-        <w:tc>
-          <w:tcPr>
-            <w:tcW w:type="dxa" w:w="1569"/>
-            <w:vAlign w:val="center"/>
-          </w:tcPr>
-          <w:p>
-            <w:r>
-              <w:rPr>
-                <w:sz w:val="16"/>
-              </w:rPr>
-              <w:t>THYM–Th17 Cells</w:t>
-            </w:r>
-          </w:p>
-        </w:tc>
-        <w:tc>
-          <w:tcPr>
-            <w:tcW w:type="dxa" w:w="1569"/>
-            <w:vAlign w:val="center"/>
-          </w:tcPr>
-          <w:p>
-            <w:r>
-              <w:rPr>
-                <w:sz w:val="16"/>
-              </w:rPr>
-              <w:t>Q² 0.638</w:t>
-            </w:r>
-          </w:p>
-        </w:tc>
-        <w:tc>
-          <w:tcPr>
-            <w:tcW w:type="dxa" w:w="1569"/>
-            <w:vAlign w:val="center"/>
-          </w:tcPr>
-          <w:p>
-            <w:r>
-              <w:rPr>
-                <w:sz w:val="16"/>
-              </w:rPr>
-              <w:t>0.594 (0.455–0.698)</w:t>
-            </w:r>
-          </w:p>
-        </w:tc>
-        <w:tc>
-          <w:tcPr>
-            <w:tcW w:type="dxa" w:w="1569"/>
-            <w:vAlign w:val="center"/>
-          </w:tcPr>
-          <w:p>
-            <w:r>
-              <w:rPr>
-                <w:sz w:val="16"/>
-              </w:rPr>
-              <w:t>1743.443 (1514.535–1979.481)</w:t>
-            </w:r>
-          </w:p>
-        </w:tc>
-        <w:tc>
-          <w:tcPr>
-            <w:tcW w:type="dxa" w:w="1569"/>
-            <w:vAlign w:val="center"/>
-          </w:tcPr>
-          <w:p>
-            <w:r>
-              <w:rPr>
-                <w:sz w:val="16"/>
-              </w:rPr>
-              <w:t>0.738 (0.636–0.811)</w:t>
-            </w:r>
-          </w:p>
-        </w:tc>
-        <w:tc>
-          <w:tcPr>
-            <w:tcW w:type="dxa" w:w="1569"/>
-            <w:vAlign w:val="center"/>
-          </w:tcPr>
-          <w:p>
-            <w:r>
-              <w:rPr>
-                <w:sz w:val="16"/>
-              </w:rPr>
-              <w:t xml:space="preserve">Q² NA; </w:t>
-            </w:r>
-          </w:p>
-        </w:tc>
-      </w:tr>
-      <w:tr>
-        <w:trPr>
-          <w:cantSplit/>
-        </w:trPr>
-        <w:tc>
-          <w:tcPr>
-            <w:tcW w:type="dxa" w:w="1569"/>
-            <w:vAlign w:val="center"/>
-          </w:tcPr>
-          <w:p>
-            <w:r>
-              <w:rPr>
-                <w:sz w:val="16"/>
-              </w:rPr>
-              <w:t>THCA–Lymphocyte Infiltration Signature Score</w:t>
-            </w:r>
-          </w:p>
-        </w:tc>
-        <w:tc>
-          <w:tcPr>
-            <w:tcW w:type="dxa" w:w="1569"/>
-            <w:vAlign w:val="center"/>
-          </w:tcPr>
-          <w:p>
-            <w:r>
-              <w:rPr>
-                <w:sz w:val="16"/>
-              </w:rPr>
-              <w:t>Q² 0.580</w:t>
-            </w:r>
-          </w:p>
-        </w:tc>
-        <w:tc>
-          <w:tcPr>
-            <w:tcW w:type="dxa" w:w="1569"/>
-            <w:vAlign w:val="center"/>
-          </w:tcPr>
-          <w:p>
-            <w:r>
-              <w:rPr>
-                <w:sz w:val="16"/>
-              </w:rPr>
-              <w:t>0.577 (0.511–0.636)</w:t>
-            </w:r>
-          </w:p>
-        </w:tc>
-        <w:tc>
-          <w:tcPr>
-            <w:tcW w:type="dxa" w:w="1569"/>
-            <w:vAlign w:val="center"/>
-          </w:tcPr>
-          <w:p>
-            <w:r>
-              <w:rPr>
-                <w:sz w:val="16"/>
-              </w:rPr>
-              <w:t>0.781 (0.722–0.844)</w:t>
-            </w:r>
-          </w:p>
-        </w:tc>
-        <w:tc>
-          <w:tcPr>
-            <w:tcW w:type="dxa" w:w="1569"/>
-            <w:vAlign w:val="center"/>
-          </w:tcPr>
-          <w:p>
-            <w:r>
-              <w:rPr>
-                <w:sz w:val="16"/>
-              </w:rPr>
-              <w:t>0.742 (0.693–0.786)</w:t>
-            </w:r>
-          </w:p>
-        </w:tc>
-        <w:tc>
-          <w:tcPr>
-            <w:tcW w:type="dxa" w:w="1569"/>
-            <w:vAlign w:val="center"/>
-          </w:tcPr>
-          <w:p>
-            <w:r>
-              <w:rPr>
-                <w:sz w:val="16"/>
-              </w:rPr>
-              <w:t xml:space="preserve">Q² NA; </w:t>
-            </w:r>
-          </w:p>
-        </w:tc>
-      </w:tr>
-      <w:tr>
-        <w:trPr>
-          <w:cantSplit/>
-        </w:trPr>
-        <w:tc>
-          <w:tcPr>
-            <w:tcW w:type="dxa" w:w="1569"/>
-            <w:vAlign w:val="center"/>
-          </w:tcPr>
-          <w:p>
-            <w:r>
-              <w:rPr>
-                <w:sz w:val="16"/>
-              </w:rPr>
-              <w:t>BRCA–Wound Healing</w:t>
-            </w:r>
-          </w:p>
-        </w:tc>
-        <w:tc>
-          <w:tcPr>
-            <w:tcW w:type="dxa" w:w="1569"/>
-            <w:vAlign w:val="center"/>
-          </w:tcPr>
-          <w:p>
-            <w:r>
-              <w:rPr>
-                <w:sz w:val="16"/>
-              </w:rPr>
-              <w:t>Q² 0.527</w:t>
-            </w:r>
-          </w:p>
-        </w:tc>
-        <w:tc>
-          <w:tcPr>
-            <w:tcW w:type="dxa" w:w="1569"/>
-            <w:vAlign w:val="center"/>
-          </w:tcPr>
-          <w:p>
-            <w:r>
-              <w:rPr>
-                <w:sz w:val="16"/>
-              </w:rPr>
-              <w:t>0.528 (0.483–0.569)</w:t>
-            </w:r>
-          </w:p>
-        </w:tc>
-        <w:tc>
-          <w:tcPr>
-            <w:tcW w:type="dxa" w:w="1569"/>
-            <w:vAlign w:val="center"/>
-          </w:tcPr>
-          <w:p>
-            <w:r>
-              <w:rPr>
-                <w:sz w:val="16"/>
-              </w:rPr>
-              <w:t>0.111 (0.106–0.116)</w:t>
-            </w:r>
-          </w:p>
-        </w:tc>
-        <w:tc>
-          <w:tcPr>
-            <w:tcW w:type="dxa" w:w="1569"/>
-            <w:vAlign w:val="center"/>
-          </w:tcPr>
-          <w:p>
-            <w:r>
-              <w:rPr>
-                <w:sz w:val="16"/>
-              </w:rPr>
-              <w:t>0.724 (0.694–0.753)</w:t>
-            </w:r>
-          </w:p>
-        </w:tc>
-        <w:tc>
-          <w:tcPr>
-            <w:tcW w:type="dxa" w:w="1569"/>
-            <w:vAlign w:val="center"/>
-          </w:tcPr>
-          <w:p>
-            <w:r>
-              <w:rPr>
-                <w:sz w:val="16"/>
-              </w:rPr>
-              <w:t xml:space="preserve">Q² NA; </w:t>
-            </w:r>
-          </w:p>
-        </w:tc>
-      </w:tr>
-      <w:tr>
-        <w:trPr>
-          <w:cantSplit/>
-        </w:trPr>
-        <w:tc>
-          <w:tcPr>
-            <w:tcW w:type="dxa" w:w="1569"/>
-            <w:vAlign w:val="center"/>
-          </w:tcPr>
-          <w:p>
-            <w:r>
-              <w:rPr>
-                <w:sz w:val="16"/>
-              </w:rPr>
-              <w:t>LGG–TP53</w:t>
-            </w:r>
-          </w:p>
-        </w:tc>
-        <w:tc>
-          <w:tcPr>
-            <w:tcW w:type="dxa" w:w="1569"/>
-            <w:vAlign w:val="center"/>
-          </w:tcPr>
-          <w:p>
-            <w:r>
-              <w:rPr>
-                <w:sz w:val="16"/>
-              </w:rPr>
-              <w:t>BA 0.846</w:t>
-            </w:r>
-          </w:p>
-        </w:tc>
-        <w:tc>
-          <w:tcPr>
-            <w:tcW w:type="dxa" w:w="1569"/>
-            <w:vAlign w:val="center"/>
-          </w:tcPr>
-          <w:p>
-            <w:r>
-              <w:rPr>
-                <w:sz w:val="16"/>
-              </w:rPr>
-              <w:t>Se 0.839 (0.795–0.877); Sp 0.885 (0.848–0.920)</w:t>
-            </w:r>
-          </w:p>
-        </w:tc>
-        <w:tc>
-          <w:tcPr>
-            <w:tcW w:type="dxa" w:w="1569"/>
-            <w:vAlign w:val="center"/>
-          </w:tcPr>
-          <w:p>
-            <w:r>
-              <w:rPr>
-                <w:sz w:val="16"/>
-              </w:rPr>
-              <w:t>BA 0.862 (0.833–0.888)</w:t>
-            </w:r>
-          </w:p>
-        </w:tc>
-        <w:tc>
-          <w:tcPr>
-            <w:tcW w:type="dxa" w:w="1569"/>
-            <w:vAlign w:val="center"/>
-          </w:tcPr>
-          <w:p>
-            <w:r>
-              <w:rPr>
-                <w:sz w:val="16"/>
-              </w:rPr>
-              <w:t>AUROC 0.908 (0.880–0.932)</w:t>
-            </w:r>
-          </w:p>
-        </w:tc>
-        <w:tc>
-          <w:tcPr>
-            <w:tcW w:type="dxa" w:w="1569"/>
-            <w:vAlign w:val="center"/>
-          </w:tcPr>
-          <w:p>
-            <w:r>
-              <w:rPr>
-                <w:sz w:val="16"/>
-              </w:rPr>
-              <w:t xml:space="preserve">BA NA; </w:t>
-            </w:r>
-          </w:p>
-        </w:tc>
-      </w:tr>
-      <w:tr>
-        <w:trPr>
-          <w:cantSplit/>
-        </w:trPr>
-        <w:tc>
-          <w:tcPr>
-            <w:tcW w:type="dxa" w:w="1569"/>
-            <w:vAlign w:val="center"/>
-          </w:tcPr>
-          <w:p>
-            <w:r>
-              <w:rPr>
-                <w:sz w:val="16"/>
-              </w:rPr>
-              <w:t>THYM–GTF2I</w:t>
-            </w:r>
-          </w:p>
-        </w:tc>
-        <w:tc>
-          <w:tcPr>
-            <w:tcW w:type="dxa" w:w="1569"/>
-            <w:vAlign w:val="center"/>
-          </w:tcPr>
-          <w:p>
-            <w:r>
-              <w:rPr>
-                <w:sz w:val="16"/>
-              </w:rPr>
-              <w:t>BA 0.883</w:t>
-            </w:r>
-          </w:p>
-        </w:tc>
-        <w:tc>
-          <w:tcPr>
-            <w:tcW w:type="dxa" w:w="1569"/>
-            <w:vAlign w:val="center"/>
-          </w:tcPr>
-          <w:p>
-            <w:r>
-              <w:rPr>
-                <w:sz w:val="16"/>
-              </w:rPr>
-              <w:t>Se 0.878 (0.804–0.940); Sp 0.839 (0.748–0.916)</w:t>
-            </w:r>
-          </w:p>
-        </w:tc>
-        <w:tc>
-          <w:tcPr>
-            <w:tcW w:type="dxa" w:w="1569"/>
-            <w:vAlign w:val="center"/>
-          </w:tcPr>
-          <w:p>
-            <w:r>
-              <w:rPr>
-                <w:sz w:val="16"/>
-              </w:rPr>
-              <w:t>BA 0.859 (0.803–0.905)</w:t>
-            </w:r>
-          </w:p>
-        </w:tc>
-        <w:tc>
-          <w:tcPr>
-            <w:tcW w:type="dxa" w:w="1569"/>
-            <w:vAlign w:val="center"/>
-          </w:tcPr>
-          <w:p>
-            <w:r>
-              <w:rPr>
-                <w:sz w:val="16"/>
-              </w:rPr>
-              <w:t>AUROC 0.907 (0.852–0.955)</w:t>
-            </w:r>
-          </w:p>
-        </w:tc>
-        <w:tc>
-          <w:tcPr>
-            <w:tcW w:type="dxa" w:w="1569"/>
-            <w:vAlign w:val="center"/>
-          </w:tcPr>
-          <w:p>
-            <w:r>
-              <w:rPr>
-                <w:sz w:val="16"/>
-              </w:rPr>
-              <w:t xml:space="preserve">BA NA; </w:t>
-            </w:r>
-          </w:p>
-        </w:tc>
-      </w:tr>
-      <w:tr>
-        <w:trPr>
-          <w:cantSplit/>
-        </w:trPr>
-        <w:tc>
-          <w:tcPr>
-            <w:tcW w:type="dxa" w:w="1569"/>
-            <w:vAlign w:val="center"/>
-          </w:tcPr>
-          <w:p>
-            <w:r>
-              <w:rPr>
-                <w:sz w:val="16"/>
-              </w:rPr>
-              <w:t>READ–TP53</w:t>
-            </w:r>
-          </w:p>
-        </w:tc>
-        <w:tc>
-          <w:tcPr>
-            <w:tcW w:type="dxa" w:w="1569"/>
-            <w:vAlign w:val="center"/>
-          </w:tcPr>
-          <w:p>
-            <w:r>
-              <w:rPr>
-                <w:sz w:val="16"/>
-              </w:rPr>
-              <w:t>BA 0.861</w:t>
-            </w:r>
-          </w:p>
-        </w:tc>
-        <w:tc>
-          <w:tcPr>
-            <w:tcW w:type="dxa" w:w="1569"/>
-            <w:vAlign w:val="center"/>
-          </w:tcPr>
-          <w:p>
-            <w:r>
-              <w:rPr>
-                <w:sz w:val="16"/>
-              </w:rPr>
-              <w:t>Se 0.912 (0.855–0.966); Sp 0.803 (0.704–0.890)</w:t>
-            </w:r>
-          </w:p>
-        </w:tc>
-        <w:tc>
-          <w:tcPr>
-            <w:tcW w:type="dxa" w:w="1569"/>
-            <w:vAlign w:val="center"/>
-          </w:tcPr>
-          <w:p>
-            <w:r>
-              <w:rPr>
-                <w:sz w:val="16"/>
-              </w:rPr>
-              <w:t>BA 0.858 (0.801–0.910)</w:t>
-            </w:r>
-          </w:p>
-        </w:tc>
-        <w:tc>
-          <w:tcPr>
-            <w:tcW w:type="dxa" w:w="1569"/>
-            <w:vAlign w:val="center"/>
-          </w:tcPr>
-          <w:p>
-            <w:r>
-              <w:rPr>
-                <w:sz w:val="16"/>
-              </w:rPr>
-              <w:t>AUROC 0.912 (0.860–0.956)</w:t>
-            </w:r>
-          </w:p>
-        </w:tc>
-        <w:tc>
-          <w:tcPr>
-            <w:tcW w:type="dxa" w:w="1569"/>
-            <w:vAlign w:val="center"/>
-          </w:tcPr>
-          <w:p>
-            <w:r>
-              <w:rPr>
-                <w:sz w:val="16"/>
-              </w:rPr>
-              <w:t xml:space="preserve">BA NA; </w:t>
-            </w:r>
-          </w:p>
-        </w:tc>
-      </w:tr>
-      <w:tr>
-        <w:trPr>
-          <w:cantSplit/>
-        </w:trPr>
-        <w:tc>
-          <w:tcPr>
-            <w:tcW w:type="dxa" w:w="1569"/>
-            <w:vAlign w:val="center"/>
-          </w:tcPr>
-          <w:p>
-            <w:r>
-              <w:rPr>
-                <w:sz w:val="16"/>
-              </w:rPr>
-              <w:t>THCA–BRAF</w:t>
-            </w:r>
-          </w:p>
-        </w:tc>
-        <w:tc>
-          <w:tcPr>
-            <w:tcW w:type="dxa" w:w="1569"/>
-            <w:vAlign w:val="center"/>
-          </w:tcPr>
-          <w:p>
-            <w:r>
-              <w:rPr>
-                <w:sz w:val="16"/>
-              </w:rPr>
-              <w:t>BA 0.830</w:t>
-            </w:r>
-          </w:p>
-        </w:tc>
-        <w:tc>
-          <w:tcPr>
-            <w:tcW w:type="dxa" w:w="1569"/>
-            <w:vAlign w:val="center"/>
-          </w:tcPr>
-          <w:p>
-            <w:r>
-              <w:rPr>
-                <w:sz w:val="16"/>
-              </w:rPr>
-              <w:t>Se 0.926 (0.897–0.952); Sp 0.747 (0.688–0.801)</w:t>
-            </w:r>
-          </w:p>
-        </w:tc>
-        <w:tc>
-          <w:tcPr>
-            <w:tcW w:type="dxa" w:w="1569"/>
-            <w:vAlign w:val="center"/>
-          </w:tcPr>
-          <w:p>
-            <w:r>
-              <w:rPr>
-                <w:sz w:val="16"/>
-              </w:rPr>
-              <w:t>BA 0.837 (0.805–0.866)</w:t>
-            </w:r>
-          </w:p>
-        </w:tc>
-        <w:tc>
-          <w:tcPr>
-            <w:tcW w:type="dxa" w:w="1569"/>
-            <w:vAlign w:val="center"/>
-          </w:tcPr>
-          <w:p>
-            <w:r>
-              <w:rPr>
-                <w:sz w:val="16"/>
-              </w:rPr>
-              <w:t>AUROC 0.894 (0.862–0.924)</w:t>
-            </w:r>
-          </w:p>
-        </w:tc>
-        <w:tc>
-          <w:tcPr>
-            <w:tcW w:type="dxa" w:w="1569"/>
-            <w:vAlign w:val="center"/>
-          </w:tcPr>
-          <w:p>
-            <w:r>
-              <w:rPr>
-                <w:sz w:val="16"/>
-              </w:rPr>
-              <w:t xml:space="preserve">BA NA; </w:t>
-            </w:r>
-          </w:p>
-        </w:tc>
-      </w:tr>
-    </w:tbl>
-    <w:p/>
-    <w:p>
-      <w:pPr>
-        <w:pStyle w:val="Caption"/>
-      </w:pPr>
-      <w:r>
-        <w:t>Panel B. Binary class-size and prevalence-dependent reliability metrics.</w:t>
-      </w:r>
-    </w:p>
-    <w:tbl>
-      <w:tblPr>
-        <w:tblStyle w:val="TableGrid"/>
-        <w:tblW w:type="auto" w:w="0"/>
-        <w:jc w:val="center"/>
-        <w:tblLook w:firstColumn="1" w:firstRow="1" w:lastColumn="0" w:lastRow="0" w:noHBand="0" w:noVBand="1" w:val="04A0"/>
-      </w:tblPr>
-      <w:tblGrid>
-        <w:gridCol w:w="1569"/>
-        <w:gridCol w:w="1569"/>
-        <w:gridCol w:w="1569"/>
-        <w:gridCol w:w="1569"/>
-        <w:gridCol w:w="1569"/>
-        <w:gridCol w:w="1569"/>
-      </w:tblGrid>
-      <w:tr>
-        <w:trPr>
-          <w:tblHeader w:val="true"/>
-          <w:cantSplit/>
-        </w:trPr>
-        <w:tc>
-          <w:tcPr>
-            <w:tcW w:type="dxa" w:w="2098"/>
-          </w:tcPr>
-          <w:p>
-            <w:r>
-              <w:rPr>
-                <w:b/>
-                <w:sz w:val="17"/>
-              </w:rPr>
-              <w:t>Cancer–endpoint</w:t>
-            </w:r>
-          </w:p>
-        </w:tc>
-        <w:tc>
-          <w:tcPr>
-            <w:tcW w:type="dxa" w:w="850"/>
-          </w:tcPr>
-          <w:p>
-            <w:r>
-              <w:rPr>
-                <w:b/>
-                <w:sz w:val="17"/>
-              </w:rPr>
-              <w:t>+/−</w:t>
-            </w:r>
-          </w:p>
-        </w:tc>
-        <w:tc>
-          <w:tcPr>
-            <w:tcW w:type="dxa" w:w="1701"/>
-          </w:tcPr>
-          <w:p>
-            <w:r>
-              <w:rPr>
-                <w:b/>
-                <w:sz w:val="17"/>
-              </w:rPr>
-              <w:t>PR-AUC (95% SC interval)</w:t>
-            </w:r>
-          </w:p>
-        </w:tc>
-        <w:tc>
-          <w:tcPr>
-            <w:tcW w:type="dxa" w:w="1871"/>
-          </w:tcPr>
-          <w:p>
-            <w:r>
-              <w:rPr>
-                <w:b/>
-                <w:sz w:val="17"/>
-              </w:rPr>
-              <w:t>PPV at TCGA prevalence (95% SC interval)</w:t>
-            </w:r>
-          </w:p>
-        </w:tc>
-        <w:tc>
-          <w:tcPr>
-            <w:tcW w:type="dxa" w:w="1871"/>
-          </w:tcPr>
-          <w:p>
-            <w:r>
-              <w:rPr>
-                <w:b/>
-                <w:sz w:val="17"/>
-              </w:rPr>
-              <w:t>NPV at TCGA prevalence (95% SC interval)</w:t>
-            </w:r>
-          </w:p>
-        </w:tc>
-        <w:tc>
-          <w:tcPr>
-            <w:tcW w:type="dxa" w:w="1984"/>
-          </w:tcPr>
-          <w:p>
-            <w:r>
-              <w:rPr>
-                <w:b/>
-                <w:sz w:val="17"/>
-              </w:rPr>
-              <w:t>Evidence/default</w:t>
-            </w:r>
-          </w:p>
-        </w:tc>
-      </w:tr>
-      <w:tr>
-        <w:trPr>
-          <w:cantSplit/>
-        </w:trPr>
-        <w:tc>
-          <w:tcPr>
-            <w:tcW w:type="dxa" w:w="2098"/>
-            <w:vAlign w:val="center"/>
-          </w:tcPr>
-          <w:p>
-            <w:r>
-              <w:rPr>
-                <w:sz w:val="16"/>
-              </w:rPr>
-              <w:t>LGG–TP53</w:t>
-            </w:r>
-          </w:p>
-        </w:tc>
-        <w:tc>
-          <w:tcPr>
-            <w:tcW w:type="dxa" w:w="850"/>
-            <w:vAlign w:val="center"/>
-          </w:tcPr>
-          <w:p>
-            <w:r>
-              <w:rPr>
-                <w:sz w:val="16"/>
-              </w:rPr>
-              <w:t>232/253</w:t>
-            </w:r>
-          </w:p>
-        </w:tc>
-        <w:tc>
-          <w:tcPr>
-            <w:tcW w:type="dxa" w:w="1701"/>
-            <w:vAlign w:val="center"/>
-          </w:tcPr>
-          <w:p>
-            <w:r>
-              <w:rPr>
-                <w:sz w:val="16"/>
-              </w:rPr>
-              <w:t>0.880 (0.831–0.926)</w:t>
-            </w:r>
-          </w:p>
-        </w:tc>
-        <w:tc>
-          <w:tcPr>
-            <w:tcW w:type="dxa" w:w="1871"/>
-            <w:vAlign w:val="center"/>
-          </w:tcPr>
-          <w:p>
-            <w:r>
-              <w:rPr>
-                <w:sz w:val="16"/>
-              </w:rPr>
-              <w:t>0.870 (0.825–0.906)</w:t>
-            </w:r>
-          </w:p>
-        </w:tc>
-        <w:tc>
-          <w:tcPr>
-            <w:tcW w:type="dxa" w:w="1871"/>
-            <w:vAlign w:val="center"/>
-          </w:tcPr>
-          <w:p>
-            <w:r>
-              <w:rPr>
-                <w:sz w:val="16"/>
-              </w:rPr>
-              <w:t>0.857 (0.818–0.893)</w:t>
-            </w:r>
-          </w:p>
-        </w:tc>
-        <w:tc>
-          <w:tcPr>
-            <w:tcW w:type="dxa" w:w="1984"/>
-            <w:vAlign w:val="center"/>
-          </w:tcPr>
-          <w:p>
-            <w:r>
-              <w:rPr>
-                <w:sz w:val="16"/>
-              </w:rPr>
-              <w:t>standard internal evidence; included</w:t>
-            </w:r>
-          </w:p>
-        </w:tc>
-      </w:tr>
-      <w:tr>
-        <w:trPr>
-          <w:cantSplit/>
-        </w:trPr>
-        <w:tc>
-          <w:tcPr>
-            <w:tcW w:type="dxa" w:w="2098"/>
-            <w:vAlign w:val="center"/>
-          </w:tcPr>
-          <w:p>
-            <w:r>
-              <w:rPr>
-                <w:sz w:val="16"/>
-              </w:rPr>
-              <w:t>THYM–GTF2I</w:t>
-            </w:r>
-          </w:p>
-        </w:tc>
-        <w:tc>
-          <w:tcPr>
-            <w:tcW w:type="dxa" w:w="850"/>
-            <w:vAlign w:val="center"/>
-          </w:tcPr>
-          <w:p>
-            <w:r>
-              <w:rPr>
-                <w:sz w:val="16"/>
-              </w:rPr>
-              <w:t>59/61</w:t>
-            </w:r>
-          </w:p>
-        </w:tc>
-        <w:tc>
-          <w:tcPr>
-            <w:tcW w:type="dxa" w:w="1701"/>
-            <w:vAlign w:val="center"/>
-          </w:tcPr>
-          <w:p>
-            <w:r>
-              <w:rPr>
-                <w:sz w:val="16"/>
-              </w:rPr>
-              <w:t>0.873 (0.794–0.947)</w:t>
-            </w:r>
-          </w:p>
-        </w:tc>
-        <w:tc>
-          <w:tcPr>
-            <w:tcW w:type="dxa" w:w="1871"/>
-            <w:vAlign w:val="center"/>
-          </w:tcPr>
-          <w:p>
-            <w:r>
-              <w:rPr>
-                <w:sz w:val="16"/>
-              </w:rPr>
-              <w:t>0.841 (0.756–0.918)</w:t>
-            </w:r>
-          </w:p>
-        </w:tc>
-        <w:tc>
-          <w:tcPr>
-            <w:tcW w:type="dxa" w:w="1871"/>
-            <w:vAlign w:val="center"/>
-          </w:tcPr>
-          <w:p>
-            <w:r>
-              <w:rPr>
-                <w:sz w:val="16"/>
-              </w:rPr>
-              <w:t>0.877 (0.791–0.942)</w:t>
-            </w:r>
-          </w:p>
-        </w:tc>
-        <w:tc>
-          <w:tcPr>
-            <w:tcW w:type="dxa" w:w="1984"/>
-            <w:vAlign w:val="center"/>
-          </w:tcPr>
-          <w:p>
-            <w:r>
-              <w:rPr>
-                <w:sz w:val="16"/>
-              </w:rPr>
-              <w:t>standard internal evidence; included</w:t>
-            </w:r>
-          </w:p>
-        </w:tc>
-      </w:tr>
-      <w:tr>
-        <w:trPr>
-          <w:cantSplit/>
-        </w:trPr>
-        <w:tc>
-          <w:tcPr>
-            <w:tcW w:type="dxa" w:w="2098"/>
-            <w:vAlign w:val="center"/>
-          </w:tcPr>
-          <w:p>
-            <w:r>
-              <w:rPr>
-                <w:sz w:val="16"/>
-              </w:rPr>
-              <w:t>READ–TP53</w:t>
-            </w:r>
-          </w:p>
-        </w:tc>
-        <w:tc>
-          <w:tcPr>
-            <w:tcW w:type="dxa" w:w="850"/>
-            <w:vAlign w:val="center"/>
-          </w:tcPr>
-          <w:p>
-            <w:r>
-              <w:rPr>
-                <w:sz w:val="16"/>
-              </w:rPr>
-              <w:t>66/69</w:t>
-            </w:r>
-          </w:p>
-        </w:tc>
-        <w:tc>
-          <w:tcPr>
-            <w:tcW w:type="dxa" w:w="1701"/>
-            <w:vAlign w:val="center"/>
-          </w:tcPr>
-          <w:p>
-            <w:r>
-              <w:rPr>
-                <w:sz w:val="16"/>
-              </w:rPr>
-              <w:t>0.870 (0.785–0.954)</w:t>
-            </w:r>
-          </w:p>
-        </w:tc>
-        <w:tc>
-          <w:tcPr>
-            <w:tcW w:type="dxa" w:w="1871"/>
-            <w:vAlign w:val="center"/>
-          </w:tcPr>
-          <w:p>
-            <w:r>
-              <w:rPr>
-                <w:sz w:val="16"/>
-              </w:rPr>
-              <w:t>0.816 (0.726–0.905)</w:t>
-            </w:r>
-          </w:p>
-        </w:tc>
-        <w:tc>
-          <w:tcPr>
-            <w:tcW w:type="dxa" w:w="1871"/>
-            <w:vAlign w:val="center"/>
-          </w:tcPr>
-          <w:p>
-            <w:r>
-              <w:rPr>
-                <w:sz w:val="16"/>
-              </w:rPr>
-              <w:t>0.906 (0.838–0.964)</w:t>
-            </w:r>
-          </w:p>
-        </w:tc>
-        <w:tc>
-          <w:tcPr>
-            <w:tcW w:type="dxa" w:w="1984"/>
-            <w:vAlign w:val="center"/>
-          </w:tcPr>
-          <w:p>
-            <w:r>
-              <w:rPr>
-                <w:sz w:val="16"/>
-              </w:rPr>
-              <w:t>standard internal evidence; included</w:t>
-            </w:r>
-          </w:p>
-        </w:tc>
-      </w:tr>
-      <w:tr>
-        <w:trPr>
-          <w:cantSplit/>
-        </w:trPr>
-        <w:tc>
-          <w:tcPr>
-            <w:tcW w:type="dxa" w:w="2098"/>
-            <w:vAlign w:val="center"/>
-          </w:tcPr>
-          <w:p>
-            <w:r>
-              <w:rPr>
-                <w:sz w:val="16"/>
-              </w:rPr>
-              <w:t>THCA–BRAF</w:t>
-            </w:r>
-          </w:p>
-        </w:tc>
-        <w:tc>
-          <w:tcPr>
-            <w:tcW w:type="dxa" w:w="850"/>
-            <w:vAlign w:val="center"/>
-          </w:tcPr>
-          <w:p>
-            <w:r>
-              <w:rPr>
-                <w:sz w:val="16"/>
-              </w:rPr>
-              <w:t>289/201</w:t>
-            </w:r>
-          </w:p>
-        </w:tc>
-        <w:tc>
-          <w:tcPr>
-            <w:tcW w:type="dxa" w:w="1701"/>
-            <w:vAlign w:val="center"/>
-          </w:tcPr>
-          <w:p>
-            <w:r>
-              <w:rPr>
-                <w:sz w:val="16"/>
-              </w:rPr>
-              <w:t>0.899 (0.859–0.936)</w:t>
-            </w:r>
-          </w:p>
-        </w:tc>
-        <w:tc>
-          <w:tcPr>
-            <w:tcW w:type="dxa" w:w="1871"/>
-            <w:vAlign w:val="center"/>
-          </w:tcPr>
-          <w:p>
-            <w:r>
-              <w:rPr>
-                <w:sz w:val="16"/>
-              </w:rPr>
-              <w:t>0.840 (0.800–0.877)</w:t>
-            </w:r>
-          </w:p>
-        </w:tc>
-        <w:tc>
-          <w:tcPr>
-            <w:tcW w:type="dxa" w:w="1871"/>
-            <w:vAlign w:val="center"/>
-          </w:tcPr>
-          <w:p>
-            <w:r>
-              <w:rPr>
-                <w:sz w:val="16"/>
-              </w:rPr>
-              <w:t>0.876 (0.826–0.920)</w:t>
-            </w:r>
-          </w:p>
-        </w:tc>
-        <w:tc>
-          <w:tcPr>
-            <w:tcW w:type="dxa" w:w="1984"/>
-            <w:vAlign w:val="center"/>
-          </w:tcPr>
-          <w:p>
-            <w:r>
-              <w:rPr>
-                <w:sz w:val="16"/>
-              </w:rPr>
-              <w:t>standard internal evidence; included</w:t>
-            </w:r>
-          </w:p>
-        </w:tc>
-      </w:tr>
-    </w:tbl>
-    <w:p/>
     <w:p>
       <w:pPr>
         <w:jc w:val="center"/>
@@ -4635,7 +2274,7 @@
     </w:p>
     <w:p>
       <w:r>
-        <w:t>Table 4 records the three fitted UCEC artifacts locked for any future untouched evaluation. The displayed performance values are internally derived TCGA estimates included only to document why the targets were selected; they are not external benchmarks. All three must be reported under the protocol, including chance-level performance, extraction failure or endpoint non-evaluability.</w:t>
+        <w:t>Table 2 records the three fitted UCEC artifacts locked for any future untouched evaluation. The displayed performance values are internally derived TCGA estimates included only to document why the targets were selected; they are not external benchmarks. All three must be reported under the protocol, including chance-level performance, extraction failure or endpoint non-evaluability.</w:t>
       </w:r>
     </w:p>
     <w:tbl>
@@ -5017,7 +2656,7 @@
         <w:pStyle w:val="Caption"/>
       </w:pPr>
       <w:r>
-        <w:t>Table 4. Prospectively locked subset for future independent evaluation. Model selection occurred after the TCGA screen but before any external feature, outcome or prediction was inspected. Full hashes, secondary metrics, endpoint-compatibility rules and mandatory failure reporting are provided in Supplementary Table S6c and the machine-readable lock file.</w:t>
+        <w:t>Table 2. Prospectively locked subset for future independent evaluation. Model selection occurred after the TCGA screen but before any external feature, outcome or prediction was inspected. Full hashes, secondary metrics, endpoint-compatibility rules and mandatory failure reporting are provided in Supplementary Table S6c and the machine-readable lock file.</w:t>
       </w:r>
     </w:p>
     <w:p>
@@ -5101,7 +2740,7 @@
     </w:p>
     <w:p>
       <w:r>
-        <w:t>The closest breadth comparator is Arslan et al., who already trained 12,093 target-specific models for 4,031 multi-omic biomarkers in 8,890 TCGA patients across the same 32 cancers [13]. The present study is smaller in endpoint breadth and lacks external validation. Its differentiating elements are instead the fixed pretrained representation, deterministic pre-outcome patient aggregation, nested patient-level validation, complete tested-negative and ineligible outputs, target-level site-grouped sensitivity, continuous modelling of selected immune and genomic-context measures, and distribution of compact fitted linear predictors. Table 1 makes these distinctions explicit and prevents breadth or endpoint novelty from being inferred from the study framing.</w:t>
+        <w:t>The closest breadth comparator is Arslan et al., who already trained 12,093 target-specific models for 4,031 multi-omic biomarkers in 8,890 TCGA patients across the same 32 cancers [13]. The present study is smaller in endpoint breadth and lacks external validation. Its differentiating elements are the fixed pretrained representation, deterministic pre-outcome patient aggregation, nested patient-level validation, complete tested-negative and ineligible outputs, target-level site-grouped sensitivity, continuous modelling of selected immune and genomic-context measures, and distribution of compact fitted linear predictors. These distinctions—not breadth or endpoint novelty—motivate the study.</w:t>
       </w:r>
     </w:p>
     <w:p>
@@ -5583,7 +3222,6 @@
       <w:docGrid w:linePitch="360"/>
       <w:lnNumType w:countBy="1" w:restart="continuous"/>
       <w:lnNumType w:countBy="1" w:restart="continuous"/>
-      <w:lnNumType w:countBy="1" w:restart="continuous"/>
     </w:sectPr>
   </w:body>
 </w:document>

</xml_diff>

<commit_message>
Make precision-recall reporting explicit
</commit_message>
<xml_diff>
--- a/manuscript/manuscript_JTM_patient_level_TITAN.docx
+++ b/manuscript/manuscript_JTM_patient_level_TITAN.docx
@@ -340,7 +340,7 @@
         <w:t xml:space="preserve">Methods. </w:t>
       </w:r>
       <w:r>
-        <w:t>We mean-pooled 11,449 primary diagnostic slide embeddings into 9,404 patient vectors across 32 TCGA cancers; 843 patients contributed multiple slides. We tested 1,614 continuous and 459 binary cancer–endpoint pairs using patient-level nested PLS1 or PLS–LDA. Targets were classified as direct alteration calls, sequencing-derived burdens, inferred immune-cell fractions, transcriptomic signatures, pathology-derived quantities or composite scores. Models meeting the prespecified screening-statistic threshold underwent 999 complete-process permutations with conservative stopping, exact Monte Carlo intervals and Benjamini–Hochberg corrections locally, across cancers and atlas-wide. Eight prespecified leading models were extended to 9,999 permutations.</w:t>
+        <w:t>We mean-pooled 11,449 diagnostic slide embeddings into 9,404 patient vectors across 32 TCGA cancers; 843 patients contributed multiple slides. We tested 1,614 continuous and 459 binary cancer–endpoint pairs using patient-level nested PLS1 or PLS–LDA. Targets were classified as direct alteration calls, sequencing-derived burdens, inferred immune-cell fractions, transcriptomic signatures, pathology-derived quantities or composite scores. Models meeting the prespecified screening-statistic threshold underwent 999 complete-process permutations with conservative stopping, exact Monte Carlo intervals and Benjamini–Hochberg corrections locally, across cancers and atlas-wide. Eight prespecified models were extended to 9,999 permutations.</w:t>
       </w:r>
     </w:p>
     <w:p>
@@ -351,7 +351,7 @@
         <w:t xml:space="preserve">Results. </w:t>
       </w:r>
       <w:r>
-        <w:t>Screening identified 219 continuous and 104 binary candidates in prespecified screening tiers A or B. A stricter ≥50-per-class sensitivity retained 87/104 binary candidates; 17 smaller-class models were exploratory and excluded from default inference. Highlighted repeated-CV results included TGCT–TGF-beta Response (five-repeat mean Q² 0.670, selection-conditioned 95% patient-resampling interval 0.573–0.741; RMSE 0.303, Spearman 0.791) and LGG–TP53 (five-repeat mean sensitivity 0.839, specificity 0.885, balanced accuracy 0.862, selection-conditioned 95% patient-resampling interval 0.833–0.888; AUROC 0.908). Prior studies supported 38/41 screen-positive cancer–gene pairs. 320/323 local candidates passed single BH correction across all 2,073 eligible tests. Tissue-source-site grouping reduced 83/323 candidates (25.7%) below the original screening threshold. In a 47-target metadata-stratified benchmark selected without PLS performance, median ridge-minus-PLS differences were 0.008 AUROC and 0.053 Q²; paired intervals favoured ridge for 8/35 binary and 10/12 continuous targets, and PLS for none.</w:t>
+        <w:t>Screening identified 219 continuous and 104 binary candidates in prespecified screening tiers A or B. A stricter ≥50-per-class sensitivity retained 87/104 binary candidates; 17 smaller-class models were exploratory and excluded from default inference. Highlighted repeated-CV results included TGCT–TGF-beta Response (five-repeat mean Q² 0.670, selection-conditioned 95% patient-resampling interval 0.573–0.741; RMSE 0.303, Spearman 0.791) and LGG–TP53 (five-repeat mean sensitivity 0.839, specificity 0.885, balanced accuracy 0.862, selection-conditioned 95% patient-resampling interval 0.833–0.888; AUROC 0.908, PR-AUC 0.880). Prior studies supported 38/41 screen-positive cancer–gene pairs. 320/323 local candidates passed single BH correction across all 2,073 eligible tests. Tissue-source-site grouping reduced 83/323 candidates (25.7%) below the original screening threshold. In a 47-target metadata-stratified benchmark selected without PLS performance, median ridge-minus-PLS differences were 0.008 AUROC and 0.053 Q²; paired intervals favoured ridge for 8/35 binary and 10/12 continuous targets, and PLS for none.</w:t>
       </w:r>
     </w:p>
     <w:p>
@@ -2049,6 +2049,11 @@
       </w:r>
     </w:p>
     <w:p>
+      <w:r>
+        <w:t>Precision–recall performance was reported for every screen-positive binary endpoint. Across all 104 models, median five-repeat PR-AUC was 0.592; each value should be read against its no-skill reference, the observed TCGA prevalence. The 13 mutation or fusion endpoints with prevalence below 0.20 had median prevalence 0.091, median PR-AUC 0.360 (range 0.196–0.452), despite median AUROC 0.790. This divergence illustrates why AUROC or balanced accuracy alone can overstate positive-class retrieval under low prevalence. Endpoint-level PR-AUC, prevalence, repeat variability and class counts are reported in Supplementary Tables S6a, S7 and S10g and the machine-readable registry.</w:t>
+      </w:r>
+    </w:p>
+    <w:p>
       <w:pPr>
         <w:jc w:val="center"/>
       </w:pPr>

</xml_diff>

<commit_message>
Improve main figure readability
</commit_message>
<xml_diff>
--- a/manuscript/manuscript_JTM_patient_level_TITAN.docx
+++ b/manuscript/manuscript_JTM_patient_level_TITAN.docx
@@ -1900,7 +1900,7 @@
       <w:r>
         <w:drawing>
           <wp:inline xmlns:a="http://schemas.openxmlformats.org/drawingml/2006/main" xmlns:pic="http://schemas.openxmlformats.org/drawingml/2006/picture">
-            <wp:extent cx="5806440" cy="4952551"/>
+            <wp:extent cx="5806440" cy="3978487"/>
             <wp:docPr id="2" name="Picture 2"/>
             <wp:cNvGraphicFramePr>
               <a:graphicFrameLocks noChangeAspect="1"/>
@@ -1921,7 +1921,7 @@
                   <pic:spPr>
                     <a:xfrm>
                       <a:off x="0" y="0"/>
-                      <a:ext cx="5806440" cy="4952551"/>
+                      <a:ext cx="5806440" cy="3978487"/>
                     </a:xfrm>
                     <a:prstGeom prst="rect"/>
                   </pic:spPr>
@@ -1938,7 +1938,7 @@
         <w:jc w:val="center"/>
       </w:pPr>
       <w:r>
-        <w:t>Figure 2. Strongest within-cancer screen-positive continuous cancer–endpoint results, ranked by the primary screening Q² from the initial nested-CV run. Five-repeat mean repeated-validation estimates are reported separately in the model tables and machine-readable summary. All Q² values are calculated from genuine patient-level outer-fold predictions.</w:t>
+        <w:t>Figure 2. Eighteen strongest within-cancer screen-positive continuous cancer–endpoint results, ranked by primary screening Q². The reduced set and larger typography improve readability; complete results and five-repeat estimates are in Supplementary Table S7 and machine-readable files. All Q² values use genuine patient-level outer-fold predictions.</w:t>
       </w:r>
     </w:p>
     <w:p>
@@ -2007,7 +2007,7 @@
       <w:r>
         <w:drawing>
           <wp:inline xmlns:a="http://schemas.openxmlformats.org/drawingml/2006/main" xmlns:pic="http://schemas.openxmlformats.org/drawingml/2006/picture">
-            <wp:extent cx="5806440" cy="4873262"/>
+            <wp:extent cx="5806440" cy="4032250"/>
             <wp:docPr id="3" name="Picture 3"/>
             <wp:cNvGraphicFramePr>
               <a:graphicFrameLocks noChangeAspect="1"/>
@@ -2028,7 +2028,7 @@
                   <pic:spPr>
                     <a:xfrm>
                       <a:off x="0" y="0"/>
-                      <a:ext cx="5806440" cy="4873262"/>
+                      <a:ext cx="5806440" cy="4032250"/>
                     </a:xfrm>
                     <a:prstGeom prst="rect"/>
                   </pic:spPr>
@@ -2045,7 +2045,7 @@
         <w:jc w:val="center"/>
       </w:pPr>
       <w:r>
-        <w:t>Figure 3. Strongest within-cancer screen-positive binary molecular predictions among the 87 models with at least 50 positive and 50 negative patients, ranked by primary screening balanced accuracy from the initial nested-CV run. Five-repeat mean repeated-validation estimates are reported separately. Point size represents the number of positive patients; colour indicates endpoint family and symbols report across-cancer correction status. The 17 exploratory/limited-evidence models are excluded from this main panel and shown separately in Supplementary Figure S3.</w:t>
+        <w:t>Figure 3. Eighteen strongest within-cancer screen-positive binary molecular predictions among the 87 models with at least 50 patients per class, ranked by primary screening balanced accuracy. Uniform point size and shortened labels reduce visual load; colour indicates endpoint family and symbols indicate across-cancer correction status. Complete BA, AUROC and PR-AUC results are in Supplementary Tables S6a, S7 and S10g. The 17 limited-evidence models appear in Figure S3.</w:t>
       </w:r>
     </w:p>
     <w:p>
@@ -2113,7 +2113,7 @@
       <w:r>
         <w:drawing>
           <wp:inline xmlns:a="http://schemas.openxmlformats.org/drawingml/2006/main" xmlns:pic="http://schemas.openxmlformats.org/drawingml/2006/picture">
-            <wp:extent cx="5806440" cy="4125628"/>
+            <wp:extent cx="5806440" cy="3958936"/>
             <wp:docPr id="5" name="Picture 5"/>
             <wp:cNvGraphicFramePr>
               <a:graphicFrameLocks noChangeAspect="1"/>
@@ -2134,7 +2134,7 @@
                   <pic:spPr>
                     <a:xfrm>
                       <a:off x="0" y="0"/>
-                      <a:ext cx="5806440" cy="4125628"/>
+                      <a:ext cx="5806440" cy="3958936"/>
                     </a:xfrm>
                     <a:prstGeom prst="rect"/>
                   </pic:spPr>
@@ -2151,7 +2151,7 @@
         <w:jc w:val="center"/>
       </w:pPr>
       <w:r>
-        <w:t>Figure 5. Breadth and family of within-cancer screen-positive prediction targets. Absence of an eligible target is distinct from a tested screen-negative result.</w:t>
+        <w:t>Figure 5. Breadth and family of screen-positive targets in the 20 cancers with the largest candidate counts. Restricting the display improves label size; complete cancer-level counts are in Supplementary Table S1. Absence of a target is distinct from a tested screen-negative result.</w:t>
       </w:r>
     </w:p>
     <w:p>
@@ -2197,7 +2197,7 @@
       <w:r>
         <w:drawing>
           <wp:inline xmlns:a="http://schemas.openxmlformats.org/drawingml/2006/main" xmlns:pic="http://schemas.openxmlformats.org/drawingml/2006/picture">
-            <wp:extent cx="5806440" cy="5195236"/>
+            <wp:extent cx="5806440" cy="4569002"/>
             <wp:docPr id="6" name="Picture 6"/>
             <wp:cNvGraphicFramePr>
               <a:graphicFrameLocks noChangeAspect="1"/>
@@ -2218,7 +2218,7 @@
                   <pic:spPr>
                     <a:xfrm>
                       <a:off x="0" y="0"/>
-                      <a:ext cx="5806440" cy="5195236"/>
+                      <a:ext cx="5806440" cy="4569002"/>
                     </a:xfrm>
                     <a:prstGeom prst="rect"/>
                   </pic:spPr>
@@ -2235,7 +2235,7 @@
         <w:jc w:val="center"/>
       </w:pPr>
       <w:r>
-        <w:t>Figure 6. Tissue-source-site sensitivity as a principal result. Panel A compares random-fold and tissue-source-site-grouped internal performance for all 323 screen-positive models; Panel B names the largest attenuations; Panel C quantifies within-cancer prediction of tissue-source site from TITAN representations. Grouping is internal to TCGA, and tissue-source site is an imperfect proxy rather than institutional or scanner-level external validation.</w:t>
+        <w:t>Figure 6. Tissue-source-site sensitivity as a principal result. Panel A compares all 323 random-fold and grouped estimates; Panel B shows the eight largest attenuations; Panel C shows the 15 strongest chance-normalised within-cancer submitting-site results. Larger typography and restricted ranked panels improve readability. Grouping remains internal to TCGA and is not institutional or scanner-level external validation.</w:t>
       </w:r>
     </w:p>
     <w:p>
@@ -2679,7 +2679,7 @@
     </w:p>
     <w:p>
       <w:r>
-        <w:t>Two COAD participants, TCGA-AA-A01F and TCGA-AA-3972, are retained solely to show the radar and binary-output interface (Figure 7). The pair was chosen post hoc after clinical-text and profile-saturation restrictions and then maximising Euclidean separation across continuous TCGA OOF prediction percentiles; the procedure intentionally enhances visual contrast. Nodal status was not matched: TCGA-AA-A01F was reported as pN1, whereas the available slide summary for TCGA-AA-3972 did not state a nodal category. The cases are not presented as a matched clinical comparison, and treatment, response, recurrence, follow-up and survival are neither shown nor interpreted. This is a visualization example, not performance, prevalence, prognosis or treatment-response evidence.</w:t>
+        <w:t>Two COAD participants, TCGA-AA-A01F and TCGA-AA-3972, are retained solely to show continuous and binary research-software outputs (Figure 7). The pair was chosen post hoc after clinical-text and profile-saturation restrictions and then maximising Euclidean separation across continuous TCGA OOF prediction percentiles; the procedure intentionally enhances visual contrast. Nodal status was not matched: TCGA-AA-A01F was reported as pN1, whereas the available slide summary for TCGA-AA-3972 did not state a nodal category. The cases are not presented as a matched clinical comparison, and treatment, response, recurrence, follow-up and survival are neither shown nor interpreted. This is a visualization example, not performance, prevalence, prognosis or treatment-response evidence.</w:t>
       </w:r>
     </w:p>
     <w:p>
@@ -2689,7 +2689,7 @@
       <w:r>
         <w:drawing>
           <wp:inline xmlns:a="http://schemas.openxmlformats.org/drawingml/2006/main" xmlns:pic="http://schemas.openxmlformats.org/drawingml/2006/picture">
-            <wp:extent cx="6126480" cy="5198225"/>
+            <wp:extent cx="6126480" cy="5039524"/>
             <wp:docPr id="7" name="Picture 7"/>
             <wp:cNvGraphicFramePr>
               <a:graphicFrameLocks noChangeAspect="1"/>
@@ -2710,7 +2710,7 @@
                   <pic:spPr>
                     <a:xfrm>
                       <a:off x="0" y="0"/>
-                      <a:ext cx="6126480" cy="5198225"/>
+                      <a:ext cx="6126480" cy="5039524"/>
                     </a:xfrm>
                     <a:prstGeom prst="rect"/>
                   </pic:spPr>
@@ -2727,7 +2727,7 @@
         <w:jc w:val="center"/>
       </w:pPr>
       <w:r>
-        <w:t>Figure 7. Post hoc TITANPred research-software visualization for two COAD participants. Panels A and B show internally derived full-cohort TCGA continuous estimates for TCGA-AA-A01F and TCGA-AA-3972; every radar corner gives the TCGA OOF prediction percentile and original estimate. Panel C shows PLS-LDA calls with the adjacent label 'TCGA OOF score rank (not probability)' and development class counts. The pair was selected after clinical-text and saturation restrictions by maximising continuous-profile separation, intentionally enhancing visual contrast. Treatment and outcomes are not displayed. The figure is an interface illustration, not probability-calibrated output, external validation, representative case sampling, prognosis or treatment-response evidence.</w:t>
+        <w:t>Figure 7. Post hoc TITANPred research-software visualization for two COAD participants. Panel A replaces separate radar plots with a common-scale dumbbell comparison of continuous TCGA OOF ranks; the right column preserves each original prediction. Panel B compares PLS-LDA score ranks and calls with development class counts. All ranks are explicitly not probabilities. The pair was selected after clinical-text and saturation restrictions by maximising continuous-profile separation, intentionally enhancing contrast. Treatment and outcomes are not displayed. This is an interface illustration, not external validation or representative case sampling.</w:t>
       </w:r>
     </w:p>
     <w:p>

</xml_diff>

<commit_message>
Move software detail to supplement
</commit_message>
<xml_diff>
--- a/manuscript/manuscript_JTM_patient_level_TITAN.docx
+++ b/manuscript/manuscript_JTM_patient_level_TITAN.docx
@@ -2279,389 +2279,7 @@
     </w:p>
     <w:p>
       <w:r>
-        <w:t>Table 2 records the three fitted UCEC artifacts locked for any future untouched evaluation. The displayed performance values are internally derived TCGA estimates included only to document why the targets were selected; they are not external benchmarks. All three must be reported under the protocol, including chance-level performance, extraction failure or endpoint non-evaluability.</w:t>
-      </w:r>
-    </w:p>
-    <w:tbl>
-      <w:tblPr>
-        <w:tblStyle w:val="TableGrid"/>
-        <w:tblW w:type="auto" w:w="0"/>
-        <w:jc w:val="center"/>
-        <w:tblLook w:firstColumn="1" w:firstRow="1" w:lastColumn="0" w:lastRow="0" w:noHBand="0" w:noVBand="1" w:val="04A0"/>
-      </w:tblPr>
-      <w:tblGrid>
-        <w:gridCol w:w="1569"/>
-        <w:gridCol w:w="1569"/>
-        <w:gridCol w:w="1569"/>
-        <w:gridCol w:w="1569"/>
-        <w:gridCol w:w="1569"/>
-        <w:gridCol w:w="1569"/>
-      </w:tblGrid>
-      <w:tr>
-        <w:trPr>
-          <w:tblHeader w:val="true"/>
-          <w:cantSplit/>
-        </w:trPr>
-        <w:tc>
-          <w:tcPr>
-            <w:tcW w:type="dxa" w:w="1474"/>
-          </w:tcPr>
-          <w:p>
-            <w:r>
-              <w:rPr>
-                <w:b/>
-                <w:sz w:val="17"/>
-              </w:rPr>
-              <w:t>Locked target</w:t>
-            </w:r>
-          </w:p>
-        </w:tc>
-        <w:tc>
-          <w:tcPr>
-            <w:tcW w:type="dxa" w:w="1587"/>
-          </w:tcPr>
-          <w:p>
-            <w:r>
-              <w:rPr>
-                <w:b/>
-                <w:sz w:val="17"/>
-              </w:rPr>
-              <w:t>Artifact SHA-256 (prefix)</w:t>
-            </w:r>
-          </w:p>
-        </w:tc>
-        <w:tc>
-          <w:tcPr>
-            <w:tcW w:type="dxa" w:w="1928"/>
-          </w:tcPr>
-          <w:p>
-            <w:r>
-              <w:rPr>
-                <w:b/>
-                <w:sz w:val="17"/>
-              </w:rPr>
-              <w:t>Internal repeated-CV estimate</w:t>
-            </w:r>
-          </w:p>
-        </w:tc>
-        <w:tc>
-          <w:tcPr>
-            <w:tcW w:type="dxa" w:w="1814"/>
-          </w:tcPr>
-          <w:p>
-            <w:r>
-              <w:rPr>
-                <w:b/>
-                <w:sz w:val="17"/>
-              </w:rPr>
-              <w:t>Site-grouped estimate</w:t>
-            </w:r>
-          </w:p>
-        </w:tc>
-        <w:tc>
-          <w:tcPr>
-            <w:tcW w:type="dxa" w:w="1474"/>
-          </w:tcPr>
-          <w:p>
-            <w:r>
-              <w:rPr>
-                <w:b/>
-                <w:sz w:val="17"/>
-              </w:rPr>
-              <w:t>Future primary metric</w:t>
-            </w:r>
-          </w:p>
-        </w:tc>
-        <w:tc>
-          <w:tcPr>
-            <w:tcW w:type="dxa" w:w="1134"/>
-          </w:tcPr>
-          <w:p>
-            <w:r>
-              <w:rPr>
-                <w:b/>
-                <w:sz w:val="17"/>
-              </w:rPr>
-              <w:t>Status</w:t>
-            </w:r>
-          </w:p>
-        </w:tc>
-      </w:tr>
-      <w:tr>
-        <w:trPr>
-          <w:cantSplit/>
-        </w:trPr>
-        <w:tc>
-          <w:tcPr>
-            <w:tcW w:type="dxa" w:w="1474"/>
-            <w:vAlign w:val="center"/>
-          </w:tcPr>
-          <w:p>
-            <w:r>
-              <w:rPr>
-                <w:sz w:val="16"/>
-              </w:rPr>
-              <w:t>UCEC–TP53</w:t>
-            </w:r>
-          </w:p>
-        </w:tc>
-        <w:tc>
-          <w:tcPr>
-            <w:tcW w:type="dxa" w:w="1587"/>
-            <w:vAlign w:val="center"/>
-          </w:tcPr>
-          <w:p>
-            <w:r>
-              <w:rPr>
-                <w:sz w:val="16"/>
-              </w:rPr>
-              <w:t>c39ba2caeefc</w:t>
-            </w:r>
-          </w:p>
-        </w:tc>
-        <w:tc>
-          <w:tcPr>
-            <w:tcW w:type="dxa" w:w="1928"/>
-            <w:vAlign w:val="center"/>
-          </w:tcPr>
-          <w:p>
-            <w:r>
-              <w:rPr>
-                <w:sz w:val="16"/>
-              </w:rPr>
-              <w:t>balanced accuracy 0.744</w:t>
-            </w:r>
-          </w:p>
-        </w:tc>
-        <w:tc>
-          <w:tcPr>
-            <w:tcW w:type="dxa" w:w="1814"/>
-            <w:vAlign w:val="center"/>
-          </w:tcPr>
-          <w:p>
-            <w:r>
-              <w:rPr>
-                <w:sz w:val="16"/>
-              </w:rPr>
-              <w:t>site-grouped balanced accuracy 0.740</w:t>
-            </w:r>
-          </w:p>
-        </w:tc>
-        <w:tc>
-          <w:tcPr>
-            <w:tcW w:type="dxa" w:w="1474"/>
-            <w:vAlign w:val="center"/>
-          </w:tcPr>
-          <w:p>
-            <w:r>
-              <w:rPr>
-                <w:sz w:val="16"/>
-              </w:rPr>
-              <w:t>balanced accuracy</w:t>
-            </w:r>
-          </w:p>
-        </w:tc>
-        <w:tc>
-          <w:tcPr>
-            <w:tcW w:type="dxa" w:w="1134"/>
-            <w:vAlign w:val="center"/>
-          </w:tcPr>
-          <w:p>
-            <w:r>
-              <w:rPr>
-                <w:sz w:val="16"/>
-              </w:rPr>
-              <w:t>Not performed</w:t>
-            </w:r>
-          </w:p>
-        </w:tc>
-      </w:tr>
-      <w:tr>
-        <w:trPr>
-          <w:cantSplit/>
-        </w:trPr>
-        <w:tc>
-          <w:tcPr>
-            <w:tcW w:type="dxa" w:w="1474"/>
-            <w:vAlign w:val="center"/>
-          </w:tcPr>
-          <w:p>
-            <w:r>
-              <w:rPr>
-                <w:sz w:val="16"/>
-              </w:rPr>
-              <w:t>UCEC–Genome doubling</w:t>
-            </w:r>
-          </w:p>
-        </w:tc>
-        <w:tc>
-          <w:tcPr>
-            <w:tcW w:type="dxa" w:w="1587"/>
-            <w:vAlign w:val="center"/>
-          </w:tcPr>
-          <w:p>
-            <w:r>
-              <w:rPr>
-                <w:sz w:val="16"/>
-              </w:rPr>
-              <w:t>8f9fd7357818</w:t>
-            </w:r>
-          </w:p>
-        </w:tc>
-        <w:tc>
-          <w:tcPr>
-            <w:tcW w:type="dxa" w:w="1928"/>
-            <w:vAlign w:val="center"/>
-          </w:tcPr>
-          <w:p>
-            <w:r>
-              <w:rPr>
-                <w:sz w:val="16"/>
-              </w:rPr>
-              <w:t>balanced accuracy 0.722</w:t>
-            </w:r>
-          </w:p>
-        </w:tc>
-        <w:tc>
-          <w:tcPr>
-            <w:tcW w:type="dxa" w:w="1814"/>
-            <w:vAlign w:val="center"/>
-          </w:tcPr>
-          <w:p>
-            <w:r>
-              <w:rPr>
-                <w:sz w:val="16"/>
-              </w:rPr>
-              <w:t>site-grouped balanced accuracy 0.722</w:t>
-            </w:r>
-          </w:p>
-        </w:tc>
-        <w:tc>
-          <w:tcPr>
-            <w:tcW w:type="dxa" w:w="1474"/>
-            <w:vAlign w:val="center"/>
-          </w:tcPr>
-          <w:p>
-            <w:r>
-              <w:rPr>
-                <w:sz w:val="16"/>
-              </w:rPr>
-              <w:t>balanced accuracy</w:t>
-            </w:r>
-          </w:p>
-        </w:tc>
-        <w:tc>
-          <w:tcPr>
-            <w:tcW w:type="dxa" w:w="1134"/>
-            <w:vAlign w:val="center"/>
-          </w:tcPr>
-          <w:p>
-            <w:r>
-              <w:rPr>
-                <w:sz w:val="16"/>
-              </w:rPr>
-              <w:t>Not performed</w:t>
-            </w:r>
-          </w:p>
-        </w:tc>
-      </w:tr>
-      <w:tr>
-        <w:trPr>
-          <w:cantSplit/>
-        </w:trPr>
-        <w:tc>
-          <w:tcPr>
-            <w:tcW w:type="dxa" w:w="1474"/>
-            <w:vAlign w:val="center"/>
-          </w:tcPr>
-          <w:p>
-            <w:r>
-              <w:rPr>
-                <w:sz w:val="16"/>
-              </w:rPr>
-              <w:t>UCEC–Aneuploidy score</w:t>
-            </w:r>
-          </w:p>
-        </w:tc>
-        <w:tc>
-          <w:tcPr>
-            <w:tcW w:type="dxa" w:w="1587"/>
-            <w:vAlign w:val="center"/>
-          </w:tcPr>
-          <w:p>
-            <w:r>
-              <w:rPr>
-                <w:sz w:val="16"/>
-              </w:rPr>
-              <w:t>0c520d8a9d57</w:t>
-            </w:r>
-          </w:p>
-        </w:tc>
-        <w:tc>
-          <w:tcPr>
-            <w:tcW w:type="dxa" w:w="1928"/>
-            <w:vAlign w:val="center"/>
-          </w:tcPr>
-          <w:p>
-            <w:r>
-              <w:rPr>
-                <w:sz w:val="16"/>
-              </w:rPr>
-              <w:t>Q2 0.347</w:t>
-            </w:r>
-          </w:p>
-        </w:tc>
-        <w:tc>
-          <w:tcPr>
-            <w:tcW w:type="dxa" w:w="1814"/>
-            <w:vAlign w:val="center"/>
-          </w:tcPr>
-          <w:p>
-            <w:r>
-              <w:rPr>
-                <w:sz w:val="16"/>
-              </w:rPr>
-              <w:t>site-grouped Q2 0.328</w:t>
-            </w:r>
-          </w:p>
-        </w:tc>
-        <w:tc>
-          <w:tcPr>
-            <w:tcW w:type="dxa" w:w="1474"/>
-            <w:vAlign w:val="center"/>
-          </w:tcPr>
-          <w:p>
-            <w:r>
-              <w:rPr>
-                <w:sz w:val="16"/>
-              </w:rPr>
-              <w:t>Q2</w:t>
-            </w:r>
-          </w:p>
-        </w:tc>
-        <w:tc>
-          <w:tcPr>
-            <w:tcW w:type="dxa" w:w="1134"/>
-            <w:vAlign w:val="center"/>
-          </w:tcPr>
-          <w:p>
-            <w:r>
-              <w:rPr>
-                <w:sz w:val="16"/>
-              </w:rPr>
-              <w:t>Not performed</w:t>
-            </w:r>
-          </w:p>
-        </w:tc>
-      </w:tr>
-    </w:tbl>
-    <w:p/>
-    <w:p>
-      <w:pPr>
-        <w:pStyle w:val="Caption"/>
-      </w:pPr>
-      <w:r>
-        <w:t>Table 2. Prospectively locked subset for future independent evaluation. Model selection occurred after the TCGA screen but before any external feature, outcome or prediction was inspected. Full hashes, secondary metrics, endpoint-compatibility rules and mandatory failure reporting are provided in Supplementary Table S6c and the machine-readable lock file.</w:t>
+        <w:t>Three UCEC targets—TP53 mutation, genome doubling and continuous aneuploidy score—were prospectively locked for future independent evaluation, but no external result is available. Target definitions, internal estimates, artifact hashes, endpoint-compatibility rules and mandatory failure reporting are provided in Supplementary Table S6c and the software documentation.</w:t>
       </w:r>
     </w:p>
     <w:p>
@@ -2669,12 +2287,12 @@
         <w:pStyle w:val="Heading2"/>
       </w:pPr>
       <w:r>
-        <w:t>Research-software interface and COAD radar illustration</w:t>
+        <w:t>Illustrative COAD output</w:t>
       </w:r>
     </w:p>
     <w:p>
       <w:r>
-        <w:t>The access-controlled TITANPred R package contains 323 fitted models (219 continuous and 104 binary) across 27 cancers [32]. An authorised research user supplies a cancer vector and correctly named 768-dimensional TITAN features; the interface applies every bundled model available for that cancer. Repeated patient identifiers are mean-pooled before inference. Continuous outputs retain source endpoint units and are positioned against repeated out-of-fold reference distributions; binary outputs comprise the fitted PLS-LDA class and uncalibrated LDA score. Default inference exposes 306 models; the 17 limited-evidence binary models require explicit opt-in. Every binary display uses the adjacent label 'TCGA OOF score rank (not probability)' and places training positive/negative counts, prevalence, repeated-CV balanced accuracy, AUROC, PR-AUC, TCGA-prevalence PPV/NPV, fold minima, component variability, repeat stability, the tissue-source-site-grouped metric and any limited-class-size or site-sensitivity warning beside the call. A single-sample research-software output renders all available continuous endpoints as a radar, with the exact reference percentile and original prediction printed at every corner, and displays binary calls with provenance and out-of-distribution diagnostics. The demonstration ends with definitions of every displayed endpoint and citations for the data source used to construct each TCGA model target. A prominent report banner states that the output lacks independent external validation, is uncalibrated for probability and is not for diagnosis, treatment selection or clinical-risk estimation. The package provides a synthetic feature vector constructed from stored training-feature means for interface examples and smoke tests; it is explicitly labelled as not being a patient record.</w:t>
+        <w:t>The fitted-model resource was implemented as research software; construction, model inventory, checksums, score-rank definitions, reliability warnings, input validation and report behaviour are described in Supplementary Methods, Tables S6b–S6c and S13, and the package documentation [32].</w:t>
       </w:r>
     </w:p>
     <w:p>
@@ -2810,7 +2428,7 @@
     </w:p>
     <w:p>
       <w:r>
-        <w:t>A further practical feature is data-minimising model portability. Preprocessing values, latent weights and coefficients are sufficient for continuous prediction, with compact LDA parameters added for binary classification. The access-controlled TITANPred package applies cancer-matched models to correctly ordered TITAN features without requiring the original patient embeddings or outcomes [32]. Its current private status is stated explicitly; the manuscript makes no public-artifact availability claim. This design reduces the patient-level data that would need to be exchanged in authorised research, although it does not itself confer privacy, satisfy local governance requirements or establish transportability. The synthetic smoke-test vector supports routine interface testing without creating a patient narrative. The two main-text COAD radar examples remain explicitly post hoc and cannot provide new accuracy, prognosis or response-prediction evidence.</w:t>
+        <w:t>A further practical feature is data-minimising model portability. Preprocessing values, latent weights and coefficients are sufficient for continuous prediction, with compact LDA parameters added for binary classification. The access-controlled TITANPred package applies cancer-matched models to correctly ordered TITAN features without requiring the original patient embeddings or outcomes [32]. Its current private status is stated explicitly; the manuscript makes no public-artifact availability claim. This design reduces the patient-level data that would need to be exchanged in authorised research, although it does not itself confer privacy, satisfy local governance requirements or establish transportability. The synthetic smoke-test vector supports routine interface testing without creating a patient narrative. The two main-text COAD examples remain explicitly post hoc and cannot provide new accuracy, prognosis or response-prediction evidence.</w:t>
       </w:r>
     </w:p>
     <w:p>

</xml_diff>

<commit_message>
Clarify TCGA tissue-source-site code
</commit_message>
<xml_diff>
--- a/manuscript/manuscript_JTM_patient_level_TITAN.docx
+++ b/manuscript/manuscript_JTM_patient_level_TITAN.docx
@@ -351,7 +351,7 @@
         <w:t xml:space="preserve">Results. </w:t>
       </w:r>
       <w:r>
-        <w:t>Screening identified 219 continuous and 104 binary candidates in prespecified screening tiers A or B. A stricter ≥50-per-class sensitivity retained 87/104 binary candidates; 17 smaller-class models were exploratory and excluded from default inference. Highlighted repeated-CV results included TGCT–TGF-beta Response (five-repeat mean Q² 0.670, selection-conditioned 95% patient-resampling interval 0.573–0.741; RMSE 0.303, Spearman 0.791) and LGG–TP53 (five-repeat mean sensitivity 0.839, specificity 0.885, balanced accuracy 0.862, selection-conditioned 95% patient-resampling interval 0.833–0.888; AUROC 0.908, PR-AUC 0.880). Prior studies supported 38/41 screen-positive cancer–gene pairs. 320/323 local candidates passed single BH correction across all 2,073 eligible tests. Tissue-source-site grouping reduced 83/323 candidates (25.7%) below the original screening threshold. In a 47-target metadata-stratified benchmark selected without PLS performance, median ridge-minus-PLS differences were 0.008 AUROC and 0.053 Q²; paired intervals favoured ridge for 8/35 binary and 10/12 continuous targets, and PLS for none.</w:t>
+        <w:t>Screening identified 219 continuous and 104 binary candidates in screening tiers A or B. A stricter ≥50-per-class sensitivity retained 87/104 binary candidates; 17 smaller-class models were exploratory and excluded from default inference. Highlighted repeated-CV results included TGCT–TGF-beta Response (five-repeat mean Q² 0.670, selection-conditioned 95% patient-resampling interval 0.573–0.741; RMSE 0.303, Spearman 0.791) and LGG–TP53 (five-repeat mean sensitivity 0.839, specificity 0.885, balanced accuracy 0.862, selection-conditioned 95% patient-resampling interval 0.833–0.888; AUROC 0.908, PR-AUC 0.880). Prior studies supported 38/41 screen-positive cancer–gene pairs. 320/323 local candidates passed single BH correction across 2,073 eligible tests. Grouping by TCGA tissue-source-site code reduced 83/323 candidates (25.7%) below the screening threshold. In a 47-target metadata-stratified benchmark selected without PLS performance, median ridge-minus-PLS differences were 0.008 AUROC and 0.053 Q²; paired intervals favoured ridge for 8/35 binary and 10/12 continuous targets, and PLS for none.</w:t>
       </w:r>
     </w:p>
     <w:p>
@@ -401,7 +401,7 @@
     </w:p>
     <w:p>
       <w:r>
-        <w:t>The narrower unresolved gap is a reproducible benchmark that applies one fixed pretrained representation to every target; deterministically aggregates slides before outcome matching; performs nested validation with the patient as the unit; preserves tested-negative and sample-size-ineligible results; reports target-level tissue-source-site sensitivity; models selected derived immune and genomic-context features continuously; and constructs compact fitted predictors with research-use provenance metadata. These design and resource features—not unprecedented endpoint classes—define the contribution of this study.</w:t>
+        <w:t>The narrower unresolved gap is a reproducible benchmark that applies one fixed pretrained representation to every target; deterministically aggregates slides before outcome matching; performs nested validation with the patient as the unit; preserves tested-negative and sample-size-ineligible results; reports target-level sensitivity to grouping by TCGA tissue-source-site code; models selected derived immune and genomic-context features continuously; and constructs compact fitted predictors with research-use provenance metadata. These design and resource features—not unprecedented endpoint classes—define the contribution of this study.</w:t>
       </w:r>
     </w:p>
     <w:p>
@@ -589,7 +589,7 @@
     </w:p>
     <w:p>
       <w:r>
-        <w:t>Because each disease defines a separate prediction and intended-use population, Benjamini–Hochberg FDR was controlled separately for continuous and binary screens within cancer and prespecified endpoint family [27]. Two stricter sensitivities were retained: BH across cancers within the same outcome type and family, and a single BH correction across all eligible continuous and binary cancer–endpoint tests in the atlas. Eight models were locked before high-resolution results were generated: four leading continuous immune programmes and four leading binary claims spanning mutation, strict MSI and fusion endpoints. Their saved first 999 permutations were extended without early stopping to 9,999 complete-process permutations. This targeted analysis improves Monte Carlo resolution for leading claims but was not substituted into the prespecified 999-permutation FDR screen. The screening statistic is Q² for continuous outcomes and 2×balanced accuracy−1 for binary outcomes. Screen-positive candidates were assigned to prespecified screening tier A (primary q&lt;0.05 and screening statistic≥0.40) or prespecified screening tier B (primary q&lt;0.05 and screening statistic from 0.20 to &lt;0.40). For binary outcomes these cut-offs correspond to balanced accuracy≥0.70 and 0.60 to &lt;0.70, respectively; for continuous outcomes they correspond to Q²≥0.40 and 0.20 to &lt;0.40. Screen-negative tested pairs and pairs ineligible by sample-size rules were reported separately. Models are ordered by the outcome-appropriate predictive metric, with repeated and site-grouped stability reported alongside; tied permutation q-values are not used for ranking. The tiers are prespecified prioritisation rules, not established clinical or statistical effect categories, and their numerical values are not interpreted as directly commensurate across outcome types.</w:t>
+        <w:t>Because each disease defines a separate prediction and intended-use population, Benjamini–Hochberg FDR was controlled separately for continuous and binary screens within cancer and prespecified endpoint family [27]. Two stricter sensitivities were retained: BH across cancers within the same outcome type and family, and a single BH correction across all eligible continuous and binary cancer–endpoint tests in the atlas. Eight models were locked before high-resolution results were generated: four leading continuous immune programmes and four leading binary claims spanning mutation, strict MSI and fusion endpoints. Their saved first 999 permutations were extended without early stopping to 9,999 complete-process permutations. This targeted analysis improves Monte Carlo resolution for leading claims but was not substituted into the prespecified 999-permutation FDR screen. The screening statistic is Q² for continuous outcomes and 2×balanced accuracy−1 for binary outcomes. Screen-positive candidates were assigned to prespecified screening tier A (primary q&lt;0.05 and screening statistic≥0.40) or prespecified screening tier B (primary q&lt;0.05 and screening statistic from 0.20 to &lt;0.40). For binary outcomes these cut-offs correspond to balanced accuracy≥0.70 and 0.60 to &lt;0.70, respectively; for continuous outcomes they correspond to Q²≥0.40 and 0.20 to &lt;0.40. Screen-negative tested pairs and pairs ineligible by sample-size rules were reported separately. Models are ordered by the outcome-appropriate predictive metric, with repeated stability and stability under grouping by TCGA tissue-source-site code reported alongside; tied permutation q-values are not used for ranking. The tiers are prespecified prioritisation rules, not established clinical or statistical effect categories, and their numerical values are not interpreted as directly commensurate across outcome types.</w:t>
       </w:r>
     </w:p>
     <w:p>
@@ -602,7 +602,7 @@
     </w:p>
     <w:p>
       <w:r>
-        <w:t>The initial nested-CV estimate used for candidate screening, permutation testing and tier assignment is termed the primary screening estimate. Only endpoints passing that initial atlas screen entered five additional independently seeded nested-CV partitions; their reported repeated-validation estimate is the arithmetic mean of the five repeat-specific metrics. The two estimates answer different questions and need not be numerically identical because they use different fold partitions and rSVD seeds. The primary screening estimate preserves the prespecified selection and multiplicity path, whereas the five-repeat estimate describes post-selection resampling stability; it does not replace or retroactively alter screen membership. For example, THYM–Th17 had primary screening Q²=0.638 and five-repeat mean Q²=0.594. Each repeat seed governed both fold construction and rSVD. Sensitivity, specificity, balanced accuracy and AUROC were calculated within each repeat for binary endpoints; Q², RMSE and Spearman correlation were calculated within each repeat for continuous endpoints. LDA scores from independently fitted repeats were never pooled onto an assumed common scale. For highlighted models, 1,000 patient-cluster bootstrap resamples retained all five existing held-out predictions for each sampled patient, recalculated the metric within repeat and then averaged the five repeat metrics; the 2.5th and 97.5th percentiles formed the reported 95% selection-conditioned patient-resampling interval for repeated out-of-fold predictions. This interval represents patient sampling variability conditional on the five fitted nested-CV prediction sets. It includes neither the initial screen and endpoint highlighting nor new partition generation, scaling or component reselection, model refitting inside bootstrap replicates, winner's-curse correction, or external cohort, site, scanner and population variation. Tissue-source-site-grouped validation assigned all patients sharing a two-character TCGA tissue-source-site code to the same outer fold. The same site constraint was passed to every inner component-selection split within the outer training set; thus neither outer performance estimation nor inner tuning divided a tissue-source site across folds. For every model and outer fold, we recorded test and training patients, sites, and—where applicable—positive and negative cases. A sensitivity analysis replaced each mean-pooled vector with the lexicographically first eligible diagnostic slide while preserving patients and seeds. Full-data research models were tuned by ten-fold CV and saved with feature order and checksum, training ranges, aggregation rule, endpoint transformation and output units, class coding and priors, decision rule, calibration status, class counts, exact software version and commit, computation backend, rSVD controls, external-validation status and intended-use metadata.</w:t>
+        <w:t>The initial nested-CV estimate used for candidate screening, permutation testing and tier assignment is termed the primary screening estimate. Only endpoints passing that initial atlas screen entered five additional independently seeded nested-CV partitions; their reported repeated-validation estimate is the arithmetic mean of the five repeat-specific metrics. The two estimates answer different questions and need not be numerically identical because they use different fold partitions and rSVD seeds. The primary screening estimate preserves the prespecified selection and multiplicity path, whereas the five-repeat estimate describes post-selection resampling stability; it does not replace or retroactively alter screen membership. For example, THYM–Th17 had primary screening Q²=0.638 and five-repeat mean Q²=0.594. Each repeat seed governed both fold construction and rSVD. Sensitivity, specificity, balanced accuracy and AUROC were calculated within each repeat for binary endpoints; Q², RMSE and Spearman correlation were calculated within each repeat for continuous endpoints. LDA scores from independently fitted repeats were never pooled onto an assumed common scale. For highlighted models, 1,000 patient-cluster bootstrap resamples retained all five existing held-out predictions for each sampled patient, recalculated the metric within repeat and then averaged the five repeat metrics; the 2.5th and 97.5th percentiles formed the reported 95% selection-conditioned patient-resampling interval for repeated out-of-fold predictions. This interval represents patient sampling variability conditional on the five fitted nested-CV prediction sets. It includes neither the initial screen and endpoint highlighting nor new partition generation, scaling or component reselection, model refitting inside bootstrap replicates, winner's-curse correction, or external cohort, institution, scanner and population variation. Validation grouped by TCGA tissue-source-site code assigned all patients sharing the same two-character code to one outer fold. The same TCGA tissue-source-site-code constraint was passed to every inner component-selection split within the outer training set; thus neither outer performance estimation nor inner tuning divided a code across folds. For every model and outer fold, we recorded test and training patients, TCGA tissue-source-site codes, and—where applicable—positive and negative cases. A sensitivity analysis replaced each mean-pooled vector with the lexicographically first eligible diagnostic slide while preserving patients and seeds. Full-data research models were tuned by ten-fold CV and saved with feature order and checksum, training ranges, aggregation rule, endpoint transformation and output units, class coding and priors, decision rule, calibration status, class counts, exact software version and commit, computation backend, rSVD controls, external-validation status and intended-use metadata.</w:t>
       </w:r>
     </w:p>
     <w:p>
@@ -612,7 +612,7 @@
     </w:p>
     <w:p>
       <w:r>
-        <w:t>To quantify whether TITAN itself retained submitting-site information, we treated tissue-source site as a multiclass outcome within each cancer. This dedicated confounding analysis retained sites with at least 10 patients, required at least two eligible sites per cancer, and used five independently seeded nested five-fold PLS–LDA validations with the same component range and rSVD controls. The primary metric was multiclass macro balanced accuracy (mean per-site recall); chance was 1/k for k analysed sites, and a chance-normalised value, (balanced accuracy − 1/k)/(1 − 1/k), was calculated for cross-cancer description. Patients from rare sites excluded from this site-classification analysis remained in all eligible molecular-endpoint analyses. This analysis tests whether the representation encodes TCGA submitting-site signatures; it does not identify their scanner, laboratory, staining or population causes.</w:t>
+        <w:t>To quantify whether TITAN itself retained information about TCGA tissue-source-site code, we treated that code as a multiclass outcome within each cancer. This dedicated confounding analysis retained codes represented by at least 10 patients, required at least two eligible codes per cancer, and used five independently seeded nested five-fold PLS–LDA validations with the same component range and rSVD controls. The primary metric was multiclass macro balanced accuracy (mean recall across TCGA tissue-source-site codes); chance was 1/k for k analysed codes, and a chance-normalised value, (balanced accuracy − 1/k)/(1 − 1/k), was calculated for cross-cancer description. Patients with rare codes excluded from this code-classification analysis remained in all eligible molecular-endpoint analyses. This analysis tests whether the representation encodes TCGA tissue-source-site-code signatures; it does not identify their scanner, laboratory, staining or population causes.</w:t>
       </w:r>
     </w:p>
     <w:p>
@@ -622,7 +622,7 @@
     </w:p>
     <w:p>
       <w:r>
-        <w:t>TITANPred retains the binary LDA score but does not convert it to a probability. In the research-software demonstration, its position is labelled 'TCGA out-of-fold score rank (not probability)' rather than percentile or risk. Binary output displays total training n, class counts and prevalence; balanced accuracy, AUROC and PR-AUC; TCGA-prevalence PPV and NPV; fold minima, component-selection variability and repeat stability; and site sensitivity. The 17 screen-positive models with fewer than 50 patients in either class are marked exploratory/limited evidence, omitted from default inference and available only through explicit opt-in with a warning. Probability calibration was not added post hoc because it would require an independently evaluated or fully nested calibration procedure, which is not available in this TCGA benchmark.</w:t>
+        <w:t>TITANPred retains the binary LDA score but does not convert it to a probability. In the research-software demonstration, its position is labelled 'TCGA out-of-fold score rank (not probability)' rather than percentile or risk. Binary output displays total training n, class counts and prevalence; balanced accuracy, AUROC and PR-AUC; TCGA-prevalence PPV and NPV; fold minima, component-selection variability and repeat stability; and sensitivity to grouping by TCGA tissue-source-site code. The 17 screen-positive models with fewer than 50 patients in either class are marked exploratory/limited evidence, omitted from default inference and available only through explicit opt-in with a warning. Probability calibration was not added post hoc because it would require an independently evaluated or fully nested calibration procedure, which is not available in this TCGA benchmark.</w:t>
       </w:r>
     </w:p>
     <w:p>
@@ -1997,7 +1997,7 @@
     </w:p>
     <w:p>
       <w:r>
-        <w:t>Among completed 999-permutation tests, 308 had zero null statistics at least as extreme as observed. Their finite empirical p-value was 0.001, but the exact two-sided 95% Monte Carlo interval for the underlying exceedance probability was 0–0.003686. The prespecified high-resolution subset extended 8 leading models to 9,999 full nested permutations; 8 had zero exceedances and refined p-values were all 0.0001. The refined values are a targeted precision sensitivity and were not inserted into the primary FDR calculations. Because many primary p- and q-values remain tied at their attainable minimum, figures and tables are ordered by the outcome-appropriate predictive metric, with repeated and site-grouped stability reported alongside; q-values are not used for ranking.</w:t>
+        <w:t>Among completed 999-permutation tests, 308 had zero null statistics at least as extreme as observed. Their finite empirical p-value was 0.001, but the exact two-sided 95% Monte Carlo interval for the underlying exceedance probability was 0–0.003686. The prespecified high-resolution subset extended 8 leading models to 9,999 full nested permutations; 8 had zero exceedances and refined p-values were all 0.0001. The refined values are a targeted precision sensitivity and were not inserted into the primary FDR calculations. Because many primary p- and q-values remain tied at their attainable minimum, figures and tables are ordered by the outcome-appropriate predictive metric, with repeated stability and stability under grouping by TCGA tissue-source-site code reported alongside; q-values are not used for ranking.</w:t>
       </w:r>
     </w:p>
     <w:p>
@@ -2103,7 +2103,7 @@
     </w:p>
     <w:p>
       <w:r>
-        <w:t>Complete highlighted-model performance, uncertainty, class-size metrics and tissue-source-site-grouped estimates are reported in Supplementary Table S6a and the machine-readable result files. The main text retains outcome-level summaries and illustrative figures.</w:t>
+        <w:t>Complete highlighted-model performance, uncertainty, class-size metrics and estimates grouped by TCGA tissue-source-site code are reported in Supplementary Table S6a and the machine-readable result files. The main text retains outcome-level summaries and illustrative figures.</w:t>
       </w:r>
     </w:p>
     <w:p>
@@ -2172,22 +2172,22 @@
         <w:pStyle w:val="Heading2"/>
       </w:pPr>
       <w:r>
-        <w:t>Tissue-source-site sensitivity and submitting-site prediction</w:t>
+        <w:t>Sensitivity to TCGA tissue-source-site-code grouping</w:t>
       </w:r>
     </w:p>
     <w:p>
       <w:r>
-        <w:t xml:space="preserve">Tissue-source-site-grouped internal validation was feasible for 323 screen-positive models. Although the median grouped-minus-random performance change was only -0.026, 83/323 models (25.7%) fell below the original prespecified screening threshold: 58/219 continuous models and 25/104 binary models. Prominent attenuations were READ–APC (balanced accuracy 0.862 to 0.495); COAD–APC (balanced accuracy 0.793 to 0.543); PCPG–Cell Cycle (balanced accuracy 0.686 to 0.476); LIHC–CTNNB1 (balanced accuracy 0.668 to 0.565); OV–TCR Shannon (Q² 0.206 to -0.551); COAD–SNV Neoantigens (Q² 0.239 to -0.013). The site-grouped folds contain fewer and less evenly distributed training and test patients, so the decline cannot be attributed solely to site artefact; nevertheless, the near-chance colorectal APC results are not adequately summarised by the median and are labelled site-sensitive in the main model table, registry and research-software output. </w:t>
+        <w:t xml:space="preserve">Internal validation grouped by TCGA tissue-source-site code was feasible for 323 screen-positive models. Although the median grouped-minus-random performance change was only -0.026, 83/323 models (25.7%) fell below the original prespecified screening threshold: 58/219 continuous models and 25/104 binary models. Prominent attenuations were READ–APC (balanced accuracy 0.862 to 0.495); COAD–APC (balanced accuracy 0.793 to 0.543); PCPG–Cell Cycle (balanced accuracy 0.686 to 0.476); LIHC–CTNNB1 (balanced accuracy 0.668 to 0.565); OV–TCR Shannon (Q² 0.206 to -0.551); COAD–SNV Neoantigens (Q² 0.239 to -0.013). Folds grouped by TCGA tissue-source-site code contain fewer and less evenly distributed training and test patients, so the decline cannot be attributed solely to confounding by that code; nevertheless, the near-chance colorectal APC results are not adequately summarised by the median and are prominently labelled as sensitive to TCGA tissue-source-site-code grouping in the registry and research-software output. </w:t>
       </w:r>
     </w:p>
     <w:p>
       <w:r>
-        <w:t>Across 1,613 outer folds, test partitions contained 1–445 patients and 1–9 tissue-source sites; binary folds contained 0–130 positive and 0–269 negative patients. These imbalances are intrinsic to keeping complete sites together and are reported model by model and fold by fold. The deterministic fold audit confirmed that no site crossed an outer fold and that the same separation was maintained in every inner component-selection split.</w:t>
+        <w:t>Across 1,613 outer folds, test partitions contained 1–445 patients and 1–9 TCGA tissue-source-site codes; binary folds contained 0–130 positive and 0–269 negative patients. These imbalances are intrinsic to keeping complete code groups together and are reported model by model and fold by fold. The deterministic fold audit confirmed that no TCGA tissue-source-site code crossed an outer fold and that the same separation was maintained in every inner component-selection split.</w:t>
       </w:r>
     </w:p>
     <w:p>
       <w:r>
-        <w:t>The dedicated within-cancer site-classification analysis was evaluable in 27/32 cancers and included 7,863 patients from sites with at least 10 patients. All 27 observed macro balanced accuracies exceeded their cancer-specific 1/k chance reference; the median was 0.628 (range 0.425–0.966). The strongest chance-normalised site predictability occurred in UVM (macro balanced accuracy 0.966; 3 sites); OV (macro balanced accuracy 0.963; 2 sites); PAAD (macro balanced accuracy 0.911; 5 sites); ESCA (macro balanced accuracy 0.861; 7 sites); READ (macro balanced accuracy 0.862; 5 sites). ACC, CHOL, DLBC, MESO and UCS had fewer than two sites meeting the 10-patient requirement and were reported as ineligible. This result shows substantial submitting-site information in the fixed TITAN representation and strengthens the confounding concern; it does not identify a causal scanner, laboratory or staining effect.</w:t>
+        <w:t>The dedicated within-cancer TCGA tissue-source-site-code classification analysis was evaluable in 27/32 cancers and included 7,863 patients from codes represented by at least 10 patients. All 27 observed macro balanced accuracies exceeded their cancer-specific 1/k chance reference; the median was 0.628 (range 0.425–0.966). The strongest chance-normalised code predictability occurred in UVM (macro balanced accuracy 0.966; 3 codes); OV (macro balanced accuracy 0.963; 2 codes); PAAD (macro balanced accuracy 0.911; 5 codes); ESCA (macro balanced accuracy 0.861; 7 codes); READ (macro balanced accuracy 0.862; 5 codes). ACC, CHOL, DLBC, MESO and UCS had fewer than two codes meeting the 10-patient requirement and were reported as ineligible. This result shows substantial TCGA tissue-source-site-code information in the fixed TITAN representation and strengthens the confounding concern; it does not identify a causal scanner, laboratory or staining effect.</w:t>
       </w:r>
     </w:p>
     <w:p>
@@ -2235,7 +2235,7 @@
         <w:jc w:val="center"/>
       </w:pPr>
       <w:r>
-        <w:t>Figure 6. Tissue-source-site sensitivity as a principal result. Panel A compares all 323 random-fold and grouped estimates; Panel B shows the eight largest attenuations; Panel C shows the 15 strongest chance-normalised within-cancer submitting-site results. Larger typography and restricted ranked panels improve readability. Grouping remains internal to TCGA and is not institutional or scanner-level external validation.</w:t>
+        <w:t>Figure 6. Sensitivity to TCGA tissue-source-site-code grouping as a principal result. Panel A compares all 323 random-fold estimates with estimates grouped by TCGA tissue-source-site code; Panel B shows the eight largest attenuations; Panel C shows the 15 strongest chance-normalised within-cancer code-classification results. Larger typography and restricted ranked panels improve readability. This grouping remains internal to TCGA; the code is not an institutional, scanner or laboratory identifier, and the analysis is not external validation.</w:t>
       </w:r>
     </w:p>
     <w:p>
@@ -2248,7 +2248,7 @@
     </w:p>
     <w:p>
       <w:r>
-        <w:t>Replacing each deterministic patient mean with the lexicographically first eligible diagnostic slide produced a median first-slide-minus-mean-pool performance change of -0.001 across screen-positive models. This patient-level sensitivity is distinct from the tissue-source-site analysis.</w:t>
+        <w:t>Replacing each deterministic patient mean with the lexicographically first eligible diagnostic slide produced a median first-slide-minus-mean-pool performance change of -0.001 across screen-positive models. This patient-level sensitivity is distinct from the analysis grouped by TCGA tissue-source-site code.</w:t>
       </w:r>
     </w:p>
     <w:p>
@@ -2363,7 +2363,7 @@
     </w:p>
     <w:p>
       <w:r>
-        <w:t>The closest breadth comparator is Arslan et al., who already trained 12,093 target-specific models for 4,031 multi-omic biomarkers in 8,890 TCGA patients across the same 32 cancers [13]. The present study is smaller in endpoint breadth and lacks external validation. Its differentiating elements are the fixed pretrained representation, deterministic pre-outcome patient aggregation, nested patient-level validation, complete tested-negative and ineligible outputs, target-level site-grouped sensitivity, continuous modelling of selected immune and genomic-context measures, and distribution of compact fitted linear predictors. These distinctions—not breadth or endpoint novelty—motivate the study.</w:t>
+        <w:t>The closest breadth comparator is Arslan et al., who already trained 12,093 target-specific models for 4,031 multi-omic biomarkers in 8,890 TCGA patients across the same 32 cancers [13]. The present study is smaller in endpoint breadth and lacks external validation. Its differentiating elements are the fixed pretrained representation, deterministic pre-outcome patient aggregation, nested patient-level validation, complete tested-negative and ineligible outputs, target-level sensitivity to grouping by TCGA tissue-source-site code, continuous modelling of selected immune and genomic-context measures, and distribution of compact fitted linear predictors. These distinctions—not breadth or endpoint novelty—motivate the study.</w:t>
       </w:r>
     </w:p>
     <w:p>
@@ -2418,12 +2418,12 @@
     </w:p>
     <w:p>
       <w:r>
-        <w:t>Tissue-source-site sensitivity is a central result rather than a generic robustness footnote. Grouping revealed heterogeneity that the median attenuation concealed: 83/323 screen-positive models (25.7%) fell below their original prespecified screening threshold. READ–APC and COAD–APC declined from balanced accuracies 0.862 and 0.793 to 0.495 and 0.543, respectively. Smaller and less balanced training folds contribute to grouped-validation loss, but performance close to chance requires these models to be labelled site-sensitive rather than robust biological signals. The model registry and inference output therefore expose the grouped metric, delta, number of sites, threshold-retention status and a prominent warning for every affected endpoint.</w:t>
+        <w:t>Sensitivity to grouping by TCGA tissue-source-site code is a central result rather than a generic robustness footnote. Grouping revealed heterogeneity that the median attenuation concealed: 83/323 screen-positive models (25.7%) fell below their original prespecified screening threshold. READ–APC and COAD–APC declined from balanced accuracies 0.862 and 0.793 to 0.495 and 0.543, respectively. Smaller and less balanced training folds contribute to grouped-validation loss, but performance close to chance requires these models to carry a prominent warning rather than be described as robust biological signals. The model registry and inference output therefore expose the grouped metric, delta, number of TCGA tissue-source-site codes, threshold-retention status and warning for every affected endpoint.</w:t>
       </w:r>
     </w:p>
     <w:p>
       <w:r>
-        <w:t>The complementary site-classification analysis strengthens this interpretation: the fixed TITAN representation predicted submitting site within 27/32 evaluable cancers, with median macro balanced accuracy 0.628 despite cancer-specific chance references from 0.053 to 0.500. This demonstrates that site information is present in the representation and could support confounding. It does not show that each attenuated molecular model is wholly artifactual, because site correlates with case mix and molecular prevalence as well as technical acquisition. Conversely, successful tissue-source-site grouping cannot prove transportability: the barcode-derived site is an imperfect proxy for institutions, scanners, staining laboratories and batch effects.</w:t>
+        <w:t>The complementary TCGA tissue-source-site-code classification analysis strengthens this interpretation: the fixed TITAN representation predicted the code within 27/32 evaluable cancers, with median macro balanced accuracy 0.628 despite cancer-specific chance references from 0.053 to 0.500. This demonstrates that information about the TCGA tissue-source-site code is present in the representation and could support confounding. It does not show that each attenuated molecular model is wholly artifactual, because the code correlates with case mix and molecular prevalence as well as technical acquisition. Conversely, successful grouping by TCGA tissue-source-site code cannot prove transportability: the barcode-derived code is not an institution, scanner, staining laboratory or batch identifier.</w:t>
       </w:r>
     </w:p>
     <w:p>
@@ -2433,12 +2433,12 @@
     </w:p>
     <w:p>
       <w:r>
-        <w:t>Strengths include primary-tumour matching across every data source, deterministic mean pooling of multiple slides, nested patient-level validation, FDR control within cancer and endpoint family, exact negative-result reporting, site-grouped sensitivity, saved research models and executable inference code. The supplied Bonneville spreadsheets contained only an ACC/CESC/MESO subset; cBioPortal PanCancer Atlas MANTIS fields were therefore used for full coverage and agreed exactly for all 387 overlapping cases.</w:t>
+        <w:t>Strengths include primary-tumour matching across every data source, deterministic mean pooling of multiple slides, nested patient-level validation, FDR control within cancer and endpoint family, exact negative-result reporting, sensitivity analysis grouped by TCGA tissue-source-site code, saved research models and executable inference code. The supplied Bonneville spreadsheets contained only an ACC/CESC/MESO subset; cBioPortal PanCancer Atlas MANTIS fields were therefore used for full coverage and agreed exactly for all 387 overlapping cases.</w:t>
       </w:r>
     </w:p>
     <w:p>
       <w:r>
-        <w:t>The principal limitation is absence of independent external validation. TCGA resampling—including the analysis termed 'TCGA tissue-source-site-grouped internal validation'—cannot establish transportability to another institution, scanner, stain distribution or patient population. Tissue-source site is not a complete scanner or laboratory identifier. The study is retrospective and exploratory; thresholds are prioritisation rules, not clinical operating points. Although TCGA was excluded from TITAN's Mass-340K pretraining corpus, it was used in the original paper's downstream evaluation; the present cohort is therefore neither a pretraining cohort nor an independent validation cohort. Predictability does not establish biological causality, and image-derived estimates cannot justify omitting a molecular assay. The three-model UCEC subset is locked only for future independent evaluation. Until that untouched analysis reports every target, the work should be evaluated as a computational pathology benchmark and research-software resource rather than a translational prediction study.</w:t>
+        <w:t>The principal limitation is absence of independent external validation. TCGA resampling—including the analysis termed 'internal validation grouped by TCGA tissue-source-site code'—cannot establish transportability to another institution, scanner, stain distribution or patient population. The TCGA tissue-source-site code is not an institution, scanner or laboratory identifier. The study is retrospective and exploratory; thresholds are prioritisation rules, not clinical operating points. Although TCGA was excluded from TITAN's Mass-340K pretraining corpus, it was used in the original paper's downstream evaluation; the present cohort is therefore neither a pretraining cohort nor an independent validation cohort. Predictability does not establish biological causality, and image-derived estimates cannot justify omitting a molecular assay. The three-model UCEC subset is locked only for future independent evaluation. Until that untouched analysis reports every target, the work should be evaluated as a computational pathology benchmark and research-software resource rather than a translational prediction study.</w:t>
       </w:r>
     </w:p>
     <w:p>
@@ -2463,7 +2463,7 @@
     </w:p>
     <w:p>
       <w:r>
-        <w:t>Demographic subgroup performance and algorithmic fairness were not evaluated. The TCGA Clinical Data Resource provides descriptive age, recorded gender, race and stage fields, but coverage and subgroup sizes vary across cancers and would fragment further under endpoint-specific molecular missingness. Tissue-source-site grouping probes one form of institutional heterogeneity but cannot establish fairness across ancestry, sex, age or access-to-care groups. Any external evaluation should prespecify representative sampling and subgroup performance, calibration and failure analysis.</w:t>
+        <w:t>Demographic subgroup performance and algorithmic fairness were not evaluated. The TCGA Clinical Data Resource provides descriptive age, recorded gender, race and stage fields, but coverage and subgroup sizes vary across cancers and would fragment further under endpoint-specific molecular missingness. Grouping by TCGA tissue-source-site code probes one source of heterogeneity but does not directly identify an institution and cannot establish fairness across ancestry, sex, age or access-to-care groups. Any external evaluation should prespecify representative sampling and subgroup performance, calibration and failure analysis.</w:t>
       </w:r>
     </w:p>
     <w:p>

</xml_diff>

<commit_message>
Streamline biological results narrative
</commit_message>
<xml_diff>
--- a/manuscript/manuscript_JTM_patient_level_TITAN.docx
+++ b/manuscript/manuscript_JTM_patient_level_TITAN.docx
@@ -2265,21 +2265,8 @@
       </w:r>
     </w:p>
     <w:p>
-      <w:pPr>
-        <w:pStyle w:val="Heading2"/>
-      </w:pPr>
       <w:r>
-        <w:t>External-validation readiness audit</w:t>
-      </w:r>
-    </w:p>
-    <w:p>
-      <w:r>
-        <w:t>No non-TCGA patient entered model evaluation, and no external performance result is reported. The official TITAN release provided the precomputed TCGA representation used here, but the audit did not identify a compatible non-TCGA TITAN embedding set carrying the required outcomes. CPTAC-UCEC is a plausible future cohort: its official TCIA collection reports 250 subjects, 887 pathology whole-slide images (approximately 154 GB) and links to genomic, proteomic and clinical resources [36]. Those slides were not downloaded or processed in this study, and the availability of linked data does not by itself guarantee exact reconstruction of each endpoint.</w:t>
-      </w:r>
-    </w:p>
-    <w:p>
-      <w:r>
-        <w:t>Three UCEC targets—TP53 mutation, genome doubling and continuous aneuploidy score—were prospectively locked for future independent evaluation, but no external result is available. Target definitions, internal estimates, artifact hashes, endpoint-compatibility rules and mandatory failure reporting are provided in Supplementary Table S6c and the software documentation.</w:t>
+        <w:t>No non-TCGA patient entered model evaluation, and no external performance result is reported. The prespecified targets and protocol for future independent evaluation are provided in Supplementary Table S6c and the software documentation.</w:t>
       </w:r>
     </w:p>
     <w:p>
@@ -2287,17 +2274,12 @@
         <w:pStyle w:val="Heading2"/>
       </w:pPr>
       <w:r>
-        <w:t>Illustrative COAD output</w:t>
+        <w:t>Illustrative COAD profiles</w:t>
       </w:r>
     </w:p>
     <w:p>
       <w:r>
-        <w:t>The fitted-model resource was implemented as research software; construction, model inventory, checksums, score-rank definitions, reliability warnings, input validation and report behaviour are described in Supplementary Methods, Tables S6b–S6c and S13, and the package documentation [32].</w:t>
-      </w:r>
-    </w:p>
-    <w:p>
-      <w:r>
-        <w:t>Two COAD participants, TCGA-AA-A01F and TCGA-AA-3972, are retained solely to show continuous and binary research-software outputs (Figure 7). The pair was chosen post hoc after clinical-text and profile-saturation restrictions and then maximising Euclidean separation across continuous TCGA OOF prediction percentiles; the procedure intentionally enhances visual contrast. Nodal status was not matched: TCGA-AA-A01F was reported as pN1, whereas the available slide summary for TCGA-AA-3972 did not state a nodal category. The cases are not presented as a matched clinical comparison, and treatment, response, recurrence, follow-up and survival are neither shown nor interpreted. This is a visualization example, not performance, prevalence, prognosis or treatment-response evidence.</w:t>
+        <w:t>Two COAD participants, TCGA-AA-A01F and TCGA-AA-3972, illustrate contrasting continuous and binary profiles (Figure 7). The pair was chosen post hoc after clinical-text and profile-saturation restrictions and then maximising Euclidean separation across continuous TCGA OOF prediction ranks; the procedure intentionally enhances visual contrast. Nodal status was not matched: TCGA-AA-A01F was reported as pN1, whereas the available slide summary for TCGA-AA-3972 did not state a nodal category. The cases are not presented as a matched clinical comparison, and treatment, response, recurrence, follow-up and survival are neither shown nor interpreted. This is an illustration, not performance, prevalence, prognosis or treatment-response evidence.</w:t>
       </w:r>
     </w:p>
     <w:p>

</xml_diff>

<commit_message>
Clarify TCGA tissue-source-site code terminology
</commit_message>
<xml_diff>
--- a/manuscript/manuscript_JTM_patient_level_TITAN.docx
+++ b/manuscript/manuscript_JTM_patient_level_TITAN.docx
@@ -391,7 +391,7 @@
     </w:p>
     <w:p>
       <w:r>
-        <w:t>Routine haematoxylin-and-eosin sections reflect phenotypic consequences of tumour genotype and the immune microenvironment. Coudray and colleagues established mutation prediction from lung histology [1]. Subsequent work predicted microsatellite instability, including externally validated colorectal models [2,3]; extended mutation and multi-omic screening across TCGA cancers [4,5,8,11,13]; inferred RNA expression [6,12]; identified tissue-source-site bias [7]; detected gene fusions [9,10]; estimated homologous-recombination deficiency [14]; and characterised tumour-microenvironment phenotypes [15]. Collectively, these studies establish biological plausibility while also showing that performance depends on endpoint, disease, cohort and validation design.</w:t>
+        <w:t>Routine haematoxylin-and-eosin sections reflect phenotypic consequences of tumour genotype and the immune microenvironment. Coudray and colleagues established mutation prediction from lung histology [1]. Subsequent work predicted microsatellite instability, including externally validated colorectal models [2,3]; extended mutation and multi-omic screening across TCGA cancers [4,5,8,11,13]; inferred RNA expression [6,12]; identified institution-associated histology bias [7]; detected gene fusions [9,10]; estimated homologous-recombination deficiency [14]; and characterised tumour-microenvironment phenotypes [15]. Collectively, these studies establish biological plausibility while also showing that performance depends on endpoint, disease, cohort and validation design.</w:t>
       </w:r>
     </w:p>
     <w:p>
@@ -602,7 +602,7 @@
     </w:p>
     <w:p>
       <w:r>
-        <w:t>The initial nested-CV estimate used for candidate screening, permutation testing and tier assignment is termed the primary screening estimate. Only endpoints passing that initial atlas screen entered five additional independently seeded nested-CV partitions; their reported repeated-validation estimate is the arithmetic mean of the five repeat-specific metrics. The two estimates answer different questions and need not be numerically identical because they use different fold partitions and rSVD seeds. The primary screening estimate preserves the prespecified selection and multiplicity path, whereas the five-repeat estimate describes post-selection resampling stability; it does not replace or retroactively alter screen membership. For example, THYM–Th17 had primary screening Q²=0.638 and five-repeat mean Q²=0.594. Each repeat seed governed both fold construction and rSVD. Sensitivity, specificity, balanced accuracy and AUROC were calculated within each repeat for binary endpoints; Q², RMSE and Spearman correlation were calculated within each repeat for continuous endpoints. LDA scores from independently fitted repeats were never pooled onto an assumed common scale. For highlighted models, 1,000 patient-cluster bootstrap resamples retained all five existing held-out predictions for each sampled patient, recalculated the metric within repeat and then averaged the five repeat metrics; the 2.5th and 97.5th percentiles formed the reported 95% selection-conditioned patient-resampling interval for repeated out-of-fold predictions. This interval represents patient sampling variability conditional on the five fitted nested-CV prediction sets. It includes neither the initial screen and endpoint highlighting nor new partition generation, scaling or component reselection, model refitting inside bootstrap replicates, winner's-curse correction, or external cohort, institution, scanner and population variation. Validation grouped by TCGA tissue-source-site code assigned all patients sharing the same two-character code to one outer fold. The same TCGA tissue-source-site-code constraint was passed to every inner component-selection split within the outer training set; thus neither outer performance estimation nor inner tuning divided a code across folds. For every model and outer fold, we recorded test and training patients, TCGA tissue-source-site codes, and—where applicable—positive and negative cases. A sensitivity analysis replaced each mean-pooled vector with the lexicographically first eligible diagnostic slide while preserving patients and seeds. Full-data research models were tuned by ten-fold CV and saved with feature order and checksum, training ranges, aggregation rule, endpoint transformation and output units, class coding and priors, decision rule, calibration status, class counts, exact software version and commit, computation backend, rSVD controls, external-validation status and intended-use metadata.</w:t>
+        <w:t>The initial nested-CV estimate used for candidate screening, permutation testing and tier assignment is termed the primary screening estimate. Only endpoints passing that initial atlas screen entered five additional independently seeded nested-CV partitions; their reported repeated-validation estimate is the arithmetic mean of the five repeat-specific metrics. The two estimates answer different questions and need not be numerically identical because they use different fold partitions and rSVD seeds. The primary screening estimate preserves the prespecified selection and multiplicity path, whereas the five-repeat estimate describes post-selection resampling stability; it does not replace or retroactively alter screen membership. For example, THYM–Th17 had primary screening Q²=0.638 and five-repeat mean Q²=0.594. Each repeat seed governed both fold construction and rSVD. Sensitivity, specificity, balanced accuracy and AUROC were calculated within each repeat for binary endpoints; Q², RMSE and Spearman correlation were calculated within each repeat for continuous endpoints. LDA scores from independently fitted repeats were never pooled onto an assumed common scale. For highlighted models, 1,000 patient-cluster bootstrap resamples retained all five existing held-out predictions for each sampled patient, recalculated the metric within repeat and then averaged the five repeat metrics; the 2.5th and 97.5th percentiles formed the reported 95% selection-conditioned patient-resampling interval for repeated out-of-fold predictions. This interval represents patient sampling variability conditional on the five fitted nested-CV prediction sets. It includes neither the initial screen and endpoint highlighting nor new partition generation, scaling or component reselection, model refitting inside bootstrap replicates, winner's-curse correction, or external cohort, institution, scanner and population variation. Validation grouped by TCGA tissue-source-site code assigned all patients sharing the same two-character code to one outer fold. The same constraint on TCGA tissue-source-site code was passed to every inner component-selection split within the outer training set; thus neither outer performance estimation nor inner tuning divided a code across folds. For every model and outer fold, we recorded test and training patients, TCGA tissue-source-site codes, and—where applicable—positive and negative cases. A sensitivity analysis replaced each mean-pooled vector with the lexicographically first eligible diagnostic slide while preserving patients and seeds. Full-data research models were tuned by ten-fold CV and saved with feature order and checksum, training ranges, aggregation rule, endpoint transformation and output units, class coding and priors, decision rule, calibration status, class counts, exact software version and commit, computation backend, rSVD controls, external-validation status and intended-use metadata.</w:t>
       </w:r>
     </w:p>
     <w:p>
@@ -612,7 +612,7 @@
     </w:p>
     <w:p>
       <w:r>
-        <w:t>To quantify whether TITAN itself retained information about TCGA tissue-source-site code, we treated that code as a multiclass outcome within each cancer. This dedicated confounding analysis retained codes represented by at least 10 patients, required at least two eligible codes per cancer, and used five independently seeded nested five-fold PLS–LDA validations with the same component range and rSVD controls. The primary metric was multiclass macro balanced accuracy (mean recall across TCGA tissue-source-site codes); chance was 1/k for k analysed codes, and a chance-normalised value, (balanced accuracy − 1/k)/(1 − 1/k), was calculated for cross-cancer description. Patients with rare codes excluded from this code-classification analysis remained in all eligible molecular-endpoint analyses. This analysis tests whether the representation encodes TCGA tissue-source-site-code signatures; it does not identify their scanner, laboratory, staining or population causes.</w:t>
+        <w:t>To quantify whether TITAN itself retained information about TCGA tissue-source-site code, we treated that code as a multiclass outcome within each cancer. This dedicated confounding analysis retained codes represented by at least 10 patients, required at least two eligible codes per cancer, and used five independently seeded nested five-fold PLS–LDA validations with the same component range and rSVD controls. The primary metric was multiclass macro balanced accuracy (mean recall across TCGA tissue-source-site codes); chance was 1/k for k analysed codes, and a chance-normalised value, (balanced accuracy − 1/k)/(1 − 1/k), was calculated for cross-cancer description. Patients with rare codes excluded from this code-classification analysis remained in all eligible molecular-endpoint analyses. This analysis tests whether the representation encodes signatures associated with TCGA tissue-source-site code; it does not identify their scanner, laboratory, staining or population causes.</w:t>
       </w:r>
     </w:p>
     <w:p>
@@ -2172,12 +2172,12 @@
         <w:pStyle w:val="Heading2"/>
       </w:pPr>
       <w:r>
-        <w:t>Sensitivity to TCGA tissue-source-site-code grouping</w:t>
+        <w:t>Sensitivity to grouping by TCGA tissue-source-site code</w:t>
       </w:r>
     </w:p>
     <w:p>
       <w:r>
-        <w:t xml:space="preserve">Internal validation grouped by TCGA tissue-source-site code was feasible for 323 screen-positive models. Although the median grouped-minus-random performance change was only -0.026, 83/323 models (25.7%) fell below the original prespecified screening threshold: 58/219 continuous models and 25/104 binary models. Prominent attenuations were READ–APC (balanced accuracy 0.862 to 0.495); COAD–APC (balanced accuracy 0.793 to 0.543); PCPG–Cell Cycle (balanced accuracy 0.686 to 0.476); LIHC–CTNNB1 (balanced accuracy 0.668 to 0.565); OV–TCR Shannon (Q² 0.206 to -0.551); COAD–SNV Neoantigens (Q² 0.239 to -0.013). Folds grouped by TCGA tissue-source-site code contain fewer and less evenly distributed training and test patients, so the decline cannot be attributed solely to confounding by that code; nevertheless, the near-chance colorectal APC results are not adequately summarised by the median and are prominently labelled as sensitive to TCGA tissue-source-site-code grouping in the registry and research-software output. </w:t>
+        <w:t xml:space="preserve">Internal validation grouped by TCGA tissue-source-site code was feasible for 323 screen-positive models. Although the median grouped-minus-random performance change was only -0.026, 83/323 models (25.7%) fell below the original prespecified screening threshold: 58/219 continuous models and 25/104 binary models. Prominent attenuations were READ–APC (balanced accuracy 0.862 to 0.495); COAD–APC (balanced accuracy 0.793 to 0.543); PCPG–Cell Cycle (balanced accuracy 0.686 to 0.476); LIHC–CTNNB1 (balanced accuracy 0.668 to 0.565); OV–TCR Shannon (Q² 0.206 to -0.551); COAD–SNV Neoantigens (Q² 0.239 to -0.013). Folds grouped by TCGA tissue-source-site code contain fewer and less evenly distributed training and test patients, so the decline cannot be attributed solely to confounding by that code; nevertheless, the near-chance colorectal APC results are not adequately summarised by the median and are prominently labelled as sensitive to grouping by TCGA tissue-source-site code in the registry and research-software output. </w:t>
       </w:r>
     </w:p>
     <w:p>
@@ -2187,7 +2187,7 @@
     </w:p>
     <w:p>
       <w:r>
-        <w:t>The dedicated within-cancer TCGA tissue-source-site-code classification analysis was evaluable in 27/32 cancers and included 7,863 patients from codes represented by at least 10 patients. All 27 observed macro balanced accuracies exceeded their cancer-specific 1/k chance reference; the median was 0.628 (range 0.425–0.966). The strongest chance-normalised code predictability occurred in UVM (macro balanced accuracy 0.966; 3 codes); OV (macro balanced accuracy 0.963; 2 codes); PAAD (macro balanced accuracy 0.911; 5 codes); ESCA (macro balanced accuracy 0.861; 7 codes); READ (macro balanced accuracy 0.862; 5 codes). ACC, CHOL, DLBC, MESO and UCS had fewer than two codes meeting the 10-patient requirement and were reported as ineligible. This result shows substantial TCGA tissue-source-site-code information in the fixed TITAN representation and strengthens the confounding concern; it does not identify a causal scanner, laboratory or staining effect.</w:t>
+        <w:t>The dedicated within-cancer classification of TCGA tissue-source-site code analysis was evaluable in 27/32 cancers and included 7,863 patients from codes represented by at least 10 patients. All 27 observed macro balanced accuracies exceeded their cancer-specific 1/k chance reference; the median was 0.628 (range 0.425–0.966). The strongest chance-normalised code predictability occurred in UVM (macro balanced accuracy 0.966; 3 codes); OV (macro balanced accuracy 0.963; 2 codes); PAAD (macro balanced accuracy 0.911; 5 codes); ESCA (macro balanced accuracy 0.861; 7 codes); READ (macro balanced accuracy 0.862; 5 codes). ACC, CHOL, DLBC, MESO and UCS had fewer than two codes meeting the 10-patient requirement and were reported as ineligible. This result shows substantial information associated with TCGA tissue-source-site code in the fixed TITAN representation and strengthens the confounding concern; it does not identify a causal scanner, laboratory or staining effect.</w:t>
       </w:r>
     </w:p>
     <w:p>
@@ -2235,7 +2235,7 @@
         <w:jc w:val="center"/>
       </w:pPr>
       <w:r>
-        <w:t>Figure 6. Sensitivity to TCGA tissue-source-site-code grouping as a principal result. Panel A compares all 323 random-fold estimates with estimates grouped by TCGA tissue-source-site code; Panel B shows the six largest attenuations; Panel C shows the 10 strongest chance-normalised within-cancer code-classification results. Larger typography and restricted ranked panels improve readability. This grouping remains internal to TCGA; the code is not an institutional, scanner or laboratory identifier, and the analysis is not external validation.</w:t>
+        <w:t>Figure 6. Sensitivity to grouping by TCGA tissue-source-site code as a principal result. Panel A compares all 323 random-fold estimates with estimates grouped by TCGA tissue-source-site code; Panel B shows the six largest attenuations; Panel C shows the 10 strongest chance-normalised within-cancer code-classification results. Larger typography and restricted ranked panels improve readability. This grouping remains internal to TCGA; the code is not an institutional, scanner or laboratory identifier, and the analysis is not external validation.</w:t>
       </w:r>
     </w:p>
     <w:p>
@@ -2405,7 +2405,7 @@
     </w:p>
     <w:p>
       <w:r>
-        <w:t>The complementary TCGA tissue-source-site-code classification analysis strengthens this interpretation: the fixed TITAN representation predicted the code within 27/32 evaluable cancers, with median macro balanced accuracy 0.628 despite cancer-specific chance references from 0.053 to 0.500. This demonstrates that information about the TCGA tissue-source-site code is present in the representation and could support confounding. It does not show that each attenuated molecular model is wholly artifactual, because the code correlates with case mix and molecular prevalence as well as technical acquisition. Conversely, successful grouping by TCGA tissue-source-site code cannot prove transportability: the barcode-derived code is not an institution, scanner, staining laboratory or batch identifier.</w:t>
+        <w:t>The complementary classification analysis of TCGA tissue-source-site code analysis strengthens this interpretation: the fixed TITAN representation predicted the code within 27/32 evaluable cancers, with median macro balanced accuracy 0.628 despite cancer-specific chance references from 0.053 to 0.500. This demonstrates that information about the TCGA tissue-source-site code is present in the representation and could support confounding. It does not show that each attenuated molecular model is wholly artifactual, because the code correlates with case mix and molecular prevalence as well as technical acquisition. Conversely, successful grouping by TCGA tissue-source-site code cannot prove transportability: the barcode-derived code is not an institution, scanner, staining laboratory or batch identifier.</w:t>
       </w:r>
     </w:p>
     <w:p>

</xml_diff>

<commit_message>
Add demographic subgroup performance audit
</commit_message>
<xml_diff>
--- a/manuscript/manuscript_JTM_patient_level_TITAN.docx
+++ b/manuscript/manuscript_JTM_patient_level_TITAN.docx
@@ -460,12 +460,12 @@
     </w:p>
     <w:p>
       <w:r>
-        <w:t>All available eligible TCGA participants were used; no formal power calculation was performed. Minimum outcome-specific denominators were prespecified to support nested folds. Treatments were not modelled because the endpoints were contemporaneous molecular or derived immune/genomic features rather than prognosis or treatment response. Available demographic fields, subgroup sizes and endpoint-specific missingness did not provide a basis for representative subgroup performance or fairness evaluation; this is considered a limitation rather than evidence of equivalent performance across groups.</w:t>
+        <w:t>All available eligible TCGA participants were used; no formal power calculation was performed. Minimum outcome-specific denominators were prespecified to support nested folds. Treatments were not modelled because the endpoints were contemporaneous molecular or derived immune/genomic features rather than prognosis or treatment response.</w:t>
       </w:r>
     </w:p>
     <w:p>
       <w:r>
-        <w:t>Reporting was audited against TRIPOD+AI [28]. Participant characteristics were linked from the TCGA Clinical Data Resource [29] and summarized overall and by cancer. These descriptive fields were not supplied to prediction models, and no subgroup performance comparison was prespecified.</w:t>
+        <w:t>Reporting was audited against TRIPOD+AI [28]. Participant characteristics were linked from the TCGA Clinical Data Resource [29] and summarized overall and by cancer. These fields were not supplied to prediction models. In a post hoc denominator-first audit, a cancer–endpoint model was considered high volume at ≥200 outcome-labelled patients. Performance was recalculated within the fixed five-repeat held-out predictions when a continuous subgroup contained ≥50 patients or a binary subgroup contained ≥20 positive and ≥20 negative patients. Recorded sex used the TCGA CDR gender field; broad race retained White, Black or African American, Asian and other recorded categories separately. Continuous subgroup metrics were Q², RMSE and Spearman correlation; binary metrics were sensitivity, specificity, balanced accuracy, AUROC and PR-AUC. No subgroup-specific model was refitted, no formal between-group hypothesis test or multiplicity correction was performed, and the audit was not designed to establish fairness. Exact counts and reasons for non-estimability were retained for every model–subgroup row.</w:t>
       </w:r>
     </w:p>
     <w:p>
@@ -694,7 +694,20 @@
     </w:p>
     <w:p>
       <w:r>
-        <w:t>The TCGA Clinical Data Resource [29] matched 9,385/9,404 participants. Age was available for 9,338 participants (median 60.0 years, IQR 50.0–70.0); 4,780/9,385 with recorded gender were female. Race was recorded for 8,262 and broad stage I–IV for 7,505. These fields describe cohort composition only; subgroup predictive performance was not evaluated.</w:t>
+        <w:t>The TCGA Clinical Data Resource [29] matched 9,385/9,404 participants. Age was available for 9,338 participants (median 60.0 years, IQR 50.0–70.0); 4,780/9,385 with recorded gender were female. Race was recorded for 8,262 and broad stage I–IV for 7,505. These fields describe cohort composition and support the post hoc subgroup denominator audit below.</w:t>
+      </w:r>
+    </w:p>
+    <w:p>
+      <w:pPr>
+        <w:pStyle w:val="Heading2"/>
+      </w:pPr>
+      <w:r>
+        <w:t>Sex- and broad race-stratified performance audit</w:t>
+      </w:r>
+    </w:p>
+    <w:p>
+      <w:r>
+        <w:t>Of 323 screen-positive models, 266 had at least 200 outcome-labelled patients. Using fixed repeated out-of-fold predictions, both recorded-sex groups met the prespecified subgroup denominator in 138 continuous and 56 binary models; at least two broad race groups were estimable in 98 continuous and 32 binary models. The complete audit contains 2,094 model–subgroup rows, including exact subgroup and binary class counts, 864 estimable performance rows and a specific non-estimability reason for every remaining row. Across estimable female–male comparisons, the median absolute difference was 0.099 in Q², 0.026 in AUROC and 0.019 in balanced accuracy. For White versus each estimable non-White category, the corresponding medians were 0.089 in Q², 0.023 in AUROC and 0.034 in balanced accuracy. These are descriptive, post hoc internal TCGA estimates from the same held-out predictions—not independently validated fairness estimates—and small differences should not be interpreted as evidence of demographic equivalence or disparity.</w:t>
       </w:r>
     </w:p>
     <w:p>
@@ -2445,7 +2458,7 @@
     </w:p>
     <w:p>
       <w:r>
-        <w:t>Demographic subgroup performance and algorithmic fairness were not evaluated. The TCGA Clinical Data Resource provides descriptive age, recorded gender, race and stage fields, but coverage and subgroup sizes vary across cancers and would fragment further under endpoint-specific molecular missingness. Grouping by TCGA tissue-source-site code probes one source of heterogeneity but does not directly identify an institution and cannot establish fairness across ancestry, sex, age or access-to-care groups. Any external evaluation should prespecify representative sampling and subgroup performance, calibration and failure analysis.</w:t>
+        <w:t>The post hoc subgroup audit partially addresses demographic performance but does not establish algorithmic fairness. Among high-volume models, both recorded-sex groups were estimable for 138 continuous and 56 binary targets, whereas at least two broad race groups were estimable for only 98 continuous and 32 binary targets. Sparse Black or African American, Asian and other recorded-race groups—and, for binary endpoints, sparse positive or negative classes within those groups—were the dominant barriers. Race categories are heterogeneous administrative labels and are not substitutes for ancestry, socioeconomic context or exposure. The estimates condition on the same selected TCGA models and held-out predictions, have no external validation, and were not accompanied by formal between-group tests or multiplicity correction. Apparent similarity therefore cannot be interpreted as demographic equivalence, and apparent differences may reflect sampling error, outcome prevalence, missingness or structure associated with TCGA tissue-source-site code. Any external evaluation should prespecify representative sampling, intersectional subgroups, calibration and failure analysis.</w:t>
       </w:r>
     </w:p>
     <w:p>

</xml_diff>

<commit_message>
Document pathology quality control limitations
</commit_message>
<xml_diff>
--- a/manuscript/manuscript_JTM_patient_level_TITAN.docx
+++ b/manuscript/manuscript_JTM_patient_level_TITAN.docx
@@ -450,7 +450,12 @@
     </w:p>
     <w:p>
       <w:r>
-        <w:t>The published TITAN TCGA table contained 11,449 eligible primary-tumour diagnostic slides (TCGA sample type 01 and –DX filename) from 9,404 participants. The 843 participants with multiple eligible slides contributed one patient vector obtained by feature-wise arithmetic mean before outcomes were joined. Patient—not slide—was the independent cross-validation unit. TITAN's TCGA-Slide-Reports.csv matched 10,106 selected slides exactly by filename; 1,343 slides lacked an exact report row. Report metadata were used only to audit identifiers, project/cancer provenance and resection-site annotations, and no report text entered a model. The two-character tissue-source-site code used for grouped validation was derived directly from the TCGA participant barcode. 9 participants without a resolvable cancer label did not enter cancer-specific modelling. No participant had eligible slides from more than one primary sample barcode.</w:t>
+        <w:t>The published TITAN TCGA table contained 11,449 eligible primary-tumour diagnostic slides (TCGA sample type 01 and –DX filename) from 9,404 participants. The 843 participants with multiple eligible slides contributed one patient vector obtained by feature-wise arithmetic mean before outcomes were joined. Patient—not slide—was the independent cross-validation unit. Within a patient, every eligible slide received weight 1/n; after pooling, every participant contributed one row and therefore one observational unit. TITAN's TCGA-Slide-Reports.csv matched 10,106 selected slides exactly by filename; 1,343 slides lacked an exact report row. Report metadata were used only to audit identifiers, project/cancer provenance and anatomical resection/biopsy-site annotations, and no report text entered a model. The two-character tissue-source-site code used for grouped validation was derived directly from the TCGA participant barcode. 9 participants without a resolvable cancer label did not enter cancer-specific modelling. No participant had eligible slides from more than one primary sample barcode.</w:t>
+      </w:r>
+    </w:p>
+    <w:p>
+      <w:r>
+        <w:t>No structured tumour-content/cellularity percentage, tissue-area measurement, artefact assessment, biopsy-versus-resection indicator or slide/image-quality score was available in the TITAN feature table or TCGA-Slide-Reports.csv; accordingly, none was used for slide exclusion or weighting. The field named site_of_resection_or_biopsy contains an anatomical site, not specimen procedure. Generated slide narratives were audited only for transparency and were not treated as independent pathologist-adjudicated QC labels. Eligibility therefore reflected TCGA sample type and diagnostic-slide filename, not prospective pathology review.</w:t>
       </w:r>
     </w:p>
     <w:p>
@@ -689,7 +694,12 @@
     </w:p>
     <w:p>
       <w:r>
-        <w:t>The embedding cohort contained 9,404 patients represented by 11,449 slides; 843 patients (9.0%) had more than one eligible diagnostic slide. The maximum was 30 slides for one patient, and no patient contributed slides from multiple primary sample barcodes. Exact slide-report coverage was 10,106/11,449 (88.3%). Cancer labels were available for 9,395 patients across 32 cancers. The benchmark evaluated 1,614 continuous and 459 binary cancer–endpoint pairs (Table 1). Of 537 prespecified cancer–gene mutation pairs with a profiled denominator, 238 met the 20-positive/20-negative rule and 299 were reported as ineligible rather than tested-negative. Molecular coverage varied by source and cancer; missing cases were excluded outcome by outcome.</w:t>
+        <w:t>The embedding cohort contained 9,404 patients represented by 11,449 slides; 843 patients (9.0%) had more than one eligible diagnostic slide. The maximum was 30 slides for TCGA-DX-AB2L (TCGA-SARC); its 30 slides each received weight 1/30 in the pooled vector, while the resulting patient vector had the same downstream observational weight as every other participant. No patient contributed slides from multiple primary sample barcodes. Exact slide-report coverage was 10,106/11,449 (88.3%). Cancer labels were available for 9,395 patients across 32 cancers. The benchmark evaluated 1,614 continuous and 459 binary cancer–endpoint pairs (Table 1). Of 537 prespecified cancer–gene mutation pairs with a profiled denominator, 238 met the 20-positive/20-negative rule and 299 were reported as ineligible rather than tested-negative. Molecular coverage varied by source and cancer; missing cases were excluded outcome by outcome.</w:t>
+      </w:r>
+    </w:p>
+    <w:p>
+      <w:r>
+        <w:t>The structured pathology-QC audit confirmed that tumour percentage, tissue area, artefact, specimen procedure and slide quality were unavailable. Among the 10,106 matched generated slide narratives, tumour-content, tissue-area, artefact and explicit slide-quality phrases occurred in only 16, 9, 2 and 0 slides, respectively; these unvalidated text mentions did not alter inclusion or weights. All 30 generated narratives for TCGA-DX-AB2L stated that no residual sarcoma/myxofibrosarcoma was seen. This finding exposes a clinically important limitation of barcode-based eligibility and is not reinterpreted as an adjudicated exclusion because the narratives were generated from the same images rather than independently reviewed.</w:t>
       </w:r>
     </w:p>
     <w:p>
@@ -2265,6 +2275,11 @@
       </w:r>
     </w:p>
     <w:p>
+      <w:r>
+        <w:t>Mean pooling limits numerical dominance by heavily sampled participants because each participant remains one validation observation, but it cannot rescue a patient whose eligible slides are uniformly non-representative of the molecularly profiled tumour. The 30-slide SARC example therefore motivates future independent pathology QC and tumour-area-aware aggregation rather than a claim that equal pooling solved tissue adequacy.</w:t>
+      </w:r>
+    </w:p>
+    <w:p>
       <w:pPr>
         <w:pStyle w:val="Heading2"/>
       </w:pPr>
@@ -2448,7 +2463,7 @@
     </w:p>
     <w:p>
       <w:r>
-        <w:t>Arithmetic mean pooling gives each eligible slide equal weight and prevents multiple-slide leakage, but it does not model variable tissue area or within-patient morphological heterogeneity. The first-slide sensitivity measures dependence on one deterministic alternative and should not be interpreted as a comparison with learned or tissue-area-weighted aggregation.</w:t>
+        <w:t>Arithmetic mean pooling gives each eligible slide equal within-patient weight and prevents multiple-slide leakage, but it does not model tumour content, variable tissue area, artefact, specimen procedure, slide quality or within-patient morphological heterogeneity. No structured fields for those quantities were available, and no independent pathology review was performed. The maximum-slide participant (TCGA-DX-AB2L, SARC) is particularly cautionary: all 30 generated narratives described no residual sarcoma/myxofibrosarcoma, although those same-image automated narratives cannot serve as adjudicated ground truth. The first-slide sensitivity measures dependence on one deterministic alternative and should not be interpreted as a comparison with pathology-screened, learned or tissue-area-weighted aggregation.</w:t>
       </w:r>
     </w:p>
     <w:p>

</xml_diff>

<commit_message>
Define predictability as cross-validated association
</commit_message>
<xml_diff>
--- a/manuscript/manuscript_JTM_patient_level_TITAN.docx
+++ b/manuscript/manuscript_JTM_patient_level_TITAN.docx
@@ -416,7 +416,7 @@
     </w:p>
     <w:p>
       <w:r>
-        <w:t>The primary question was cancer-specific: which individual mutations, derived inflammatory features, oncogenic pathways, MSI phenotypes, aneuploidy measures and fusions are predictable within each cancer? Molecular subtype association was not analysed. One-at-a-time PLS1 and PLS–LDA formed the prespecified reference screen because they preserve outcome-specific denominators and yield one independently usable model per endpoint. Joint PLS2 was evaluated secondarily only for coherent continuous inflammatory panels; its complete-case panel, shared latent structure and multiresponse estimand are not interchangeable with the endpoint-specific atlas.</w:t>
+        <w:t>The primary question was cancer-specific: which individual mutations, derived inflammatory features, oncogenic pathways, MSI phenotypes, aneuploidy measures and fusions show held-out cross-validated statistical association with the TITAN representation within each cancer? Throughout this article, ‘predictability’ is shorthand only for that operational cross-validated association at the reported performance threshold. It does not denote causal biological information, a morphological mechanism, direct recovery of the source measurement or justification for replacing an assay. Molecular subtype association was not analysed. One-at-a-time PLS1 and PLS–LDA formed the prespecified reference screen because they preserve outcome-specific denominators and yield one independently usable model per endpoint. Joint PLS2 was evaluated secondarily only for coherent continuous inflammatory panels; its complete-case panel, shared latent structure and multiresponse estimand are not interchangeable with the endpoint-specific atlas.</w:t>
       </w:r>
     </w:p>
     <w:p>
@@ -1903,7 +1903,7 @@
     </w:p>
     <w:p>
       <w:r>
-        <w:t>Among continuous targets, 37 were assigned to prespecified screening tier A and 182 to tier B. The largest primary screening Q² values were TGCT–TGF-beta Response (0.670); THYM–Th17 Cells (0.638); THCA–Lymphocyte Infiltration Signature Score (0.580); BRCA–Wound Healing (0.527); THCA–TGF-beta Response (0.522); SARC–Macrophage Regulation (0.520); KIRP–Proliferation (0.515); LUAD–Proliferation (0.512); BRCA–Proliferation (0.510); THCA–Th1 Cells (0.503). These initial nested-CV values determined screening and tier assignment; five-repeat means are reported separately for stability. These results were cancer specific: the same endpoint could be predictable in one tumour type and screen-negative in another.</w:t>
+        <w:t>Among continuous targets, 37 were assigned to prespecified screening tier A and 182 to tier B. The largest primary screening Q² values were TGCT–TGF-beta Response (0.670); THYM–Th17 Cells (0.638); THCA–Lymphocyte Infiltration Signature Score (0.580); BRCA–Wound Healing (0.527); THCA–TGF-beta Response (0.522); SARC–Macrophage Regulation (0.520); KIRP–Proliferation (0.515); LUAD–Proliferation (0.512); BRCA–Proliferation (0.510); THCA–Th1 Cells (0.503). These initial nested-CV values determined screening and tier assignment; five-repeat means are reported separately for stability. These cross-validated statistical associations were cancer specific: the same endpoint could meet the predictability criterion in one tumour type and be screen-negative in another. This contrast is predictive, not evidence of a cancer-specific causal mechanism.</w:t>
       </w:r>
     </w:p>
     <w:p>
@@ -2210,7 +2210,7 @@
     </w:p>
     <w:p>
       <w:r>
-        <w:t>The dedicated within-cancer classification of TCGA tissue-source-site code analysis was evaluable in 27/32 cancers and included 7,863 patients from codes represented by at least 10 patients. All 27 observed macro balanced accuracies exceeded their cancer-specific 1/k chance reference; the median was 0.628 (range 0.425–0.966). The strongest chance-normalised code predictability occurred in UVM (macro balanced accuracy 0.966; 3 codes); OV (macro balanced accuracy 0.963; 2 codes); PAAD (macro balanced accuracy 0.911; 5 codes); ESCA (macro balanced accuracy 0.861; 7 codes); READ (macro balanced accuracy 0.862; 5 codes). ACC, CHOL, DLBC, MESO and UCS had fewer than two codes meeting the 10-patient requirement and were reported as ineligible. This result shows substantial information associated with TCGA tissue-source-site code in the fixed TITAN representation and strengthens the confounding concern; it does not identify a causal scanner, laboratory or staining effect.</w:t>
+        <w:t>The dedicated within-cancer classification of TCGA tissue-source-site code analysis was evaluable in 27/32 cancers and included 7,863 patients from codes represented by at least 10 patients. All 27 observed macro balanced accuracies exceeded their cancer-specific 1/k chance reference; the median was 0.628 (range 0.425–0.966). The strongest chance-normalised code predictability occurred in UVM (macro balanced accuracy 0.966; 3 codes); OV (macro balanced accuracy 0.963; 2 codes); PAAD (macro balanced accuracy 0.911; 5 codes); ESCA (macro balanced accuracy 0.861; 7 codes); READ (macro balanced accuracy 0.862; 5 codes). ACC, CHOL, DLBC, MESO and UCS had fewer than two codes meeting the 10-patient requirement and were reported as ineligible. This result shows a held-out statistical association between the fixed TITAN representation and TCGA tissue-source-site code and strengthens the confounding concern; it does not identify causal scanner, laboratory or staining information.</w:t>
       </w:r>
     </w:p>
     <w:p>
@@ -2368,7 +2368,7 @@
     </w:p>
     <w:p>
       <w:r>
-        <w:t>This study is best interpreted as a systematic patient-level benchmark and reusable fitted-model resource, not as the first pan-cancer molecular-prediction study or a catalogue of unprecedented mutation targets. It answers a target-by-target, cancer-specific question using one fixed pretrained TITAN representation. Selected immune programmes, mutations and higher-level genomic phenotypes were predictable, but most eligible pairs did not satisfy both multiplicity and prespecified screening-statistic thresholds. That heterogeneity—and transparent negative and ineligible reporting—is the primary empirical result. The primary analysis controls local cancer-specific families; it does not attach one global 5% FDR interpretation to the aggregate 323 candidates. In sensitivity analyses, 219 continuous and 39 mutation pairs passed the across-cancer family correction, and 320/323 local candidates passed a single BH correction across all eligible atlas tests. These large counts partly reflect extensive ties at the 0.001 empirical-p floor: a zero-exceedance 999-permutation result still has a 95% Monte Carlo interval extending to 0.003686. The 9,999-permutation refinement sharpened precision for eight leading claims but does not resolve the entire atlas or justify ranking by q-value; outcome-appropriate predictive magnitude and stability remain the appropriate ordering criteria.</w:t>
+        <w:t>This study is best interpreted as a systematic patient-level benchmark and reusable fitted-model resource, not as the first pan-cancer molecular-prediction study or a catalogue of unprecedented mutation targets. It answers a target-by-target, cancer-specific question using one fixed pretrained TITAN representation. Selected immune programmes, mutations and higher-level genomic phenotypes met prespecified criteria for held-out cross-validated statistical association, but most eligible pairs did not satisfy both multiplicity and screening-statistic thresholds. Here and throughout, this operational ‘predictability’ neither establishes causal biological information nor demonstrates recovery or replacement of the originating assay. That heterogeneity—and transparent negative and ineligible reporting—is the primary empirical result. The primary analysis controls local cancer-specific families; it does not attach one global 5% FDR interpretation to the aggregate 323 candidates. In sensitivity analyses, 219 continuous and 39 mutation pairs passed the across-cancer family correction, and 320/323 local candidates passed a single BH correction across all eligible atlas tests. These large counts partly reflect extensive ties at the 0.001 empirical-p floor: a zero-exceedance 999-permutation result still has a 95% Monte Carlo interval extending to 0.003686. The 9,999-permutation refinement sharpened precision for eight leading claims but does not resolve the entire atlas or justify ranking by q-value; outcome-appropriate predictive magnitude and stability remain the appropriate ordering criteria.</w:t>
       </w:r>
     </w:p>
     <w:p>
@@ -2448,7 +2448,7 @@
     </w:p>
     <w:p>
       <w:r>
-        <w:t>The principal limitation is absence of independent external validation. TCGA resampling—including the analysis termed 'internal validation grouped by TCGA tissue-source-site code'—cannot establish transportability to another institution, scanner, stain distribution or patient population. The TCGA tissue-source-site code is not an institution, scanner or laboratory identifier. The study is retrospective and exploratory; thresholds are prioritisation rules, not clinical operating points. Although TCGA was excluded from TITAN's Mass-340K pretraining corpus, it was used in the original paper's downstream evaluation; the present cohort is therefore neither a pretraining cohort nor an independent validation cohort. Predictability does not establish biological causality, and image-derived estimates cannot justify omitting a molecular assay. The three-model UCEC subset is locked only for future independent evaluation. Until that untouched analysis reports every target, the work should be evaluated as a computational pathology benchmark and research-software resource rather than a translational prediction study.</w:t>
+        <w:t>The principal limitation is absence of independent external validation. TCGA resampling—including the analysis termed 'internal validation grouped by TCGA tissue-source-site code'—cannot establish transportability to another institution, scanner, stain distribution or patient population. The TCGA tissue-source-site code is not an institution, scanner or laboratory identifier. The study is retrospective and exploratory; thresholds are prioritisation rules, not clinical operating points. Although TCGA was excluded from TITAN's Mass-340K pretraining corpus, it was used in the original paper's downstream evaluation; the present cohort is therefore neither a pretraining cohort nor an independent validation cohort. Predictability means cross-validated statistical association only: it does not establish biological causality, reveal a mechanism, reproduce the analytical validity of the source measurement or justify omitting or replacing a molecular or immune assay. The three-model UCEC subset is locked only for future independent evaluation. Until that untouched analysis reports every target, the work should be evaluated as a computational pathology benchmark and research-software resource rather than a translational prediction study.</w:t>
       </w:r>
     </w:p>
     <w:p>

</xml_diff>